<commit_message>
added a definition for KKILMO trip counts calculation
</commit_message>
<xml_diff>
--- a/documents/2026/FDI_TO_DO.docx
+++ b/documents/2026/FDI_TO_DO.docx
@@ -165,6 +165,147 @@
           <w:lang w:val="en-US"/>
         </w:rPr>
       </w:pPr>
+    </w:p>
+    <w:p>
+      <w:pPr>
+        <w:pStyle w:val="ListParagraph"/>
+        <w:numPr>
+          <w:ilvl w:val="0"/>
+          <w:numId w:val="11"/>
+        </w:numPr>
+        <w:rPr>
+          <w:lang w:val="en-US"/>
+        </w:rPr>
+      </w:pPr>
+      <w:r>
+        <w:rPr>
+          <w:lang w:val="en-US"/>
+        </w:rPr>
+        <w:t xml:space="preserve">Re-calculate trips from monthly reports (KKILMO) part (definition: </w:t>
+      </w:r>
+      <w:r>
+        <w:rPr>
+          <w:b/>
+          <w:bCs/>
+          <w:lang w:val="en-US"/>
+        </w:rPr>
+        <w:t>Key definition</w:t>
+      </w:r>
+    </w:p>
+    <w:p>
+      <w:pPr>
+        <w:pStyle w:val="ListParagraph"/>
+        <w:rPr>
+          <w:lang w:val="en-US"/>
+        </w:rPr>
+      </w:pPr>
+      <w:r>
+        <w:rPr>
+          <w:lang w:val="en-US"/>
+        </w:rPr>
+        <w:t>A fishing trip is approximated by reported fishing days, aggregated from monthly reports by taking the maximum number of fishing days per vessel–month–</w:t>
+      </w:r>
+      <w:proofErr w:type="spellStart"/>
+      <w:r>
+        <w:rPr>
+          <w:lang w:val="en-US"/>
+        </w:rPr>
+        <w:t>metier</w:t>
+      </w:r>
+      <w:proofErr w:type="spellEnd"/>
+      <w:r>
+        <w:rPr>
+          <w:lang w:val="en-US"/>
+        </w:rPr>
+        <w:t xml:space="preserve"> combination and summing these over time and vessels.</w:t>
+      </w:r>
+    </w:p>
+    <w:p>
+      <w:pPr>
+        <w:rPr>
+          <w:lang w:val="en-US"/>
+        </w:rPr>
+      </w:pPr>
+      <w:r>
+        <w:rPr>
+          <w:lang w:val="en-US"/>
+        </w:rPr>
+        <w:t xml:space="preserve">              </w:t>
+      </w:r>
+      <w:r>
+        <w:rPr>
+          <w:rFonts w:ascii="Helvetica" w:hAnsi="Helvetica" w:cs="Helvetica"/>
+          <w:noProof/>
+          <w:color w:val="1B1B1B"/>
+          <w:kern w:val="0"/>
+        </w:rPr>
+        <w:drawing>
+          <wp:inline distT="0" distB="0" distL="0" distR="0" wp14:anchorId="4DB01184" wp14:editId="769CDE00">
+            <wp:extent cx="2783205" cy="198755"/>
+            <wp:effectExtent l="0" t="0" r="0" b="4445"/>
+            <wp:docPr id="1400901149" name="Picture 1"/>
+            <wp:cNvGraphicFramePr>
+              <a:graphicFrameLocks xmlns:a="http://schemas.openxmlformats.org/drawingml/2006/main" noChangeAspect="1"/>
+            </wp:cNvGraphicFramePr>
+            <a:graphic xmlns:a="http://schemas.openxmlformats.org/drawingml/2006/main">
+              <a:graphicData uri="http://schemas.openxmlformats.org/drawingml/2006/picture">
+                <pic:pic xmlns:pic="http://schemas.openxmlformats.org/drawingml/2006/picture">
+                  <pic:nvPicPr>
+                    <pic:cNvPr id="0" name="Picture 1"/>
+                    <pic:cNvPicPr>
+                      <a:picLocks noChangeAspect="1" noChangeArrowheads="1"/>
+                    </pic:cNvPicPr>
+                  </pic:nvPicPr>
+                  <pic:blipFill>
+                    <a:blip r:embed="rId5">
+                      <a:extLst>
+                        <a:ext uri="{28A0092B-C50C-407E-A947-70E740481C1C}">
+                          <a14:useLocalDpi xmlns:a14="http://schemas.microsoft.com/office/drawing/2010/main" val="0"/>
+                        </a:ext>
+                      </a:extLst>
+                    </a:blip>
+                    <a:srcRect/>
+                    <a:stretch>
+                      <a:fillRect/>
+                    </a:stretch>
+                  </pic:blipFill>
+                  <pic:spPr bwMode="auto">
+                    <a:xfrm>
+                      <a:off x="0" y="0"/>
+                      <a:ext cx="2783205" cy="198755"/>
+                    </a:xfrm>
+                    <a:prstGeom prst="rect">
+                      <a:avLst/>
+                    </a:prstGeom>
+                    <a:noFill/>
+                    <a:ln>
+                      <a:noFill/>
+                    </a:ln>
+                  </pic:spPr>
+                </pic:pic>
+              </a:graphicData>
+            </a:graphic>
+          </wp:inline>
+        </w:drawing>
+      </w:r>
+    </w:p>
+    <w:p>
+      <w:pPr>
+        <w:pStyle w:val="ListParagraph"/>
+        <w:numPr>
+          <w:ilvl w:val="0"/>
+          <w:numId w:val="11"/>
+        </w:numPr>
+        <w:rPr>
+          <w:lang w:val="en-US"/>
+        </w:rPr>
+      </w:pPr>
+      <w:r>
+        <w:rPr>
+          <w:lang w:val="en-US"/>
+        </w:rPr>
+        <w:t>…</w:t>
+      </w:r>
     </w:p>
     <w:p>
       <w:pPr>
@@ -1467,7 +1608,7 @@
         <w:kern w:val="2"/>
         <w:sz w:val="24"/>
         <w:szCs w:val="24"/>
-        <w:lang w:eastAsia="en-US" w:bidi="ar-SA"/>
+        <w:lang w:val="en-US" w:eastAsia="en-US" w:bidi="ar-SA"/>
         <w14:ligatures w14:val="standardContextual"/>
       </w:rPr>
     </w:rPrDefault>
@@ -2064,7 +2205,6 @@
   <w:style w:type="character" w:default="1" w:styleId="DefaultParagraphFont">
     <w:name w:val="Default Paragraph Font"/>
     <w:uiPriority w:val="1"/>
-    <w:semiHidden/>
     <w:unhideWhenUsed/>
   </w:style>
   <w:style w:type="table" w:default="1" w:styleId="TableNormal">

</xml_diff>

<commit_message>
table b comments added
</commit_message>
<xml_diff>
--- a/documents/2026/FDI_TO_DO.docx
+++ b/documents/2026/FDI_TO_DO.docx
@@ -34,6 +34,278 @@
           <w:lang w:val="en-US"/>
         </w:rPr>
         <w:t xml:space="preserve"> TO DO list</w:t>
+      </w:r>
+    </w:p>
+    <w:p>
+      <w:pPr>
+        <w:rPr>
+          <w:b/>
+          <w:bCs/>
+          <w:lang w:val="en-US"/>
+        </w:rPr>
+      </w:pPr>
+    </w:p>
+    <w:p>
+      <w:pPr>
+        <w:rPr>
+          <w:b/>
+          <w:bCs/>
+          <w:lang w:val="en-US"/>
+        </w:rPr>
+      </w:pPr>
+      <w:r>
+        <w:rPr>
+          <w:b/>
+          <w:bCs/>
+          <w:lang w:val="en-US"/>
+        </w:rPr>
+        <w:t>Meeting 2</w:t>
+      </w:r>
+      <w:r>
+        <w:rPr>
+          <w:b/>
+          <w:bCs/>
+          <w:lang w:val="en-US"/>
+        </w:rPr>
+        <w:t>1</w:t>
+      </w:r>
+      <w:r>
+        <w:rPr>
+          <w:b/>
+          <w:bCs/>
+          <w:lang w:val="en-US"/>
+        </w:rPr>
+        <w:t>/05/2026</w:t>
+      </w:r>
+    </w:p>
+    <w:p>
+      <w:pPr>
+        <w:pStyle w:val="ListParagraph"/>
+        <w:numPr>
+          <w:ilvl w:val="0"/>
+          <w:numId w:val="13"/>
+        </w:numPr>
+        <w:rPr>
+          <w:lang w:val="en-US"/>
+        </w:rPr>
+      </w:pPr>
+      <w:r>
+        <w:rPr>
+          <w:lang w:val="en-US"/>
+        </w:rPr>
+        <w:t>Preparing table B script</w:t>
+      </w:r>
+      <w:r>
+        <w:rPr>
+          <w:lang w:val="en-US"/>
+        </w:rPr>
+        <w:t xml:space="preserve"> </w:t>
+      </w:r>
+      <w:proofErr w:type="spellStart"/>
+      <w:r>
+        <w:rPr>
+          <w:lang w:val="en-US"/>
+        </w:rPr>
+        <w:t>Rmd</w:t>
+      </w:r>
+      <w:proofErr w:type="spellEnd"/>
+    </w:p>
+    <w:p>
+      <w:pPr>
+        <w:pStyle w:val="ListParagraph"/>
+        <w:numPr>
+          <w:ilvl w:val="1"/>
+          <w:numId w:val="13"/>
+        </w:numPr>
+        <w:rPr>
+          <w:lang w:val="en-US"/>
+        </w:rPr>
+      </w:pPr>
+      <w:r>
+        <w:rPr>
+          <w:lang w:val="en-US"/>
+        </w:rPr>
+        <w:t>Starting to i</w:t>
+      </w:r>
+      <w:r>
+        <w:rPr>
+          <w:lang w:val="en-US"/>
+        </w:rPr>
+        <w:t>mplement</w:t>
+      </w:r>
+      <w:r>
+        <w:rPr>
+          <w:lang w:val="en-US"/>
+        </w:rPr>
+        <w:t xml:space="preserve"> </w:t>
+      </w:r>
+      <w:r>
+        <w:rPr>
+          <w:lang w:val="en-US"/>
+        </w:rPr>
+        <w:t xml:space="preserve">new mongo implementation of </w:t>
+      </w:r>
+      <w:proofErr w:type="spellStart"/>
+      <w:r>
+        <w:rPr>
+          <w:lang w:val="en-US"/>
+        </w:rPr>
+        <w:t>Suomu</w:t>
+      </w:r>
+      <w:proofErr w:type="spellEnd"/>
+      <w:r>
+        <w:rPr>
+          <w:lang w:val="en-US"/>
+        </w:rPr>
+        <w:t xml:space="preserve"> cloud data</w:t>
+      </w:r>
+    </w:p>
+    <w:p>
+      <w:pPr>
+        <w:pStyle w:val="ListParagraph"/>
+        <w:numPr>
+          <w:ilvl w:val="0"/>
+          <w:numId w:val="13"/>
+        </w:numPr>
+        <w:rPr>
+          <w:lang w:val="en-US"/>
+        </w:rPr>
+      </w:pPr>
+    </w:p>
+    <w:p>
+      <w:pPr>
+        <w:rPr>
+          <w:b/>
+          <w:bCs/>
+          <w:lang w:val="en-US"/>
+        </w:rPr>
+      </w:pPr>
+    </w:p>
+    <w:p>
+      <w:pPr>
+        <w:rPr>
+          <w:b/>
+          <w:bCs/>
+          <w:lang w:val="en-US"/>
+        </w:rPr>
+      </w:pPr>
+      <w:r>
+        <w:rPr>
+          <w:b/>
+          <w:bCs/>
+          <w:lang w:val="en-US"/>
+        </w:rPr>
+        <w:t>Meeting 2</w:t>
+      </w:r>
+      <w:r>
+        <w:rPr>
+          <w:b/>
+          <w:bCs/>
+          <w:lang w:val="en-US"/>
+        </w:rPr>
+        <w:t>0</w:t>
+      </w:r>
+      <w:r>
+        <w:rPr>
+          <w:b/>
+          <w:bCs/>
+          <w:lang w:val="en-US"/>
+        </w:rPr>
+        <w:t>/05/2026</w:t>
+      </w:r>
+    </w:p>
+    <w:p>
+      <w:pPr>
+        <w:pStyle w:val="ListParagraph"/>
+        <w:numPr>
+          <w:ilvl w:val="0"/>
+          <w:numId w:val="13"/>
+        </w:numPr>
+        <w:rPr>
+          <w:lang w:val="en-US"/>
+        </w:rPr>
+      </w:pPr>
+      <w:r>
+        <w:rPr>
+          <w:lang w:val="en-US"/>
+        </w:rPr>
+        <w:t xml:space="preserve">Fixing </w:t>
+      </w:r>
+      <w:proofErr w:type="spellStart"/>
+      <w:r>
+        <w:rPr>
+          <w:lang w:val="en-US"/>
+        </w:rPr>
+        <w:t>meti</w:t>
+      </w:r>
+      <w:r>
+        <w:rPr>
+          <w:lang w:val="en-US"/>
+        </w:rPr>
+        <w:t>ers</w:t>
+      </w:r>
+      <w:proofErr w:type="spellEnd"/>
+      <w:r>
+        <w:rPr>
+          <w:lang w:val="en-US"/>
+        </w:rPr>
+        <w:t xml:space="preserve"> in table a-j script</w:t>
+      </w:r>
+    </w:p>
+    <w:p>
+      <w:pPr>
+        <w:pStyle w:val="ListParagraph"/>
+        <w:numPr>
+          <w:ilvl w:val="0"/>
+          <w:numId w:val="13"/>
+        </w:numPr>
+        <w:rPr>
+          <w:lang w:val="en-US"/>
+        </w:rPr>
+      </w:pPr>
+      <w:proofErr w:type="spellStart"/>
+      <w:r>
+        <w:rPr>
+          <w:lang w:val="en-US"/>
+        </w:rPr>
+        <w:t>Rmd</w:t>
+      </w:r>
+      <w:proofErr w:type="spellEnd"/>
+      <w:r>
+        <w:rPr>
+          <w:lang w:val="en-US"/>
+        </w:rPr>
+        <w:t xml:space="preserve"> now running</w:t>
+      </w:r>
+    </w:p>
+    <w:p>
+      <w:pPr>
+        <w:pStyle w:val="ListParagraph"/>
+        <w:numPr>
+          <w:ilvl w:val="0"/>
+          <w:numId w:val="13"/>
+        </w:numPr>
+        <w:rPr>
+          <w:lang w:val="en-US"/>
+        </w:rPr>
+      </w:pPr>
+      <w:r>
+        <w:rPr>
+          <w:lang w:val="en-US"/>
+        </w:rPr>
+        <w:t>S</w:t>
+      </w:r>
+      <w:r>
+        <w:rPr>
+          <w:lang w:val="en-US"/>
+        </w:rPr>
+        <w:t>ea</w:t>
+      </w:r>
+      <w:r>
+        <w:rPr>
+          <w:lang w:val="en-US"/>
+        </w:rPr>
+        <w:t xml:space="preserve"> days for table H+I are calculated on line 343-344</w:t>
       </w:r>
     </w:p>
     <w:p>
@@ -1184,6 +1456,118 @@
     </w:lvl>
   </w:abstractNum>
   <w:abstractNum w:abstractNumId="6" w15:restartNumberingAfterBreak="0">
+    <w:nsid w:val="2A623D97"/>
+    <w:multiLevelType w:val="hybridMultilevel"/>
+    <w:tmpl w:val="236C2F34"/>
+    <w:lvl w:ilvl="0" w:tplc="988CB79A">
+      <w:numFmt w:val="bullet"/>
+      <w:lvlText w:val="-"/>
+      <w:lvlJc w:val="left"/>
+      <w:pPr>
+        <w:ind w:left="720" w:hanging="360"/>
+      </w:pPr>
+      <w:rPr>
+        <w:rFonts w:ascii="Aptos" w:eastAsiaTheme="minorHAnsi" w:hAnsi="Aptos" w:cstheme="minorBidi" w:hint="default"/>
+      </w:rPr>
+    </w:lvl>
+    <w:lvl w:ilvl="1" w:tplc="20000003">
+      <w:start w:val="1"/>
+      <w:numFmt w:val="bullet"/>
+      <w:lvlText w:val="o"/>
+      <w:lvlJc w:val="left"/>
+      <w:pPr>
+        <w:ind w:left="1440" w:hanging="360"/>
+      </w:pPr>
+      <w:rPr>
+        <w:rFonts w:ascii="Courier New" w:hAnsi="Courier New" w:cs="Courier New" w:hint="default"/>
+      </w:rPr>
+    </w:lvl>
+    <w:lvl w:ilvl="2" w:tplc="20000005" w:tentative="1">
+      <w:start w:val="1"/>
+      <w:numFmt w:val="bullet"/>
+      <w:lvlText w:val=""/>
+      <w:lvlJc w:val="left"/>
+      <w:pPr>
+        <w:ind w:left="2160" w:hanging="360"/>
+      </w:pPr>
+      <w:rPr>
+        <w:rFonts w:ascii="Wingdings" w:hAnsi="Wingdings" w:hint="default"/>
+      </w:rPr>
+    </w:lvl>
+    <w:lvl w:ilvl="3" w:tplc="20000001" w:tentative="1">
+      <w:start w:val="1"/>
+      <w:numFmt w:val="bullet"/>
+      <w:lvlText w:val=""/>
+      <w:lvlJc w:val="left"/>
+      <w:pPr>
+        <w:ind w:left="2880" w:hanging="360"/>
+      </w:pPr>
+      <w:rPr>
+        <w:rFonts w:ascii="Symbol" w:hAnsi="Symbol" w:hint="default"/>
+      </w:rPr>
+    </w:lvl>
+    <w:lvl w:ilvl="4" w:tplc="20000003" w:tentative="1">
+      <w:start w:val="1"/>
+      <w:numFmt w:val="bullet"/>
+      <w:lvlText w:val="o"/>
+      <w:lvlJc w:val="left"/>
+      <w:pPr>
+        <w:ind w:left="3600" w:hanging="360"/>
+      </w:pPr>
+      <w:rPr>
+        <w:rFonts w:ascii="Courier New" w:hAnsi="Courier New" w:cs="Courier New" w:hint="default"/>
+      </w:rPr>
+    </w:lvl>
+    <w:lvl w:ilvl="5" w:tplc="20000005" w:tentative="1">
+      <w:start w:val="1"/>
+      <w:numFmt w:val="bullet"/>
+      <w:lvlText w:val=""/>
+      <w:lvlJc w:val="left"/>
+      <w:pPr>
+        <w:ind w:left="4320" w:hanging="360"/>
+      </w:pPr>
+      <w:rPr>
+        <w:rFonts w:ascii="Wingdings" w:hAnsi="Wingdings" w:hint="default"/>
+      </w:rPr>
+    </w:lvl>
+    <w:lvl w:ilvl="6" w:tplc="20000001" w:tentative="1">
+      <w:start w:val="1"/>
+      <w:numFmt w:val="bullet"/>
+      <w:lvlText w:val=""/>
+      <w:lvlJc w:val="left"/>
+      <w:pPr>
+        <w:ind w:left="5040" w:hanging="360"/>
+      </w:pPr>
+      <w:rPr>
+        <w:rFonts w:ascii="Symbol" w:hAnsi="Symbol" w:hint="default"/>
+      </w:rPr>
+    </w:lvl>
+    <w:lvl w:ilvl="7" w:tplc="20000003" w:tentative="1">
+      <w:start w:val="1"/>
+      <w:numFmt w:val="bullet"/>
+      <w:lvlText w:val="o"/>
+      <w:lvlJc w:val="left"/>
+      <w:pPr>
+        <w:ind w:left="5760" w:hanging="360"/>
+      </w:pPr>
+      <w:rPr>
+        <w:rFonts w:ascii="Courier New" w:hAnsi="Courier New" w:cs="Courier New" w:hint="default"/>
+      </w:rPr>
+    </w:lvl>
+    <w:lvl w:ilvl="8" w:tplc="20000005" w:tentative="1">
+      <w:start w:val="1"/>
+      <w:numFmt w:val="bullet"/>
+      <w:lvlText w:val=""/>
+      <w:lvlJc w:val="left"/>
+      <w:pPr>
+        <w:ind w:left="6480" w:hanging="360"/>
+      </w:pPr>
+      <w:rPr>
+        <w:rFonts w:ascii="Wingdings" w:hAnsi="Wingdings" w:hint="default"/>
+      </w:rPr>
+    </w:lvl>
+  </w:abstractNum>
+  <w:abstractNum w:abstractNumId="7" w15:restartNumberingAfterBreak="0">
     <w:nsid w:val="308237DE"/>
     <w:multiLevelType w:val="hybridMultilevel"/>
     <w:tmpl w:val="E0942DCE"/>
@@ -1296,7 +1680,7 @@
       </w:rPr>
     </w:lvl>
   </w:abstractNum>
-  <w:abstractNum w:abstractNumId="7" w15:restartNumberingAfterBreak="0">
+  <w:abstractNum w:abstractNumId="8" w15:restartNumberingAfterBreak="0">
     <w:nsid w:val="3B3F2A02"/>
     <w:multiLevelType w:val="hybridMultilevel"/>
     <w:tmpl w:val="9BB62138"/>
@@ -1409,7 +1793,7 @@
       </w:rPr>
     </w:lvl>
   </w:abstractNum>
-  <w:abstractNum w:abstractNumId="8" w15:restartNumberingAfterBreak="0">
+  <w:abstractNum w:abstractNumId="9" w15:restartNumberingAfterBreak="0">
     <w:nsid w:val="47F96F2F"/>
     <w:multiLevelType w:val="hybridMultilevel"/>
     <w:tmpl w:val="7256ACFE"/>
@@ -1521,7 +1905,7 @@
       </w:rPr>
     </w:lvl>
   </w:abstractNum>
-  <w:abstractNum w:abstractNumId="9" w15:restartNumberingAfterBreak="0">
+  <w:abstractNum w:abstractNumId="10" w15:restartNumberingAfterBreak="0">
     <w:nsid w:val="5FC00F8A"/>
     <w:multiLevelType w:val="hybridMultilevel"/>
     <w:tmpl w:val="9D96EDD4"/>
@@ -1634,7 +2018,7 @@
       </w:rPr>
     </w:lvl>
   </w:abstractNum>
-  <w:abstractNum w:abstractNumId="10" w15:restartNumberingAfterBreak="0">
+  <w:abstractNum w:abstractNumId="11" w15:restartNumberingAfterBreak="0">
     <w:nsid w:val="65070E8D"/>
     <w:multiLevelType w:val="hybridMultilevel"/>
     <w:tmpl w:val="BDB6982A"/>
@@ -1747,7 +2131,7 @@
       </w:rPr>
     </w:lvl>
   </w:abstractNum>
-  <w:abstractNum w:abstractNumId="11" w15:restartNumberingAfterBreak="0">
+  <w:abstractNum w:abstractNumId="12" w15:restartNumberingAfterBreak="0">
     <w:nsid w:val="73B949D2"/>
     <w:multiLevelType w:val="hybridMultilevel"/>
     <w:tmpl w:val="28606D2A"/>
@@ -1866,7 +2250,7 @@
     <w:abstractNumId w:val="1"/>
   </w:num>
   <w:num w:numId="3" w16cid:durableId="1364742651">
-    <w:abstractNumId w:val="9"/>
+    <w:abstractNumId w:val="10"/>
   </w:num>
   <w:num w:numId="4" w16cid:durableId="302855184">
     <w:abstractNumId w:val="4"/>
@@ -1878,22 +2262,25 @@
     <w:abstractNumId w:val="5"/>
   </w:num>
   <w:num w:numId="7" w16cid:durableId="276644472">
-    <w:abstractNumId w:val="6"/>
+    <w:abstractNumId w:val="7"/>
   </w:num>
   <w:num w:numId="8" w16cid:durableId="836699043">
-    <w:abstractNumId w:val="7"/>
+    <w:abstractNumId w:val="8"/>
   </w:num>
   <w:num w:numId="9" w16cid:durableId="536427938">
     <w:abstractNumId w:val="2"/>
   </w:num>
   <w:num w:numId="10" w16cid:durableId="1761370988">
-    <w:abstractNumId w:val="10"/>
+    <w:abstractNumId w:val="11"/>
   </w:num>
   <w:num w:numId="11" w16cid:durableId="1499495752">
-    <w:abstractNumId w:val="8"/>
+    <w:abstractNumId w:val="9"/>
   </w:num>
   <w:num w:numId="12" w16cid:durableId="1412316134">
-    <w:abstractNumId w:val="11"/>
+    <w:abstractNumId w:val="12"/>
+  </w:num>
+  <w:num w:numId="13" w16cid:durableId="1350258004">
+    <w:abstractNumId w:val="6"/>
   </w:num>
 </w:numbering>
 </file>

</xml_diff>

<commit_message>
include table d comment
</commit_message>
<xml_diff>
--- a/documents/2026/FDI_TO_DO.docx
+++ b/documents/2026/FDI_TO_DO.docx
@@ -195,7 +195,43 @@
         <w:rPr>
           <w:lang w:val="en-US"/>
         </w:rPr>
-        <w:t>Table c Rmd preparation</w:t>
+        <w:t xml:space="preserve">Table </w:t>
+      </w:r>
+      <w:r>
+        <w:rPr>
+          <w:lang w:val="en-US"/>
+        </w:rPr>
+        <w:t>d</w:t>
+      </w:r>
+      <w:r>
+        <w:rPr>
+          <w:lang w:val="en-US"/>
+        </w:rPr>
+        <w:t xml:space="preserve"> Rmd preparation</w:t>
+      </w:r>
+      <w:r>
+        <w:rPr>
+          <w:lang w:val="en-US"/>
+        </w:rPr>
+        <w:t xml:space="preserve"> and test run</w:t>
+      </w:r>
+    </w:p>
+    <w:p>
+      <w:pPr>
+        <w:pStyle w:val="ListParagraph"/>
+        <w:numPr>
+          <w:ilvl w:val="1"/>
+          <w:numId w:val="13"/>
+        </w:numPr>
+        <w:rPr>
+          <w:lang w:val="en-US"/>
+        </w:rPr>
+      </w:pPr>
+      <w:r>
+        <w:rPr>
+          <w:lang w:val="en-US"/>
+        </w:rPr>
+        <w:t>Also dependent on table a</w:t>
       </w:r>
     </w:p>
     <w:p>

</xml_diff>

<commit_message>
comment for table e
</commit_message>
<xml_diff>
--- a/documents/2026/FDI_TO_DO.docx
+++ b/documents/2026/FDI_TO_DO.docx
@@ -99,8 +99,16 @@
         <w:rPr>
           <w:lang w:val="en-US"/>
         </w:rPr>
-        <w:t xml:space="preserve"> Rmd</w:t>
-      </w:r>
+        <w:t xml:space="preserve"> </w:t>
+      </w:r>
+      <w:proofErr w:type="spellStart"/>
+      <w:r>
+        <w:rPr>
+          <w:lang w:val="en-US"/>
+        </w:rPr>
+        <w:t>Rmd</w:t>
+      </w:r>
+      <w:proofErr w:type="spellEnd"/>
     </w:p>
     <w:p>
       <w:pPr>
@@ -135,7 +143,21 @@
         <w:rPr>
           <w:lang w:val="en-US"/>
         </w:rPr>
-        <w:t>new mongo implementation of Suomu cloud data</w:t>
+        <w:t xml:space="preserve">new mongo implementation of </w:t>
+      </w:r>
+      <w:proofErr w:type="spellStart"/>
+      <w:r>
+        <w:rPr>
+          <w:lang w:val="en-US"/>
+        </w:rPr>
+        <w:t>Suomu</w:t>
+      </w:r>
+      <w:proofErr w:type="spellEnd"/>
+      <w:r>
+        <w:rPr>
+          <w:lang w:val="en-US"/>
+        </w:rPr>
+        <w:t xml:space="preserve"> cloud data</w:t>
       </w:r>
     </w:p>
     <w:p>
@@ -146,7 +168,7 @@
           <w:numId w:val="13"/>
         </w:numPr>
         <w:rPr>
-          <w:lang w:val="en-US"/>
+          <w:lang w:val="en-FI"/>
         </w:rPr>
       </w:pPr>
       <w:r>
@@ -159,7 +181,40 @@
         <w:rPr>
           <w:lang w:val="en-US"/>
         </w:rPr>
-        <w:t xml:space="preserve"> Rmd prepared and test run</w:t>
+        <w:t xml:space="preserve"> </w:t>
+      </w:r>
+      <w:proofErr w:type="spellStart"/>
+      <w:r>
+        <w:rPr>
+          <w:lang w:val="en-US"/>
+        </w:rPr>
+        <w:t>Rmd</w:t>
+      </w:r>
+      <w:proofErr w:type="spellEnd"/>
+      <w:r>
+        <w:rPr>
+          <w:lang w:val="en-US"/>
+        </w:rPr>
+        <w:t xml:space="preserve"> prepared and test run</w:t>
+      </w:r>
+      <w:r>
+        <w:rPr>
+          <w:lang w:val="en-US"/>
+        </w:rPr>
+        <w:t xml:space="preserve"> </w:t>
+      </w:r>
+      <w:r>
+        <w:rPr>
+          <w:rFonts w:ascii="Segoe UI Emoji" w:hAnsi="Segoe UI Emoji" w:cs="Segoe UI Emoji"/>
+          <w:lang w:val="en-FI"/>
+        </w:rPr>
+        <w:t>✅</w:t>
+      </w:r>
+      <w:r>
+        <w:rPr>
+          <w:lang w:val="en-FI"/>
+        </w:rPr>
+        <w:t xml:space="preserve"> </w:t>
       </w:r>
     </w:p>
     <w:p>
@@ -188,7 +243,7 @@
           <w:numId w:val="13"/>
         </w:numPr>
         <w:rPr>
-          <w:lang w:val="en-US"/>
+          <w:lang w:val="en-FI"/>
         </w:rPr>
       </w:pPr>
       <w:r>
@@ -207,13 +262,46 @@
         <w:rPr>
           <w:lang w:val="en-US"/>
         </w:rPr>
-        <w:t xml:space="preserve"> Rmd preparation</w:t>
+        <w:t xml:space="preserve"> </w:t>
+      </w:r>
+      <w:proofErr w:type="spellStart"/>
+      <w:r>
+        <w:rPr>
+          <w:lang w:val="en-US"/>
+        </w:rPr>
+        <w:t>Rmd</w:t>
+      </w:r>
+      <w:proofErr w:type="spellEnd"/>
+      <w:r>
+        <w:rPr>
+          <w:lang w:val="en-US"/>
+        </w:rPr>
+        <w:t xml:space="preserve"> preparation</w:t>
       </w:r>
       <w:r>
         <w:rPr>
           <w:lang w:val="en-US"/>
         </w:rPr>
         <w:t xml:space="preserve"> and test run</w:t>
+      </w:r>
+      <w:r>
+        <w:rPr>
+          <w:lang w:val="en-US"/>
+        </w:rPr>
+        <w:t xml:space="preserve"> </w:t>
+      </w:r>
+      <w:r>
+        <w:rPr>
+          <w:rFonts w:ascii="Segoe UI Emoji" w:hAnsi="Segoe UI Emoji" w:cs="Segoe UI Emoji"/>
+          <w:lang w:val="en-FI"/>
+        </w:rPr>
+        <w:t>✅</w:t>
+      </w:r>
+      <w:r>
+        <w:rPr>
+          <w:lang w:val="en-FI"/>
+        </w:rPr>
+        <w:t xml:space="preserve"> </w:t>
       </w:r>
     </w:p>
     <w:p>
@@ -236,48 +324,6 @@
     </w:p>
     <w:p>
       <w:pPr>
-        <w:rPr>
-          <w:b/>
-          <w:bCs/>
-          <w:lang w:val="en-US"/>
-        </w:rPr>
-      </w:pPr>
-    </w:p>
-    <w:p>
-      <w:pPr>
-        <w:rPr>
-          <w:b/>
-          <w:bCs/>
-          <w:lang w:val="en-US"/>
-        </w:rPr>
-      </w:pPr>
-      <w:r>
-        <w:rPr>
-          <w:b/>
-          <w:bCs/>
-          <w:lang w:val="en-US"/>
-        </w:rPr>
-        <w:t>Meeting 2</w:t>
-      </w:r>
-      <w:r>
-        <w:rPr>
-          <w:b/>
-          <w:bCs/>
-          <w:lang w:val="en-US"/>
-        </w:rPr>
-        <w:t>0</w:t>
-      </w:r>
-      <w:r>
-        <w:rPr>
-          <w:b/>
-          <w:bCs/>
-          <w:lang w:val="en-US"/>
-        </w:rPr>
-        <w:t>/05/2026</w:t>
-      </w:r>
-    </w:p>
-    <w:p>
-      <w:pPr>
         <w:pStyle w:val="ListParagraph"/>
         <w:numPr>
           <w:ilvl w:val="0"/>
@@ -291,13 +337,137 @@
         <w:rPr>
           <w:lang w:val="en-US"/>
         </w:rPr>
-        <w:t>Fixing meti</w:t>
-      </w:r>
-      <w:r>
-        <w:rPr>
-          <w:lang w:val="en-US"/>
-        </w:rPr>
-        <w:t>ers in table a-j script</w:t>
+        <w:t xml:space="preserve">Table e </w:t>
+      </w:r>
+      <w:proofErr w:type="spellStart"/>
+      <w:r>
+        <w:rPr>
+          <w:lang w:val="en-US"/>
+        </w:rPr>
+        <w:t>Rmd</w:t>
+      </w:r>
+      <w:proofErr w:type="spellEnd"/>
+      <w:r>
+        <w:rPr>
+          <w:lang w:val="en-US"/>
+        </w:rPr>
+        <w:t xml:space="preserve"> preparation</w:t>
+      </w:r>
+    </w:p>
+    <w:p>
+      <w:pPr>
+        <w:pStyle w:val="ListParagraph"/>
+        <w:numPr>
+          <w:ilvl w:val="1"/>
+          <w:numId w:val="13"/>
+        </w:numPr>
+        <w:rPr>
+          <w:lang w:val="en-US"/>
+        </w:rPr>
+      </w:pPr>
+      <w:r>
+        <w:rPr>
+          <w:lang w:val="en-US"/>
+        </w:rPr>
+        <w:t>Also dependent on table a</w:t>
+      </w:r>
+    </w:p>
+    <w:p>
+      <w:pPr>
+        <w:pStyle w:val="ListParagraph"/>
+        <w:numPr>
+          <w:ilvl w:val="1"/>
+          <w:numId w:val="13"/>
+        </w:numPr>
+        <w:rPr>
+          <w:lang w:val="en-US"/>
+        </w:rPr>
+      </w:pPr>
+      <w:r>
+        <w:rPr>
+          <w:lang w:val="en-US"/>
+        </w:rPr>
+        <w:t>Do we need a new version of the IC data?</w:t>
+      </w:r>
+      <w:r>
+        <w:rPr>
+          <w:lang w:val="en-US"/>
+        </w:rPr>
+        <w:t xml:space="preserve"> I don’t seem to have that data at all</w:t>
+      </w:r>
+    </w:p>
+    <w:p>
+      <w:pPr>
+        <w:pStyle w:val="ListParagraph"/>
+        <w:numPr>
+          <w:ilvl w:val="1"/>
+          <w:numId w:val="13"/>
+        </w:numPr>
+        <w:rPr>
+          <w:lang w:val="en-US"/>
+        </w:rPr>
+      </w:pPr>
+      <w:r>
+        <w:rPr>
+          <w:lang w:val="en-US"/>
+        </w:rPr>
+        <w:t xml:space="preserve">Needs new </w:t>
+      </w:r>
+      <w:proofErr w:type="spellStart"/>
+      <w:r>
+        <w:rPr>
+          <w:lang w:val="en-US"/>
+        </w:rPr>
+        <w:t>Suomu</w:t>
+      </w:r>
+      <w:proofErr w:type="spellEnd"/>
+      <w:r>
+        <w:rPr>
+          <w:lang w:val="en-US"/>
+        </w:rPr>
+        <w:t xml:space="preserve"> cloud implementation</w:t>
+      </w:r>
+    </w:p>
+    <w:p>
+      <w:pPr>
+        <w:rPr>
+          <w:b/>
+          <w:bCs/>
+          <w:lang w:val="en-US"/>
+        </w:rPr>
+      </w:pPr>
+    </w:p>
+    <w:p>
+      <w:pPr>
+        <w:rPr>
+          <w:b/>
+          <w:bCs/>
+          <w:lang w:val="en-US"/>
+        </w:rPr>
+      </w:pPr>
+      <w:r>
+        <w:rPr>
+          <w:b/>
+          <w:bCs/>
+          <w:lang w:val="en-US"/>
+        </w:rPr>
+        <w:t>Meeting 2</w:t>
+      </w:r>
+      <w:r>
+        <w:rPr>
+          <w:b/>
+          <w:bCs/>
+          <w:lang w:val="en-US"/>
+        </w:rPr>
+        <w:t>0</w:t>
+      </w:r>
+      <w:r>
+        <w:rPr>
+          <w:b/>
+          <w:bCs/>
+          <w:lang w:val="en-US"/>
+        </w:rPr>
+        <w:t>/05/2026</w:t>
       </w:r>
     </w:p>
     <w:p>
@@ -315,7 +485,27 @@
         <w:rPr>
           <w:lang w:val="en-US"/>
         </w:rPr>
-        <w:t>Rmd now running</w:t>
+        <w:t xml:space="preserve">Fixing </w:t>
+      </w:r>
+      <w:proofErr w:type="spellStart"/>
+      <w:r>
+        <w:rPr>
+          <w:lang w:val="en-US"/>
+        </w:rPr>
+        <w:t>meti</w:t>
+      </w:r>
+      <w:r>
+        <w:rPr>
+          <w:lang w:val="en-US"/>
+        </w:rPr>
+        <w:t>ers</w:t>
+      </w:r>
+      <w:proofErr w:type="spellEnd"/>
+      <w:r>
+        <w:rPr>
+          <w:lang w:val="en-US"/>
+        </w:rPr>
+        <w:t xml:space="preserve"> in table a-j script</w:t>
       </w:r>
     </w:p>
     <w:p>
@@ -329,6 +519,32 @@
           <w:lang w:val="en-US"/>
         </w:rPr>
       </w:pPr>
+      <w:proofErr w:type="spellStart"/>
+      <w:r>
+        <w:rPr>
+          <w:lang w:val="en-US"/>
+        </w:rPr>
+        <w:t>Rmd</w:t>
+      </w:r>
+      <w:proofErr w:type="spellEnd"/>
+      <w:r>
+        <w:rPr>
+          <w:lang w:val="en-US"/>
+        </w:rPr>
+        <w:t xml:space="preserve"> now running</w:t>
+      </w:r>
+    </w:p>
+    <w:p>
+      <w:pPr>
+        <w:pStyle w:val="ListParagraph"/>
+        <w:numPr>
+          <w:ilvl w:val="0"/>
+          <w:numId w:val="13"/>
+        </w:numPr>
+        <w:rPr>
+          <w:lang w:val="en-US"/>
+        </w:rPr>
+      </w:pPr>
       <w:r>
         <w:rPr>
           <w:lang w:val="en-US"/>
@@ -401,11 +617,19 @@
           <w:lang w:val="en-US"/>
         </w:rPr>
       </w:pPr>
-      <w:r>
-        <w:rPr>
-          <w:lang w:val="en-US"/>
-        </w:rPr>
-        <w:t>LukeTools (testing)</w:t>
+      <w:proofErr w:type="spellStart"/>
+      <w:r>
+        <w:rPr>
+          <w:lang w:val="en-US"/>
+        </w:rPr>
+        <w:t>LukeTools</w:t>
+      </w:r>
+      <w:proofErr w:type="spellEnd"/>
+      <w:r>
+        <w:rPr>
+          <w:lang w:val="en-US"/>
+        </w:rPr>
+        <w:t xml:space="preserve"> (testing)</w:t>
       </w:r>
       <w:r>
         <w:rPr>
@@ -447,7 +671,21 @@
         <w:rPr>
           <w:lang w:val="en-US"/>
         </w:rPr>
-        <w:t>Replace scripts with Rmd files</w:t>
+        <w:t xml:space="preserve">Replace scripts with </w:t>
+      </w:r>
+      <w:proofErr w:type="spellStart"/>
+      <w:r>
+        <w:rPr>
+          <w:lang w:val="en-US"/>
+        </w:rPr>
+        <w:t>Rmd</w:t>
+      </w:r>
+      <w:proofErr w:type="spellEnd"/>
+      <w:r>
+        <w:rPr>
+          <w:lang w:val="en-US"/>
+        </w:rPr>
+        <w:t xml:space="preserve"> files</w:t>
       </w:r>
     </w:p>
     <w:p>
@@ -501,8 +739,30 @@
         <w:rPr>
           <w:lang w:val="en-US"/>
         </w:rPr>
-        <w:t>Change the metier lookup from github</w:t>
-      </w:r>
+        <w:t xml:space="preserve">Change the </w:t>
+      </w:r>
+      <w:proofErr w:type="spellStart"/>
+      <w:r>
+        <w:rPr>
+          <w:lang w:val="en-US"/>
+        </w:rPr>
+        <w:t>metier</w:t>
+      </w:r>
+      <w:proofErr w:type="spellEnd"/>
+      <w:r>
+        <w:rPr>
+          <w:lang w:val="en-US"/>
+        </w:rPr>
+        <w:t xml:space="preserve"> lookup from </w:t>
+      </w:r>
+      <w:proofErr w:type="spellStart"/>
+      <w:r>
+        <w:rPr>
+          <w:lang w:val="en-US"/>
+        </w:rPr>
+        <w:t>github</w:t>
+      </w:r>
+      <w:proofErr w:type="spellEnd"/>
     </w:p>
     <w:p>
       <w:pPr>
@@ -519,7 +779,21 @@
         <w:rPr>
           <w:lang w:val="en-US"/>
         </w:rPr>
-        <w:t>Save sas logbook from database and import from database</w:t>
+        <w:t xml:space="preserve">Save </w:t>
+      </w:r>
+      <w:proofErr w:type="spellStart"/>
+      <w:r>
+        <w:rPr>
+          <w:lang w:val="en-US"/>
+        </w:rPr>
+        <w:t>sas</w:t>
+      </w:r>
+      <w:proofErr w:type="spellEnd"/>
+      <w:r>
+        <w:rPr>
+          <w:lang w:val="en-US"/>
+        </w:rPr>
+        <w:t xml:space="preserve"> logbook from database and import from database</w:t>
       </w:r>
     </w:p>
     <w:p>
@@ -573,7 +847,21 @@
         <w:rPr>
           <w:lang w:val="en-US"/>
         </w:rPr>
-        <w:t>Create first Rmd version</w:t>
+        <w:t xml:space="preserve">Create first </w:t>
+      </w:r>
+      <w:proofErr w:type="spellStart"/>
+      <w:r>
+        <w:rPr>
+          <w:lang w:val="en-US"/>
+        </w:rPr>
+        <w:t>Rmd</w:t>
+      </w:r>
+      <w:proofErr w:type="spellEnd"/>
+      <w:r>
+        <w:rPr>
+          <w:lang w:val="en-US"/>
+        </w:rPr>
+        <w:t xml:space="preserve"> version</w:t>
       </w:r>
     </w:p>
     <w:p>
@@ -613,7 +901,21 @@
         <w:rPr>
           <w:lang w:val="en-US"/>
         </w:rPr>
-        <w:t>A fishing trip is approximated by reported fishing days, aggregated from monthly reports by taking the maximum number of fishing days per vessel–month–metier combination and summing these over time and vessels.</w:t>
+        <w:t>A fishing trip is approximated by reported fishing days, aggregated from monthly reports by taking the maximum number of fishing days per vessel–month–</w:t>
+      </w:r>
+      <w:proofErr w:type="spellStart"/>
+      <w:r>
+        <w:rPr>
+          <w:lang w:val="en-US"/>
+        </w:rPr>
+        <w:t>metier</w:t>
+      </w:r>
+      <w:proofErr w:type="spellEnd"/>
+      <w:r>
+        <w:rPr>
+          <w:lang w:val="en-US"/>
+        </w:rPr>
+        <w:t xml:space="preserve"> combination and summing these over time and vessels.</w:t>
       </w:r>
     </w:p>
     <w:p>
@@ -626,6 +928,7 @@
         <w:rPr>
           <w:lang w:val="en-US"/>
         </w:rPr>
+        <w:lastRenderedPageBreak/>
         <w:t xml:space="preserve">              </w:t>
       </w:r>
       <w:r>
@@ -2831,7 +3134,6 @@
   <w:style w:type="character" w:default="1" w:styleId="DefaultParagraphFont">
     <w:name w:val="Default Paragraph Font"/>
     <w:uiPriority w:val="1"/>
-    <w:semiHidden/>
     <w:unhideWhenUsed/>
   </w:style>
   <w:style w:type="table" w:default="1" w:styleId="TableNormal">

</xml_diff>

<commit_message>
added comments about table f
</commit_message>
<xml_diff>
--- a/documents/2026/FDI_TO_DO.docx
+++ b/documents/2026/FDI_TO_DO.docx
@@ -99,16 +99,8 @@
         <w:rPr>
           <w:lang w:val="en-US"/>
         </w:rPr>
-        <w:t xml:space="preserve"> </w:t>
-      </w:r>
-      <w:proofErr w:type="spellStart"/>
-      <w:r>
-        <w:rPr>
-          <w:lang w:val="en-US"/>
-        </w:rPr>
-        <w:t>Rmd</w:t>
-      </w:r>
-      <w:proofErr w:type="spellEnd"/>
+        <w:t xml:space="preserve"> Rmd</w:t>
+      </w:r>
     </w:p>
     <w:p>
       <w:pPr>
@@ -143,21 +135,7 @@
         <w:rPr>
           <w:lang w:val="en-US"/>
         </w:rPr>
-        <w:t xml:space="preserve">new mongo implementation of </w:t>
-      </w:r>
-      <w:proofErr w:type="spellStart"/>
-      <w:r>
-        <w:rPr>
-          <w:lang w:val="en-US"/>
-        </w:rPr>
-        <w:t>Suomu</w:t>
-      </w:r>
-      <w:proofErr w:type="spellEnd"/>
-      <w:r>
-        <w:rPr>
-          <w:lang w:val="en-US"/>
-        </w:rPr>
-        <w:t xml:space="preserve"> cloud data</w:t>
+        <w:t>new mongo implementation of Suomu cloud data</w:t>
       </w:r>
     </w:p>
     <w:p>
@@ -181,21 +159,7 @@
         <w:rPr>
           <w:lang w:val="en-US"/>
         </w:rPr>
-        <w:t xml:space="preserve"> </w:t>
-      </w:r>
-      <w:proofErr w:type="spellStart"/>
-      <w:r>
-        <w:rPr>
-          <w:lang w:val="en-US"/>
-        </w:rPr>
-        <w:t>Rmd</w:t>
-      </w:r>
-      <w:proofErr w:type="spellEnd"/>
-      <w:r>
-        <w:rPr>
-          <w:lang w:val="en-US"/>
-        </w:rPr>
-        <w:t xml:space="preserve"> prepared and test run</w:t>
+        <w:t xml:space="preserve"> Rmd prepared and test run</w:t>
       </w:r>
       <w:r>
         <w:rPr>
@@ -262,21 +226,7 @@
         <w:rPr>
           <w:lang w:val="en-US"/>
         </w:rPr>
-        <w:t xml:space="preserve"> </w:t>
-      </w:r>
-      <w:proofErr w:type="spellStart"/>
-      <w:r>
-        <w:rPr>
-          <w:lang w:val="en-US"/>
-        </w:rPr>
-        <w:t>Rmd</w:t>
-      </w:r>
-      <w:proofErr w:type="spellEnd"/>
-      <w:r>
-        <w:rPr>
-          <w:lang w:val="en-US"/>
-        </w:rPr>
-        <w:t xml:space="preserve"> preparation</w:t>
+        <w:t xml:space="preserve"> Rmd preparation</w:t>
       </w:r>
       <w:r>
         <w:rPr>
@@ -337,21 +287,7 @@
         <w:rPr>
           <w:lang w:val="en-US"/>
         </w:rPr>
-        <w:t xml:space="preserve">Table e </w:t>
-      </w:r>
-      <w:proofErr w:type="spellStart"/>
-      <w:r>
-        <w:rPr>
-          <w:lang w:val="en-US"/>
-        </w:rPr>
-        <w:t>Rmd</w:t>
-      </w:r>
-      <w:proofErr w:type="spellEnd"/>
-      <w:r>
-        <w:rPr>
-          <w:lang w:val="en-US"/>
-        </w:rPr>
-        <w:t xml:space="preserve"> preparation</w:t>
+        <w:t>Table e Rmd preparation</w:t>
       </w:r>
     </w:p>
     <w:p>
@@ -411,63 +347,7 @@
         <w:rPr>
           <w:lang w:val="en-US"/>
         </w:rPr>
-        <w:t xml:space="preserve">Needs new </w:t>
-      </w:r>
-      <w:proofErr w:type="spellStart"/>
-      <w:r>
-        <w:rPr>
-          <w:lang w:val="en-US"/>
-        </w:rPr>
-        <w:t>Suomu</w:t>
-      </w:r>
-      <w:proofErr w:type="spellEnd"/>
-      <w:r>
-        <w:rPr>
-          <w:lang w:val="en-US"/>
-        </w:rPr>
-        <w:t xml:space="preserve"> cloud implementation</w:t>
-      </w:r>
-    </w:p>
-    <w:p>
-      <w:pPr>
-        <w:rPr>
-          <w:b/>
-          <w:bCs/>
-          <w:lang w:val="en-US"/>
-        </w:rPr>
-      </w:pPr>
-    </w:p>
-    <w:p>
-      <w:pPr>
-        <w:rPr>
-          <w:b/>
-          <w:bCs/>
-          <w:lang w:val="en-US"/>
-        </w:rPr>
-      </w:pPr>
-      <w:r>
-        <w:rPr>
-          <w:b/>
-          <w:bCs/>
-          <w:lang w:val="en-US"/>
-        </w:rPr>
-        <w:t>Meeting 2</w:t>
-      </w:r>
-      <w:r>
-        <w:rPr>
-          <w:b/>
-          <w:bCs/>
-          <w:lang w:val="en-US"/>
-        </w:rPr>
-        <w:t>0</w:t>
-      </w:r>
-      <w:r>
-        <w:rPr>
-          <w:b/>
-          <w:bCs/>
-          <w:lang w:val="en-US"/>
-        </w:rPr>
-        <w:t>/05/2026</w:t>
+        <w:t>Needs new Suomu cloud implementation</w:t>
       </w:r>
     </w:p>
     <w:p>
@@ -485,27 +365,85 @@
         <w:rPr>
           <w:lang w:val="en-US"/>
         </w:rPr>
-        <w:t xml:space="preserve">Fixing </w:t>
-      </w:r>
-      <w:proofErr w:type="spellStart"/>
-      <w:r>
-        <w:rPr>
-          <w:lang w:val="en-US"/>
-        </w:rPr>
-        <w:t>meti</w:t>
-      </w:r>
-      <w:r>
-        <w:rPr>
-          <w:lang w:val="en-US"/>
-        </w:rPr>
-        <w:t>ers</w:t>
-      </w:r>
-      <w:proofErr w:type="spellEnd"/>
-      <w:r>
-        <w:rPr>
-          <w:lang w:val="en-US"/>
-        </w:rPr>
-        <w:t xml:space="preserve"> in table a-j script</w:t>
+        <w:t>Table f Rmd preparation</w:t>
+      </w:r>
+    </w:p>
+    <w:p>
+      <w:pPr>
+        <w:pStyle w:val="ListParagraph"/>
+        <w:numPr>
+          <w:ilvl w:val="1"/>
+          <w:numId w:val="13"/>
+        </w:numPr>
+        <w:rPr>
+          <w:lang w:val="en-US"/>
+        </w:rPr>
+      </w:pPr>
+      <w:r>
+        <w:rPr>
+          <w:lang w:val="en-US"/>
+        </w:rPr>
+        <w:t>Also dependent on table a</w:t>
+      </w:r>
+    </w:p>
+    <w:p>
+      <w:pPr>
+        <w:pStyle w:val="ListParagraph"/>
+        <w:numPr>
+          <w:ilvl w:val="1"/>
+          <w:numId w:val="13"/>
+        </w:numPr>
+        <w:rPr>
+          <w:lang w:val="en-US"/>
+        </w:rPr>
+      </w:pPr>
+      <w:r>
+        <w:rPr>
+          <w:lang w:val="en-US"/>
+        </w:rPr>
+        <w:t>Needs new Suomu cloud implementation</w:t>
+      </w:r>
+    </w:p>
+    <w:p>
+      <w:pPr>
+        <w:rPr>
+          <w:b/>
+          <w:bCs/>
+          <w:lang w:val="en-US"/>
+        </w:rPr>
+      </w:pPr>
+    </w:p>
+    <w:p>
+      <w:pPr>
+        <w:rPr>
+          <w:b/>
+          <w:bCs/>
+          <w:lang w:val="en-US"/>
+        </w:rPr>
+      </w:pPr>
+      <w:r>
+        <w:rPr>
+          <w:b/>
+          <w:bCs/>
+          <w:lang w:val="en-US"/>
+        </w:rPr>
+        <w:t>Meeting 2</w:t>
+      </w:r>
+      <w:r>
+        <w:rPr>
+          <w:b/>
+          <w:bCs/>
+          <w:lang w:val="en-US"/>
+        </w:rPr>
+        <w:t>0</w:t>
+      </w:r>
+      <w:r>
+        <w:rPr>
+          <w:b/>
+          <w:bCs/>
+          <w:lang w:val="en-US"/>
+        </w:rPr>
+        <w:t>/05/2026</w:t>
       </w:r>
     </w:p>
     <w:p>
@@ -519,19 +457,17 @@
           <w:lang w:val="en-US"/>
         </w:rPr>
       </w:pPr>
-      <w:proofErr w:type="spellStart"/>
-      <w:r>
-        <w:rPr>
-          <w:lang w:val="en-US"/>
-        </w:rPr>
-        <w:t>Rmd</w:t>
-      </w:r>
-      <w:proofErr w:type="spellEnd"/>
-      <w:r>
-        <w:rPr>
-          <w:lang w:val="en-US"/>
-        </w:rPr>
-        <w:t xml:space="preserve"> now running</w:t>
+      <w:r>
+        <w:rPr>
+          <w:lang w:val="en-US"/>
+        </w:rPr>
+        <w:t>Fixing meti</w:t>
+      </w:r>
+      <w:r>
+        <w:rPr>
+          <w:lang w:val="en-US"/>
+        </w:rPr>
+        <w:t>ers in table a-j script</w:t>
       </w:r>
     </w:p>
     <w:p>
@@ -549,6 +485,24 @@
         <w:rPr>
           <w:lang w:val="en-US"/>
         </w:rPr>
+        <w:t>Rmd now running</w:t>
+      </w:r>
+    </w:p>
+    <w:p>
+      <w:pPr>
+        <w:pStyle w:val="ListParagraph"/>
+        <w:numPr>
+          <w:ilvl w:val="0"/>
+          <w:numId w:val="13"/>
+        </w:numPr>
+        <w:rPr>
+          <w:lang w:val="en-US"/>
+        </w:rPr>
+      </w:pPr>
+      <w:r>
+        <w:rPr>
+          <w:lang w:val="en-US"/>
+        </w:rPr>
         <w:t>S</w:t>
       </w:r>
       <w:r>
@@ -617,19 +571,11 @@
           <w:lang w:val="en-US"/>
         </w:rPr>
       </w:pPr>
-      <w:proofErr w:type="spellStart"/>
-      <w:r>
-        <w:rPr>
-          <w:lang w:val="en-US"/>
-        </w:rPr>
-        <w:t>LukeTools</w:t>
-      </w:r>
-      <w:proofErr w:type="spellEnd"/>
-      <w:r>
-        <w:rPr>
-          <w:lang w:val="en-US"/>
-        </w:rPr>
-        <w:t xml:space="preserve"> (testing)</w:t>
+      <w:r>
+        <w:rPr>
+          <w:lang w:val="en-US"/>
+        </w:rPr>
+        <w:t>LukeTools (testing)</w:t>
       </w:r>
       <w:r>
         <w:rPr>
@@ -671,21 +617,7 @@
         <w:rPr>
           <w:lang w:val="en-US"/>
         </w:rPr>
-        <w:t xml:space="preserve">Replace scripts with </w:t>
-      </w:r>
-      <w:proofErr w:type="spellStart"/>
-      <w:r>
-        <w:rPr>
-          <w:lang w:val="en-US"/>
-        </w:rPr>
-        <w:t>Rmd</w:t>
-      </w:r>
-      <w:proofErr w:type="spellEnd"/>
-      <w:r>
-        <w:rPr>
-          <w:lang w:val="en-US"/>
-        </w:rPr>
-        <w:t xml:space="preserve"> files</w:t>
+        <w:t>Replace scripts with Rmd files</w:t>
       </w:r>
     </w:p>
     <w:p>
@@ -739,30 +671,8 @@
         <w:rPr>
           <w:lang w:val="en-US"/>
         </w:rPr>
-        <w:t xml:space="preserve">Change the </w:t>
-      </w:r>
-      <w:proofErr w:type="spellStart"/>
-      <w:r>
-        <w:rPr>
-          <w:lang w:val="en-US"/>
-        </w:rPr>
-        <w:t>metier</w:t>
-      </w:r>
-      <w:proofErr w:type="spellEnd"/>
-      <w:r>
-        <w:rPr>
-          <w:lang w:val="en-US"/>
-        </w:rPr>
-        <w:t xml:space="preserve"> lookup from </w:t>
-      </w:r>
-      <w:proofErr w:type="spellStart"/>
-      <w:r>
-        <w:rPr>
-          <w:lang w:val="en-US"/>
-        </w:rPr>
-        <w:t>github</w:t>
-      </w:r>
-      <w:proofErr w:type="spellEnd"/>
+        <w:t>Change the metier lookup from github</w:t>
+      </w:r>
     </w:p>
     <w:p>
       <w:pPr>
@@ -779,21 +689,7 @@
         <w:rPr>
           <w:lang w:val="en-US"/>
         </w:rPr>
-        <w:t xml:space="preserve">Save </w:t>
-      </w:r>
-      <w:proofErr w:type="spellStart"/>
-      <w:r>
-        <w:rPr>
-          <w:lang w:val="en-US"/>
-        </w:rPr>
-        <w:t>sas</w:t>
-      </w:r>
-      <w:proofErr w:type="spellEnd"/>
-      <w:r>
-        <w:rPr>
-          <w:lang w:val="en-US"/>
-        </w:rPr>
-        <w:t xml:space="preserve"> logbook from database and import from database</w:t>
+        <w:t>Save sas logbook from database and import from database</w:t>
       </w:r>
     </w:p>
     <w:p>
@@ -847,21 +743,7 @@
         <w:rPr>
           <w:lang w:val="en-US"/>
         </w:rPr>
-        <w:t xml:space="preserve">Create first </w:t>
-      </w:r>
-      <w:proofErr w:type="spellStart"/>
-      <w:r>
-        <w:rPr>
-          <w:lang w:val="en-US"/>
-        </w:rPr>
-        <w:t>Rmd</w:t>
-      </w:r>
-      <w:proofErr w:type="spellEnd"/>
-      <w:r>
-        <w:rPr>
-          <w:lang w:val="en-US"/>
-        </w:rPr>
-        <w:t xml:space="preserve"> version</w:t>
+        <w:t>Create first Rmd version</w:t>
       </w:r>
     </w:p>
     <w:p>
@@ -901,21 +783,8 @@
         <w:rPr>
           <w:lang w:val="en-US"/>
         </w:rPr>
-        <w:t>A fishing trip is approximated by reported fishing days, aggregated from monthly reports by taking the maximum number of fishing days per vessel–month–</w:t>
-      </w:r>
-      <w:proofErr w:type="spellStart"/>
-      <w:r>
-        <w:rPr>
-          <w:lang w:val="en-US"/>
-        </w:rPr>
-        <w:t>metier</w:t>
-      </w:r>
-      <w:proofErr w:type="spellEnd"/>
-      <w:r>
-        <w:rPr>
-          <w:lang w:val="en-US"/>
-        </w:rPr>
-        <w:t xml:space="preserve"> combination and summing these over time and vessels.</w:t>
+        <w:lastRenderedPageBreak/>
+        <w:t>A fishing trip is approximated by reported fishing days, aggregated from monthly reports by taking the maximum number of fishing days per vessel–month–metier combination and summing these over time and vessels.</w:t>
       </w:r>
     </w:p>
     <w:p>
@@ -928,7 +797,6 @@
         <w:rPr>
           <w:lang w:val="en-US"/>
         </w:rPr>
-        <w:lastRenderedPageBreak/>
         <w:t xml:space="preserve">              </w:t>
       </w:r>
       <w:r>

</xml_diff>

<commit_message>
checking sas integration from last year (i.e. vessel length issue)
</commit_message>
<xml_diff>
--- a/documents/2026/FDI_TO_DO.docx
+++ b/documents/2026/FDI_TO_DO.docx
@@ -59,6 +59,159 @@
           <w:bCs/>
           <w:lang w:val="en-US"/>
         </w:rPr>
+        <w:t>12/06/2026</w:t>
+      </w:r>
+    </w:p>
+    <w:p>
+      <w:pPr>
+        <w:pStyle w:val="ListParagraph"/>
+        <w:numPr>
+          <w:ilvl w:val="0"/>
+          <w:numId w:val="20"/>
+        </w:numPr>
+        <w:rPr>
+          <w:lang w:val="en-US"/>
+        </w:rPr>
+      </w:pPr>
+    </w:p>
+    <w:p>
+      <w:pPr>
+        <w:rPr>
+          <w:b/>
+          <w:bCs/>
+          <w:lang w:val="en-US"/>
+        </w:rPr>
+      </w:pPr>
+      <w:r>
+        <w:rPr>
+          <w:b/>
+          <w:bCs/>
+          <w:lang w:val="en-US"/>
+        </w:rPr>
+        <w:t>11/06/2026</w:t>
+      </w:r>
+    </w:p>
+    <w:p>
+      <w:pPr>
+        <w:pStyle w:val="ListParagraph"/>
+        <w:numPr>
+          <w:ilvl w:val="0"/>
+          <w:numId w:val="19"/>
+        </w:numPr>
+        <w:rPr>
+          <w:lang w:val="en-US"/>
+        </w:rPr>
+      </w:pPr>
+      <w:r>
+        <w:rPr>
+          <w:lang w:val="en-US"/>
+        </w:rPr>
+        <w:t>Go through last years</w:t>
+      </w:r>
+      <w:r>
+        <w:rPr>
+          <w:lang w:val="en-US"/>
+        </w:rPr>
+        <w:t>’</w:t>
+      </w:r>
+      <w:r>
+        <w:rPr>
+          <w:lang w:val="en-US"/>
+        </w:rPr>
+        <w:t xml:space="preserve"> </w:t>
+      </w:r>
+      <w:proofErr w:type="spellStart"/>
+      <w:r>
+        <w:rPr>
+          <w:lang w:val="en-US"/>
+        </w:rPr>
+        <w:t>sas</w:t>
+      </w:r>
+      <w:proofErr w:type="spellEnd"/>
+      <w:r>
+        <w:rPr>
+          <w:lang w:val="en-US"/>
+        </w:rPr>
+        <w:t xml:space="preserve"> integration logic</w:t>
+      </w:r>
+    </w:p>
+    <w:p>
+      <w:pPr>
+        <w:rPr>
+          <w:b/>
+          <w:bCs/>
+          <w:lang w:val="en-US"/>
+        </w:rPr>
+      </w:pPr>
+      <w:r>
+        <w:rPr>
+          <w:b/>
+          <w:bCs/>
+          <w:lang w:val="en-US"/>
+        </w:rPr>
+        <w:t>10/06/2026</w:t>
+      </w:r>
+    </w:p>
+    <w:p>
+      <w:pPr>
+        <w:pStyle w:val="ListParagraph"/>
+        <w:numPr>
+          <w:ilvl w:val="0"/>
+          <w:numId w:val="19"/>
+        </w:numPr>
+        <w:rPr>
+          <w:lang w:val="en-US"/>
+        </w:rPr>
+      </w:pPr>
+      <w:r>
+        <w:rPr>
+          <w:lang w:val="en-US"/>
+        </w:rPr>
+        <w:t xml:space="preserve">Create </w:t>
+      </w:r>
+      <w:proofErr w:type="spellStart"/>
+      <w:r>
+        <w:rPr>
+          <w:lang w:val="en-US"/>
+        </w:rPr>
+        <w:t>Rmd</w:t>
+      </w:r>
+      <w:proofErr w:type="spellEnd"/>
+      <w:r>
+        <w:rPr>
+          <w:lang w:val="en-US"/>
+        </w:rPr>
+        <w:t xml:space="preserve"> version of </w:t>
+      </w:r>
+      <w:proofErr w:type="spellStart"/>
+      <w:r>
+        <w:rPr>
+          <w:lang w:val="en-US"/>
+        </w:rPr>
+        <w:t>sas</w:t>
+      </w:r>
+      <w:proofErr w:type="spellEnd"/>
+      <w:r>
+        <w:rPr>
+          <w:lang w:val="en-US"/>
+        </w:rPr>
+        <w:t xml:space="preserve"> integration script from 2025</w:t>
+      </w:r>
+    </w:p>
+    <w:p>
+      <w:pPr>
+        <w:rPr>
+          <w:b/>
+          <w:bCs/>
+          <w:lang w:val="en-US"/>
+        </w:rPr>
+      </w:pPr>
+      <w:r>
+        <w:rPr>
+          <w:b/>
+          <w:bCs/>
+          <w:lang w:val="en-US"/>
+        </w:rPr>
         <w:t>08/06/2026</w:t>
       </w:r>
     </w:p>
@@ -245,7 +398,21 @@
         <w:rPr>
           <w:lang w:val="en-US"/>
         </w:rPr>
-        <w:t>Incorrect length classes in old sas data</w:t>
+        <w:t xml:space="preserve">Incorrect length classes in old </w:t>
+      </w:r>
+      <w:proofErr w:type="spellStart"/>
+      <w:r>
+        <w:rPr>
+          <w:lang w:val="en-US"/>
+        </w:rPr>
+        <w:t>sas</w:t>
+      </w:r>
+      <w:proofErr w:type="spellEnd"/>
+      <w:r>
+        <w:rPr>
+          <w:lang w:val="en-US"/>
+        </w:rPr>
+        <w:t xml:space="preserve"> data</w:t>
       </w:r>
       <w:r>
         <w:rPr>
@@ -266,6 +433,7 @@
         <w:rPr>
           <w:b/>
           <w:bCs/>
+          <w:noProof/>
           <w:lang w:val="en-US"/>
         </w:rPr>
         <w:drawing>
@@ -402,7 +570,21 @@
         <w:rPr>
           <w:lang w:val="en-US"/>
         </w:rPr>
-        <w:t xml:space="preserve"> Rmd now running</w:t>
+        <w:t xml:space="preserve"> </w:t>
+      </w:r>
+      <w:proofErr w:type="spellStart"/>
+      <w:r>
+        <w:rPr>
+          <w:lang w:val="en-US"/>
+        </w:rPr>
+        <w:t>Rmd</w:t>
+      </w:r>
+      <w:proofErr w:type="spellEnd"/>
+      <w:r>
+        <w:rPr>
+          <w:lang w:val="en-US"/>
+        </w:rPr>
+        <w:t xml:space="preserve"> now running</w:t>
       </w:r>
       <w:r>
         <w:rPr>
@@ -435,12 +617,14 @@
         </w:rPr>
         <w:t xml:space="preserve">: </w:t>
       </w:r>
+      <w:proofErr w:type="spellStart"/>
       <w:r>
         <w:rPr>
           <w:lang w:val="en-US"/>
         </w:rPr>
         <w:t>IC_DB.rds</w:t>
       </w:r>
+      <w:proofErr w:type="spellEnd"/>
       <w:r>
         <w:rPr>
           <w:lang w:val="en-US"/>
@@ -471,11 +655,19 @@
         </w:rPr>
         <w:t xml:space="preserve">TABLE F: </w:t>
       </w:r>
-      <w:r>
-        <w:rPr>
-          <w:lang w:val="en-US"/>
-        </w:rPr>
-        <w:t>Rmd now running</w:t>
+      <w:proofErr w:type="spellStart"/>
+      <w:r>
+        <w:rPr>
+          <w:lang w:val="en-US"/>
+        </w:rPr>
+        <w:t>Rmd</w:t>
+      </w:r>
+      <w:proofErr w:type="spellEnd"/>
+      <w:r>
+        <w:rPr>
+          <w:lang w:val="en-US"/>
+        </w:rPr>
+        <w:t xml:space="preserve"> now running</w:t>
       </w:r>
       <w:r>
         <w:rPr>
@@ -531,8 +723,16 @@
         <w:rPr>
           <w:lang w:val="en-US"/>
         </w:rPr>
-        <w:t xml:space="preserve"> Rmd</w:t>
-      </w:r>
+        <w:t xml:space="preserve"> </w:t>
+      </w:r>
+      <w:proofErr w:type="spellStart"/>
+      <w:r>
+        <w:rPr>
+          <w:lang w:val="en-US"/>
+        </w:rPr>
+        <w:t>Rmd</w:t>
+      </w:r>
+      <w:proofErr w:type="spellEnd"/>
     </w:p>
     <w:p>
       <w:pPr>
@@ -572,7 +772,23 @@
           <w:strike/>
           <w:lang w:val="en-US"/>
         </w:rPr>
-        <w:t>new mongo implementation of Suomu cloud data</w:t>
+        <w:t xml:space="preserve">new mongo implementation of </w:t>
+      </w:r>
+      <w:proofErr w:type="spellStart"/>
+      <w:r>
+        <w:rPr>
+          <w:strike/>
+          <w:lang w:val="en-US"/>
+        </w:rPr>
+        <w:t>Suomu</w:t>
+      </w:r>
+      <w:proofErr w:type="spellEnd"/>
+      <w:r>
+        <w:rPr>
+          <w:strike/>
+          <w:lang w:val="en-US"/>
+        </w:rPr>
+        <w:t xml:space="preserve"> cloud data</w:t>
       </w:r>
     </w:p>
     <w:p>
@@ -596,7 +812,21 @@
         <w:rPr>
           <w:lang w:val="en-US"/>
         </w:rPr>
-        <w:t xml:space="preserve"> Rmd prepared and test run</w:t>
+        <w:t xml:space="preserve"> </w:t>
+      </w:r>
+      <w:proofErr w:type="spellStart"/>
+      <w:r>
+        <w:rPr>
+          <w:lang w:val="en-US"/>
+        </w:rPr>
+        <w:t>Rmd</w:t>
+      </w:r>
+      <w:proofErr w:type="spellEnd"/>
+      <w:r>
+        <w:rPr>
+          <w:lang w:val="en-US"/>
+        </w:rPr>
+        <w:t xml:space="preserve"> prepared and test run</w:t>
       </w:r>
       <w:r>
         <w:rPr>
@@ -663,7 +893,21 @@
         <w:rPr>
           <w:lang w:val="en-US"/>
         </w:rPr>
-        <w:t xml:space="preserve"> Rmd preparation</w:t>
+        <w:t xml:space="preserve"> </w:t>
+      </w:r>
+      <w:proofErr w:type="spellStart"/>
+      <w:r>
+        <w:rPr>
+          <w:lang w:val="en-US"/>
+        </w:rPr>
+        <w:t>Rmd</w:t>
+      </w:r>
+      <w:proofErr w:type="spellEnd"/>
+      <w:r>
+        <w:rPr>
+          <w:lang w:val="en-US"/>
+        </w:rPr>
+        <w:t xml:space="preserve"> preparation</w:t>
       </w:r>
       <w:r>
         <w:rPr>
@@ -724,8 +968,21 @@
         <w:rPr>
           <w:lang w:val="en-US"/>
         </w:rPr>
-        <w:lastRenderedPageBreak/>
-        <w:t>Table e Rmd preparation</w:t>
+        <w:t xml:space="preserve">Table e </w:t>
+      </w:r>
+      <w:proofErr w:type="spellStart"/>
+      <w:r>
+        <w:rPr>
+          <w:lang w:val="en-US"/>
+        </w:rPr>
+        <w:t>Rmd</w:t>
+      </w:r>
+      <w:proofErr w:type="spellEnd"/>
+      <w:r>
+        <w:rPr>
+          <w:lang w:val="en-US"/>
+        </w:rPr>
+        <w:t xml:space="preserve"> preparation</w:t>
       </w:r>
     </w:p>
     <w:p>
@@ -787,7 +1044,23 @@
           <w:strike/>
           <w:lang w:val="en-US"/>
         </w:rPr>
-        <w:t>Needs new Suomu cloud implementation</w:t>
+        <w:t xml:space="preserve">Needs new </w:t>
+      </w:r>
+      <w:proofErr w:type="spellStart"/>
+      <w:r>
+        <w:rPr>
+          <w:strike/>
+          <w:lang w:val="en-US"/>
+        </w:rPr>
+        <w:t>Suomu</w:t>
+      </w:r>
+      <w:proofErr w:type="spellEnd"/>
+      <w:r>
+        <w:rPr>
+          <w:strike/>
+          <w:lang w:val="en-US"/>
+        </w:rPr>
+        <w:t xml:space="preserve"> cloud implementation</w:t>
       </w:r>
     </w:p>
     <w:p>
@@ -805,7 +1078,21 @@
         <w:rPr>
           <w:lang w:val="en-US"/>
         </w:rPr>
-        <w:t>Table f Rmd preparation</w:t>
+        <w:t xml:space="preserve">Table f </w:t>
+      </w:r>
+      <w:proofErr w:type="spellStart"/>
+      <w:r>
+        <w:rPr>
+          <w:lang w:val="en-US"/>
+        </w:rPr>
+        <w:t>Rmd</w:t>
+      </w:r>
+      <w:proofErr w:type="spellEnd"/>
+      <w:r>
+        <w:rPr>
+          <w:lang w:val="en-US"/>
+        </w:rPr>
+        <w:t xml:space="preserve"> preparation</w:t>
       </w:r>
     </w:p>
     <w:p>
@@ -843,7 +1130,23 @@
           <w:strike/>
           <w:lang w:val="en-US"/>
         </w:rPr>
-        <w:t>Needs new Suomu cloud implementation</w:t>
+        <w:t xml:space="preserve">Needs new </w:t>
+      </w:r>
+      <w:proofErr w:type="spellStart"/>
+      <w:r>
+        <w:rPr>
+          <w:strike/>
+          <w:lang w:val="en-US"/>
+        </w:rPr>
+        <w:t>Suomu</w:t>
+      </w:r>
+      <w:proofErr w:type="spellEnd"/>
+      <w:r>
+        <w:rPr>
+          <w:strike/>
+          <w:lang w:val="en-US"/>
+        </w:rPr>
+        <w:t xml:space="preserve"> cloud implementation</w:t>
       </w:r>
     </w:p>
     <w:p>
@@ -903,13 +1206,27 @@
         <w:rPr>
           <w:lang w:val="en-US"/>
         </w:rPr>
-        <w:t>Fixing meti</w:t>
-      </w:r>
-      <w:r>
-        <w:rPr>
-          <w:lang w:val="en-US"/>
-        </w:rPr>
-        <w:t>ers in table a-j script</w:t>
+        <w:t xml:space="preserve">Fixing </w:t>
+      </w:r>
+      <w:proofErr w:type="spellStart"/>
+      <w:r>
+        <w:rPr>
+          <w:lang w:val="en-US"/>
+        </w:rPr>
+        <w:t>meti</w:t>
+      </w:r>
+      <w:r>
+        <w:rPr>
+          <w:lang w:val="en-US"/>
+        </w:rPr>
+        <w:t>ers</w:t>
+      </w:r>
+      <w:proofErr w:type="spellEnd"/>
+      <w:r>
+        <w:rPr>
+          <w:lang w:val="en-US"/>
+        </w:rPr>
+        <w:t xml:space="preserve"> in table a-j script</w:t>
       </w:r>
     </w:p>
     <w:p>
@@ -923,11 +1240,19 @@
           <w:lang w:val="en-US"/>
         </w:rPr>
       </w:pPr>
-      <w:r>
-        <w:rPr>
-          <w:lang w:val="en-US"/>
-        </w:rPr>
-        <w:t>Rmd now running</w:t>
+      <w:proofErr w:type="spellStart"/>
+      <w:r>
+        <w:rPr>
+          <w:lang w:val="en-US"/>
+        </w:rPr>
+        <w:t>Rmd</w:t>
+      </w:r>
+      <w:proofErr w:type="spellEnd"/>
+      <w:r>
+        <w:rPr>
+          <w:lang w:val="en-US"/>
+        </w:rPr>
+        <w:t xml:space="preserve"> now running</w:t>
       </w:r>
     </w:p>
     <w:p>
@@ -1013,11 +1338,19 @@
           <w:lang w:val="en-US"/>
         </w:rPr>
       </w:pPr>
-      <w:r>
-        <w:rPr>
-          <w:lang w:val="en-US"/>
-        </w:rPr>
-        <w:t>LukeTools (testing)</w:t>
+      <w:proofErr w:type="spellStart"/>
+      <w:r>
+        <w:rPr>
+          <w:lang w:val="en-US"/>
+        </w:rPr>
+        <w:t>LukeTools</w:t>
+      </w:r>
+      <w:proofErr w:type="spellEnd"/>
+      <w:r>
+        <w:rPr>
+          <w:lang w:val="en-US"/>
+        </w:rPr>
+        <w:t xml:space="preserve"> (testing)</w:t>
       </w:r>
       <w:r>
         <w:rPr>
@@ -1059,7 +1392,21 @@
         <w:rPr>
           <w:lang w:val="en-US"/>
         </w:rPr>
-        <w:t>Replace scripts with Rmd files</w:t>
+        <w:t xml:space="preserve">Replace scripts with </w:t>
+      </w:r>
+      <w:proofErr w:type="spellStart"/>
+      <w:r>
+        <w:rPr>
+          <w:lang w:val="en-US"/>
+        </w:rPr>
+        <w:t>Rmd</w:t>
+      </w:r>
+      <w:proofErr w:type="spellEnd"/>
+      <w:r>
+        <w:rPr>
+          <w:lang w:val="en-US"/>
+        </w:rPr>
+        <w:t xml:space="preserve"> files</w:t>
       </w:r>
     </w:p>
     <w:p>
@@ -1113,8 +1460,30 @@
         <w:rPr>
           <w:lang w:val="en-US"/>
         </w:rPr>
-        <w:t>Change the metier lookup from github</w:t>
-      </w:r>
+        <w:t xml:space="preserve">Change the </w:t>
+      </w:r>
+      <w:proofErr w:type="spellStart"/>
+      <w:r>
+        <w:rPr>
+          <w:lang w:val="en-US"/>
+        </w:rPr>
+        <w:t>metier</w:t>
+      </w:r>
+      <w:proofErr w:type="spellEnd"/>
+      <w:r>
+        <w:rPr>
+          <w:lang w:val="en-US"/>
+        </w:rPr>
+        <w:t xml:space="preserve"> lookup from </w:t>
+      </w:r>
+      <w:proofErr w:type="spellStart"/>
+      <w:r>
+        <w:rPr>
+          <w:lang w:val="en-US"/>
+        </w:rPr>
+        <w:t>github</w:t>
+      </w:r>
+      <w:proofErr w:type="spellEnd"/>
     </w:p>
     <w:p>
       <w:pPr>
@@ -1131,7 +1500,21 @@
         <w:rPr>
           <w:lang w:val="en-US"/>
         </w:rPr>
-        <w:t>Save sas logbook from database and import from database</w:t>
+        <w:t xml:space="preserve">Save </w:t>
+      </w:r>
+      <w:proofErr w:type="spellStart"/>
+      <w:r>
+        <w:rPr>
+          <w:lang w:val="en-US"/>
+        </w:rPr>
+        <w:t>sas</w:t>
+      </w:r>
+      <w:proofErr w:type="spellEnd"/>
+      <w:r>
+        <w:rPr>
+          <w:lang w:val="en-US"/>
+        </w:rPr>
+        <w:t xml:space="preserve"> logbook from database and import from database</w:t>
       </w:r>
     </w:p>
     <w:p>
@@ -1185,7 +1568,21 @@
         <w:rPr>
           <w:lang w:val="en-US"/>
         </w:rPr>
-        <w:t>Create first Rmd version</w:t>
+        <w:t xml:space="preserve">Create first </w:t>
+      </w:r>
+      <w:proofErr w:type="spellStart"/>
+      <w:r>
+        <w:rPr>
+          <w:lang w:val="en-US"/>
+        </w:rPr>
+        <w:t>Rmd</w:t>
+      </w:r>
+      <w:proofErr w:type="spellEnd"/>
+      <w:r>
+        <w:rPr>
+          <w:lang w:val="en-US"/>
+        </w:rPr>
+        <w:t xml:space="preserve"> version</w:t>
       </w:r>
     </w:p>
     <w:p>
@@ -1225,7 +1622,22 @@
         <w:rPr>
           <w:lang w:val="en-US"/>
         </w:rPr>
-        <w:t>A fishing trip is approximated by reported fishing days, aggregated from monthly reports by taking the maximum number of fishing days per vessel–month–metier combination and summing these over time and vessels.</w:t>
+        <w:lastRenderedPageBreak/>
+        <w:t>A fishing trip is approximated by reported fishing days, aggregated from monthly reports by taking the maximum number of fishing days per vessel–month–</w:t>
+      </w:r>
+      <w:proofErr w:type="spellStart"/>
+      <w:r>
+        <w:rPr>
+          <w:lang w:val="en-US"/>
+        </w:rPr>
+        <w:t>metier</w:t>
+      </w:r>
+      <w:proofErr w:type="spellEnd"/>
+      <w:r>
+        <w:rPr>
+          <w:lang w:val="en-US"/>
+        </w:rPr>
+        <w:t xml:space="preserve"> combination and summing these over time and vessels.</w:t>
       </w:r>
     </w:p>
     <w:p>
@@ -1335,6 +1747,119 @@
 <file path=word/numbering.xml><?xml version="1.0" encoding="utf-8"?>
 <w:numbering xmlns:wpc="http://schemas.microsoft.com/office/word/2010/wordprocessingCanvas" xmlns:cx="http://schemas.microsoft.com/office/drawing/2014/chartex" xmlns:cx1="http://schemas.microsoft.com/office/drawing/2015/9/8/chartex" xmlns:cx2="http://schemas.microsoft.com/office/drawing/2015/10/21/chartex" xmlns:cx3="http://schemas.microsoft.com/office/drawing/2016/5/9/chartex" xmlns:cx4="http://schemas.microsoft.com/office/drawing/2016/5/10/chartex" xmlns:cx5="http://schemas.microsoft.com/office/drawing/2016/5/11/chartex" xmlns:cx6="http://schemas.microsoft.com/office/drawing/2016/5/12/chartex" xmlns:cx7="http://schemas.microsoft.com/office/drawing/2016/5/13/chartex" xmlns:cx8="http://schemas.microsoft.com/office/drawing/2016/5/14/chartex" xmlns:mc="http://schemas.openxmlformats.org/markup-compatibility/2006" xmlns:aink="http://schemas.microsoft.com/office/drawing/2016/ink" xmlns:am3d="http://schemas.microsoft.com/office/drawing/2017/model3d" xmlns:o="urn:schemas-microsoft-com:office:office" xmlns:oel="http://schemas.microsoft.com/office/2019/extlst" xmlns:r="http://schemas.openxmlformats.org/officeDocument/2006/relationships" xmlns:m="http://schemas.openxmlformats.org/officeDocument/2006/math" xmlns:v="urn:schemas-microsoft-com:vml" xmlns:wp14="http://schemas.microsoft.com/office/word/2010/wordprocessingDrawing" xmlns:wp="http://schemas.openxmlformats.org/drawingml/2006/wordprocessingDrawing" xmlns:w10="urn:schemas-microsoft-com:office:word" xmlns:w="http://schemas.openxmlformats.org/wordprocessingml/2006/main" xmlns:w14="http://schemas.microsoft.com/office/word/2010/wordml" xmlns:w15="http://schemas.microsoft.com/office/word/2012/wordml" xmlns:w16cex="http://schemas.microsoft.com/office/word/2018/wordml/cex" xmlns:w16cid="http://schemas.microsoft.com/office/word/2016/wordml/cid" xmlns:w16="http://schemas.microsoft.com/office/word/2018/wordml" xmlns:w16du="http://schemas.microsoft.com/office/word/2023/wordml/word16du" xmlns:w16sdtdh="http://schemas.microsoft.com/office/word/2020/wordml/sdtdatahash" xmlns:w16sdtfl="http://schemas.microsoft.com/office/word/2024/wordml/sdtformatlock" xmlns:w16se="http://schemas.microsoft.com/office/word/2015/wordml/symex" xmlns:wpg="http://schemas.microsoft.com/office/word/2010/wordprocessingGroup" xmlns:wpi="http://schemas.microsoft.com/office/word/2010/wordprocessingInk" xmlns:wne="http://schemas.microsoft.com/office/word/2006/wordml" xmlns:wps="http://schemas.microsoft.com/office/word/2010/wordprocessingShape" mc:Ignorable="w14 w15 w16se w16cid w16 w16cex w16sdtdh w16sdtfl w16du wp14">
   <w:abstractNum w:abstractNumId="0" w15:restartNumberingAfterBreak="0">
+    <w:nsid w:val="02953697"/>
+    <w:multiLevelType w:val="hybridMultilevel"/>
+    <w:tmpl w:val="EFAAF022"/>
+    <w:lvl w:ilvl="0" w:tplc="08090001">
+      <w:start w:val="1"/>
+      <w:numFmt w:val="bullet"/>
+      <w:lvlText w:val=""/>
+      <w:lvlJc w:val="left"/>
+      <w:pPr>
+        <w:ind w:left="720" w:hanging="360"/>
+      </w:pPr>
+      <w:rPr>
+        <w:rFonts w:ascii="Symbol" w:hAnsi="Symbol" w:hint="default"/>
+      </w:rPr>
+    </w:lvl>
+    <w:lvl w:ilvl="1" w:tplc="08090003" w:tentative="1">
+      <w:start w:val="1"/>
+      <w:numFmt w:val="bullet"/>
+      <w:lvlText w:val="o"/>
+      <w:lvlJc w:val="left"/>
+      <w:pPr>
+        <w:ind w:left="1440" w:hanging="360"/>
+      </w:pPr>
+      <w:rPr>
+        <w:rFonts w:ascii="Courier New" w:hAnsi="Courier New" w:cs="Courier New" w:hint="default"/>
+      </w:rPr>
+    </w:lvl>
+    <w:lvl w:ilvl="2" w:tplc="08090005" w:tentative="1">
+      <w:start w:val="1"/>
+      <w:numFmt w:val="bullet"/>
+      <w:lvlText w:val=""/>
+      <w:lvlJc w:val="left"/>
+      <w:pPr>
+        <w:ind w:left="2160" w:hanging="360"/>
+      </w:pPr>
+      <w:rPr>
+        <w:rFonts w:ascii="Wingdings" w:hAnsi="Wingdings" w:hint="default"/>
+      </w:rPr>
+    </w:lvl>
+    <w:lvl w:ilvl="3" w:tplc="08090001" w:tentative="1">
+      <w:start w:val="1"/>
+      <w:numFmt w:val="bullet"/>
+      <w:lvlText w:val=""/>
+      <w:lvlJc w:val="left"/>
+      <w:pPr>
+        <w:ind w:left="2880" w:hanging="360"/>
+      </w:pPr>
+      <w:rPr>
+        <w:rFonts w:ascii="Symbol" w:hAnsi="Symbol" w:hint="default"/>
+      </w:rPr>
+    </w:lvl>
+    <w:lvl w:ilvl="4" w:tplc="08090003" w:tentative="1">
+      <w:start w:val="1"/>
+      <w:numFmt w:val="bullet"/>
+      <w:lvlText w:val="o"/>
+      <w:lvlJc w:val="left"/>
+      <w:pPr>
+        <w:ind w:left="3600" w:hanging="360"/>
+      </w:pPr>
+      <w:rPr>
+        <w:rFonts w:ascii="Courier New" w:hAnsi="Courier New" w:cs="Courier New" w:hint="default"/>
+      </w:rPr>
+    </w:lvl>
+    <w:lvl w:ilvl="5" w:tplc="08090005" w:tentative="1">
+      <w:start w:val="1"/>
+      <w:numFmt w:val="bullet"/>
+      <w:lvlText w:val=""/>
+      <w:lvlJc w:val="left"/>
+      <w:pPr>
+        <w:ind w:left="4320" w:hanging="360"/>
+      </w:pPr>
+      <w:rPr>
+        <w:rFonts w:ascii="Wingdings" w:hAnsi="Wingdings" w:hint="default"/>
+      </w:rPr>
+    </w:lvl>
+    <w:lvl w:ilvl="6" w:tplc="08090001" w:tentative="1">
+      <w:start w:val="1"/>
+      <w:numFmt w:val="bullet"/>
+      <w:lvlText w:val=""/>
+      <w:lvlJc w:val="left"/>
+      <w:pPr>
+        <w:ind w:left="5040" w:hanging="360"/>
+      </w:pPr>
+      <w:rPr>
+        <w:rFonts w:ascii="Symbol" w:hAnsi="Symbol" w:hint="default"/>
+      </w:rPr>
+    </w:lvl>
+    <w:lvl w:ilvl="7" w:tplc="08090003" w:tentative="1">
+      <w:start w:val="1"/>
+      <w:numFmt w:val="bullet"/>
+      <w:lvlText w:val="o"/>
+      <w:lvlJc w:val="left"/>
+      <w:pPr>
+        <w:ind w:left="5760" w:hanging="360"/>
+      </w:pPr>
+      <w:rPr>
+        <w:rFonts w:ascii="Courier New" w:hAnsi="Courier New" w:cs="Courier New" w:hint="default"/>
+      </w:rPr>
+    </w:lvl>
+    <w:lvl w:ilvl="8" w:tplc="08090005" w:tentative="1">
+      <w:start w:val="1"/>
+      <w:numFmt w:val="bullet"/>
+      <w:lvlText w:val=""/>
+      <w:lvlJc w:val="left"/>
+      <w:pPr>
+        <w:ind w:left="6480" w:hanging="360"/>
+      </w:pPr>
+      <w:rPr>
+        <w:rFonts w:ascii="Wingdings" w:hAnsi="Wingdings" w:hint="default"/>
+      </w:rPr>
+    </w:lvl>
+  </w:abstractNum>
+  <w:abstractNum w:abstractNumId="1" w15:restartNumberingAfterBreak="0">
     <w:nsid w:val="03702057"/>
     <w:multiLevelType w:val="hybridMultilevel"/>
     <w:tmpl w:val="7DDCDDC8"/>
@@ -1446,7 +1971,7 @@
       </w:rPr>
     </w:lvl>
   </w:abstractNum>
-  <w:abstractNum w:abstractNumId="1" w15:restartNumberingAfterBreak="0">
+  <w:abstractNum w:abstractNumId="2" w15:restartNumberingAfterBreak="0">
     <w:nsid w:val="12FA2BA1"/>
     <w:multiLevelType w:val="hybridMultilevel"/>
     <w:tmpl w:val="F59ADA98"/>
@@ -1559,7 +2084,7 @@
       </w:rPr>
     </w:lvl>
   </w:abstractNum>
-  <w:abstractNum w:abstractNumId="2" w15:restartNumberingAfterBreak="0">
+  <w:abstractNum w:abstractNumId="3" w15:restartNumberingAfterBreak="0">
     <w:nsid w:val="1864755F"/>
     <w:multiLevelType w:val="hybridMultilevel"/>
     <w:tmpl w:val="42D41E72"/>
@@ -1671,7 +2196,7 @@
       </w:rPr>
     </w:lvl>
   </w:abstractNum>
-  <w:abstractNum w:abstractNumId="3" w15:restartNumberingAfterBreak="0">
+  <w:abstractNum w:abstractNumId="4" w15:restartNumberingAfterBreak="0">
     <w:nsid w:val="23120FA5"/>
     <w:multiLevelType w:val="hybridMultilevel"/>
     <w:tmpl w:val="4AE806A8"/>
@@ -1783,7 +2308,7 @@
       </w:rPr>
     </w:lvl>
   </w:abstractNum>
-  <w:abstractNum w:abstractNumId="4" w15:restartNumberingAfterBreak="0">
+  <w:abstractNum w:abstractNumId="5" w15:restartNumberingAfterBreak="0">
     <w:nsid w:val="260F3E04"/>
     <w:multiLevelType w:val="hybridMultilevel"/>
     <w:tmpl w:val="4FE43C20"/>
@@ -1895,7 +2420,7 @@
       </w:rPr>
     </w:lvl>
   </w:abstractNum>
-  <w:abstractNum w:abstractNumId="5" w15:restartNumberingAfterBreak="0">
+  <w:abstractNum w:abstractNumId="6" w15:restartNumberingAfterBreak="0">
     <w:nsid w:val="28575A35"/>
     <w:multiLevelType w:val="hybridMultilevel"/>
     <w:tmpl w:val="599E81EC"/>
@@ -2007,7 +2532,7 @@
       </w:rPr>
     </w:lvl>
   </w:abstractNum>
-  <w:abstractNum w:abstractNumId="6" w15:restartNumberingAfterBreak="0">
+  <w:abstractNum w:abstractNumId="7" w15:restartNumberingAfterBreak="0">
     <w:nsid w:val="2A623D97"/>
     <w:multiLevelType w:val="hybridMultilevel"/>
     <w:tmpl w:val="236C2F34"/>
@@ -2119,7 +2644,7 @@
       </w:rPr>
     </w:lvl>
   </w:abstractNum>
-  <w:abstractNum w:abstractNumId="7" w15:restartNumberingAfterBreak="0">
+  <w:abstractNum w:abstractNumId="8" w15:restartNumberingAfterBreak="0">
     <w:nsid w:val="2EAF3385"/>
     <w:multiLevelType w:val="hybridMultilevel"/>
     <w:tmpl w:val="FDEA9C72"/>
@@ -2231,7 +2756,7 @@
       </w:rPr>
     </w:lvl>
   </w:abstractNum>
-  <w:abstractNum w:abstractNumId="8" w15:restartNumberingAfterBreak="0">
+  <w:abstractNum w:abstractNumId="9" w15:restartNumberingAfterBreak="0">
     <w:nsid w:val="308237DE"/>
     <w:multiLevelType w:val="hybridMultilevel"/>
     <w:tmpl w:val="E0942DCE"/>
@@ -2344,7 +2869,120 @@
       </w:rPr>
     </w:lvl>
   </w:abstractNum>
-  <w:abstractNum w:abstractNumId="9" w15:restartNumberingAfterBreak="0">
+  <w:abstractNum w:abstractNumId="10" w15:restartNumberingAfterBreak="0">
+    <w:nsid w:val="324547E5"/>
+    <w:multiLevelType w:val="hybridMultilevel"/>
+    <w:tmpl w:val="D7488678"/>
+    <w:lvl w:ilvl="0" w:tplc="08090001">
+      <w:start w:val="1"/>
+      <w:numFmt w:val="bullet"/>
+      <w:lvlText w:val=""/>
+      <w:lvlJc w:val="left"/>
+      <w:pPr>
+        <w:ind w:left="720" w:hanging="360"/>
+      </w:pPr>
+      <w:rPr>
+        <w:rFonts w:ascii="Symbol" w:hAnsi="Symbol" w:hint="default"/>
+      </w:rPr>
+    </w:lvl>
+    <w:lvl w:ilvl="1" w:tplc="08090003" w:tentative="1">
+      <w:start w:val="1"/>
+      <w:numFmt w:val="bullet"/>
+      <w:lvlText w:val="o"/>
+      <w:lvlJc w:val="left"/>
+      <w:pPr>
+        <w:ind w:left="1440" w:hanging="360"/>
+      </w:pPr>
+      <w:rPr>
+        <w:rFonts w:ascii="Courier New" w:hAnsi="Courier New" w:cs="Courier New" w:hint="default"/>
+      </w:rPr>
+    </w:lvl>
+    <w:lvl w:ilvl="2" w:tplc="08090005" w:tentative="1">
+      <w:start w:val="1"/>
+      <w:numFmt w:val="bullet"/>
+      <w:lvlText w:val=""/>
+      <w:lvlJc w:val="left"/>
+      <w:pPr>
+        <w:ind w:left="2160" w:hanging="360"/>
+      </w:pPr>
+      <w:rPr>
+        <w:rFonts w:ascii="Wingdings" w:hAnsi="Wingdings" w:hint="default"/>
+      </w:rPr>
+    </w:lvl>
+    <w:lvl w:ilvl="3" w:tplc="08090001" w:tentative="1">
+      <w:start w:val="1"/>
+      <w:numFmt w:val="bullet"/>
+      <w:lvlText w:val=""/>
+      <w:lvlJc w:val="left"/>
+      <w:pPr>
+        <w:ind w:left="2880" w:hanging="360"/>
+      </w:pPr>
+      <w:rPr>
+        <w:rFonts w:ascii="Symbol" w:hAnsi="Symbol" w:hint="default"/>
+      </w:rPr>
+    </w:lvl>
+    <w:lvl w:ilvl="4" w:tplc="08090003" w:tentative="1">
+      <w:start w:val="1"/>
+      <w:numFmt w:val="bullet"/>
+      <w:lvlText w:val="o"/>
+      <w:lvlJc w:val="left"/>
+      <w:pPr>
+        <w:ind w:left="3600" w:hanging="360"/>
+      </w:pPr>
+      <w:rPr>
+        <w:rFonts w:ascii="Courier New" w:hAnsi="Courier New" w:cs="Courier New" w:hint="default"/>
+      </w:rPr>
+    </w:lvl>
+    <w:lvl w:ilvl="5" w:tplc="08090005" w:tentative="1">
+      <w:start w:val="1"/>
+      <w:numFmt w:val="bullet"/>
+      <w:lvlText w:val=""/>
+      <w:lvlJc w:val="left"/>
+      <w:pPr>
+        <w:ind w:left="4320" w:hanging="360"/>
+      </w:pPr>
+      <w:rPr>
+        <w:rFonts w:ascii="Wingdings" w:hAnsi="Wingdings" w:hint="default"/>
+      </w:rPr>
+    </w:lvl>
+    <w:lvl w:ilvl="6" w:tplc="08090001" w:tentative="1">
+      <w:start w:val="1"/>
+      <w:numFmt w:val="bullet"/>
+      <w:lvlText w:val=""/>
+      <w:lvlJc w:val="left"/>
+      <w:pPr>
+        <w:ind w:left="5040" w:hanging="360"/>
+      </w:pPr>
+      <w:rPr>
+        <w:rFonts w:ascii="Symbol" w:hAnsi="Symbol" w:hint="default"/>
+      </w:rPr>
+    </w:lvl>
+    <w:lvl w:ilvl="7" w:tplc="08090003" w:tentative="1">
+      <w:start w:val="1"/>
+      <w:numFmt w:val="bullet"/>
+      <w:lvlText w:val="o"/>
+      <w:lvlJc w:val="left"/>
+      <w:pPr>
+        <w:ind w:left="5760" w:hanging="360"/>
+      </w:pPr>
+      <w:rPr>
+        <w:rFonts w:ascii="Courier New" w:hAnsi="Courier New" w:cs="Courier New" w:hint="default"/>
+      </w:rPr>
+    </w:lvl>
+    <w:lvl w:ilvl="8" w:tplc="08090005" w:tentative="1">
+      <w:start w:val="1"/>
+      <w:numFmt w:val="bullet"/>
+      <w:lvlText w:val=""/>
+      <w:lvlJc w:val="left"/>
+      <w:pPr>
+        <w:ind w:left="6480" w:hanging="360"/>
+      </w:pPr>
+      <w:rPr>
+        <w:rFonts w:ascii="Wingdings" w:hAnsi="Wingdings" w:hint="default"/>
+      </w:rPr>
+    </w:lvl>
+  </w:abstractNum>
+  <w:abstractNum w:abstractNumId="11" w15:restartNumberingAfterBreak="0">
     <w:nsid w:val="3B3F2A02"/>
     <w:multiLevelType w:val="hybridMultilevel"/>
     <w:tmpl w:val="9BB62138"/>
@@ -2457,7 +3095,7 @@
       </w:rPr>
     </w:lvl>
   </w:abstractNum>
-  <w:abstractNum w:abstractNumId="10" w15:restartNumberingAfterBreak="0">
+  <w:abstractNum w:abstractNumId="12" w15:restartNumberingAfterBreak="0">
     <w:nsid w:val="47F96F2F"/>
     <w:multiLevelType w:val="hybridMultilevel"/>
     <w:tmpl w:val="7256ACFE"/>
@@ -2569,7 +3207,7 @@
       </w:rPr>
     </w:lvl>
   </w:abstractNum>
-  <w:abstractNum w:abstractNumId="11" w15:restartNumberingAfterBreak="0">
+  <w:abstractNum w:abstractNumId="13" w15:restartNumberingAfterBreak="0">
     <w:nsid w:val="483435CC"/>
     <w:multiLevelType w:val="hybridMultilevel"/>
     <w:tmpl w:val="787CC9BA"/>
@@ -2681,7 +3319,7 @@
       </w:rPr>
     </w:lvl>
   </w:abstractNum>
-  <w:abstractNum w:abstractNumId="12" w15:restartNumberingAfterBreak="0">
+  <w:abstractNum w:abstractNumId="14" w15:restartNumberingAfterBreak="0">
     <w:nsid w:val="49A87142"/>
     <w:multiLevelType w:val="hybridMultilevel"/>
     <w:tmpl w:val="0C047B9C"/>
@@ -2793,7 +3431,120 @@
       </w:rPr>
     </w:lvl>
   </w:abstractNum>
-  <w:abstractNum w:abstractNumId="13" w15:restartNumberingAfterBreak="0">
+  <w:abstractNum w:abstractNumId="15" w15:restartNumberingAfterBreak="0">
+    <w:nsid w:val="4C62209E"/>
+    <w:multiLevelType w:val="hybridMultilevel"/>
+    <w:tmpl w:val="07F6CAEE"/>
+    <w:lvl w:ilvl="0" w:tplc="08090001">
+      <w:start w:val="1"/>
+      <w:numFmt w:val="bullet"/>
+      <w:lvlText w:val=""/>
+      <w:lvlJc w:val="left"/>
+      <w:pPr>
+        <w:ind w:left="720" w:hanging="360"/>
+      </w:pPr>
+      <w:rPr>
+        <w:rFonts w:ascii="Symbol" w:hAnsi="Symbol" w:hint="default"/>
+      </w:rPr>
+    </w:lvl>
+    <w:lvl w:ilvl="1" w:tplc="08090003" w:tentative="1">
+      <w:start w:val="1"/>
+      <w:numFmt w:val="bullet"/>
+      <w:lvlText w:val="o"/>
+      <w:lvlJc w:val="left"/>
+      <w:pPr>
+        <w:ind w:left="1440" w:hanging="360"/>
+      </w:pPr>
+      <w:rPr>
+        <w:rFonts w:ascii="Courier New" w:hAnsi="Courier New" w:cs="Courier New" w:hint="default"/>
+      </w:rPr>
+    </w:lvl>
+    <w:lvl w:ilvl="2" w:tplc="08090005" w:tentative="1">
+      <w:start w:val="1"/>
+      <w:numFmt w:val="bullet"/>
+      <w:lvlText w:val=""/>
+      <w:lvlJc w:val="left"/>
+      <w:pPr>
+        <w:ind w:left="2160" w:hanging="360"/>
+      </w:pPr>
+      <w:rPr>
+        <w:rFonts w:ascii="Wingdings" w:hAnsi="Wingdings" w:hint="default"/>
+      </w:rPr>
+    </w:lvl>
+    <w:lvl w:ilvl="3" w:tplc="08090001" w:tentative="1">
+      <w:start w:val="1"/>
+      <w:numFmt w:val="bullet"/>
+      <w:lvlText w:val=""/>
+      <w:lvlJc w:val="left"/>
+      <w:pPr>
+        <w:ind w:left="2880" w:hanging="360"/>
+      </w:pPr>
+      <w:rPr>
+        <w:rFonts w:ascii="Symbol" w:hAnsi="Symbol" w:hint="default"/>
+      </w:rPr>
+    </w:lvl>
+    <w:lvl w:ilvl="4" w:tplc="08090003" w:tentative="1">
+      <w:start w:val="1"/>
+      <w:numFmt w:val="bullet"/>
+      <w:lvlText w:val="o"/>
+      <w:lvlJc w:val="left"/>
+      <w:pPr>
+        <w:ind w:left="3600" w:hanging="360"/>
+      </w:pPr>
+      <w:rPr>
+        <w:rFonts w:ascii="Courier New" w:hAnsi="Courier New" w:cs="Courier New" w:hint="default"/>
+      </w:rPr>
+    </w:lvl>
+    <w:lvl w:ilvl="5" w:tplc="08090005" w:tentative="1">
+      <w:start w:val="1"/>
+      <w:numFmt w:val="bullet"/>
+      <w:lvlText w:val=""/>
+      <w:lvlJc w:val="left"/>
+      <w:pPr>
+        <w:ind w:left="4320" w:hanging="360"/>
+      </w:pPr>
+      <w:rPr>
+        <w:rFonts w:ascii="Wingdings" w:hAnsi="Wingdings" w:hint="default"/>
+      </w:rPr>
+    </w:lvl>
+    <w:lvl w:ilvl="6" w:tplc="08090001" w:tentative="1">
+      <w:start w:val="1"/>
+      <w:numFmt w:val="bullet"/>
+      <w:lvlText w:val=""/>
+      <w:lvlJc w:val="left"/>
+      <w:pPr>
+        <w:ind w:left="5040" w:hanging="360"/>
+      </w:pPr>
+      <w:rPr>
+        <w:rFonts w:ascii="Symbol" w:hAnsi="Symbol" w:hint="default"/>
+      </w:rPr>
+    </w:lvl>
+    <w:lvl w:ilvl="7" w:tplc="08090003" w:tentative="1">
+      <w:start w:val="1"/>
+      <w:numFmt w:val="bullet"/>
+      <w:lvlText w:val="o"/>
+      <w:lvlJc w:val="left"/>
+      <w:pPr>
+        <w:ind w:left="5760" w:hanging="360"/>
+      </w:pPr>
+      <w:rPr>
+        <w:rFonts w:ascii="Courier New" w:hAnsi="Courier New" w:cs="Courier New" w:hint="default"/>
+      </w:rPr>
+    </w:lvl>
+    <w:lvl w:ilvl="8" w:tplc="08090005" w:tentative="1">
+      <w:start w:val="1"/>
+      <w:numFmt w:val="bullet"/>
+      <w:lvlText w:val=""/>
+      <w:lvlJc w:val="left"/>
+      <w:pPr>
+        <w:ind w:left="6480" w:hanging="360"/>
+      </w:pPr>
+      <w:rPr>
+        <w:rFonts w:ascii="Wingdings" w:hAnsi="Wingdings" w:hint="default"/>
+      </w:rPr>
+    </w:lvl>
+  </w:abstractNum>
+  <w:abstractNum w:abstractNumId="16" w15:restartNumberingAfterBreak="0">
     <w:nsid w:val="5FC00F8A"/>
     <w:multiLevelType w:val="hybridMultilevel"/>
     <w:tmpl w:val="9D96EDD4"/>
@@ -2906,7 +3657,7 @@
       </w:rPr>
     </w:lvl>
   </w:abstractNum>
-  <w:abstractNum w:abstractNumId="14" w15:restartNumberingAfterBreak="0">
+  <w:abstractNum w:abstractNumId="17" w15:restartNumberingAfterBreak="0">
     <w:nsid w:val="65070E8D"/>
     <w:multiLevelType w:val="hybridMultilevel"/>
     <w:tmpl w:val="BDB6982A"/>
@@ -3019,7 +3770,7 @@
       </w:rPr>
     </w:lvl>
   </w:abstractNum>
-  <w:abstractNum w:abstractNumId="15" w15:restartNumberingAfterBreak="0">
+  <w:abstractNum w:abstractNumId="18" w15:restartNumberingAfterBreak="0">
     <w:nsid w:val="695A7833"/>
     <w:multiLevelType w:val="hybridMultilevel"/>
     <w:tmpl w:val="E564D540"/>
@@ -3131,7 +3882,7 @@
       </w:rPr>
     </w:lvl>
   </w:abstractNum>
-  <w:abstractNum w:abstractNumId="16" w15:restartNumberingAfterBreak="0">
+  <w:abstractNum w:abstractNumId="19" w15:restartNumberingAfterBreak="0">
     <w:nsid w:val="73B949D2"/>
     <w:multiLevelType w:val="hybridMultilevel"/>
     <w:tmpl w:val="28606D2A"/>
@@ -3244,55 +3995,64 @@
     </w:lvl>
   </w:abstractNum>
   <w:num w:numId="1" w16cid:durableId="355086478">
-    <w:abstractNumId w:val="0"/>
+    <w:abstractNumId w:val="1"/>
   </w:num>
   <w:num w:numId="2" w16cid:durableId="214704310">
-    <w:abstractNumId w:val="1"/>
+    <w:abstractNumId w:val="2"/>
   </w:num>
   <w:num w:numId="3" w16cid:durableId="1364742651">
+    <w:abstractNumId w:val="16"/>
+  </w:num>
+  <w:num w:numId="4" w16cid:durableId="302855184">
+    <w:abstractNumId w:val="5"/>
+  </w:num>
+  <w:num w:numId="5" w16cid:durableId="913128674">
+    <w:abstractNumId w:val="4"/>
+  </w:num>
+  <w:num w:numId="6" w16cid:durableId="1637492389">
+    <w:abstractNumId w:val="6"/>
+  </w:num>
+  <w:num w:numId="7" w16cid:durableId="276644472">
+    <w:abstractNumId w:val="9"/>
+  </w:num>
+  <w:num w:numId="8" w16cid:durableId="836699043">
+    <w:abstractNumId w:val="11"/>
+  </w:num>
+  <w:num w:numId="9" w16cid:durableId="536427938">
+    <w:abstractNumId w:val="3"/>
+  </w:num>
+  <w:num w:numId="10" w16cid:durableId="1761370988">
+    <w:abstractNumId w:val="17"/>
+  </w:num>
+  <w:num w:numId="11" w16cid:durableId="1499495752">
+    <w:abstractNumId w:val="12"/>
+  </w:num>
+  <w:num w:numId="12" w16cid:durableId="1412316134">
+    <w:abstractNumId w:val="19"/>
+  </w:num>
+  <w:num w:numId="13" w16cid:durableId="1350258004">
+    <w:abstractNumId w:val="7"/>
+  </w:num>
+  <w:num w:numId="14" w16cid:durableId="1673683661">
+    <w:abstractNumId w:val="14"/>
+  </w:num>
+  <w:num w:numId="15" w16cid:durableId="867064272">
+    <w:abstractNumId w:val="18"/>
+  </w:num>
+  <w:num w:numId="16" w16cid:durableId="7604246">
     <w:abstractNumId w:val="13"/>
   </w:num>
-  <w:num w:numId="4" w16cid:durableId="302855184">
-    <w:abstractNumId w:val="4"/>
-  </w:num>
-  <w:num w:numId="5" w16cid:durableId="913128674">
-    <w:abstractNumId w:val="3"/>
-  </w:num>
-  <w:num w:numId="6" w16cid:durableId="1637492389">
-    <w:abstractNumId w:val="5"/>
-  </w:num>
-  <w:num w:numId="7" w16cid:durableId="276644472">
+  <w:num w:numId="17" w16cid:durableId="2089039549">
     <w:abstractNumId w:val="8"/>
   </w:num>
-  <w:num w:numId="8" w16cid:durableId="836699043">
-    <w:abstractNumId w:val="9"/>
+  <w:num w:numId="18" w16cid:durableId="595285920">
+    <w:abstractNumId w:val="15"/>
   </w:num>
-  <w:num w:numId="9" w16cid:durableId="536427938">
-    <w:abstractNumId w:val="2"/>
-  </w:num>
-  <w:num w:numId="10" w16cid:durableId="1761370988">
-    <w:abstractNumId w:val="14"/>
-  </w:num>
-  <w:num w:numId="11" w16cid:durableId="1499495752">
+  <w:num w:numId="19" w16cid:durableId="2136634086">
     <w:abstractNumId w:val="10"/>
   </w:num>
-  <w:num w:numId="12" w16cid:durableId="1412316134">
-    <w:abstractNumId w:val="16"/>
-  </w:num>
-  <w:num w:numId="13" w16cid:durableId="1350258004">
-    <w:abstractNumId w:val="6"/>
-  </w:num>
-  <w:num w:numId="14" w16cid:durableId="1673683661">
-    <w:abstractNumId w:val="12"/>
-  </w:num>
-  <w:num w:numId="15" w16cid:durableId="867064272">
-    <w:abstractNumId w:val="15"/>
-  </w:num>
-  <w:num w:numId="16" w16cid:durableId="7604246">
-    <w:abstractNumId w:val="11"/>
-  </w:num>
-  <w:num w:numId="17" w16cid:durableId="2089039549">
-    <w:abstractNumId w:val="7"/>
+  <w:num w:numId="20" w16cid:durableId="411004895">
+    <w:abstractNumId w:val="0"/>
   </w:num>
 </w:numbering>
 </file>

</xml_diff>

<commit_message>
-testing 2013 - 2025 discard file - added To Do line 2024 and 2025 discard salmon tonnes don´t merge to table A?
</commit_message>
<xml_diff>
--- a/documents/2026/FDI_TO_DO.docx
+++ b/documents/2026/FDI_TO_DO.docx
@@ -59,7 +59,23 @@
           <w:bCs/>
           <w:lang w:val="en-US"/>
         </w:rPr>
-        <w:t>12/06/2026</w:t>
+        <w:t>1</w:t>
+      </w:r>
+      <w:r>
+        <w:rPr>
+          <w:b/>
+          <w:bCs/>
+          <w:lang w:val="en-US"/>
+        </w:rPr>
+        <w:t>5</w:t>
+      </w:r>
+      <w:r>
+        <w:rPr>
+          <w:b/>
+          <w:bCs/>
+          <w:lang w:val="en-US"/>
+        </w:rPr>
+        <w:t>/06/2026</w:t>
       </w:r>
     </w:p>
     <w:p>
@@ -73,6 +89,48 @@
           <w:lang w:val="en-US"/>
         </w:rPr>
       </w:pPr>
+      <w:r>
+        <w:rPr>
+          <w:rFonts w:ascii="Helvetica" w:hAnsi="Helvetica" w:cs="Helvetica"/>
+          <w:kern w:val="0"/>
+          <w:lang w:val="en-US"/>
+        </w:rPr>
+        <w:t xml:space="preserve">TO DO 2024 and 2025 </w:t>
+      </w:r>
+      <w:proofErr w:type="spellStart"/>
+      <w:r>
+        <w:rPr>
+          <w:rFonts w:ascii="Helvetica" w:hAnsi="Helvetica" w:cs="Helvetica"/>
+          <w:kern w:val="0"/>
+          <w:lang w:val="en-US"/>
+        </w:rPr>
+        <w:t>tonnes</w:t>
+      </w:r>
+      <w:proofErr w:type="spellEnd"/>
+      <w:r>
+        <w:rPr>
+          <w:rFonts w:ascii="Helvetica" w:hAnsi="Helvetica" w:cs="Helvetica"/>
+          <w:kern w:val="0"/>
+          <w:lang w:val="en-US"/>
+        </w:rPr>
+        <w:t xml:space="preserve"> from discard SALMON table don´t merge</w:t>
+      </w:r>
+      <w:r>
+        <w:rPr>
+          <w:rFonts w:ascii="Helvetica" w:hAnsi="Helvetica" w:cs="Helvetica"/>
+          <w:kern w:val="0"/>
+          <w:lang w:val="en-US"/>
+        </w:rPr>
+        <w:t xml:space="preserve"> to table A</w:t>
+      </w:r>
+      <w:r>
+        <w:rPr>
+          <w:rFonts w:ascii="Helvetica" w:hAnsi="Helvetica" w:cs="Helvetica"/>
+          <w:kern w:val="0"/>
+          <w:lang w:val="en-US"/>
+        </w:rPr>
+        <w:t>?</w:t>
+      </w:r>
     </w:p>
     <w:p>
       <w:pPr>
@@ -589,7 +647,7 @@
       <w:r>
         <w:rPr>
           <w:rFonts w:ascii="Segoe UI Emoji" w:hAnsi="Segoe UI Emoji" w:cs="Segoe UI Emoji"/>
-          <w:lang w:val="en-FI"/>
+          <w:lang/>
         </w:rPr>
         <w:t>✅</w:t>
       </w:r>
@@ -653,6 +711,7 @@
         <w:rPr>
           <w:lang w:val="en-US"/>
         </w:rPr>
+        <w:lastRenderedPageBreak/>
         <w:t xml:space="preserve">TABLE F: </w:t>
       </w:r>
       <w:proofErr w:type="spellStart"/>
@@ -672,7 +731,7 @@
       <w:r>
         <w:rPr>
           <w:rFonts w:ascii="Segoe UI Emoji" w:hAnsi="Segoe UI Emoji" w:cs="Segoe UI Emoji"/>
-          <w:lang w:val="en-FI"/>
+          <w:lang/>
         </w:rPr>
         <w:t>✅</w:t>
       </w:r>
@@ -799,7 +858,7 @@
           <w:numId w:val="13"/>
         </w:numPr>
         <w:rPr>
-          <w:lang w:val="en-FI"/>
+          <w:lang/>
         </w:rPr>
       </w:pPr>
       <w:r>
@@ -837,13 +896,13 @@
       <w:r>
         <w:rPr>
           <w:rFonts w:ascii="Segoe UI Emoji" w:hAnsi="Segoe UI Emoji" w:cs="Segoe UI Emoji"/>
-          <w:lang w:val="en-FI"/>
+          <w:lang/>
         </w:rPr>
         <w:t>✅</w:t>
       </w:r>
       <w:r>
         <w:rPr>
-          <w:lang w:val="en-FI"/>
+          <w:lang/>
         </w:rPr>
         <w:t xml:space="preserve"> </w:t>
       </w:r>
@@ -874,7 +933,7 @@
           <w:numId w:val="13"/>
         </w:numPr>
         <w:rPr>
-          <w:lang w:val="en-FI"/>
+          <w:lang/>
         </w:rPr>
       </w:pPr>
       <w:r>
@@ -924,13 +983,13 @@
       <w:r>
         <w:rPr>
           <w:rFonts w:ascii="Segoe UI Emoji" w:hAnsi="Segoe UI Emoji" w:cs="Segoe UI Emoji"/>
-          <w:lang w:val="en-FI"/>
+          <w:lang/>
         </w:rPr>
         <w:t>✅</w:t>
       </w:r>
       <w:r>
         <w:rPr>
-          <w:lang w:val="en-FI"/>
+          <w:lang/>
         </w:rPr>
         <w:t xml:space="preserve"> </w:t>
       </w:r>
@@ -1350,13 +1409,27 @@
         <w:rPr>
           <w:lang w:val="en-US"/>
         </w:rPr>
-        <w:t xml:space="preserve"> (testing)</w:t>
-      </w:r>
-      <w:r>
-        <w:rPr>
-          <w:lang w:val="en-US"/>
-        </w:rPr>
-        <w:t xml:space="preserve">  - DONE</w:t>
+        <w:t xml:space="preserve"> (</w:t>
+      </w:r>
+      <w:proofErr w:type="gramStart"/>
+      <w:r>
+        <w:rPr>
+          <w:lang w:val="en-US"/>
+        </w:rPr>
+        <w:t>testing)</w:t>
+      </w:r>
+      <w:r>
+        <w:rPr>
+          <w:lang w:val="en-US"/>
+        </w:rPr>
+        <w:t xml:space="preserve">  -</w:t>
+      </w:r>
+      <w:proofErr w:type="gramEnd"/>
+      <w:r>
+        <w:rPr>
+          <w:lang w:val="en-US"/>
+        </w:rPr>
+        <w:t xml:space="preserve"> DONE</w:t>
       </w:r>
     </w:p>
     <w:p>
@@ -4066,7 +4139,7 @@
         <w:kern w:val="2"/>
         <w:sz w:val="24"/>
         <w:szCs w:val="24"/>
-        <w:lang w:val="en-FI" w:eastAsia="en-US" w:bidi="ar-SA"/>
+        <w:lang w:eastAsia="en-US" w:bidi="ar-SA"/>
         <w14:ligatures w14:val="standardContextual"/>
       </w:rPr>
     </w:rPrDefault>

</xml_diff>

<commit_message>
update am TO DO for today
</commit_message>
<xml_diff>
--- a/documents/2026/FDI_TO_DO.docx
+++ b/documents/2026/FDI_TO_DO.docx
@@ -59,6 +59,116 @@
           <w:bCs/>
           <w:lang w:val="en-US"/>
         </w:rPr>
+        <w:t>15/06/2026</w:t>
+      </w:r>
+    </w:p>
+    <w:p>
+      <w:pPr>
+        <w:pStyle w:val="ListParagraph"/>
+        <w:numPr>
+          <w:ilvl w:val="0"/>
+          <w:numId w:val="21"/>
+        </w:numPr>
+        <w:rPr>
+          <w:lang w:val="en-US"/>
+        </w:rPr>
+      </w:pPr>
+      <w:r>
+        <w:rPr>
+          <w:lang w:val="en-US"/>
+        </w:rPr>
+        <w:t xml:space="preserve">Replace </w:t>
+      </w:r>
+      <w:proofErr w:type="spellStart"/>
+      <w:r>
+        <w:rPr>
+          <w:lang w:val="en-US"/>
+        </w:rPr>
+        <w:t>shorelog</w:t>
+      </w:r>
+      <w:proofErr w:type="spellEnd"/>
+      <w:r>
+        <w:rPr>
+          <w:lang w:val="en-US"/>
+        </w:rPr>
+        <w:t xml:space="preserve"> vessel length VL0010 with VL0812 </w:t>
+      </w:r>
+      <w:r>
+        <w:rPr>
+          <w:lang w:val="en-US"/>
+        </w:rPr>
+        <w:sym w:font="Wingdings" w:char="F0E0"/>
+      </w:r>
+    </w:p>
+    <w:p>
+      <w:pPr>
+        <w:jc w:val="center"/>
+        <w:rPr>
+          <w:lang w:val="en-US"/>
+        </w:rPr>
+      </w:pPr>
+      <w:r>
+        <w:rPr>
+          <w:lang w:val="en-US"/>
+        </w:rPr>
+        <w:drawing>
+          <wp:inline distT="0" distB="0" distL="0" distR="0" wp14:anchorId="246A9859" wp14:editId="28635C7C">
+            <wp:extent cx="3505504" cy="3086367"/>
+            <wp:effectExtent l="0" t="0" r="0" b="0"/>
+            <wp:docPr id="1301490541" name="Picture 1"/>
+            <wp:cNvGraphicFramePr>
+              <a:graphicFrameLocks xmlns:a="http://schemas.openxmlformats.org/drawingml/2006/main" noChangeAspect="1"/>
+            </wp:cNvGraphicFramePr>
+            <a:graphic xmlns:a="http://schemas.openxmlformats.org/drawingml/2006/main">
+              <a:graphicData uri="http://schemas.openxmlformats.org/drawingml/2006/picture">
+                <pic:pic xmlns:pic="http://schemas.openxmlformats.org/drawingml/2006/picture">
+                  <pic:nvPicPr>
+                    <pic:cNvPr id="1301490541" name=""/>
+                    <pic:cNvPicPr/>
+                  </pic:nvPicPr>
+                  <pic:blipFill>
+                    <a:blip r:embed="rId5"/>
+                    <a:stretch>
+                      <a:fillRect/>
+                    </a:stretch>
+                  </pic:blipFill>
+                  <pic:spPr>
+                    <a:xfrm>
+                      <a:off x="0" y="0"/>
+                      <a:ext cx="3505504" cy="3086367"/>
+                    </a:xfrm>
+                    <a:prstGeom prst="rect">
+                      <a:avLst/>
+                    </a:prstGeom>
+                  </pic:spPr>
+                </pic:pic>
+              </a:graphicData>
+            </a:graphic>
+          </wp:inline>
+        </w:drawing>
+      </w:r>
+    </w:p>
+    <w:p>
+      <w:pPr>
+        <w:rPr>
+          <w:lang w:val="en-US"/>
+        </w:rPr>
+      </w:pPr>
+    </w:p>
+    <w:p>
+      <w:pPr>
+        <w:rPr>
+          <w:b/>
+          <w:bCs/>
+          <w:lang w:val="en-US"/>
+        </w:rPr>
+      </w:pPr>
+      <w:r>
+        <w:rPr>
+          <w:b/>
+          <w:bCs/>
+          <w:lang w:val="en-US"/>
+        </w:rPr>
         <w:t>12/06/2026</w:t>
       </w:r>
     </w:p>
@@ -73,6 +183,463 @@
           <w:lang w:val="en-US"/>
         </w:rPr>
       </w:pPr>
+      <w:r>
+        <w:rPr>
+          <w:lang w:val="en-US"/>
+        </w:rPr>
+        <w:t xml:space="preserve">Go through last </w:t>
+      </w:r>
+      <w:proofErr w:type="gramStart"/>
+      <w:r>
+        <w:rPr>
+          <w:lang w:val="en-US"/>
+        </w:rPr>
+        <w:t>years’</w:t>
+      </w:r>
+      <w:proofErr w:type="gramEnd"/>
+      <w:r>
+        <w:rPr>
+          <w:lang w:val="en-US"/>
+        </w:rPr>
+        <w:t xml:space="preserve"> </w:t>
+      </w:r>
+      <w:proofErr w:type="spellStart"/>
+      <w:r>
+        <w:rPr>
+          <w:lang w:val="en-US"/>
+        </w:rPr>
+        <w:t>sas</w:t>
+      </w:r>
+      <w:proofErr w:type="spellEnd"/>
+      <w:r>
+        <w:rPr>
+          <w:lang w:val="en-US"/>
+        </w:rPr>
+        <w:t xml:space="preserve"> integration logic</w:t>
+      </w:r>
+    </w:p>
+    <w:p>
+      <w:pPr>
+        <w:pStyle w:val="ListParagraph"/>
+        <w:numPr>
+          <w:ilvl w:val="0"/>
+          <w:numId w:val="20"/>
+        </w:numPr>
+        <w:rPr>
+          <w:lang w:val="en-US"/>
+        </w:rPr>
+      </w:pPr>
+      <w:r>
+        <w:rPr>
+          <w:lang w:val="en-US"/>
+        </w:rPr>
+        <w:t>Import raw from 2025 back into script</w:t>
+      </w:r>
+      <w:r>
+        <w:rPr>
+          <w:lang w:val="en-US"/>
+        </w:rPr>
+        <w:t xml:space="preserve"> and rerun</w:t>
+      </w:r>
+    </w:p>
+    <w:p>
+      <w:pPr>
+        <w:pStyle w:val="ListParagraph"/>
+        <w:numPr>
+          <w:ilvl w:val="1"/>
+          <w:numId w:val="20"/>
+        </w:numPr>
+        <w:rPr>
+          <w:lang w:val="en-US"/>
+        </w:rPr>
+      </w:pPr>
+      <w:r>
+        <w:rPr>
+          <w:lang w:val="en-US"/>
+        </w:rPr>
+        <w:sym w:font="Wingdings" w:char="F04C"/>
+      </w:r>
+      <w:r>
+        <w:rPr>
+          <w:lang w:val="en-US"/>
+        </w:rPr>
+        <w:sym w:font="Wingdings" w:char="F04E"/>
+      </w:r>
+      <w:r>
+        <w:rPr>
+          <w:lang w:val="en-US"/>
+        </w:rPr>
+        <w:t xml:space="preserve"> I don’t think we saved the cleaned version to DCPROD</w:t>
+      </w:r>
+    </w:p>
+    <w:p>
+      <w:pPr>
+        <w:pStyle w:val="ListParagraph"/>
+        <w:numPr>
+          <w:ilvl w:val="0"/>
+          <w:numId w:val="20"/>
+        </w:numPr>
+        <w:rPr>
+          <w:lang w:val="en-US"/>
+        </w:rPr>
+      </w:pPr>
+      <w:r>
+        <w:rPr>
+          <w:lang w:val="en-US"/>
+        </w:rPr>
+        <w:t>Vessel length in script</w:t>
+      </w:r>
+    </w:p>
+    <w:p>
+      <w:pPr>
+        <w:pStyle w:val="ListParagraph"/>
+        <w:numPr>
+          <w:ilvl w:val="1"/>
+          <w:numId w:val="20"/>
+        </w:numPr>
+        <w:rPr>
+          <w:rFonts w:ascii="Miriam Fixed" w:hAnsi="Miriam Fixed" w:cs="Miriam Fixed"/>
+          <w:u w:val="single"/>
+        </w:rPr>
+      </w:pPr>
+      <w:r>
+        <w:rPr>
+          <w:lang w:val="en-US"/>
+        </w:rPr>
+        <w:t xml:space="preserve">Logbook: </w:t>
+      </w:r>
+      <w:r>
+        <w:rPr>
+          <w:lang w:val="en-US"/>
+        </w:rPr>
+        <w:t xml:space="preserve">see chunk </w:t>
+      </w:r>
+      <w:proofErr w:type="gramStart"/>
+      <w:r>
+        <w:rPr>
+          <w:rFonts w:ascii="Miriam Fixed" w:hAnsi="Miriam Fixed" w:cs="Miriam Fixed" w:hint="cs"/>
+          <w:u w:val="single"/>
+          <w:lang w:val="en-US"/>
+        </w:rPr>
+        <w:t>clean-logboo</w:t>
+      </w:r>
+      <w:r>
+        <w:rPr>
+          <w:rFonts w:ascii="Miriam Fixed" w:hAnsi="Miriam Fixed" w:cs="Miriam Fixed" w:hint="cs"/>
+          <w:u w:val="single"/>
+          <w:lang w:val="en-US"/>
+        </w:rPr>
+        <w:t>k</w:t>
+      </w:r>
+      <w:proofErr w:type="gramEnd"/>
+      <w:r>
+        <w:rPr>
+          <w:rFonts w:ascii="Miriam Fixed" w:hAnsi="Miriam Fixed" w:cs="Miriam Fixed"/>
+          <w:u w:val="single"/>
+          <w:lang w:val="en-US"/>
+        </w:rPr>
+        <w:t xml:space="preserve"> </w:t>
+      </w:r>
+      <w:r>
+        <w:rPr>
+          <w:rFonts w:ascii="Miriam Fixed" w:hAnsi="Miriam Fixed" w:cs="Miriam Fixed"/>
+          <w:u w:val="single"/>
+          <w:lang w:val="en-US"/>
+        </w:rPr>
+        <w:sym w:font="Wingdings" w:char="F0E0"/>
+      </w:r>
+      <w:r>
+        <w:rPr>
+          <w:rFonts w:ascii="Miriam Fixed" w:hAnsi="Miriam Fixed" w:cs="Miriam Fixed"/>
+          <w:u w:val="single"/>
+          <w:lang w:val="en-US"/>
+        </w:rPr>
+        <w:t xml:space="preserve"> </w:t>
+      </w:r>
+      <w:r>
+        <w:rPr>
+          <w:rFonts w:ascii="Segoe UI Emoji" w:hAnsi="Segoe UI Emoji" w:cs="Segoe UI Emoji"/>
+          <w:u w:val="single"/>
+        </w:rPr>
+        <w:t>✅</w:t>
+      </w:r>
+      <w:r>
+        <w:rPr>
+          <w:rFonts w:ascii="Miriam Fixed" w:hAnsi="Miriam Fixed" w:cs="Miriam Fixed"/>
+          <w:u w:val="single"/>
+        </w:rPr>
+        <w:t xml:space="preserve"> </w:t>
+      </w:r>
+    </w:p>
+    <w:p>
+      <w:pPr>
+        <w:rPr>
+          <w:noProof/>
+        </w:rPr>
+      </w:pPr>
+      <w:r>
+        <w:rPr>
+          <w:lang w:val="en-US"/>
+        </w:rPr>
+        <w:lastRenderedPageBreak/>
+        <w:drawing>
+          <wp:inline distT="0" distB="0" distL="0" distR="0" wp14:anchorId="531A49BB" wp14:editId="3B74A859">
+            <wp:extent cx="2570780" cy="3753852"/>
+            <wp:effectExtent l="0" t="0" r="1270" b="0"/>
+            <wp:docPr id="1838559976" name="Picture 1"/>
+            <wp:cNvGraphicFramePr>
+              <a:graphicFrameLocks xmlns:a="http://schemas.openxmlformats.org/drawingml/2006/main" noChangeAspect="1"/>
+            </wp:cNvGraphicFramePr>
+            <a:graphic xmlns:a="http://schemas.openxmlformats.org/drawingml/2006/main">
+              <a:graphicData uri="http://schemas.openxmlformats.org/drawingml/2006/picture">
+                <pic:pic xmlns:pic="http://schemas.openxmlformats.org/drawingml/2006/picture">
+                  <pic:nvPicPr>
+                    <pic:cNvPr id="1838559976" name=""/>
+                    <pic:cNvPicPr/>
+                  </pic:nvPicPr>
+                  <pic:blipFill>
+                    <a:blip r:embed="rId6"/>
+                    <a:stretch>
+                      <a:fillRect/>
+                    </a:stretch>
+                  </pic:blipFill>
+                  <pic:spPr>
+                    <a:xfrm>
+                      <a:off x="0" y="0"/>
+                      <a:ext cx="2575940" cy="3761386"/>
+                    </a:xfrm>
+                    <a:prstGeom prst="rect">
+                      <a:avLst/>
+                    </a:prstGeom>
+                  </pic:spPr>
+                </pic:pic>
+              </a:graphicData>
+            </a:graphic>
+          </wp:inline>
+        </w:drawing>
+      </w:r>
+      <w:r>
+        <w:rPr>
+          <w:noProof/>
+        </w:rPr>
+        <w:t xml:space="preserve"> </w:t>
+      </w:r>
+      <w:r>
+        <w:rPr>
+          <w:lang w:val="en-US"/>
+        </w:rPr>
+        <w:drawing>
+          <wp:inline distT="0" distB="0" distL="0" distR="0" wp14:anchorId="12C0335C" wp14:editId="0333D7C2">
+            <wp:extent cx="3119418" cy="4499810"/>
+            <wp:effectExtent l="0" t="0" r="5080" b="0"/>
+            <wp:docPr id="1262524936" name="Picture 1"/>
+            <wp:cNvGraphicFramePr>
+              <a:graphicFrameLocks xmlns:a="http://schemas.openxmlformats.org/drawingml/2006/main" noChangeAspect="1"/>
+            </wp:cNvGraphicFramePr>
+            <a:graphic xmlns:a="http://schemas.openxmlformats.org/drawingml/2006/main">
+              <a:graphicData uri="http://schemas.openxmlformats.org/drawingml/2006/picture">
+                <pic:pic xmlns:pic="http://schemas.openxmlformats.org/drawingml/2006/picture">
+                  <pic:nvPicPr>
+                    <pic:cNvPr id="1262524936" name=""/>
+                    <pic:cNvPicPr/>
+                  </pic:nvPicPr>
+                  <pic:blipFill>
+                    <a:blip r:embed="rId7"/>
+                    <a:stretch>
+                      <a:fillRect/>
+                    </a:stretch>
+                  </pic:blipFill>
+                  <pic:spPr>
+                    <a:xfrm>
+                      <a:off x="0" y="0"/>
+                      <a:ext cx="3120132" cy="4500840"/>
+                    </a:xfrm>
+                    <a:prstGeom prst="rect">
+                      <a:avLst/>
+                    </a:prstGeom>
+                  </pic:spPr>
+                </pic:pic>
+              </a:graphicData>
+            </a:graphic>
+          </wp:inline>
+        </w:drawing>
+      </w:r>
+    </w:p>
+    <w:p>
+      <w:pPr>
+        <w:pStyle w:val="ListParagraph"/>
+        <w:numPr>
+          <w:ilvl w:val="1"/>
+          <w:numId w:val="20"/>
+        </w:numPr>
+        <w:rPr>
+          <w:rFonts w:ascii="Miriam Fixed" w:hAnsi="Miriam Fixed" w:cs="Miriam Fixed"/>
+          <w:u w:val="single"/>
+        </w:rPr>
+      </w:pPr>
+      <w:proofErr w:type="spellStart"/>
+      <w:r>
+        <w:rPr>
+          <w:lang w:val="en-US"/>
+        </w:rPr>
+        <w:t>Shorelogs</w:t>
+      </w:r>
+      <w:proofErr w:type="spellEnd"/>
+      <w:r>
+        <w:rPr>
+          <w:lang w:val="en-US"/>
+        </w:rPr>
+        <w:t xml:space="preserve">: see chunk </w:t>
+      </w:r>
+      <w:r>
+        <w:rPr>
+          <w:rFonts w:ascii="Miriam Fixed" w:hAnsi="Miriam Fixed" w:cs="Miriam Fixed" w:hint="cs"/>
+          <w:u w:val="single"/>
+          <w:lang w:val="en-US"/>
+        </w:rPr>
+        <w:t>clean-</w:t>
+      </w:r>
+      <w:proofErr w:type="spellStart"/>
+      <w:r>
+        <w:rPr>
+          <w:rFonts w:ascii="Miriam Fixed" w:hAnsi="Miriam Fixed" w:cs="Miriam Fixed" w:hint="cs"/>
+          <w:u w:val="single"/>
+          <w:lang w:val="en-US"/>
+        </w:rPr>
+        <w:t>shorelogs</w:t>
+      </w:r>
+      <w:proofErr w:type="spellEnd"/>
+      <w:r>
+        <w:rPr>
+          <w:rFonts w:ascii="Miriam Fixed" w:hAnsi="Miriam Fixed" w:cs="Miriam Fixed"/>
+          <w:u w:val="single"/>
+          <w:lang w:val="en-US"/>
+        </w:rPr>
+        <w:t xml:space="preserve"> </w:t>
+      </w:r>
+      <w:r>
+        <w:rPr>
+          <w:rFonts w:ascii="Segoe UI Emoji" w:hAnsi="Segoe UI Emoji" w:cs="Segoe UI Emoji"/>
+          <w:u w:val="single"/>
+        </w:rPr>
+        <w:t>❌</w:t>
+      </w:r>
+    </w:p>
+    <w:p>
+      <w:pPr>
+        <w:pStyle w:val="ListParagraph"/>
+        <w:ind w:left="1440"/>
+        <w:rPr>
+          <w:lang w:val="en-US"/>
+        </w:rPr>
+      </w:pPr>
+    </w:p>
+    <w:p>
+      <w:pPr>
+        <w:rPr>
+          <w:noProof/>
+        </w:rPr>
+      </w:pPr>
+      <w:r>
+        <w:rPr>
+          <w:lang w:val="en-US"/>
+        </w:rPr>
+        <w:drawing>
+          <wp:inline distT="0" distB="0" distL="0" distR="0" wp14:anchorId="6CD656A8" wp14:editId="0A804541">
+            <wp:extent cx="2422358" cy="1376051"/>
+            <wp:effectExtent l="0" t="0" r="0" b="0"/>
+            <wp:docPr id="1665001468" name="Picture 1"/>
+            <wp:cNvGraphicFramePr>
+              <a:graphicFrameLocks xmlns:a="http://schemas.openxmlformats.org/drawingml/2006/main" noChangeAspect="1"/>
+            </wp:cNvGraphicFramePr>
+            <a:graphic xmlns:a="http://schemas.openxmlformats.org/drawingml/2006/main">
+              <a:graphicData uri="http://schemas.openxmlformats.org/drawingml/2006/picture">
+                <pic:pic xmlns:pic="http://schemas.openxmlformats.org/drawingml/2006/picture">
+                  <pic:nvPicPr>
+                    <pic:cNvPr id="1665001468" name=""/>
+                    <pic:cNvPicPr/>
+                  </pic:nvPicPr>
+                  <pic:blipFill>
+                    <a:blip r:embed="rId8"/>
+                    <a:stretch>
+                      <a:fillRect/>
+                    </a:stretch>
+                  </pic:blipFill>
+                  <pic:spPr>
+                    <a:xfrm>
+                      <a:off x="0" y="0"/>
+                      <a:ext cx="2433244" cy="1382235"/>
+                    </a:xfrm>
+                    <a:prstGeom prst="rect">
+                      <a:avLst/>
+                    </a:prstGeom>
+                  </pic:spPr>
+                </pic:pic>
+              </a:graphicData>
+            </a:graphic>
+          </wp:inline>
+        </w:drawing>
+      </w:r>
+      <w:r>
+        <w:rPr>
+          <w:noProof/>
+        </w:rPr>
+        <w:t xml:space="preserve"> </w:t>
+      </w:r>
+      <w:r>
+        <w:rPr>
+          <w:lang w:val="en-US"/>
+        </w:rPr>
+        <w:drawing>
+          <wp:inline distT="0" distB="0" distL="0" distR="0" wp14:anchorId="340767ED" wp14:editId="047DB7E8">
+            <wp:extent cx="2951747" cy="3114648"/>
+            <wp:effectExtent l="0" t="0" r="1270" b="0"/>
+            <wp:docPr id="1225379478" name="Picture 1"/>
+            <wp:cNvGraphicFramePr>
+              <a:graphicFrameLocks xmlns:a="http://schemas.openxmlformats.org/drawingml/2006/main" noChangeAspect="1"/>
+            </wp:cNvGraphicFramePr>
+            <a:graphic xmlns:a="http://schemas.openxmlformats.org/drawingml/2006/main">
+              <a:graphicData uri="http://schemas.openxmlformats.org/drawingml/2006/picture">
+                <pic:pic xmlns:pic="http://schemas.openxmlformats.org/drawingml/2006/picture">
+                  <pic:nvPicPr>
+                    <pic:cNvPr id="1225379478" name=""/>
+                    <pic:cNvPicPr/>
+                  </pic:nvPicPr>
+                  <pic:blipFill>
+                    <a:blip r:embed="rId9"/>
+                    <a:stretch>
+                      <a:fillRect/>
+                    </a:stretch>
+                  </pic:blipFill>
+                  <pic:spPr>
+                    <a:xfrm>
+                      <a:off x="0" y="0"/>
+                      <a:ext cx="2982805" cy="3147420"/>
+                    </a:xfrm>
+                    <a:prstGeom prst="rect">
+                      <a:avLst/>
+                    </a:prstGeom>
+                  </pic:spPr>
+                </pic:pic>
+              </a:graphicData>
+            </a:graphic>
+          </wp:inline>
+        </w:drawing>
+      </w:r>
+    </w:p>
+    <w:p>
+      <w:pPr>
+        <w:rPr>
+          <w:noProof/>
+        </w:rPr>
+      </w:pPr>
+    </w:p>
+    <w:p>
+      <w:pPr>
+        <w:rPr>
+          <w:lang w:val="en-US"/>
+        </w:rPr>
+      </w:pPr>
     </w:p>
     <w:p>
       <w:pPr>
@@ -106,7 +673,14 @@
         <w:rPr>
           <w:lang w:val="en-US"/>
         </w:rPr>
-        <w:t>Go through last years</w:t>
+        <w:t xml:space="preserve">Go through last </w:t>
+      </w:r>
+      <w:proofErr w:type="gramStart"/>
+      <w:r>
+        <w:rPr>
+          <w:lang w:val="en-US"/>
+        </w:rPr>
+        <w:t>years</w:t>
       </w:r>
       <w:r>
         <w:rPr>
@@ -114,6 +688,7 @@
         </w:rPr>
         <w:t>’</w:t>
       </w:r>
+      <w:proofErr w:type="gramEnd"/>
       <w:r>
         <w:rPr>
           <w:lang w:val="en-US"/>
@@ -452,7 +1027,7 @@
                     <pic:cNvPicPr/>
                   </pic:nvPicPr>
                   <pic:blipFill>
-                    <a:blip r:embed="rId5"/>
+                    <a:blip r:embed="rId10"/>
                     <a:stretch>
                       <a:fillRect/>
                     </a:stretch>
@@ -751,6 +1326,7 @@
           <w:strike/>
           <w:lang w:val="en-US"/>
         </w:rPr>
+        <w:lastRenderedPageBreak/>
         <w:t>Starting to i</w:t>
       </w:r>
       <w:r>
@@ -1078,7 +1654,14 @@
         <w:rPr>
           <w:lang w:val="en-US"/>
         </w:rPr>
-        <w:t xml:space="preserve">Table f </w:t>
+        <w:t xml:space="preserve">Table </w:t>
+      </w:r>
+      <w:proofErr w:type="gramStart"/>
+      <w:r>
+        <w:rPr>
+          <w:lang w:val="en-US"/>
+        </w:rPr>
+        <w:t xml:space="preserve">f </w:t>
       </w:r>
       <w:proofErr w:type="spellStart"/>
       <w:r>
@@ -1088,6 +1671,7 @@
         <w:t>Rmd</w:t>
       </w:r>
       <w:proofErr w:type="spellEnd"/>
+      <w:proofErr w:type="gramEnd"/>
       <w:r>
         <w:rPr>
           <w:lang w:val="en-US"/>
@@ -1350,13 +1934,27 @@
         <w:rPr>
           <w:lang w:val="en-US"/>
         </w:rPr>
-        <w:t xml:space="preserve"> (testing)</w:t>
-      </w:r>
-      <w:r>
-        <w:rPr>
-          <w:lang w:val="en-US"/>
-        </w:rPr>
-        <w:t xml:space="preserve">  - DONE</w:t>
+        <w:t xml:space="preserve"> (</w:t>
+      </w:r>
+      <w:proofErr w:type="gramStart"/>
+      <w:r>
+        <w:rPr>
+          <w:lang w:val="en-US"/>
+        </w:rPr>
+        <w:t>testing)</w:t>
+      </w:r>
+      <w:r>
+        <w:rPr>
+          <w:lang w:val="en-US"/>
+        </w:rPr>
+        <w:t xml:space="preserve">  -</w:t>
+      </w:r>
+      <w:proofErr w:type="gramEnd"/>
+      <w:r>
+        <w:rPr>
+          <w:lang w:val="en-US"/>
+        </w:rPr>
+        <w:t xml:space="preserve"> DONE</w:t>
       </w:r>
     </w:p>
     <w:p>
@@ -1622,7 +2220,6 @@
         <w:rPr>
           <w:lang w:val="en-US"/>
         </w:rPr>
-        <w:lastRenderedPageBreak/>
         <w:t>A fishing trip is approximated by reported fishing days, aggregated from monthly reports by taking the maximum number of fishing days per vessel–month–</w:t>
       </w:r>
       <w:proofErr w:type="spellStart"/>
@@ -1677,7 +2274,7 @@
                     </pic:cNvPicPr>
                   </pic:nvPicPr>
                   <pic:blipFill>
-                    <a:blip r:embed="rId6">
+                    <a:blip r:embed="rId11">
                       <a:extLst>
                         <a:ext uri="{28A0092B-C50C-407E-A947-70E740481C1C}">
                           <a14:useLocalDpi xmlns:a14="http://schemas.microsoft.com/office/drawing/2010/main" val="0"/>
@@ -1762,7 +2359,7 @@
         <w:rFonts w:ascii="Symbol" w:hAnsi="Symbol" w:hint="default"/>
       </w:rPr>
     </w:lvl>
-    <w:lvl w:ilvl="1" w:tplc="08090003" w:tentative="1">
+    <w:lvl w:ilvl="1" w:tplc="08090003">
       <w:start w:val="1"/>
       <w:numFmt w:val="bullet"/>
       <w:lvlText w:val="o"/>
@@ -3096,6 +3693,119 @@
     </w:lvl>
   </w:abstractNum>
   <w:abstractNum w:abstractNumId="12" w15:restartNumberingAfterBreak="0">
+    <w:nsid w:val="3BA86148"/>
+    <w:multiLevelType w:val="hybridMultilevel"/>
+    <w:tmpl w:val="8CA86A1E"/>
+    <w:lvl w:ilvl="0" w:tplc="08090001">
+      <w:start w:val="1"/>
+      <w:numFmt w:val="bullet"/>
+      <w:lvlText w:val=""/>
+      <w:lvlJc w:val="left"/>
+      <w:pPr>
+        <w:ind w:left="720" w:hanging="360"/>
+      </w:pPr>
+      <w:rPr>
+        <w:rFonts w:ascii="Symbol" w:hAnsi="Symbol" w:hint="default"/>
+      </w:rPr>
+    </w:lvl>
+    <w:lvl w:ilvl="1" w:tplc="08090003" w:tentative="1">
+      <w:start w:val="1"/>
+      <w:numFmt w:val="bullet"/>
+      <w:lvlText w:val="o"/>
+      <w:lvlJc w:val="left"/>
+      <w:pPr>
+        <w:ind w:left="1440" w:hanging="360"/>
+      </w:pPr>
+      <w:rPr>
+        <w:rFonts w:ascii="Courier New" w:hAnsi="Courier New" w:cs="Courier New" w:hint="default"/>
+      </w:rPr>
+    </w:lvl>
+    <w:lvl w:ilvl="2" w:tplc="08090005" w:tentative="1">
+      <w:start w:val="1"/>
+      <w:numFmt w:val="bullet"/>
+      <w:lvlText w:val=""/>
+      <w:lvlJc w:val="left"/>
+      <w:pPr>
+        <w:ind w:left="2160" w:hanging="360"/>
+      </w:pPr>
+      <w:rPr>
+        <w:rFonts w:ascii="Wingdings" w:hAnsi="Wingdings" w:hint="default"/>
+      </w:rPr>
+    </w:lvl>
+    <w:lvl w:ilvl="3" w:tplc="08090001" w:tentative="1">
+      <w:start w:val="1"/>
+      <w:numFmt w:val="bullet"/>
+      <w:lvlText w:val=""/>
+      <w:lvlJc w:val="left"/>
+      <w:pPr>
+        <w:ind w:left="2880" w:hanging="360"/>
+      </w:pPr>
+      <w:rPr>
+        <w:rFonts w:ascii="Symbol" w:hAnsi="Symbol" w:hint="default"/>
+      </w:rPr>
+    </w:lvl>
+    <w:lvl w:ilvl="4" w:tplc="08090003" w:tentative="1">
+      <w:start w:val="1"/>
+      <w:numFmt w:val="bullet"/>
+      <w:lvlText w:val="o"/>
+      <w:lvlJc w:val="left"/>
+      <w:pPr>
+        <w:ind w:left="3600" w:hanging="360"/>
+      </w:pPr>
+      <w:rPr>
+        <w:rFonts w:ascii="Courier New" w:hAnsi="Courier New" w:cs="Courier New" w:hint="default"/>
+      </w:rPr>
+    </w:lvl>
+    <w:lvl w:ilvl="5" w:tplc="08090005" w:tentative="1">
+      <w:start w:val="1"/>
+      <w:numFmt w:val="bullet"/>
+      <w:lvlText w:val=""/>
+      <w:lvlJc w:val="left"/>
+      <w:pPr>
+        <w:ind w:left="4320" w:hanging="360"/>
+      </w:pPr>
+      <w:rPr>
+        <w:rFonts w:ascii="Wingdings" w:hAnsi="Wingdings" w:hint="default"/>
+      </w:rPr>
+    </w:lvl>
+    <w:lvl w:ilvl="6" w:tplc="08090001" w:tentative="1">
+      <w:start w:val="1"/>
+      <w:numFmt w:val="bullet"/>
+      <w:lvlText w:val=""/>
+      <w:lvlJc w:val="left"/>
+      <w:pPr>
+        <w:ind w:left="5040" w:hanging="360"/>
+      </w:pPr>
+      <w:rPr>
+        <w:rFonts w:ascii="Symbol" w:hAnsi="Symbol" w:hint="default"/>
+      </w:rPr>
+    </w:lvl>
+    <w:lvl w:ilvl="7" w:tplc="08090003" w:tentative="1">
+      <w:start w:val="1"/>
+      <w:numFmt w:val="bullet"/>
+      <w:lvlText w:val="o"/>
+      <w:lvlJc w:val="left"/>
+      <w:pPr>
+        <w:ind w:left="5760" w:hanging="360"/>
+      </w:pPr>
+      <w:rPr>
+        <w:rFonts w:ascii="Courier New" w:hAnsi="Courier New" w:cs="Courier New" w:hint="default"/>
+      </w:rPr>
+    </w:lvl>
+    <w:lvl w:ilvl="8" w:tplc="08090005" w:tentative="1">
+      <w:start w:val="1"/>
+      <w:numFmt w:val="bullet"/>
+      <w:lvlText w:val=""/>
+      <w:lvlJc w:val="left"/>
+      <w:pPr>
+        <w:ind w:left="6480" w:hanging="360"/>
+      </w:pPr>
+      <w:rPr>
+        <w:rFonts w:ascii="Wingdings" w:hAnsi="Wingdings" w:hint="default"/>
+      </w:rPr>
+    </w:lvl>
+  </w:abstractNum>
+  <w:abstractNum w:abstractNumId="13" w15:restartNumberingAfterBreak="0">
     <w:nsid w:val="47F96F2F"/>
     <w:multiLevelType w:val="hybridMultilevel"/>
     <w:tmpl w:val="7256ACFE"/>
@@ -3207,7 +3917,7 @@
       </w:rPr>
     </w:lvl>
   </w:abstractNum>
-  <w:abstractNum w:abstractNumId="13" w15:restartNumberingAfterBreak="0">
+  <w:abstractNum w:abstractNumId="14" w15:restartNumberingAfterBreak="0">
     <w:nsid w:val="483435CC"/>
     <w:multiLevelType w:val="hybridMultilevel"/>
     <w:tmpl w:val="787CC9BA"/>
@@ -3319,7 +4029,7 @@
       </w:rPr>
     </w:lvl>
   </w:abstractNum>
-  <w:abstractNum w:abstractNumId="14" w15:restartNumberingAfterBreak="0">
+  <w:abstractNum w:abstractNumId="15" w15:restartNumberingAfterBreak="0">
     <w:nsid w:val="49A87142"/>
     <w:multiLevelType w:val="hybridMultilevel"/>
     <w:tmpl w:val="0C047B9C"/>
@@ -3431,7 +4141,7 @@
       </w:rPr>
     </w:lvl>
   </w:abstractNum>
-  <w:abstractNum w:abstractNumId="15" w15:restartNumberingAfterBreak="0">
+  <w:abstractNum w:abstractNumId="16" w15:restartNumberingAfterBreak="0">
     <w:nsid w:val="4C62209E"/>
     <w:multiLevelType w:val="hybridMultilevel"/>
     <w:tmpl w:val="07F6CAEE"/>
@@ -3544,7 +4254,120 @@
       </w:rPr>
     </w:lvl>
   </w:abstractNum>
-  <w:abstractNum w:abstractNumId="16" w15:restartNumberingAfterBreak="0">
+  <w:abstractNum w:abstractNumId="17" w15:restartNumberingAfterBreak="0">
+    <w:nsid w:val="5A9430D7"/>
+    <w:multiLevelType w:val="hybridMultilevel"/>
+    <w:tmpl w:val="B894B5FA"/>
+    <w:lvl w:ilvl="0" w:tplc="08090001">
+      <w:start w:val="1"/>
+      <w:numFmt w:val="bullet"/>
+      <w:lvlText w:val=""/>
+      <w:lvlJc w:val="left"/>
+      <w:pPr>
+        <w:ind w:left="720" w:hanging="360"/>
+      </w:pPr>
+      <w:rPr>
+        <w:rFonts w:ascii="Symbol" w:hAnsi="Symbol" w:hint="default"/>
+      </w:rPr>
+    </w:lvl>
+    <w:lvl w:ilvl="1" w:tplc="08090003" w:tentative="1">
+      <w:start w:val="1"/>
+      <w:numFmt w:val="bullet"/>
+      <w:lvlText w:val="o"/>
+      <w:lvlJc w:val="left"/>
+      <w:pPr>
+        <w:ind w:left="1440" w:hanging="360"/>
+      </w:pPr>
+      <w:rPr>
+        <w:rFonts w:ascii="Courier New" w:hAnsi="Courier New" w:cs="Courier New" w:hint="default"/>
+      </w:rPr>
+    </w:lvl>
+    <w:lvl w:ilvl="2" w:tplc="08090005" w:tentative="1">
+      <w:start w:val="1"/>
+      <w:numFmt w:val="bullet"/>
+      <w:lvlText w:val=""/>
+      <w:lvlJc w:val="left"/>
+      <w:pPr>
+        <w:ind w:left="2160" w:hanging="360"/>
+      </w:pPr>
+      <w:rPr>
+        <w:rFonts w:ascii="Wingdings" w:hAnsi="Wingdings" w:hint="default"/>
+      </w:rPr>
+    </w:lvl>
+    <w:lvl w:ilvl="3" w:tplc="08090001" w:tentative="1">
+      <w:start w:val="1"/>
+      <w:numFmt w:val="bullet"/>
+      <w:lvlText w:val=""/>
+      <w:lvlJc w:val="left"/>
+      <w:pPr>
+        <w:ind w:left="2880" w:hanging="360"/>
+      </w:pPr>
+      <w:rPr>
+        <w:rFonts w:ascii="Symbol" w:hAnsi="Symbol" w:hint="default"/>
+      </w:rPr>
+    </w:lvl>
+    <w:lvl w:ilvl="4" w:tplc="08090003" w:tentative="1">
+      <w:start w:val="1"/>
+      <w:numFmt w:val="bullet"/>
+      <w:lvlText w:val="o"/>
+      <w:lvlJc w:val="left"/>
+      <w:pPr>
+        <w:ind w:left="3600" w:hanging="360"/>
+      </w:pPr>
+      <w:rPr>
+        <w:rFonts w:ascii="Courier New" w:hAnsi="Courier New" w:cs="Courier New" w:hint="default"/>
+      </w:rPr>
+    </w:lvl>
+    <w:lvl w:ilvl="5" w:tplc="08090005" w:tentative="1">
+      <w:start w:val="1"/>
+      <w:numFmt w:val="bullet"/>
+      <w:lvlText w:val=""/>
+      <w:lvlJc w:val="left"/>
+      <w:pPr>
+        <w:ind w:left="4320" w:hanging="360"/>
+      </w:pPr>
+      <w:rPr>
+        <w:rFonts w:ascii="Wingdings" w:hAnsi="Wingdings" w:hint="default"/>
+      </w:rPr>
+    </w:lvl>
+    <w:lvl w:ilvl="6" w:tplc="08090001" w:tentative="1">
+      <w:start w:val="1"/>
+      <w:numFmt w:val="bullet"/>
+      <w:lvlText w:val=""/>
+      <w:lvlJc w:val="left"/>
+      <w:pPr>
+        <w:ind w:left="5040" w:hanging="360"/>
+      </w:pPr>
+      <w:rPr>
+        <w:rFonts w:ascii="Symbol" w:hAnsi="Symbol" w:hint="default"/>
+      </w:rPr>
+    </w:lvl>
+    <w:lvl w:ilvl="7" w:tplc="08090003" w:tentative="1">
+      <w:start w:val="1"/>
+      <w:numFmt w:val="bullet"/>
+      <w:lvlText w:val="o"/>
+      <w:lvlJc w:val="left"/>
+      <w:pPr>
+        <w:ind w:left="5760" w:hanging="360"/>
+      </w:pPr>
+      <w:rPr>
+        <w:rFonts w:ascii="Courier New" w:hAnsi="Courier New" w:cs="Courier New" w:hint="default"/>
+      </w:rPr>
+    </w:lvl>
+    <w:lvl w:ilvl="8" w:tplc="08090005" w:tentative="1">
+      <w:start w:val="1"/>
+      <w:numFmt w:val="bullet"/>
+      <w:lvlText w:val=""/>
+      <w:lvlJc w:val="left"/>
+      <w:pPr>
+        <w:ind w:left="6480" w:hanging="360"/>
+      </w:pPr>
+      <w:rPr>
+        <w:rFonts w:ascii="Wingdings" w:hAnsi="Wingdings" w:hint="default"/>
+      </w:rPr>
+    </w:lvl>
+  </w:abstractNum>
+  <w:abstractNum w:abstractNumId="18" w15:restartNumberingAfterBreak="0">
     <w:nsid w:val="5FC00F8A"/>
     <w:multiLevelType w:val="hybridMultilevel"/>
     <w:tmpl w:val="9D96EDD4"/>
@@ -3657,7 +4480,7 @@
       </w:rPr>
     </w:lvl>
   </w:abstractNum>
-  <w:abstractNum w:abstractNumId="17" w15:restartNumberingAfterBreak="0">
+  <w:abstractNum w:abstractNumId="19" w15:restartNumberingAfterBreak="0">
     <w:nsid w:val="65070E8D"/>
     <w:multiLevelType w:val="hybridMultilevel"/>
     <w:tmpl w:val="BDB6982A"/>
@@ -3770,7 +4593,7 @@
       </w:rPr>
     </w:lvl>
   </w:abstractNum>
-  <w:abstractNum w:abstractNumId="18" w15:restartNumberingAfterBreak="0">
+  <w:abstractNum w:abstractNumId="20" w15:restartNumberingAfterBreak="0">
     <w:nsid w:val="695A7833"/>
     <w:multiLevelType w:val="hybridMultilevel"/>
     <w:tmpl w:val="E564D540"/>
@@ -3882,7 +4705,7 @@
       </w:rPr>
     </w:lvl>
   </w:abstractNum>
-  <w:abstractNum w:abstractNumId="19" w15:restartNumberingAfterBreak="0">
+  <w:abstractNum w:abstractNumId="21" w15:restartNumberingAfterBreak="0">
     <w:nsid w:val="73B949D2"/>
     <w:multiLevelType w:val="hybridMultilevel"/>
     <w:tmpl w:val="28606D2A"/>
@@ -4001,7 +4824,7 @@
     <w:abstractNumId w:val="2"/>
   </w:num>
   <w:num w:numId="3" w16cid:durableId="1364742651">
-    <w:abstractNumId w:val="16"/>
+    <w:abstractNumId w:val="18"/>
   </w:num>
   <w:num w:numId="4" w16cid:durableId="302855184">
     <w:abstractNumId w:val="5"/>
@@ -4022,37 +4845,43 @@
     <w:abstractNumId w:val="3"/>
   </w:num>
   <w:num w:numId="10" w16cid:durableId="1761370988">
-    <w:abstractNumId w:val="17"/>
+    <w:abstractNumId w:val="19"/>
   </w:num>
   <w:num w:numId="11" w16cid:durableId="1499495752">
-    <w:abstractNumId w:val="12"/>
+    <w:abstractNumId w:val="13"/>
   </w:num>
   <w:num w:numId="12" w16cid:durableId="1412316134">
-    <w:abstractNumId w:val="19"/>
+    <w:abstractNumId w:val="21"/>
   </w:num>
   <w:num w:numId="13" w16cid:durableId="1350258004">
     <w:abstractNumId w:val="7"/>
   </w:num>
   <w:num w:numId="14" w16cid:durableId="1673683661">
-    <w:abstractNumId w:val="14"/>
+    <w:abstractNumId w:val="15"/>
   </w:num>
   <w:num w:numId="15" w16cid:durableId="867064272">
-    <w:abstractNumId w:val="18"/>
+    <w:abstractNumId w:val="20"/>
   </w:num>
   <w:num w:numId="16" w16cid:durableId="7604246">
-    <w:abstractNumId w:val="13"/>
+    <w:abstractNumId w:val="14"/>
   </w:num>
   <w:num w:numId="17" w16cid:durableId="2089039549">
     <w:abstractNumId w:val="8"/>
   </w:num>
   <w:num w:numId="18" w16cid:durableId="595285920">
-    <w:abstractNumId w:val="15"/>
+    <w:abstractNumId w:val="16"/>
   </w:num>
   <w:num w:numId="19" w16cid:durableId="2136634086">
     <w:abstractNumId w:val="10"/>
   </w:num>
   <w:num w:numId="20" w16cid:durableId="411004895">
     <w:abstractNumId w:val="0"/>
+  </w:num>
+  <w:num w:numId="21" w16cid:durableId="1646935873">
+    <w:abstractNumId w:val="17"/>
+  </w:num>
+  <w:num w:numId="22" w16cid:durableId="18512531">
+    <w:abstractNumId w:val="12"/>
   </w:num>
 </w:numbering>
 </file>
@@ -4663,7 +5492,6 @@
   <w:style w:type="character" w:default="1" w:styleId="DefaultParagraphFont">
     <w:name w:val="Default Paragraph Font"/>
     <w:uiPriority w:val="1"/>
-    <w:semiHidden/>
     <w:unhideWhenUsed/>
   </w:style>
   <w:style w:type="table" w:default="1" w:styleId="TableNormal">

</xml_diff>

<commit_message>
code update --> need to save data back to DB next
</commit_message>
<xml_diff>
--- a/documents/2026/FDI_TO_DO.docx
+++ b/documents/2026/FDI_TO_DO.docx
@@ -77,21 +77,7 @@
         <w:rPr>
           <w:lang w:val="en-US"/>
         </w:rPr>
-        <w:t xml:space="preserve">Replace </w:t>
-      </w:r>
-      <w:proofErr w:type="spellStart"/>
-      <w:r>
-        <w:rPr>
-          <w:lang w:val="en-US"/>
-        </w:rPr>
-        <w:t>shorelog</w:t>
-      </w:r>
-      <w:proofErr w:type="spellEnd"/>
-      <w:r>
-        <w:rPr>
-          <w:lang w:val="en-US"/>
-        </w:rPr>
-        <w:t xml:space="preserve"> vessel length VL0010 with VL0812 </w:t>
+        <w:t xml:space="preserve">Replace shorelog vessel length VL0010 with VL0812 </w:t>
       </w:r>
       <w:r>
         <w:rPr>
@@ -109,6 +95,7 @@
       </w:pPr>
       <w:r>
         <w:rPr>
+          <w:noProof/>
           <w:lang w:val="en-US"/>
         </w:rPr>
         <w:drawing>
@@ -150,6 +137,363 @@
     </w:p>
     <w:p>
       <w:pPr>
+        <w:pStyle w:val="ListParagraph"/>
+        <w:numPr>
+          <w:ilvl w:val="0"/>
+          <w:numId w:val="21"/>
+        </w:numPr>
+        <w:rPr>
+          <w:lang w:val="en-US"/>
+        </w:rPr>
+      </w:pPr>
+      <w:r>
+        <w:rPr>
+          <w:lang w:val="en-US"/>
+        </w:rPr>
+        <w:t>Cross check against PITUUS:</w:t>
+      </w:r>
+    </w:p>
+    <w:p>
+      <w:pPr>
+        <w:ind w:left="360"/>
+        <w:rPr>
+          <w:lang w:val="en-US"/>
+        </w:rPr>
+      </w:pPr>
+      <w:r>
+        <w:rPr>
+          <w:lang w:val="en-US"/>
+        </w:rPr>
+        <w:drawing>
+          <wp:inline distT="0" distB="0" distL="0" distR="0" wp14:anchorId="0C20FD64" wp14:editId="68A59E32">
+            <wp:extent cx="2903472" cy="1920406"/>
+            <wp:effectExtent l="0" t="0" r="0" b="3810"/>
+            <wp:docPr id="1785651356" name="Picture 1"/>
+            <wp:cNvGraphicFramePr>
+              <a:graphicFrameLocks xmlns:a="http://schemas.openxmlformats.org/drawingml/2006/main" noChangeAspect="1"/>
+            </wp:cNvGraphicFramePr>
+            <a:graphic xmlns:a="http://schemas.openxmlformats.org/drawingml/2006/main">
+              <a:graphicData uri="http://schemas.openxmlformats.org/drawingml/2006/picture">
+                <pic:pic xmlns:pic="http://schemas.openxmlformats.org/drawingml/2006/picture">
+                  <pic:nvPicPr>
+                    <pic:cNvPr id="1785651356" name=""/>
+                    <pic:cNvPicPr/>
+                  </pic:nvPicPr>
+                  <pic:blipFill>
+                    <a:blip r:embed="rId6"/>
+                    <a:stretch>
+                      <a:fillRect/>
+                    </a:stretch>
+                  </pic:blipFill>
+                  <pic:spPr>
+                    <a:xfrm>
+                      <a:off x="0" y="0"/>
+                      <a:ext cx="2903472" cy="1920406"/>
+                    </a:xfrm>
+                    <a:prstGeom prst="rect">
+                      <a:avLst/>
+                    </a:prstGeom>
+                  </pic:spPr>
+                </pic:pic>
+              </a:graphicData>
+            </a:graphic>
+          </wp:inline>
+        </w:drawing>
+      </w:r>
+    </w:p>
+    <w:p>
+      <w:pPr>
+        <w:ind w:left="360"/>
+        <w:rPr>
+          <w:lang w:val="en-US"/>
+        </w:rPr>
+      </w:pPr>
+      <w:r>
+        <w:rPr>
+          <w:lang w:val="en-US"/>
+        </w:rPr>
+        <w:t xml:space="preserve">Overwrite 33 records where </w:t>
+      </w:r>
+      <w:r>
+        <w:rPr>
+          <w:lang w:val="en-US"/>
+        </w:rPr>
+        <w:t>test (based on PITUUS) does not match VESSEL_LENGTH</w:t>
+      </w:r>
+    </w:p>
+    <w:p>
+      <w:pPr>
+        <w:pStyle w:val="ListParagraph"/>
+        <w:numPr>
+          <w:ilvl w:val="0"/>
+          <w:numId w:val="21"/>
+        </w:numPr>
+        <w:rPr>
+          <w:lang w:val="en-US"/>
+        </w:rPr>
+      </w:pPr>
+      <w:r>
+        <w:rPr>
+          <w:lang w:val="en-US"/>
+        </w:rPr>
+        <w:t>Save clean data back to DCRPOD (Pertuu??? I don’t have permissions</w:t>
+      </w:r>
+      <w:r>
+        <w:rPr>
+          <w:lang w:val="en-US"/>
+        </w:rPr>
+        <w:t>)</w:t>
+      </w:r>
+    </w:p>
+    <w:p>
+      <w:pPr>
+        <w:pStyle w:val="ListParagraph"/>
+        <w:numPr>
+          <w:ilvl w:val="1"/>
+          <w:numId w:val="21"/>
+        </w:numPr>
+        <w:rPr>
+          <w:lang w:val="en-US"/>
+        </w:rPr>
+      </w:pPr>
+      <w:r>
+        <w:rPr>
+          <w:lang w:val="en-US"/>
+        </w:rPr>
+        <w:t>Chunk 23: fecR-logbooks</w:t>
+      </w:r>
+      <w:r>
+        <w:rPr>
+          <w:lang w:val="en-US"/>
+        </w:rPr>
+        <w:t xml:space="preserve"> </w:t>
+      </w:r>
+      <w:r>
+        <w:rPr>
+          <w:lang w:val="en-US"/>
+        </w:rPr>
+        <w:sym w:font="Wingdings" w:char="F0E0"/>
+      </w:r>
+      <w:r>
+        <w:rPr>
+          <w:lang w:val="en-US"/>
+        </w:rPr>
+        <w:t xml:space="preserve"> </w:t>
+      </w:r>
+      <w:r>
+        <w:rPr>
+          <w:lang w:val="en-US"/>
+        </w:rPr>
+        <w:t>sas_logbook_clean_2013_15</w:t>
+      </w:r>
+    </w:p>
+    <w:p>
+      <w:pPr>
+        <w:pStyle w:val="ListParagraph"/>
+        <w:numPr>
+          <w:ilvl w:val="1"/>
+          <w:numId w:val="21"/>
+        </w:numPr>
+        <w:rPr>
+          <w:lang w:val="en-US"/>
+        </w:rPr>
+      </w:pPr>
+      <w:r>
+        <w:rPr>
+          <w:lang w:val="en-US"/>
+        </w:rPr>
+        <w:t>Chunk 24:</w:t>
+      </w:r>
+      <w:r>
+        <w:rPr>
+          <w:lang w:val="en-US"/>
+        </w:rPr>
+        <w:t>shore-effort</w:t>
+      </w:r>
+      <w:r>
+        <w:rPr>
+          <w:lang w:val="en-US"/>
+        </w:rPr>
+        <w:t xml:space="preserve"> </w:t>
+      </w:r>
+      <w:r>
+        <w:rPr>
+          <w:lang w:val="en-US"/>
+        </w:rPr>
+        <w:sym w:font="Wingdings" w:char="F0E0"/>
+      </w:r>
+      <w:r>
+        <w:rPr>
+          <w:lang w:val="en-US"/>
+        </w:rPr>
+        <w:t xml:space="preserve"> </w:t>
+      </w:r>
+      <w:r>
+        <w:rPr>
+          <w:lang w:val="en-US"/>
+        </w:rPr>
+        <w:t>sas_shorelogs_clean_2013_15</w:t>
+      </w:r>
+    </w:p>
+    <w:p>
+      <w:pPr>
+        <w:pStyle w:val="ListParagraph"/>
+        <w:numPr>
+          <w:ilvl w:val="0"/>
+          <w:numId w:val="21"/>
+        </w:numPr>
+        <w:rPr>
+          <w:lang w:val="en-US"/>
+        </w:rPr>
+      </w:pPr>
+      <w:r>
+        <w:rPr>
+          <w:lang w:val="en-US"/>
+        </w:rPr>
+        <w:t xml:space="preserve">Save </w:t>
+      </w:r>
+      <w:r>
+        <w:rPr>
+          <w:lang w:val="en-US"/>
+        </w:rPr>
+        <w:t>data for table J back to DCPROD</w:t>
+      </w:r>
+    </w:p>
+    <w:p>
+      <w:pPr>
+        <w:pStyle w:val="ListParagraph"/>
+        <w:numPr>
+          <w:ilvl w:val="1"/>
+          <w:numId w:val="21"/>
+        </w:numPr>
+        <w:rPr>
+          <w:lang w:val="en-US"/>
+        </w:rPr>
+      </w:pPr>
+      <w:r>
+        <w:rPr>
+          <w:lang w:val="en-US"/>
+        </w:rPr>
+        <w:t xml:space="preserve">Chunk 25: join-datasets </w:t>
+      </w:r>
+      <w:r>
+        <w:rPr>
+          <w:lang w:val="en-US"/>
+        </w:rPr>
+        <w:sym w:font="Wingdings" w:char="F0E0"/>
+      </w:r>
+      <w:r>
+        <w:rPr>
+          <w:lang w:val="en-US"/>
+        </w:rPr>
+        <w:t xml:space="preserve"> </w:t>
+      </w:r>
+      <w:r>
+        <w:rPr>
+          <w:lang w:val="en-US"/>
+        </w:rPr>
+        <w:t>logbook_13_15_for_J</w:t>
+      </w:r>
+    </w:p>
+    <w:p>
+      <w:pPr>
+        <w:pStyle w:val="ListParagraph"/>
+        <w:numPr>
+          <w:ilvl w:val="0"/>
+          <w:numId w:val="21"/>
+        </w:numPr>
+        <w:rPr>
+          <w:lang w:val="en-US"/>
+        </w:rPr>
+      </w:pPr>
+      <w:r>
+        <w:rPr>
+          <w:lang w:val="en-US"/>
+        </w:rPr>
+        <w:t>Save final combined version to DCPROD</w:t>
+      </w:r>
+    </w:p>
+    <w:p>
+      <w:pPr>
+        <w:pStyle w:val="ListParagraph"/>
+        <w:numPr>
+          <w:ilvl w:val="1"/>
+          <w:numId w:val="21"/>
+        </w:numPr>
+        <w:rPr>
+          <w:lang w:val="en-US"/>
+        </w:rPr>
+      </w:pPr>
+      <w:r>
+        <w:rPr>
+          <w:lang w:val="en-US"/>
+        </w:rPr>
+        <w:lastRenderedPageBreak/>
+        <w:t xml:space="preserve">Chunk </w:t>
+      </w:r>
+      <w:r>
+        <w:rPr>
+          <w:lang w:val="en-US"/>
+        </w:rPr>
+        <w:t xml:space="preserve">26: fish-pricing </w:t>
+      </w:r>
+      <w:r>
+        <w:rPr>
+          <w:lang w:val="en-US"/>
+        </w:rPr>
+        <w:sym w:font="Wingdings" w:char="F0E0"/>
+      </w:r>
+      <w:r>
+        <w:rPr>
+          <w:lang w:val="en-US"/>
+        </w:rPr>
+        <w:t xml:space="preserve"> </w:t>
+      </w:r>
+      <w:r>
+        <w:rPr>
+          <w:lang w:val="en-US"/>
+        </w:rPr>
+        <w:t>sas_combined_clean_2013_15</w:t>
+      </w:r>
+    </w:p>
+    <w:p>
+      <w:pPr>
+        <w:pStyle w:val="ListParagraph"/>
+        <w:numPr>
+          <w:ilvl w:val="0"/>
+          <w:numId w:val="21"/>
+        </w:numPr>
+        <w:rPr>
+          <w:lang w:val="en-US"/>
+        </w:rPr>
+      </w:pPr>
+      <w:r>
+        <w:rPr>
+          <w:lang w:val="en-US"/>
+        </w:rPr>
+        <w:t>Next: use</w:t>
+      </w:r>
+      <w:r>
+        <w:rPr>
+          <w:lang w:val="en-US"/>
+        </w:rPr>
+        <w:t xml:space="preserve"> cleaned sas data in </w:t>
+      </w:r>
+      <w:r>
+        <w:rPr>
+          <w:lang w:val="en-US"/>
+        </w:rPr>
+        <w:t>Tables a-g-h-i-j</w:t>
+      </w:r>
+      <w:r>
+        <w:rPr>
+          <w:lang w:val="en-US"/>
+        </w:rPr>
+        <w:t xml:space="preserve"> (and other) scripts!</w:t>
+      </w:r>
+    </w:p>
+    <w:p>
+      <w:pPr>
         <w:rPr>
           <w:lang w:val="en-US"/>
         </w:rPr>
@@ -187,35 +531,7 @@
         <w:rPr>
           <w:lang w:val="en-US"/>
         </w:rPr>
-        <w:t xml:space="preserve">Go through last </w:t>
-      </w:r>
-      <w:proofErr w:type="gramStart"/>
-      <w:r>
-        <w:rPr>
-          <w:lang w:val="en-US"/>
-        </w:rPr>
-        <w:t>years’</w:t>
-      </w:r>
-      <w:proofErr w:type="gramEnd"/>
-      <w:r>
-        <w:rPr>
-          <w:lang w:val="en-US"/>
-        </w:rPr>
-        <w:t xml:space="preserve"> </w:t>
-      </w:r>
-      <w:proofErr w:type="spellStart"/>
-      <w:r>
-        <w:rPr>
-          <w:lang w:val="en-US"/>
-        </w:rPr>
-        <w:t>sas</w:t>
-      </w:r>
-      <w:proofErr w:type="spellEnd"/>
-      <w:r>
-        <w:rPr>
-          <w:lang w:val="en-US"/>
-        </w:rPr>
-        <w:t xml:space="preserve"> integration logic</w:t>
+        <w:t>Go through last years’ sas integration logic</w:t>
       </w:r>
     </w:p>
     <w:p>
@@ -314,7 +630,6 @@
         </w:rPr>
         <w:t xml:space="preserve">see chunk </w:t>
       </w:r>
-      <w:proofErr w:type="gramStart"/>
       <w:r>
         <w:rPr>
           <w:rFonts w:ascii="Miriam Fixed" w:hAnsi="Miriam Fixed" w:cs="Miriam Fixed" w:hint="cs"/>
@@ -331,7 +646,6 @@
         </w:rPr>
         <w:t>k</w:t>
       </w:r>
-      <w:proofErr w:type="gramEnd"/>
       <w:r>
         <w:rPr>
           <w:rFonts w:ascii="Miriam Fixed" w:hAnsi="Miriam Fixed" w:cs="Miriam Fixed"/>
@@ -379,9 +693,9 @@
       </w:pPr>
       <w:r>
         <w:rPr>
-          <w:lang w:val="en-US"/>
-        </w:rPr>
-        <w:lastRenderedPageBreak/>
+          <w:noProof/>
+          <w:lang w:val="en-US"/>
+        </w:rPr>
         <w:drawing>
           <wp:inline distT="0" distB="0" distL="0" distR="0" wp14:anchorId="531A49BB" wp14:editId="3B74A859">
             <wp:extent cx="2570780" cy="3753852"/>
@@ -398,7 +712,7 @@
                     <pic:cNvPicPr/>
                   </pic:nvPicPr>
                   <pic:blipFill>
-                    <a:blip r:embed="rId6"/>
+                    <a:blip r:embed="rId7"/>
                     <a:stretch>
                       <a:fillRect/>
                     </a:stretch>
@@ -426,6 +740,7 @@
       </w:r>
       <w:r>
         <w:rPr>
+          <w:noProof/>
           <w:lang w:val="en-US"/>
         </w:rPr>
         <w:drawing>
@@ -444,7 +759,7 @@
                     <pic:cNvPicPr/>
                   </pic:nvPicPr>
                   <pic:blipFill>
-                    <a:blip r:embed="rId7"/>
+                    <a:blip r:embed="rId8"/>
                     <a:stretch>
                       <a:fillRect/>
                     </a:stretch>
@@ -477,19 +792,11 @@
           <w:u w:val="single"/>
         </w:rPr>
       </w:pPr>
-      <w:proofErr w:type="spellStart"/>
-      <w:r>
-        <w:rPr>
-          <w:lang w:val="en-US"/>
-        </w:rPr>
-        <w:t>Shorelogs</w:t>
-      </w:r>
-      <w:proofErr w:type="spellEnd"/>
-      <w:r>
-        <w:rPr>
-          <w:lang w:val="en-US"/>
-        </w:rPr>
-        <w:t xml:space="preserve">: see chunk </w:t>
+      <w:r>
+        <w:rPr>
+          <w:lang w:val="en-US"/>
+        </w:rPr>
+        <w:t xml:space="preserve">Shorelogs: see chunk </w:t>
       </w:r>
       <w:r>
         <w:rPr>
@@ -497,18 +804,8 @@
           <w:u w:val="single"/>
           <w:lang w:val="en-US"/>
         </w:rPr>
-        <w:t>clean-</w:t>
-      </w:r>
-      <w:proofErr w:type="spellStart"/>
-      <w:r>
-        <w:rPr>
-          <w:rFonts w:ascii="Miriam Fixed" w:hAnsi="Miriam Fixed" w:cs="Miriam Fixed" w:hint="cs"/>
-          <w:u w:val="single"/>
-          <w:lang w:val="en-US"/>
-        </w:rPr>
-        <w:t>shorelogs</w:t>
-      </w:r>
-      <w:proofErr w:type="spellEnd"/>
+        <w:t>clean-shorelogs</w:t>
+      </w:r>
       <w:r>
         <w:rPr>
           <w:rFonts w:ascii="Miriam Fixed" w:hAnsi="Miriam Fixed" w:cs="Miriam Fixed"/>
@@ -542,8 +839,10 @@
       </w:pPr>
       <w:r>
         <w:rPr>
-          <w:lang w:val="en-US"/>
-        </w:rPr>
+          <w:noProof/>
+          <w:lang w:val="en-US"/>
+        </w:rPr>
+        <w:lastRenderedPageBreak/>
         <w:drawing>
           <wp:inline distT="0" distB="0" distL="0" distR="0" wp14:anchorId="6CD656A8" wp14:editId="0A804541">
             <wp:extent cx="2422358" cy="1376051"/>
@@ -560,7 +859,7 @@
                     <pic:cNvPicPr/>
                   </pic:nvPicPr>
                   <pic:blipFill>
-                    <a:blip r:embed="rId8"/>
+                    <a:blip r:embed="rId9"/>
                     <a:stretch>
                       <a:fillRect/>
                     </a:stretch>
@@ -588,6 +887,7 @@
       </w:r>
       <w:r>
         <w:rPr>
+          <w:noProof/>
           <w:lang w:val="en-US"/>
         </w:rPr>
         <w:drawing>
@@ -606,7 +906,7 @@
                     <pic:cNvPicPr/>
                   </pic:nvPicPr>
                   <pic:blipFill>
-                    <a:blip r:embed="rId9"/>
+                    <a:blip r:embed="rId10"/>
                     <a:stretch>
                       <a:fillRect/>
                     </a:stretch>
@@ -673,14 +973,7 @@
         <w:rPr>
           <w:lang w:val="en-US"/>
         </w:rPr>
-        <w:t xml:space="preserve">Go through last </w:t>
-      </w:r>
-      <w:proofErr w:type="gramStart"/>
-      <w:r>
-        <w:rPr>
-          <w:lang w:val="en-US"/>
-        </w:rPr>
-        <w:t>years</w:t>
+        <w:t>Go through last years</w:t>
       </w:r>
       <w:r>
         <w:rPr>
@@ -688,26 +981,11 @@
         </w:rPr>
         <w:t>’</w:t>
       </w:r>
-      <w:proofErr w:type="gramEnd"/>
-      <w:r>
-        <w:rPr>
-          <w:lang w:val="en-US"/>
-        </w:rPr>
-        <w:t xml:space="preserve"> </w:t>
-      </w:r>
-      <w:proofErr w:type="spellStart"/>
-      <w:r>
-        <w:rPr>
-          <w:lang w:val="en-US"/>
-        </w:rPr>
-        <w:t>sas</w:t>
-      </w:r>
-      <w:proofErr w:type="spellEnd"/>
-      <w:r>
-        <w:rPr>
-          <w:lang w:val="en-US"/>
-        </w:rPr>
-        <w:t xml:space="preserve"> integration logic</w:t>
+      <w:r>
+        <w:rPr>
+          <w:lang w:val="en-US"/>
+        </w:rPr>
+        <w:t xml:space="preserve"> sas integration logic</w:t>
       </w:r>
     </w:p>
     <w:p>
@@ -742,35 +1020,7 @@
         <w:rPr>
           <w:lang w:val="en-US"/>
         </w:rPr>
-        <w:t xml:space="preserve">Create </w:t>
-      </w:r>
-      <w:proofErr w:type="spellStart"/>
-      <w:r>
-        <w:rPr>
-          <w:lang w:val="en-US"/>
-        </w:rPr>
-        <w:t>Rmd</w:t>
-      </w:r>
-      <w:proofErr w:type="spellEnd"/>
-      <w:r>
-        <w:rPr>
-          <w:lang w:val="en-US"/>
-        </w:rPr>
-        <w:t xml:space="preserve"> version of </w:t>
-      </w:r>
-      <w:proofErr w:type="spellStart"/>
-      <w:r>
-        <w:rPr>
-          <w:lang w:val="en-US"/>
-        </w:rPr>
-        <w:t>sas</w:t>
-      </w:r>
-      <w:proofErr w:type="spellEnd"/>
-      <w:r>
-        <w:rPr>
-          <w:lang w:val="en-US"/>
-        </w:rPr>
-        <w:t xml:space="preserve"> integration script from 2025</w:t>
+        <w:t>Create Rmd version of sas integration script from 2025</w:t>
       </w:r>
     </w:p>
     <w:p>
@@ -973,21 +1223,7 @@
         <w:rPr>
           <w:lang w:val="en-US"/>
         </w:rPr>
-        <w:t xml:space="preserve">Incorrect length classes in old </w:t>
-      </w:r>
-      <w:proofErr w:type="spellStart"/>
-      <w:r>
-        <w:rPr>
-          <w:lang w:val="en-US"/>
-        </w:rPr>
-        <w:t>sas</w:t>
-      </w:r>
-      <w:proofErr w:type="spellEnd"/>
-      <w:r>
-        <w:rPr>
-          <w:lang w:val="en-US"/>
-        </w:rPr>
-        <w:t xml:space="preserve"> data</w:t>
+        <w:t>Incorrect length classes in old sas data</w:t>
       </w:r>
       <w:r>
         <w:rPr>
@@ -1011,6 +1247,7 @@
           <w:noProof/>
           <w:lang w:val="en-US"/>
         </w:rPr>
+        <w:lastRenderedPageBreak/>
         <w:drawing>
           <wp:inline distT="0" distB="0" distL="0" distR="0" wp14:anchorId="148C2AC6" wp14:editId="7720B385">
             <wp:extent cx="5731510" cy="1900555"/>
@@ -1027,7 +1264,7 @@
                     <pic:cNvPicPr/>
                   </pic:nvPicPr>
                   <pic:blipFill>
-                    <a:blip r:embed="rId10"/>
+                    <a:blip r:embed="rId11"/>
                     <a:stretch>
                       <a:fillRect/>
                     </a:stretch>
@@ -1145,21 +1382,7 @@
         <w:rPr>
           <w:lang w:val="en-US"/>
         </w:rPr>
-        <w:t xml:space="preserve"> </w:t>
-      </w:r>
-      <w:proofErr w:type="spellStart"/>
-      <w:r>
-        <w:rPr>
-          <w:lang w:val="en-US"/>
-        </w:rPr>
-        <w:t>Rmd</w:t>
-      </w:r>
-      <w:proofErr w:type="spellEnd"/>
-      <w:r>
-        <w:rPr>
-          <w:lang w:val="en-US"/>
-        </w:rPr>
-        <w:t xml:space="preserve"> now running</w:t>
+        <w:t xml:space="preserve"> Rmd now running</w:t>
       </w:r>
       <w:r>
         <w:rPr>
@@ -1192,14 +1415,12 @@
         </w:rPr>
         <w:t xml:space="preserve">: </w:t>
       </w:r>
-      <w:proofErr w:type="spellStart"/>
       <w:r>
         <w:rPr>
           <w:lang w:val="en-US"/>
         </w:rPr>
         <w:t>IC_DB.rds</w:t>
       </w:r>
-      <w:proofErr w:type="spellEnd"/>
       <w:r>
         <w:rPr>
           <w:lang w:val="en-US"/>
@@ -1230,19 +1451,11 @@
         </w:rPr>
         <w:t xml:space="preserve">TABLE F: </w:t>
       </w:r>
-      <w:proofErr w:type="spellStart"/>
-      <w:r>
-        <w:rPr>
-          <w:lang w:val="en-US"/>
-        </w:rPr>
-        <w:t>Rmd</w:t>
-      </w:r>
-      <w:proofErr w:type="spellEnd"/>
-      <w:r>
-        <w:rPr>
-          <w:lang w:val="en-US"/>
-        </w:rPr>
-        <w:t xml:space="preserve"> now running</w:t>
+      <w:r>
+        <w:rPr>
+          <w:lang w:val="en-US"/>
+        </w:rPr>
+        <w:t>Rmd now running</w:t>
       </w:r>
       <w:r>
         <w:rPr>
@@ -1298,16 +1511,8 @@
         <w:rPr>
           <w:lang w:val="en-US"/>
         </w:rPr>
-        <w:t xml:space="preserve"> </w:t>
-      </w:r>
-      <w:proofErr w:type="spellStart"/>
-      <w:r>
-        <w:rPr>
-          <w:lang w:val="en-US"/>
-        </w:rPr>
-        <w:t>Rmd</w:t>
-      </w:r>
-      <w:proofErr w:type="spellEnd"/>
+        <w:t xml:space="preserve"> Rmd</w:t>
+      </w:r>
     </w:p>
     <w:p>
       <w:pPr>
@@ -1326,7 +1531,6 @@
           <w:strike/>
           <w:lang w:val="en-US"/>
         </w:rPr>
-        <w:lastRenderedPageBreak/>
         <w:t>Starting to i</w:t>
       </w:r>
       <w:r>
@@ -1348,23 +1552,7 @@
           <w:strike/>
           <w:lang w:val="en-US"/>
         </w:rPr>
-        <w:t xml:space="preserve">new mongo implementation of </w:t>
-      </w:r>
-      <w:proofErr w:type="spellStart"/>
-      <w:r>
-        <w:rPr>
-          <w:strike/>
-          <w:lang w:val="en-US"/>
-        </w:rPr>
-        <w:t>Suomu</w:t>
-      </w:r>
-      <w:proofErr w:type="spellEnd"/>
-      <w:r>
-        <w:rPr>
-          <w:strike/>
-          <w:lang w:val="en-US"/>
-        </w:rPr>
-        <w:t xml:space="preserve"> cloud data</w:t>
+        <w:t>new mongo implementation of Suomu cloud data</w:t>
       </w:r>
     </w:p>
     <w:p>
@@ -1388,21 +1576,7 @@
         <w:rPr>
           <w:lang w:val="en-US"/>
         </w:rPr>
-        <w:t xml:space="preserve"> </w:t>
-      </w:r>
-      <w:proofErr w:type="spellStart"/>
-      <w:r>
-        <w:rPr>
-          <w:lang w:val="en-US"/>
-        </w:rPr>
-        <w:t>Rmd</w:t>
-      </w:r>
-      <w:proofErr w:type="spellEnd"/>
-      <w:r>
-        <w:rPr>
-          <w:lang w:val="en-US"/>
-        </w:rPr>
-        <w:t xml:space="preserve"> prepared and test run</w:t>
+        <w:t xml:space="preserve"> Rmd prepared and test run</w:t>
       </w:r>
       <w:r>
         <w:rPr>
@@ -1469,21 +1643,7 @@
         <w:rPr>
           <w:lang w:val="en-US"/>
         </w:rPr>
-        <w:t xml:space="preserve"> </w:t>
-      </w:r>
-      <w:proofErr w:type="spellStart"/>
-      <w:r>
-        <w:rPr>
-          <w:lang w:val="en-US"/>
-        </w:rPr>
-        <w:t>Rmd</w:t>
-      </w:r>
-      <w:proofErr w:type="spellEnd"/>
-      <w:r>
-        <w:rPr>
-          <w:lang w:val="en-US"/>
-        </w:rPr>
-        <w:t xml:space="preserve"> preparation</w:t>
+        <w:t xml:space="preserve"> Rmd preparation</w:t>
       </w:r>
       <w:r>
         <w:rPr>
@@ -1544,21 +1704,7 @@
         <w:rPr>
           <w:lang w:val="en-US"/>
         </w:rPr>
-        <w:t xml:space="preserve">Table e </w:t>
-      </w:r>
-      <w:proofErr w:type="spellStart"/>
-      <w:r>
-        <w:rPr>
-          <w:lang w:val="en-US"/>
-        </w:rPr>
-        <w:t>Rmd</w:t>
-      </w:r>
-      <w:proofErr w:type="spellEnd"/>
-      <w:r>
-        <w:rPr>
-          <w:lang w:val="en-US"/>
-        </w:rPr>
-        <w:t xml:space="preserve"> preparation</w:t>
+        <w:t>Table e Rmd preparation</w:t>
       </w:r>
     </w:p>
     <w:p>
@@ -1620,23 +1766,7 @@
           <w:strike/>
           <w:lang w:val="en-US"/>
         </w:rPr>
-        <w:t xml:space="preserve">Needs new </w:t>
-      </w:r>
-      <w:proofErr w:type="spellStart"/>
-      <w:r>
-        <w:rPr>
-          <w:strike/>
-          <w:lang w:val="en-US"/>
-        </w:rPr>
-        <w:t>Suomu</w:t>
-      </w:r>
-      <w:proofErr w:type="spellEnd"/>
-      <w:r>
-        <w:rPr>
-          <w:strike/>
-          <w:lang w:val="en-US"/>
-        </w:rPr>
-        <w:t xml:space="preserve"> cloud implementation</w:t>
+        <w:t>Needs new Suomu cloud implementation</w:t>
       </w:r>
     </w:p>
     <w:p>
@@ -1654,29 +1784,7 @@
         <w:rPr>
           <w:lang w:val="en-US"/>
         </w:rPr>
-        <w:t xml:space="preserve">Table </w:t>
-      </w:r>
-      <w:proofErr w:type="gramStart"/>
-      <w:r>
-        <w:rPr>
-          <w:lang w:val="en-US"/>
-        </w:rPr>
-        <w:t xml:space="preserve">f </w:t>
-      </w:r>
-      <w:proofErr w:type="spellStart"/>
-      <w:r>
-        <w:rPr>
-          <w:lang w:val="en-US"/>
-        </w:rPr>
-        <w:t>Rmd</w:t>
-      </w:r>
-      <w:proofErr w:type="spellEnd"/>
-      <w:proofErr w:type="gramEnd"/>
-      <w:r>
-        <w:rPr>
-          <w:lang w:val="en-US"/>
-        </w:rPr>
-        <w:t xml:space="preserve"> preparation</w:t>
+        <w:t>Table f Rmd preparation</w:t>
       </w:r>
     </w:p>
     <w:p>
@@ -1714,23 +1822,7 @@
           <w:strike/>
           <w:lang w:val="en-US"/>
         </w:rPr>
-        <w:t xml:space="preserve">Needs new </w:t>
-      </w:r>
-      <w:proofErr w:type="spellStart"/>
-      <w:r>
-        <w:rPr>
-          <w:strike/>
-          <w:lang w:val="en-US"/>
-        </w:rPr>
-        <w:t>Suomu</w:t>
-      </w:r>
-      <w:proofErr w:type="spellEnd"/>
-      <w:r>
-        <w:rPr>
-          <w:strike/>
-          <w:lang w:val="en-US"/>
-        </w:rPr>
-        <w:t xml:space="preserve"> cloud implementation</w:t>
+        <w:t>Needs new Suomu cloud implementation</w:t>
       </w:r>
     </w:p>
     <w:p>
@@ -1790,27 +1882,14 @@
         <w:rPr>
           <w:lang w:val="en-US"/>
         </w:rPr>
-        <w:t xml:space="preserve">Fixing </w:t>
-      </w:r>
-      <w:proofErr w:type="spellStart"/>
-      <w:r>
-        <w:rPr>
-          <w:lang w:val="en-US"/>
-        </w:rPr>
-        <w:t>meti</w:t>
-      </w:r>
-      <w:r>
-        <w:rPr>
-          <w:lang w:val="en-US"/>
-        </w:rPr>
-        <w:t>ers</w:t>
-      </w:r>
-      <w:proofErr w:type="spellEnd"/>
-      <w:r>
-        <w:rPr>
-          <w:lang w:val="en-US"/>
-        </w:rPr>
-        <w:t xml:space="preserve"> in table a-j script</w:t>
+        <w:lastRenderedPageBreak/>
+        <w:t>Fixing meti</w:t>
+      </w:r>
+      <w:r>
+        <w:rPr>
+          <w:lang w:val="en-US"/>
+        </w:rPr>
+        <w:t>ers in table a-j script</w:t>
       </w:r>
     </w:p>
     <w:p>
@@ -1824,19 +1903,11 @@
           <w:lang w:val="en-US"/>
         </w:rPr>
       </w:pPr>
-      <w:proofErr w:type="spellStart"/>
-      <w:r>
-        <w:rPr>
-          <w:lang w:val="en-US"/>
-        </w:rPr>
-        <w:t>Rmd</w:t>
-      </w:r>
-      <w:proofErr w:type="spellEnd"/>
-      <w:r>
-        <w:rPr>
-          <w:lang w:val="en-US"/>
-        </w:rPr>
-        <w:t xml:space="preserve"> now running</w:t>
+      <w:r>
+        <w:rPr>
+          <w:lang w:val="en-US"/>
+        </w:rPr>
+        <w:t>Rmd now running</w:t>
       </w:r>
     </w:p>
     <w:p>
@@ -1922,39 +1993,17 @@
           <w:lang w:val="en-US"/>
         </w:rPr>
       </w:pPr>
-      <w:proofErr w:type="spellStart"/>
-      <w:r>
-        <w:rPr>
-          <w:lang w:val="en-US"/>
-        </w:rPr>
-        <w:t>LukeTools</w:t>
-      </w:r>
-      <w:proofErr w:type="spellEnd"/>
-      <w:r>
-        <w:rPr>
-          <w:lang w:val="en-US"/>
-        </w:rPr>
-        <w:t xml:space="preserve"> (</w:t>
-      </w:r>
-      <w:proofErr w:type="gramStart"/>
-      <w:r>
-        <w:rPr>
-          <w:lang w:val="en-US"/>
-        </w:rPr>
-        <w:t>testing)</w:t>
-      </w:r>
-      <w:r>
-        <w:rPr>
-          <w:lang w:val="en-US"/>
-        </w:rPr>
-        <w:t xml:space="preserve">  -</w:t>
-      </w:r>
-      <w:proofErr w:type="gramEnd"/>
-      <w:r>
-        <w:rPr>
-          <w:lang w:val="en-US"/>
-        </w:rPr>
-        <w:t xml:space="preserve"> DONE</w:t>
+      <w:r>
+        <w:rPr>
+          <w:lang w:val="en-US"/>
+        </w:rPr>
+        <w:t>LukeTools (testing)</w:t>
+      </w:r>
+      <w:r>
+        <w:rPr>
+          <w:lang w:val="en-US"/>
+        </w:rPr>
+        <w:t xml:space="preserve">  - DONE</w:t>
       </w:r>
     </w:p>
     <w:p>
@@ -1990,21 +2039,7 @@
         <w:rPr>
           <w:lang w:val="en-US"/>
         </w:rPr>
-        <w:t xml:space="preserve">Replace scripts with </w:t>
-      </w:r>
-      <w:proofErr w:type="spellStart"/>
-      <w:r>
-        <w:rPr>
-          <w:lang w:val="en-US"/>
-        </w:rPr>
-        <w:t>Rmd</w:t>
-      </w:r>
-      <w:proofErr w:type="spellEnd"/>
-      <w:r>
-        <w:rPr>
-          <w:lang w:val="en-US"/>
-        </w:rPr>
-        <w:t xml:space="preserve"> files</w:t>
+        <w:t>Replace scripts with Rmd files</w:t>
       </w:r>
     </w:p>
     <w:p>
@@ -2058,30 +2093,8 @@
         <w:rPr>
           <w:lang w:val="en-US"/>
         </w:rPr>
-        <w:t xml:space="preserve">Change the </w:t>
-      </w:r>
-      <w:proofErr w:type="spellStart"/>
-      <w:r>
-        <w:rPr>
-          <w:lang w:val="en-US"/>
-        </w:rPr>
-        <w:t>metier</w:t>
-      </w:r>
-      <w:proofErr w:type="spellEnd"/>
-      <w:r>
-        <w:rPr>
-          <w:lang w:val="en-US"/>
-        </w:rPr>
-        <w:t xml:space="preserve"> lookup from </w:t>
-      </w:r>
-      <w:proofErr w:type="spellStart"/>
-      <w:r>
-        <w:rPr>
-          <w:lang w:val="en-US"/>
-        </w:rPr>
-        <w:t>github</w:t>
-      </w:r>
-      <w:proofErr w:type="spellEnd"/>
+        <w:t>Change the metier lookup from github</w:t>
+      </w:r>
     </w:p>
     <w:p>
       <w:pPr>
@@ -2098,21 +2111,7 @@
         <w:rPr>
           <w:lang w:val="en-US"/>
         </w:rPr>
-        <w:t xml:space="preserve">Save </w:t>
-      </w:r>
-      <w:proofErr w:type="spellStart"/>
-      <w:r>
-        <w:rPr>
-          <w:lang w:val="en-US"/>
-        </w:rPr>
-        <w:t>sas</w:t>
-      </w:r>
-      <w:proofErr w:type="spellEnd"/>
-      <w:r>
-        <w:rPr>
-          <w:lang w:val="en-US"/>
-        </w:rPr>
-        <w:t xml:space="preserve"> logbook from database and import from database</w:t>
+        <w:t>Save sas logbook from database and import from database</w:t>
       </w:r>
     </w:p>
     <w:p>
@@ -2166,21 +2165,7 @@
         <w:rPr>
           <w:lang w:val="en-US"/>
         </w:rPr>
-        <w:t xml:space="preserve">Create first </w:t>
-      </w:r>
-      <w:proofErr w:type="spellStart"/>
-      <w:r>
-        <w:rPr>
-          <w:lang w:val="en-US"/>
-        </w:rPr>
-        <w:t>Rmd</w:t>
-      </w:r>
-      <w:proofErr w:type="spellEnd"/>
-      <w:r>
-        <w:rPr>
-          <w:lang w:val="en-US"/>
-        </w:rPr>
-        <w:t xml:space="preserve"> version</w:t>
+        <w:t>Create first Rmd version</w:t>
       </w:r>
     </w:p>
     <w:p>
@@ -2220,21 +2205,7 @@
         <w:rPr>
           <w:lang w:val="en-US"/>
         </w:rPr>
-        <w:t>A fishing trip is approximated by reported fishing days, aggregated from monthly reports by taking the maximum number of fishing days per vessel–month–</w:t>
-      </w:r>
-      <w:proofErr w:type="spellStart"/>
-      <w:r>
-        <w:rPr>
-          <w:lang w:val="en-US"/>
-        </w:rPr>
-        <w:t>metier</w:t>
-      </w:r>
-      <w:proofErr w:type="spellEnd"/>
-      <w:r>
-        <w:rPr>
-          <w:lang w:val="en-US"/>
-        </w:rPr>
-        <w:t xml:space="preserve"> combination and summing these over time and vessels.</w:t>
+        <w:t>A fishing trip is approximated by reported fishing days, aggregated from monthly reports by taking the maximum number of fishing days per vessel–month–metier combination and summing these over time and vessels.</w:t>
       </w:r>
     </w:p>
     <w:p>
@@ -2274,7 +2245,7 @@
                     </pic:cNvPicPr>
                   </pic:nvPicPr>
                   <pic:blipFill>
-                    <a:blip r:embed="rId11">
+                    <a:blip r:embed="rId12">
                       <a:extLst>
                         <a:ext uri="{28A0092B-C50C-407E-A947-70E740481C1C}">
                           <a14:useLocalDpi xmlns:a14="http://schemas.microsoft.com/office/drawing/2010/main" val="0"/>
@@ -4257,7 +4228,7 @@
   <w:abstractNum w:abstractNumId="17" w15:restartNumberingAfterBreak="0">
     <w:nsid w:val="5A9430D7"/>
     <w:multiLevelType w:val="hybridMultilevel"/>
-    <w:tmpl w:val="B894B5FA"/>
+    <w:tmpl w:val="BB3A180A"/>
     <w:lvl w:ilvl="0" w:tplc="08090001">
       <w:start w:val="1"/>
       <w:numFmt w:val="bullet"/>
@@ -4270,7 +4241,7 @@
         <w:rFonts w:ascii="Symbol" w:hAnsi="Symbol" w:hint="default"/>
       </w:rPr>
     </w:lvl>
-    <w:lvl w:ilvl="1" w:tplc="08090003" w:tentative="1">
+    <w:lvl w:ilvl="1" w:tplc="08090003">
       <w:start w:val="1"/>
       <w:numFmt w:val="bullet"/>
       <w:lvlText w:val="o"/>
@@ -5492,6 +5463,7 @@
   <w:style w:type="character" w:default="1" w:styleId="DefaultParagraphFont">
     <w:name w:val="Default Paragraph Font"/>
     <w:uiPriority w:val="1"/>
+    <w:semiHidden/>
     <w:unhideWhenUsed/>
   </w:style>
   <w:style w:type="table" w:default="1" w:styleId="TableNormal">

</xml_diff>

<commit_message>
table C and table D subsetting of table A
</commit_message>
<xml_diff>
--- a/documents/2026/FDI_TO_DO.docx
+++ b/documents/2026/FDI_TO_DO.docx
@@ -59,6 +59,196 @@
           <w:bCs/>
           <w:lang w:val="en-US"/>
         </w:rPr>
+        <w:t>17/06/2026</w:t>
+      </w:r>
+    </w:p>
+    <w:p>
+      <w:pPr>
+        <w:pStyle w:val="ListParagraph"/>
+        <w:numPr>
+          <w:ilvl w:val="0"/>
+          <w:numId w:val="26"/>
+        </w:numPr>
+        <w:rPr>
+          <w:lang w:val="en-US"/>
+        </w:rPr>
+      </w:pPr>
+      <w:r>
+        <w:rPr>
+          <w:lang w:val="en-US"/>
+        </w:rPr>
+        <w:t>Trying out logic</w:t>
+      </w:r>
+      <w:r>
+        <w:rPr>
+          <w:lang w:val="en-US"/>
+        </w:rPr>
+        <w:t xml:space="preserve"> (table_C)</w:t>
+      </w:r>
+    </w:p>
+    <w:p>
+      <w:pPr>
+        <w:ind w:left="360"/>
+        <w:rPr>
+          <w:b/>
+          <w:bCs/>
+          <w:lang w:val="en-US"/>
+        </w:rPr>
+      </w:pPr>
+      <w:r>
+        <w:rPr>
+          <w:b/>
+          <w:bCs/>
+          <w:lang w:val="en-US"/>
+        </w:rPr>
+        <w:drawing>
+          <wp:inline distT="0" distB="0" distL="0" distR="0" wp14:anchorId="0D9110C1" wp14:editId="5E01DD71">
+            <wp:extent cx="5731510" cy="967740"/>
+            <wp:effectExtent l="0" t="0" r="2540" b="3810"/>
+            <wp:docPr id="1300773323" name="Picture 1"/>
+            <wp:cNvGraphicFramePr>
+              <a:graphicFrameLocks xmlns:a="http://schemas.openxmlformats.org/drawingml/2006/main" noChangeAspect="1"/>
+            </wp:cNvGraphicFramePr>
+            <a:graphic xmlns:a="http://schemas.openxmlformats.org/drawingml/2006/main">
+              <a:graphicData uri="http://schemas.openxmlformats.org/drawingml/2006/picture">
+                <pic:pic xmlns:pic="http://schemas.openxmlformats.org/drawingml/2006/picture">
+                  <pic:nvPicPr>
+                    <pic:cNvPr id="1300773323" name=""/>
+                    <pic:cNvPicPr/>
+                  </pic:nvPicPr>
+                  <pic:blipFill>
+                    <a:blip r:embed="rId5"/>
+                    <a:stretch>
+                      <a:fillRect/>
+                    </a:stretch>
+                  </pic:blipFill>
+                  <pic:spPr>
+                    <a:xfrm>
+                      <a:off x="0" y="0"/>
+                      <a:ext cx="5731510" cy="967740"/>
+                    </a:xfrm>
+                    <a:prstGeom prst="rect">
+                      <a:avLst/>
+                    </a:prstGeom>
+                  </pic:spPr>
+                </pic:pic>
+              </a:graphicData>
+            </a:graphic>
+          </wp:inline>
+        </w:drawing>
+      </w:r>
+    </w:p>
+    <w:p>
+      <w:pPr>
+        <w:pStyle w:val="ListParagraph"/>
+        <w:numPr>
+          <w:ilvl w:val="0"/>
+          <w:numId w:val="26"/>
+        </w:numPr>
+        <w:rPr>
+          <w:lang w:val="en-US"/>
+        </w:rPr>
+      </w:pPr>
+      <w:r>
+        <w:rPr>
+          <w:lang w:val="en-US"/>
+        </w:rPr>
+        <w:t xml:space="preserve">If year </w:t>
+      </w:r>
+      <w:r>
+        <w:rPr>
+          <w:lang w:val="en-US"/>
+        </w:rPr>
+        <w:t>=</w:t>
+      </w:r>
+      <w:r>
+        <w:rPr>
+          <w:lang w:val="en-US"/>
+        </w:rPr>
+        <w:t xml:space="preserve"> 2013</w:t>
+      </w:r>
+    </w:p>
+    <w:p>
+      <w:pPr>
+        <w:pStyle w:val="ListParagraph"/>
+        <w:numPr>
+          <w:ilvl w:val="0"/>
+          <w:numId w:val="26"/>
+        </w:numPr>
+        <w:rPr>
+          <w:lang w:val="en-US"/>
+        </w:rPr>
+      </w:pPr>
+      <w:r>
+        <w:rPr>
+          <w:lang w:val="en-US"/>
+        </w:rPr>
+        <w:t>and DOMAIN_DISCARDS</w:t>
+      </w:r>
+      <w:r>
+        <w:rPr>
+          <w:lang w:val="en-US"/>
+        </w:rPr>
+        <w:t xml:space="preserve"> = DOMAIN_DISCARDS</w:t>
+      </w:r>
+    </w:p>
+    <w:p>
+      <w:pPr>
+        <w:pStyle w:val="ListParagraph"/>
+        <w:numPr>
+          <w:ilvl w:val="0"/>
+          <w:numId w:val="26"/>
+        </w:numPr>
+        <w:rPr>
+          <w:lang w:val="en-US"/>
+        </w:rPr>
+      </w:pPr>
+      <w:r>
+        <w:rPr>
+          <w:lang w:val="en-US"/>
+        </w:rPr>
+        <w:t>and SPECIES = SPECIES</w:t>
+      </w:r>
+    </w:p>
+    <w:p>
+      <w:pPr>
+        <w:pStyle w:val="ListParagraph"/>
+        <w:numPr>
+          <w:ilvl w:val="0"/>
+          <w:numId w:val="28"/>
+        </w:numPr>
+        <w:rPr>
+          <w:lang w:val="en-US"/>
+        </w:rPr>
+      </w:pPr>
+      <w:r>
+        <w:rPr>
+          <w:lang w:val="en-US"/>
+        </w:rPr>
+        <w:t>edit or delete matches???</w:t>
+      </w:r>
+    </w:p>
+    <w:p>
+      <w:pPr>
+        <w:rPr>
+          <w:lang w:val="en-US"/>
+        </w:rPr>
+      </w:pPr>
+    </w:p>
+    <w:p>
+      <w:pPr>
+        <w:rPr>
+          <w:b/>
+          <w:bCs/>
+          <w:lang w:val="en-US"/>
+        </w:rPr>
+      </w:pPr>
+      <w:r>
+        <w:rPr>
+          <w:b/>
+          <w:bCs/>
+          <w:lang w:val="en-US"/>
+        </w:rPr>
         <w:t>16/06/2026</w:t>
       </w:r>
     </w:p>
@@ -266,6 +456,7 @@
           <w:noProof/>
           <w:lang w:val="en-US"/>
         </w:rPr>
+        <w:lastRenderedPageBreak/>
         <w:drawing>
           <wp:inline distT="0" distB="0" distL="0" distR="0" wp14:anchorId="246A9859" wp14:editId="28635C7C">
             <wp:extent cx="3505504" cy="3086367"/>
@@ -282,7 +473,7 @@
                     <pic:cNvPicPr/>
                   </pic:nvPicPr>
                   <pic:blipFill>
-                    <a:blip r:embed="rId5"/>
+                    <a:blip r:embed="rId6"/>
                     <a:stretch>
                       <a:fillRect/>
                     </a:stretch>
@@ -349,7 +540,7 @@
                     <pic:cNvPicPr/>
                   </pic:nvPicPr>
                   <pic:blipFill>
-                    <a:blip r:embed="rId6"/>
+                    <a:blip r:embed="rId7"/>
                     <a:stretch>
                       <a:fillRect/>
                     </a:stretch>
@@ -381,7 +572,6 @@
         <w:rPr>
           <w:lang w:val="en-US"/>
         </w:rPr>
-        <w:lastRenderedPageBreak/>
         <w:t xml:space="preserve">Overwrite 33 records where </w:t>
       </w:r>
       <w:r>
@@ -730,6 +920,7 @@
           <w:bCs/>
           <w:lang w:val="en-US"/>
         </w:rPr>
+        <w:lastRenderedPageBreak/>
         <w:t>12/06/2026</w:t>
       </w:r>
     </w:p>
@@ -913,7 +1104,6 @@
           <w:noProof/>
           <w:lang w:val="en-US"/>
         </w:rPr>
-        <w:lastRenderedPageBreak/>
         <w:drawing>
           <wp:inline distT="0" distB="0" distL="0" distR="0" wp14:anchorId="531A49BB" wp14:editId="3B74A859">
             <wp:extent cx="2570780" cy="3753852"/>
@@ -930,7 +1120,7 @@
                     <pic:cNvPicPr/>
                   </pic:nvPicPr>
                   <pic:blipFill>
-                    <a:blip r:embed="rId7"/>
+                    <a:blip r:embed="rId8"/>
                     <a:stretch>
                       <a:fillRect/>
                     </a:stretch>
@@ -977,7 +1167,7 @@
                     <pic:cNvPicPr/>
                   </pic:nvPicPr>
                   <pic:blipFill>
-                    <a:blip r:embed="rId8"/>
+                    <a:blip r:embed="rId9"/>
                     <a:stretch>
                       <a:fillRect/>
                     </a:stretch>
@@ -1060,6 +1250,7 @@
           <w:noProof/>
           <w:lang w:val="en-US"/>
         </w:rPr>
+        <w:lastRenderedPageBreak/>
         <w:drawing>
           <wp:inline distT="0" distB="0" distL="0" distR="0" wp14:anchorId="6CD656A8" wp14:editId="0A804541">
             <wp:extent cx="2422358" cy="1376051"/>
@@ -1076,7 +1267,7 @@
                     <pic:cNvPicPr/>
                   </pic:nvPicPr>
                   <pic:blipFill>
-                    <a:blip r:embed="rId9"/>
+                    <a:blip r:embed="rId10"/>
                     <a:stretch>
                       <a:fillRect/>
                     </a:stretch>
@@ -1123,7 +1314,7 @@
                     <pic:cNvPicPr/>
                   </pic:nvPicPr>
                   <pic:blipFill>
-                    <a:blip r:embed="rId10"/>
+                    <a:blip r:embed="rId11"/>
                     <a:stretch>
                       <a:fillRect/>
                     </a:stretch>
@@ -1464,6 +1655,7 @@
           <w:noProof/>
           <w:lang w:val="en-US"/>
         </w:rPr>
+        <w:lastRenderedPageBreak/>
         <w:drawing>
           <wp:inline distT="0" distB="0" distL="0" distR="0" wp14:anchorId="148C2AC6" wp14:editId="7720B385">
             <wp:extent cx="5731510" cy="1900555"/>
@@ -1480,7 +1672,7 @@
                     <pic:cNvPicPr/>
                   </pic:nvPicPr>
                   <pic:blipFill>
-                    <a:blip r:embed="rId11"/>
+                    <a:blip r:embed="rId12"/>
                     <a:stretch>
                       <a:fillRect/>
                     </a:stretch>
@@ -1747,7 +1939,6 @@
           <w:strike/>
           <w:lang w:val="en-US"/>
         </w:rPr>
-        <w:lastRenderedPageBreak/>
         <w:t>Starting to i</w:t>
       </w:r>
       <w:r>
@@ -2099,6 +2290,7 @@
         <w:rPr>
           <w:lang w:val="en-US"/>
         </w:rPr>
+        <w:lastRenderedPageBreak/>
         <w:t>Fixing meti</w:t>
       </w:r>
       <w:r>
@@ -2461,7 +2653,7 @@
                     </pic:cNvPicPr>
                   </pic:nvPicPr>
                   <pic:blipFill>
-                    <a:blip r:embed="rId12">
+                    <a:blip r:embed="rId13">
                       <a:extLst>
                         <a:ext uri="{28A0092B-C50C-407E-A947-70E740481C1C}">
                           <a14:useLocalDpi xmlns:a14="http://schemas.microsoft.com/office/drawing/2010/main" val="0"/>
@@ -3093,6 +3285,118 @@
     </w:lvl>
   </w:abstractNum>
   <w:abstractNum w:abstractNumId="5" w15:restartNumberingAfterBreak="0">
+    <w:nsid w:val="1C8F4780"/>
+    <w:multiLevelType w:val="hybridMultilevel"/>
+    <w:tmpl w:val="5FD6290A"/>
+    <w:lvl w:ilvl="0" w:tplc="DACA2C42">
+      <w:numFmt w:val="bullet"/>
+      <w:lvlText w:val="-"/>
+      <w:lvlJc w:val="left"/>
+      <w:pPr>
+        <w:ind w:left="720" w:hanging="360"/>
+      </w:pPr>
+      <w:rPr>
+        <w:rFonts w:ascii="Aptos" w:eastAsiaTheme="minorHAnsi" w:hAnsi="Aptos" w:cstheme="minorBidi" w:hint="default"/>
+      </w:rPr>
+    </w:lvl>
+    <w:lvl w:ilvl="1" w:tplc="08090003">
+      <w:start w:val="1"/>
+      <w:numFmt w:val="bullet"/>
+      <w:lvlText w:val="o"/>
+      <w:lvlJc w:val="left"/>
+      <w:pPr>
+        <w:ind w:left="1440" w:hanging="360"/>
+      </w:pPr>
+      <w:rPr>
+        <w:rFonts w:ascii="Courier New" w:hAnsi="Courier New" w:cs="Courier New" w:hint="default"/>
+      </w:rPr>
+    </w:lvl>
+    <w:lvl w:ilvl="2" w:tplc="08090005" w:tentative="1">
+      <w:start w:val="1"/>
+      <w:numFmt w:val="bullet"/>
+      <w:lvlText w:val=""/>
+      <w:lvlJc w:val="left"/>
+      <w:pPr>
+        <w:ind w:left="2160" w:hanging="360"/>
+      </w:pPr>
+      <w:rPr>
+        <w:rFonts w:ascii="Wingdings" w:hAnsi="Wingdings" w:hint="default"/>
+      </w:rPr>
+    </w:lvl>
+    <w:lvl w:ilvl="3" w:tplc="08090001" w:tentative="1">
+      <w:start w:val="1"/>
+      <w:numFmt w:val="bullet"/>
+      <w:lvlText w:val=""/>
+      <w:lvlJc w:val="left"/>
+      <w:pPr>
+        <w:ind w:left="2880" w:hanging="360"/>
+      </w:pPr>
+      <w:rPr>
+        <w:rFonts w:ascii="Symbol" w:hAnsi="Symbol" w:hint="default"/>
+      </w:rPr>
+    </w:lvl>
+    <w:lvl w:ilvl="4" w:tplc="08090003" w:tentative="1">
+      <w:start w:val="1"/>
+      <w:numFmt w:val="bullet"/>
+      <w:lvlText w:val="o"/>
+      <w:lvlJc w:val="left"/>
+      <w:pPr>
+        <w:ind w:left="3600" w:hanging="360"/>
+      </w:pPr>
+      <w:rPr>
+        <w:rFonts w:ascii="Courier New" w:hAnsi="Courier New" w:cs="Courier New" w:hint="default"/>
+      </w:rPr>
+    </w:lvl>
+    <w:lvl w:ilvl="5" w:tplc="08090005" w:tentative="1">
+      <w:start w:val="1"/>
+      <w:numFmt w:val="bullet"/>
+      <w:lvlText w:val=""/>
+      <w:lvlJc w:val="left"/>
+      <w:pPr>
+        <w:ind w:left="4320" w:hanging="360"/>
+      </w:pPr>
+      <w:rPr>
+        <w:rFonts w:ascii="Wingdings" w:hAnsi="Wingdings" w:hint="default"/>
+      </w:rPr>
+    </w:lvl>
+    <w:lvl w:ilvl="6" w:tplc="08090001" w:tentative="1">
+      <w:start w:val="1"/>
+      <w:numFmt w:val="bullet"/>
+      <w:lvlText w:val=""/>
+      <w:lvlJc w:val="left"/>
+      <w:pPr>
+        <w:ind w:left="5040" w:hanging="360"/>
+      </w:pPr>
+      <w:rPr>
+        <w:rFonts w:ascii="Symbol" w:hAnsi="Symbol" w:hint="default"/>
+      </w:rPr>
+    </w:lvl>
+    <w:lvl w:ilvl="7" w:tplc="08090003" w:tentative="1">
+      <w:start w:val="1"/>
+      <w:numFmt w:val="bullet"/>
+      <w:lvlText w:val="o"/>
+      <w:lvlJc w:val="left"/>
+      <w:pPr>
+        <w:ind w:left="5760" w:hanging="360"/>
+      </w:pPr>
+      <w:rPr>
+        <w:rFonts w:ascii="Courier New" w:hAnsi="Courier New" w:cs="Courier New" w:hint="default"/>
+      </w:rPr>
+    </w:lvl>
+    <w:lvl w:ilvl="8" w:tplc="08090005" w:tentative="1">
+      <w:start w:val="1"/>
+      <w:numFmt w:val="bullet"/>
+      <w:lvlText w:val=""/>
+      <w:lvlJc w:val="left"/>
+      <w:pPr>
+        <w:ind w:left="6480" w:hanging="360"/>
+      </w:pPr>
+      <w:rPr>
+        <w:rFonts w:ascii="Wingdings" w:hAnsi="Wingdings" w:hint="default"/>
+      </w:rPr>
+    </w:lvl>
+  </w:abstractNum>
+  <w:abstractNum w:abstractNumId="6" w15:restartNumberingAfterBreak="0">
     <w:nsid w:val="23120FA5"/>
     <w:multiLevelType w:val="hybridMultilevel"/>
     <w:tmpl w:val="4AE806A8"/>
@@ -3204,7 +3508,7 @@
       </w:rPr>
     </w:lvl>
   </w:abstractNum>
-  <w:abstractNum w:abstractNumId="6" w15:restartNumberingAfterBreak="0">
+  <w:abstractNum w:abstractNumId="7" w15:restartNumberingAfterBreak="0">
     <w:nsid w:val="260F3E04"/>
     <w:multiLevelType w:val="hybridMultilevel"/>
     <w:tmpl w:val="4FE43C20"/>
@@ -3316,7 +3620,7 @@
       </w:rPr>
     </w:lvl>
   </w:abstractNum>
-  <w:abstractNum w:abstractNumId="7" w15:restartNumberingAfterBreak="0">
+  <w:abstractNum w:abstractNumId="8" w15:restartNumberingAfterBreak="0">
     <w:nsid w:val="28575A35"/>
     <w:multiLevelType w:val="hybridMultilevel"/>
     <w:tmpl w:val="599E81EC"/>
@@ -3428,7 +3732,7 @@
       </w:rPr>
     </w:lvl>
   </w:abstractNum>
-  <w:abstractNum w:abstractNumId="8" w15:restartNumberingAfterBreak="0">
+  <w:abstractNum w:abstractNumId="9" w15:restartNumberingAfterBreak="0">
     <w:nsid w:val="2A623D97"/>
     <w:multiLevelType w:val="hybridMultilevel"/>
     <w:tmpl w:val="236C2F34"/>
@@ -3540,7 +3844,7 @@
       </w:rPr>
     </w:lvl>
   </w:abstractNum>
-  <w:abstractNum w:abstractNumId="9" w15:restartNumberingAfterBreak="0">
+  <w:abstractNum w:abstractNumId="10" w15:restartNumberingAfterBreak="0">
     <w:nsid w:val="2EAF3385"/>
     <w:multiLevelType w:val="hybridMultilevel"/>
     <w:tmpl w:val="FDEA9C72"/>
@@ -3652,7 +3956,7 @@
       </w:rPr>
     </w:lvl>
   </w:abstractNum>
-  <w:abstractNum w:abstractNumId="10" w15:restartNumberingAfterBreak="0">
+  <w:abstractNum w:abstractNumId="11" w15:restartNumberingAfterBreak="0">
     <w:nsid w:val="308237DE"/>
     <w:multiLevelType w:val="hybridMultilevel"/>
     <w:tmpl w:val="E0942DCE"/>
@@ -3765,7 +4069,7 @@
       </w:rPr>
     </w:lvl>
   </w:abstractNum>
-  <w:abstractNum w:abstractNumId="11" w15:restartNumberingAfterBreak="0">
+  <w:abstractNum w:abstractNumId="12" w15:restartNumberingAfterBreak="0">
     <w:nsid w:val="324547E5"/>
     <w:multiLevelType w:val="hybridMultilevel"/>
     <w:tmpl w:val="D7488678"/>
@@ -3878,7 +4182,7 @@
       </w:rPr>
     </w:lvl>
   </w:abstractNum>
-  <w:abstractNum w:abstractNumId="12" w15:restartNumberingAfterBreak="0">
+  <w:abstractNum w:abstractNumId="13" w15:restartNumberingAfterBreak="0">
     <w:nsid w:val="3B13134C"/>
     <w:multiLevelType w:val="hybridMultilevel"/>
     <w:tmpl w:val="041AC950"/>
@@ -3990,7 +4294,7 @@
       </w:rPr>
     </w:lvl>
   </w:abstractNum>
-  <w:abstractNum w:abstractNumId="13" w15:restartNumberingAfterBreak="0">
+  <w:abstractNum w:abstractNumId="14" w15:restartNumberingAfterBreak="0">
     <w:nsid w:val="3B3F2A02"/>
     <w:multiLevelType w:val="hybridMultilevel"/>
     <w:tmpl w:val="9BB62138"/>
@@ -4103,7 +4407,7 @@
       </w:rPr>
     </w:lvl>
   </w:abstractNum>
-  <w:abstractNum w:abstractNumId="14" w15:restartNumberingAfterBreak="0">
+  <w:abstractNum w:abstractNumId="15" w15:restartNumberingAfterBreak="0">
     <w:nsid w:val="3BA86148"/>
     <w:multiLevelType w:val="hybridMultilevel"/>
     <w:tmpl w:val="8CA86A1E"/>
@@ -4216,7 +4520,119 @@
       </w:rPr>
     </w:lvl>
   </w:abstractNum>
-  <w:abstractNum w:abstractNumId="15" w15:restartNumberingAfterBreak="0">
+  <w:abstractNum w:abstractNumId="16" w15:restartNumberingAfterBreak="0">
+    <w:nsid w:val="3C5B376A"/>
+    <w:multiLevelType w:val="hybridMultilevel"/>
+    <w:tmpl w:val="318AF922"/>
+    <w:lvl w:ilvl="0" w:tplc="9C561BB4">
+      <w:numFmt w:val="bullet"/>
+      <w:lvlText w:val=""/>
+      <w:lvlJc w:val="left"/>
+      <w:pPr>
+        <w:ind w:left="720" w:hanging="360"/>
+      </w:pPr>
+      <w:rPr>
+        <w:rFonts w:ascii="Wingdings" w:eastAsiaTheme="minorHAnsi" w:hAnsi="Wingdings" w:cstheme="minorBidi" w:hint="default"/>
+      </w:rPr>
+    </w:lvl>
+    <w:lvl w:ilvl="1" w:tplc="08090003" w:tentative="1">
+      <w:start w:val="1"/>
+      <w:numFmt w:val="bullet"/>
+      <w:lvlText w:val="o"/>
+      <w:lvlJc w:val="left"/>
+      <w:pPr>
+        <w:ind w:left="1440" w:hanging="360"/>
+      </w:pPr>
+      <w:rPr>
+        <w:rFonts w:ascii="Courier New" w:hAnsi="Courier New" w:cs="Courier New" w:hint="default"/>
+      </w:rPr>
+    </w:lvl>
+    <w:lvl w:ilvl="2" w:tplc="08090005" w:tentative="1">
+      <w:start w:val="1"/>
+      <w:numFmt w:val="bullet"/>
+      <w:lvlText w:val=""/>
+      <w:lvlJc w:val="left"/>
+      <w:pPr>
+        <w:ind w:left="2160" w:hanging="360"/>
+      </w:pPr>
+      <w:rPr>
+        <w:rFonts w:ascii="Wingdings" w:hAnsi="Wingdings" w:hint="default"/>
+      </w:rPr>
+    </w:lvl>
+    <w:lvl w:ilvl="3" w:tplc="08090001" w:tentative="1">
+      <w:start w:val="1"/>
+      <w:numFmt w:val="bullet"/>
+      <w:lvlText w:val=""/>
+      <w:lvlJc w:val="left"/>
+      <w:pPr>
+        <w:ind w:left="2880" w:hanging="360"/>
+      </w:pPr>
+      <w:rPr>
+        <w:rFonts w:ascii="Symbol" w:hAnsi="Symbol" w:hint="default"/>
+      </w:rPr>
+    </w:lvl>
+    <w:lvl w:ilvl="4" w:tplc="08090003" w:tentative="1">
+      <w:start w:val="1"/>
+      <w:numFmt w:val="bullet"/>
+      <w:lvlText w:val="o"/>
+      <w:lvlJc w:val="left"/>
+      <w:pPr>
+        <w:ind w:left="3600" w:hanging="360"/>
+      </w:pPr>
+      <w:rPr>
+        <w:rFonts w:ascii="Courier New" w:hAnsi="Courier New" w:cs="Courier New" w:hint="default"/>
+      </w:rPr>
+    </w:lvl>
+    <w:lvl w:ilvl="5" w:tplc="08090005" w:tentative="1">
+      <w:start w:val="1"/>
+      <w:numFmt w:val="bullet"/>
+      <w:lvlText w:val=""/>
+      <w:lvlJc w:val="left"/>
+      <w:pPr>
+        <w:ind w:left="4320" w:hanging="360"/>
+      </w:pPr>
+      <w:rPr>
+        <w:rFonts w:ascii="Wingdings" w:hAnsi="Wingdings" w:hint="default"/>
+      </w:rPr>
+    </w:lvl>
+    <w:lvl w:ilvl="6" w:tplc="08090001" w:tentative="1">
+      <w:start w:val="1"/>
+      <w:numFmt w:val="bullet"/>
+      <w:lvlText w:val=""/>
+      <w:lvlJc w:val="left"/>
+      <w:pPr>
+        <w:ind w:left="5040" w:hanging="360"/>
+      </w:pPr>
+      <w:rPr>
+        <w:rFonts w:ascii="Symbol" w:hAnsi="Symbol" w:hint="default"/>
+      </w:rPr>
+    </w:lvl>
+    <w:lvl w:ilvl="7" w:tplc="08090003" w:tentative="1">
+      <w:start w:val="1"/>
+      <w:numFmt w:val="bullet"/>
+      <w:lvlText w:val="o"/>
+      <w:lvlJc w:val="left"/>
+      <w:pPr>
+        <w:ind w:left="5760" w:hanging="360"/>
+      </w:pPr>
+      <w:rPr>
+        <w:rFonts w:ascii="Courier New" w:hAnsi="Courier New" w:cs="Courier New" w:hint="default"/>
+      </w:rPr>
+    </w:lvl>
+    <w:lvl w:ilvl="8" w:tplc="08090005" w:tentative="1">
+      <w:start w:val="1"/>
+      <w:numFmt w:val="bullet"/>
+      <w:lvlText w:val=""/>
+      <w:lvlJc w:val="left"/>
+      <w:pPr>
+        <w:ind w:left="6480" w:hanging="360"/>
+      </w:pPr>
+      <w:rPr>
+        <w:rFonts w:ascii="Wingdings" w:hAnsi="Wingdings" w:hint="default"/>
+      </w:rPr>
+    </w:lvl>
+  </w:abstractNum>
+  <w:abstractNum w:abstractNumId="17" w15:restartNumberingAfterBreak="0">
     <w:nsid w:val="47F96F2F"/>
     <w:multiLevelType w:val="hybridMultilevel"/>
     <w:tmpl w:val="7256ACFE"/>
@@ -4328,7 +4744,7 @@
       </w:rPr>
     </w:lvl>
   </w:abstractNum>
-  <w:abstractNum w:abstractNumId="16" w15:restartNumberingAfterBreak="0">
+  <w:abstractNum w:abstractNumId="18" w15:restartNumberingAfterBreak="0">
     <w:nsid w:val="483435CC"/>
     <w:multiLevelType w:val="hybridMultilevel"/>
     <w:tmpl w:val="787CC9BA"/>
@@ -4440,7 +4856,7 @@
       </w:rPr>
     </w:lvl>
   </w:abstractNum>
-  <w:abstractNum w:abstractNumId="17" w15:restartNumberingAfterBreak="0">
+  <w:abstractNum w:abstractNumId="19" w15:restartNumberingAfterBreak="0">
     <w:nsid w:val="49A87142"/>
     <w:multiLevelType w:val="hybridMultilevel"/>
     <w:tmpl w:val="0C047B9C"/>
@@ -4552,7 +4968,7 @@
       </w:rPr>
     </w:lvl>
   </w:abstractNum>
-  <w:abstractNum w:abstractNumId="18" w15:restartNumberingAfterBreak="0">
+  <w:abstractNum w:abstractNumId="20" w15:restartNumberingAfterBreak="0">
     <w:nsid w:val="4C2329FC"/>
     <w:multiLevelType w:val="hybridMultilevel"/>
     <w:tmpl w:val="DE9ED958"/>
@@ -4665,7 +5081,7 @@
       </w:rPr>
     </w:lvl>
   </w:abstractNum>
-  <w:abstractNum w:abstractNumId="19" w15:restartNumberingAfterBreak="0">
+  <w:abstractNum w:abstractNumId="21" w15:restartNumberingAfterBreak="0">
     <w:nsid w:val="4C62209E"/>
     <w:multiLevelType w:val="hybridMultilevel"/>
     <w:tmpl w:val="07F6CAEE"/>
@@ -4778,7 +5194,7 @@
       </w:rPr>
     </w:lvl>
   </w:abstractNum>
-  <w:abstractNum w:abstractNumId="20" w15:restartNumberingAfterBreak="0">
+  <w:abstractNum w:abstractNumId="22" w15:restartNumberingAfterBreak="0">
     <w:nsid w:val="5A9430D7"/>
     <w:multiLevelType w:val="hybridMultilevel"/>
     <w:tmpl w:val="BB3A180A"/>
@@ -4891,7 +5307,7 @@
       </w:rPr>
     </w:lvl>
   </w:abstractNum>
-  <w:abstractNum w:abstractNumId="21" w15:restartNumberingAfterBreak="0">
+  <w:abstractNum w:abstractNumId="23" w15:restartNumberingAfterBreak="0">
     <w:nsid w:val="5FC00F8A"/>
     <w:multiLevelType w:val="hybridMultilevel"/>
     <w:tmpl w:val="9D96EDD4"/>
@@ -5004,7 +5420,7 @@
       </w:rPr>
     </w:lvl>
   </w:abstractNum>
-  <w:abstractNum w:abstractNumId="22" w15:restartNumberingAfterBreak="0">
+  <w:abstractNum w:abstractNumId="24" w15:restartNumberingAfterBreak="0">
     <w:nsid w:val="65070E8D"/>
     <w:multiLevelType w:val="hybridMultilevel"/>
     <w:tmpl w:val="BDB6982A"/>
@@ -5117,7 +5533,7 @@
       </w:rPr>
     </w:lvl>
   </w:abstractNum>
-  <w:abstractNum w:abstractNumId="23" w15:restartNumberingAfterBreak="0">
+  <w:abstractNum w:abstractNumId="25" w15:restartNumberingAfterBreak="0">
     <w:nsid w:val="695A7833"/>
     <w:multiLevelType w:val="hybridMultilevel"/>
     <w:tmpl w:val="E564D540"/>
@@ -5229,7 +5645,119 @@
       </w:rPr>
     </w:lvl>
   </w:abstractNum>
-  <w:abstractNum w:abstractNumId="24" w15:restartNumberingAfterBreak="0">
+  <w:abstractNum w:abstractNumId="26" w15:restartNumberingAfterBreak="0">
+    <w:nsid w:val="6E5176C4"/>
+    <w:multiLevelType w:val="hybridMultilevel"/>
+    <w:tmpl w:val="51C0ACA8"/>
+    <w:lvl w:ilvl="0" w:tplc="AE826606">
+      <w:numFmt w:val="bullet"/>
+      <w:lvlText w:val=""/>
+      <w:lvlJc w:val="left"/>
+      <w:pPr>
+        <w:ind w:left="720" w:hanging="360"/>
+      </w:pPr>
+      <w:rPr>
+        <w:rFonts w:ascii="Wingdings" w:eastAsiaTheme="minorHAnsi" w:hAnsi="Wingdings" w:cstheme="minorBidi" w:hint="default"/>
+      </w:rPr>
+    </w:lvl>
+    <w:lvl w:ilvl="1" w:tplc="08090003" w:tentative="1">
+      <w:start w:val="1"/>
+      <w:numFmt w:val="bullet"/>
+      <w:lvlText w:val="o"/>
+      <w:lvlJc w:val="left"/>
+      <w:pPr>
+        <w:ind w:left="1440" w:hanging="360"/>
+      </w:pPr>
+      <w:rPr>
+        <w:rFonts w:ascii="Courier New" w:hAnsi="Courier New" w:cs="Courier New" w:hint="default"/>
+      </w:rPr>
+    </w:lvl>
+    <w:lvl w:ilvl="2" w:tplc="08090005" w:tentative="1">
+      <w:start w:val="1"/>
+      <w:numFmt w:val="bullet"/>
+      <w:lvlText w:val=""/>
+      <w:lvlJc w:val="left"/>
+      <w:pPr>
+        <w:ind w:left="2160" w:hanging="360"/>
+      </w:pPr>
+      <w:rPr>
+        <w:rFonts w:ascii="Wingdings" w:hAnsi="Wingdings" w:hint="default"/>
+      </w:rPr>
+    </w:lvl>
+    <w:lvl w:ilvl="3" w:tplc="08090001" w:tentative="1">
+      <w:start w:val="1"/>
+      <w:numFmt w:val="bullet"/>
+      <w:lvlText w:val=""/>
+      <w:lvlJc w:val="left"/>
+      <w:pPr>
+        <w:ind w:left="2880" w:hanging="360"/>
+      </w:pPr>
+      <w:rPr>
+        <w:rFonts w:ascii="Symbol" w:hAnsi="Symbol" w:hint="default"/>
+      </w:rPr>
+    </w:lvl>
+    <w:lvl w:ilvl="4" w:tplc="08090003" w:tentative="1">
+      <w:start w:val="1"/>
+      <w:numFmt w:val="bullet"/>
+      <w:lvlText w:val="o"/>
+      <w:lvlJc w:val="left"/>
+      <w:pPr>
+        <w:ind w:left="3600" w:hanging="360"/>
+      </w:pPr>
+      <w:rPr>
+        <w:rFonts w:ascii="Courier New" w:hAnsi="Courier New" w:cs="Courier New" w:hint="default"/>
+      </w:rPr>
+    </w:lvl>
+    <w:lvl w:ilvl="5" w:tplc="08090005" w:tentative="1">
+      <w:start w:val="1"/>
+      <w:numFmt w:val="bullet"/>
+      <w:lvlText w:val=""/>
+      <w:lvlJc w:val="left"/>
+      <w:pPr>
+        <w:ind w:left="4320" w:hanging="360"/>
+      </w:pPr>
+      <w:rPr>
+        <w:rFonts w:ascii="Wingdings" w:hAnsi="Wingdings" w:hint="default"/>
+      </w:rPr>
+    </w:lvl>
+    <w:lvl w:ilvl="6" w:tplc="08090001" w:tentative="1">
+      <w:start w:val="1"/>
+      <w:numFmt w:val="bullet"/>
+      <w:lvlText w:val=""/>
+      <w:lvlJc w:val="left"/>
+      <w:pPr>
+        <w:ind w:left="5040" w:hanging="360"/>
+      </w:pPr>
+      <w:rPr>
+        <w:rFonts w:ascii="Symbol" w:hAnsi="Symbol" w:hint="default"/>
+      </w:rPr>
+    </w:lvl>
+    <w:lvl w:ilvl="7" w:tplc="08090003" w:tentative="1">
+      <w:start w:val="1"/>
+      <w:numFmt w:val="bullet"/>
+      <w:lvlText w:val="o"/>
+      <w:lvlJc w:val="left"/>
+      <w:pPr>
+        <w:ind w:left="5760" w:hanging="360"/>
+      </w:pPr>
+      <w:rPr>
+        <w:rFonts w:ascii="Courier New" w:hAnsi="Courier New" w:cs="Courier New" w:hint="default"/>
+      </w:rPr>
+    </w:lvl>
+    <w:lvl w:ilvl="8" w:tplc="08090005" w:tentative="1">
+      <w:start w:val="1"/>
+      <w:numFmt w:val="bullet"/>
+      <w:lvlText w:val=""/>
+      <w:lvlJc w:val="left"/>
+      <w:pPr>
+        <w:ind w:left="6480" w:hanging="360"/>
+      </w:pPr>
+      <w:rPr>
+        <w:rFonts w:ascii="Wingdings" w:hAnsi="Wingdings" w:hint="default"/>
+      </w:rPr>
+    </w:lvl>
+  </w:abstractNum>
+  <w:abstractNum w:abstractNumId="27" w15:restartNumberingAfterBreak="0">
     <w:nsid w:val="73B949D2"/>
     <w:multiLevelType w:val="hybridMultilevel"/>
     <w:tmpl w:val="28606D2A"/>
@@ -5348,73 +5876,82 @@
     <w:abstractNumId w:val="2"/>
   </w:num>
   <w:num w:numId="3" w16cid:durableId="1364742651">
-    <w:abstractNumId w:val="21"/>
+    <w:abstractNumId w:val="23"/>
   </w:num>
   <w:num w:numId="4" w16cid:durableId="302855184">
+    <w:abstractNumId w:val="7"/>
+  </w:num>
+  <w:num w:numId="5" w16cid:durableId="913128674">
     <w:abstractNumId w:val="6"/>
   </w:num>
-  <w:num w:numId="5" w16cid:durableId="913128674">
-    <w:abstractNumId w:val="5"/>
-  </w:num>
   <w:num w:numId="6" w16cid:durableId="1637492389">
-    <w:abstractNumId w:val="7"/>
+    <w:abstractNumId w:val="8"/>
   </w:num>
   <w:num w:numId="7" w16cid:durableId="276644472">
-    <w:abstractNumId w:val="10"/>
+    <w:abstractNumId w:val="11"/>
   </w:num>
   <w:num w:numId="8" w16cid:durableId="836699043">
-    <w:abstractNumId w:val="13"/>
+    <w:abstractNumId w:val="14"/>
   </w:num>
   <w:num w:numId="9" w16cid:durableId="536427938">
     <w:abstractNumId w:val="4"/>
   </w:num>
   <w:num w:numId="10" w16cid:durableId="1761370988">
-    <w:abstractNumId w:val="22"/>
+    <w:abstractNumId w:val="24"/>
   </w:num>
   <w:num w:numId="11" w16cid:durableId="1499495752">
-    <w:abstractNumId w:val="15"/>
+    <w:abstractNumId w:val="17"/>
   </w:num>
   <w:num w:numId="12" w16cid:durableId="1412316134">
-    <w:abstractNumId w:val="24"/>
+    <w:abstractNumId w:val="27"/>
   </w:num>
   <w:num w:numId="13" w16cid:durableId="1350258004">
-    <w:abstractNumId w:val="8"/>
+    <w:abstractNumId w:val="9"/>
   </w:num>
   <w:num w:numId="14" w16cid:durableId="1673683661">
-    <w:abstractNumId w:val="17"/>
+    <w:abstractNumId w:val="19"/>
   </w:num>
   <w:num w:numId="15" w16cid:durableId="867064272">
-    <w:abstractNumId w:val="23"/>
+    <w:abstractNumId w:val="25"/>
   </w:num>
   <w:num w:numId="16" w16cid:durableId="7604246">
-    <w:abstractNumId w:val="16"/>
+    <w:abstractNumId w:val="18"/>
   </w:num>
   <w:num w:numId="17" w16cid:durableId="2089039549">
-    <w:abstractNumId w:val="9"/>
+    <w:abstractNumId w:val="10"/>
   </w:num>
   <w:num w:numId="18" w16cid:durableId="595285920">
-    <w:abstractNumId w:val="19"/>
+    <w:abstractNumId w:val="21"/>
   </w:num>
   <w:num w:numId="19" w16cid:durableId="2136634086">
-    <w:abstractNumId w:val="11"/>
+    <w:abstractNumId w:val="12"/>
   </w:num>
   <w:num w:numId="20" w16cid:durableId="411004895">
     <w:abstractNumId w:val="0"/>
   </w:num>
   <w:num w:numId="21" w16cid:durableId="1646935873">
+    <w:abstractNumId w:val="22"/>
+  </w:num>
+  <w:num w:numId="22" w16cid:durableId="18512531">
+    <w:abstractNumId w:val="15"/>
+  </w:num>
+  <w:num w:numId="23" w16cid:durableId="926422375">
     <w:abstractNumId w:val="20"/>
   </w:num>
-  <w:num w:numId="22" w16cid:durableId="18512531">
-    <w:abstractNumId w:val="14"/>
-  </w:num>
-  <w:num w:numId="23" w16cid:durableId="926422375">
-    <w:abstractNumId w:val="18"/>
-  </w:num>
   <w:num w:numId="24" w16cid:durableId="1654137957">
-    <w:abstractNumId w:val="12"/>
+    <w:abstractNumId w:val="13"/>
   </w:num>
   <w:num w:numId="25" w16cid:durableId="412093067">
     <w:abstractNumId w:val="3"/>
+  </w:num>
+  <w:num w:numId="26" w16cid:durableId="1880586110">
+    <w:abstractNumId w:val="5"/>
+  </w:num>
+  <w:num w:numId="27" w16cid:durableId="1512182773">
+    <w:abstractNumId w:val="16"/>
+  </w:num>
+  <w:num w:numId="28" w16cid:durableId="1900287879">
+    <w:abstractNumId w:val="26"/>
   </w:num>
 </w:numbering>
 </file>

</xml_diff>

<commit_message>
logic for table C and D added
</commit_message>
<xml_diff>
--- a/documents/2026/FDI_TO_DO.docx
+++ b/documents/2026/FDI_TO_DO.docx
@@ -77,65 +77,19 @@
         <w:rPr>
           <w:lang w:val="en-US"/>
         </w:rPr>
-        <w:t>Trying out logic</w:t>
-      </w:r>
-      <w:r>
-        <w:rPr>
-          <w:lang w:val="en-US"/>
-        </w:rPr>
-        <w:t xml:space="preserve"> (table_C)</w:t>
-      </w:r>
-    </w:p>
-    <w:p>
-      <w:pPr>
-        <w:ind w:left="360"/>
-        <w:rPr>
-          <w:b/>
-          <w:bCs/>
-          <w:lang w:val="en-US"/>
-        </w:rPr>
-      </w:pPr>
-      <w:r>
-        <w:rPr>
-          <w:b/>
-          <w:bCs/>
-          <w:lang w:val="en-US"/>
-        </w:rPr>
-        <w:drawing>
-          <wp:inline distT="0" distB="0" distL="0" distR="0" wp14:anchorId="0D9110C1" wp14:editId="5E01DD71">
-            <wp:extent cx="5731510" cy="967740"/>
-            <wp:effectExtent l="0" t="0" r="2540" b="3810"/>
-            <wp:docPr id="1300773323" name="Picture 1"/>
-            <wp:cNvGraphicFramePr>
-              <a:graphicFrameLocks xmlns:a="http://schemas.openxmlformats.org/drawingml/2006/main" noChangeAspect="1"/>
-            </wp:cNvGraphicFramePr>
-            <a:graphic xmlns:a="http://schemas.openxmlformats.org/drawingml/2006/main">
-              <a:graphicData uri="http://schemas.openxmlformats.org/drawingml/2006/picture">
-                <pic:pic xmlns:pic="http://schemas.openxmlformats.org/drawingml/2006/picture">
-                  <pic:nvPicPr>
-                    <pic:cNvPr id="1300773323" name=""/>
-                    <pic:cNvPicPr/>
-                  </pic:nvPicPr>
-                  <pic:blipFill>
-                    <a:blip r:embed="rId5"/>
-                    <a:stretch>
-                      <a:fillRect/>
-                    </a:stretch>
-                  </pic:blipFill>
-                  <pic:spPr>
-                    <a:xfrm>
-                      <a:off x="0" y="0"/>
-                      <a:ext cx="5731510" cy="967740"/>
-                    </a:xfrm>
-                    <a:prstGeom prst="rect">
-                      <a:avLst/>
-                    </a:prstGeom>
-                  </pic:spPr>
-                </pic:pic>
-              </a:graphicData>
-            </a:graphic>
-          </wp:inline>
-        </w:drawing>
+        <w:t xml:space="preserve">if in table A, but not in table C </w:t>
+      </w:r>
+      <w:r>
+        <w:rPr>
+          <w:lang w:val="en-US"/>
+        </w:rPr>
+        <w:sym w:font="Wingdings" w:char="F0E0"/>
+      </w:r>
+      <w:r>
+        <w:rPr>
+          <w:lang w:val="en-US"/>
+        </w:rPr>
+        <w:t xml:space="preserve"> DISCARD_DOMAIN = “NK”</w:t>
       </w:r>
     </w:p>
     <w:p>
@@ -153,19 +107,31 @@
         <w:rPr>
           <w:lang w:val="en-US"/>
         </w:rPr>
-        <w:t xml:space="preserve">If year </w:t>
-      </w:r>
-      <w:r>
-        <w:rPr>
-          <w:lang w:val="en-US"/>
-        </w:rPr>
-        <w:t>=</w:t>
-      </w:r>
-      <w:r>
-        <w:rPr>
-          <w:lang w:val="en-US"/>
-        </w:rPr>
-        <w:t xml:space="preserve"> 2013</w:t>
+        <w:t xml:space="preserve">If in table A, but not in table </w:t>
+      </w:r>
+      <w:r>
+        <w:rPr>
+          <w:lang w:val="en-US"/>
+        </w:rPr>
+        <w:t>D</w:t>
+      </w:r>
+      <w:r>
+        <w:rPr>
+          <w:lang w:val="en-US"/>
+        </w:rPr>
+        <w:t xml:space="preserve"> </w:t>
+      </w:r>
+      <w:r>
+        <w:rPr>
+          <w:lang w:val="en-US"/>
+        </w:rPr>
+        <w:sym w:font="Wingdings" w:char="F0E0"/>
+      </w:r>
+      <w:r>
+        <w:rPr>
+          <w:lang w:val="en-US"/>
+        </w:rPr>
+        <w:t xml:space="preserve"> DISCARD_DOMAIN = “NK”</w:t>
       </w:r>
     </w:p>
     <w:p>
@@ -183,13 +149,25 @@
         <w:rPr>
           <w:lang w:val="en-US"/>
         </w:rPr>
-        <w:t>and DOMAIN_DISCARDS</w:t>
-      </w:r>
-      <w:r>
-        <w:rPr>
-          <w:lang w:val="en-US"/>
-        </w:rPr>
-        <w:t xml:space="preserve"> = DOMAIN_DISCARDS</w:t>
+        <w:t>Table E</w:t>
+      </w:r>
+      <w:r>
+        <w:rPr>
+          <w:lang w:val="en-US"/>
+        </w:rPr>
+        <w:t xml:space="preserve"> </w:t>
+      </w:r>
+      <w:r>
+        <w:rPr>
+          <w:lang w:val="en-US"/>
+        </w:rPr>
+        <w:sym w:font="Wingdings" w:char="F0E0"/>
+      </w:r>
+      <w:r>
+        <w:rPr>
+          <w:lang w:val="en-US"/>
+        </w:rPr>
+        <w:t xml:space="preserve"> TO DO</w:t>
       </w:r>
     </w:p>
     <w:p>
@@ -207,15 +185,15 @@
         <w:rPr>
           <w:lang w:val="en-US"/>
         </w:rPr>
-        <w:t>and SPECIES = SPECIES</w:t>
+        <w:t>Table F</w:t>
       </w:r>
     </w:p>
     <w:p>
       <w:pPr>
         <w:pStyle w:val="ListParagraph"/>
         <w:numPr>
-          <w:ilvl w:val="0"/>
-          <w:numId w:val="28"/>
+          <w:ilvl w:val="1"/>
+          <w:numId w:val="26"/>
         </w:numPr>
         <w:rPr>
           <w:lang w:val="en-US"/>
@@ -225,15 +203,8 @@
         <w:rPr>
           <w:lang w:val="en-US"/>
         </w:rPr>
-        <w:t>edit or delete matches???</w:t>
-      </w:r>
-    </w:p>
-    <w:p>
-      <w:pPr>
-        <w:rPr>
-          <w:lang w:val="en-US"/>
-        </w:rPr>
-      </w:pPr>
+        <w:t>Check if rows need dropping</w:t>
+      </w:r>
     </w:p>
     <w:p>
       <w:pPr>
@@ -435,7 +406,21 @@
         <w:rPr>
           <w:lang w:val="en-US"/>
         </w:rPr>
-        <w:t xml:space="preserve">Replace shorelog vessel length VL0010 with VL0812 </w:t>
+        <w:t xml:space="preserve">Replace </w:t>
+      </w:r>
+      <w:proofErr w:type="spellStart"/>
+      <w:r>
+        <w:rPr>
+          <w:lang w:val="en-US"/>
+        </w:rPr>
+        <w:t>shorelog</w:t>
+      </w:r>
+      <w:proofErr w:type="spellEnd"/>
+      <w:r>
+        <w:rPr>
+          <w:lang w:val="en-US"/>
+        </w:rPr>
+        <w:t xml:space="preserve"> vessel length VL0010 with VL0812 </w:t>
       </w:r>
       <w:r>
         <w:rPr>
@@ -456,7 +441,6 @@
           <w:noProof/>
           <w:lang w:val="en-US"/>
         </w:rPr>
-        <w:lastRenderedPageBreak/>
         <w:drawing>
           <wp:inline distT="0" distB="0" distL="0" distR="0" wp14:anchorId="246A9859" wp14:editId="28635C7C">
             <wp:extent cx="3505504" cy="3086367"/>
@@ -473,7 +457,7 @@
                     <pic:cNvPicPr/>
                   </pic:nvPicPr>
                   <pic:blipFill>
-                    <a:blip r:embed="rId6"/>
+                    <a:blip r:embed="rId5"/>
                     <a:stretch>
                       <a:fillRect/>
                     </a:stretch>
@@ -524,6 +508,7 @@
           <w:noProof/>
           <w:lang w:val="en-US"/>
         </w:rPr>
+        <w:lastRenderedPageBreak/>
         <w:drawing>
           <wp:inline distT="0" distB="0" distL="0" distR="0" wp14:anchorId="0C20FD64" wp14:editId="68A59E32">
             <wp:extent cx="2903472" cy="1920406"/>
@@ -540,7 +525,7 @@
                     <pic:cNvPicPr/>
                   </pic:nvPicPr>
                   <pic:blipFill>
-                    <a:blip r:embed="rId7"/>
+                    <a:blip r:embed="rId6"/>
                     <a:stretch>
                       <a:fillRect/>
                     </a:stretch>
@@ -596,7 +581,21 @@
         <w:rPr>
           <w:lang w:val="en-US"/>
         </w:rPr>
-        <w:t>Save clean data back to DCRPOD (Pertuu??? I don’t have permissions</w:t>
+        <w:t>Save clean data back to DCRPOD (</w:t>
+      </w:r>
+      <w:proofErr w:type="spellStart"/>
+      <w:r>
+        <w:rPr>
+          <w:lang w:val="en-US"/>
+        </w:rPr>
+        <w:t>Pertuu</w:t>
+      </w:r>
+      <w:proofErr w:type="spellEnd"/>
+      <w:r>
+        <w:rPr>
+          <w:lang w:val="en-US"/>
+        </w:rPr>
+        <w:t>??? I don’t have permissions</w:t>
       </w:r>
       <w:r>
         <w:rPr>
@@ -620,7 +619,21 @@
         <w:rPr>
           <w:lang w:val="en-US"/>
         </w:rPr>
-        <w:t>Chunk 23: fecR-logbooks</w:t>
+        <w:t xml:space="preserve">Chunk 23: </w:t>
+      </w:r>
+      <w:proofErr w:type="spellStart"/>
+      <w:r>
+        <w:rPr>
+          <w:lang w:val="en-US"/>
+        </w:rPr>
+        <w:t>fecR</w:t>
+      </w:r>
+      <w:proofErr w:type="spellEnd"/>
+      <w:r>
+        <w:rPr>
+          <w:lang w:val="en-US"/>
+        </w:rPr>
+        <w:t>-logbooks</w:t>
       </w:r>
       <w:r>
         <w:rPr>
@@ -662,13 +675,27 @@
         <w:rPr>
           <w:lang w:val="en-US"/>
         </w:rPr>
-        <w:t>Chunk 24:</w:t>
-      </w:r>
-      <w:r>
-        <w:rPr>
-          <w:lang w:val="en-US"/>
-        </w:rPr>
-        <w:t>shore-effort</w:t>
+        <w:t xml:space="preserve">Chunk </w:t>
+      </w:r>
+      <w:proofErr w:type="gramStart"/>
+      <w:r>
+        <w:rPr>
+          <w:lang w:val="en-US"/>
+        </w:rPr>
+        <w:t>24:</w:t>
+      </w:r>
+      <w:r>
+        <w:rPr>
+          <w:lang w:val="en-US"/>
+        </w:rPr>
+        <w:t>shore</w:t>
+      </w:r>
+      <w:proofErr w:type="gramEnd"/>
+      <w:r>
+        <w:rPr>
+          <w:lang w:val="en-US"/>
+        </w:rPr>
+        <w:t>-effort</w:t>
       </w:r>
       <w:r>
         <w:rPr>
@@ -836,13 +863,41 @@
         <w:rPr>
           <w:lang w:val="en-US"/>
         </w:rPr>
-        <w:t xml:space="preserve"> cleaned sas data in </w:t>
-      </w:r>
-      <w:r>
-        <w:rPr>
-          <w:lang w:val="en-US"/>
-        </w:rPr>
-        <w:t>Tables a-g-h-i-j</w:t>
+        <w:t xml:space="preserve"> cleaned </w:t>
+      </w:r>
+      <w:proofErr w:type="spellStart"/>
+      <w:r>
+        <w:rPr>
+          <w:lang w:val="en-US"/>
+        </w:rPr>
+        <w:t>sas</w:t>
+      </w:r>
+      <w:proofErr w:type="spellEnd"/>
+      <w:r>
+        <w:rPr>
+          <w:lang w:val="en-US"/>
+        </w:rPr>
+        <w:t xml:space="preserve"> data in </w:t>
+      </w:r>
+      <w:r>
+        <w:rPr>
+          <w:lang w:val="en-US"/>
+        </w:rPr>
+        <w:t>Tables a-g-h-</w:t>
+      </w:r>
+      <w:proofErr w:type="spellStart"/>
+      <w:r>
+        <w:rPr>
+          <w:lang w:val="en-US"/>
+        </w:rPr>
+        <w:t>i</w:t>
+      </w:r>
+      <w:proofErr w:type="spellEnd"/>
+      <w:r>
+        <w:rPr>
+          <w:lang w:val="en-US"/>
+        </w:rPr>
+        <w:t>-j</w:t>
       </w:r>
       <w:r>
         <w:rPr>
@@ -868,11 +923,19 @@
         </w:rPr>
         <w:t xml:space="preserve">TODO: add </w:t>
       </w:r>
-      <w:r>
-        <w:rPr>
-          <w:lang w:val="en-US"/>
-        </w:rPr>
-        <w:t>sql permissions to script (Petri)</w:t>
+      <w:proofErr w:type="spellStart"/>
+      <w:r>
+        <w:rPr>
+          <w:lang w:val="en-US"/>
+        </w:rPr>
+        <w:t>sql</w:t>
+      </w:r>
+      <w:proofErr w:type="spellEnd"/>
+      <w:r>
+        <w:rPr>
+          <w:lang w:val="en-US"/>
+        </w:rPr>
+        <w:t xml:space="preserve"> permissions to script (Petri)</w:t>
       </w:r>
     </w:p>
     <w:p>
@@ -890,7 +953,35 @@
         <w:rPr>
           <w:lang w:val="en-US"/>
         </w:rPr>
-        <w:t>TODO: find minimal needed columns and join sas and aktiviteeti tables</w:t>
+        <w:t xml:space="preserve">TODO: find minimal needed columns and join </w:t>
+      </w:r>
+      <w:proofErr w:type="spellStart"/>
+      <w:r>
+        <w:rPr>
+          <w:lang w:val="en-US"/>
+        </w:rPr>
+        <w:t>sas</w:t>
+      </w:r>
+      <w:proofErr w:type="spellEnd"/>
+      <w:r>
+        <w:rPr>
+          <w:lang w:val="en-US"/>
+        </w:rPr>
+        <w:t xml:space="preserve"> and </w:t>
+      </w:r>
+      <w:proofErr w:type="spellStart"/>
+      <w:r>
+        <w:rPr>
+          <w:lang w:val="en-US"/>
+        </w:rPr>
+        <w:t>aktiviteeti</w:t>
+      </w:r>
+      <w:proofErr w:type="spellEnd"/>
+      <w:r>
+        <w:rPr>
+          <w:lang w:val="en-US"/>
+        </w:rPr>
+        <w:t xml:space="preserve"> tables</w:t>
       </w:r>
       <w:r>
         <w:rPr>
@@ -920,7 +1011,6 @@
           <w:bCs/>
           <w:lang w:val="en-US"/>
         </w:rPr>
-        <w:lastRenderedPageBreak/>
         <w:t>12/06/2026</w:t>
       </w:r>
     </w:p>
@@ -939,7 +1029,35 @@
         <w:rPr>
           <w:lang w:val="en-US"/>
         </w:rPr>
-        <w:t>Go through last years’ sas integration logic</w:t>
+        <w:t xml:space="preserve">Go through last </w:t>
+      </w:r>
+      <w:proofErr w:type="gramStart"/>
+      <w:r>
+        <w:rPr>
+          <w:lang w:val="en-US"/>
+        </w:rPr>
+        <w:t>years’</w:t>
+      </w:r>
+      <w:proofErr w:type="gramEnd"/>
+      <w:r>
+        <w:rPr>
+          <w:lang w:val="en-US"/>
+        </w:rPr>
+        <w:t xml:space="preserve"> </w:t>
+      </w:r>
+      <w:proofErr w:type="spellStart"/>
+      <w:r>
+        <w:rPr>
+          <w:lang w:val="en-US"/>
+        </w:rPr>
+        <w:t>sas</w:t>
+      </w:r>
+      <w:proofErr w:type="spellEnd"/>
+      <w:r>
+        <w:rPr>
+          <w:lang w:val="en-US"/>
+        </w:rPr>
+        <w:t xml:space="preserve"> integration logic</w:t>
       </w:r>
     </w:p>
     <w:p>
@@ -1038,6 +1156,7 @@
         </w:rPr>
         <w:t xml:space="preserve">see chunk </w:t>
       </w:r>
+      <w:proofErr w:type="gramStart"/>
       <w:r>
         <w:rPr>
           <w:rFonts w:ascii="Miriam Fixed" w:hAnsi="Miriam Fixed" w:cs="Miriam Fixed" w:hint="cs"/>
@@ -1054,6 +1173,7 @@
         </w:rPr>
         <w:t>k</w:t>
       </w:r>
+      <w:proofErr w:type="gramEnd"/>
       <w:r>
         <w:rPr>
           <w:rFonts w:ascii="Miriam Fixed" w:hAnsi="Miriam Fixed" w:cs="Miriam Fixed"/>
@@ -1104,6 +1224,7 @@
           <w:noProof/>
           <w:lang w:val="en-US"/>
         </w:rPr>
+        <w:lastRenderedPageBreak/>
         <w:drawing>
           <wp:inline distT="0" distB="0" distL="0" distR="0" wp14:anchorId="531A49BB" wp14:editId="3B74A859">
             <wp:extent cx="2570780" cy="3753852"/>
@@ -1120,7 +1241,7 @@
                     <pic:cNvPicPr/>
                   </pic:nvPicPr>
                   <pic:blipFill>
-                    <a:blip r:embed="rId8"/>
+                    <a:blip r:embed="rId7"/>
                     <a:stretch>
                       <a:fillRect/>
                     </a:stretch>
@@ -1167,7 +1288,7 @@
                     <pic:cNvPicPr/>
                   </pic:nvPicPr>
                   <pic:blipFill>
-                    <a:blip r:embed="rId9"/>
+                    <a:blip r:embed="rId8"/>
                     <a:stretch>
                       <a:fillRect/>
                     </a:stretch>
@@ -1200,11 +1321,19 @@
           <w:u w:val="single"/>
         </w:rPr>
       </w:pPr>
-      <w:r>
-        <w:rPr>
-          <w:lang w:val="en-US"/>
-        </w:rPr>
-        <w:t xml:space="preserve">Shorelogs: see chunk </w:t>
+      <w:proofErr w:type="spellStart"/>
+      <w:r>
+        <w:rPr>
+          <w:lang w:val="en-US"/>
+        </w:rPr>
+        <w:t>Shorelogs</w:t>
+      </w:r>
+      <w:proofErr w:type="spellEnd"/>
+      <w:r>
+        <w:rPr>
+          <w:lang w:val="en-US"/>
+        </w:rPr>
+        <w:t xml:space="preserve">: see chunk </w:t>
       </w:r>
       <w:r>
         <w:rPr>
@@ -1212,8 +1341,18 @@
           <w:u w:val="single"/>
           <w:lang w:val="en-US"/>
         </w:rPr>
-        <w:t>clean-shorelogs</w:t>
-      </w:r>
+        <w:t>clean-</w:t>
+      </w:r>
+      <w:proofErr w:type="spellStart"/>
+      <w:r>
+        <w:rPr>
+          <w:rFonts w:ascii="Miriam Fixed" w:hAnsi="Miriam Fixed" w:cs="Miriam Fixed" w:hint="cs"/>
+          <w:u w:val="single"/>
+          <w:lang w:val="en-US"/>
+        </w:rPr>
+        <w:t>shorelogs</w:t>
+      </w:r>
+      <w:proofErr w:type="spellEnd"/>
       <w:r>
         <w:rPr>
           <w:rFonts w:ascii="Miriam Fixed" w:hAnsi="Miriam Fixed" w:cs="Miriam Fixed"/>
@@ -1250,7 +1389,6 @@
           <w:noProof/>
           <w:lang w:val="en-US"/>
         </w:rPr>
-        <w:lastRenderedPageBreak/>
         <w:drawing>
           <wp:inline distT="0" distB="0" distL="0" distR="0" wp14:anchorId="6CD656A8" wp14:editId="0A804541">
             <wp:extent cx="2422358" cy="1376051"/>
@@ -1267,7 +1405,7 @@
                     <pic:cNvPicPr/>
                   </pic:nvPicPr>
                   <pic:blipFill>
-                    <a:blip r:embed="rId10"/>
+                    <a:blip r:embed="rId9"/>
                     <a:stretch>
                       <a:fillRect/>
                     </a:stretch>
@@ -1314,7 +1452,7 @@
                     <pic:cNvPicPr/>
                   </pic:nvPicPr>
                   <pic:blipFill>
-                    <a:blip r:embed="rId11"/>
+                    <a:blip r:embed="rId10"/>
                     <a:stretch>
                       <a:fillRect/>
                     </a:stretch>
@@ -1381,7 +1519,14 @@
         <w:rPr>
           <w:lang w:val="en-US"/>
         </w:rPr>
-        <w:t>Go through last years</w:t>
+        <w:t xml:space="preserve">Go through last </w:t>
+      </w:r>
+      <w:proofErr w:type="gramStart"/>
+      <w:r>
+        <w:rPr>
+          <w:lang w:val="en-US"/>
+        </w:rPr>
+        <w:t>years</w:t>
       </w:r>
       <w:r>
         <w:rPr>
@@ -1389,11 +1534,26 @@
         </w:rPr>
         <w:t>’</w:t>
       </w:r>
-      <w:r>
-        <w:rPr>
-          <w:lang w:val="en-US"/>
-        </w:rPr>
-        <w:t xml:space="preserve"> sas integration logic</w:t>
+      <w:proofErr w:type="gramEnd"/>
+      <w:r>
+        <w:rPr>
+          <w:lang w:val="en-US"/>
+        </w:rPr>
+        <w:t xml:space="preserve"> </w:t>
+      </w:r>
+      <w:proofErr w:type="spellStart"/>
+      <w:r>
+        <w:rPr>
+          <w:lang w:val="en-US"/>
+        </w:rPr>
+        <w:t>sas</w:t>
+      </w:r>
+      <w:proofErr w:type="spellEnd"/>
+      <w:r>
+        <w:rPr>
+          <w:lang w:val="en-US"/>
+        </w:rPr>
+        <w:t xml:space="preserve"> integration logic</w:t>
       </w:r>
     </w:p>
     <w:p>
@@ -1428,7 +1588,35 @@
         <w:rPr>
           <w:lang w:val="en-US"/>
         </w:rPr>
-        <w:t>Create Rmd version of sas integration script from 2025</w:t>
+        <w:t xml:space="preserve">Create </w:t>
+      </w:r>
+      <w:proofErr w:type="spellStart"/>
+      <w:r>
+        <w:rPr>
+          <w:lang w:val="en-US"/>
+        </w:rPr>
+        <w:t>Rmd</w:t>
+      </w:r>
+      <w:proofErr w:type="spellEnd"/>
+      <w:r>
+        <w:rPr>
+          <w:lang w:val="en-US"/>
+        </w:rPr>
+        <w:t xml:space="preserve"> version of </w:t>
+      </w:r>
+      <w:proofErr w:type="spellStart"/>
+      <w:r>
+        <w:rPr>
+          <w:lang w:val="en-US"/>
+        </w:rPr>
+        <w:t>sas</w:t>
+      </w:r>
+      <w:proofErr w:type="spellEnd"/>
+      <w:r>
+        <w:rPr>
+          <w:lang w:val="en-US"/>
+        </w:rPr>
+        <w:t xml:space="preserve"> integration script from 2025</w:t>
       </w:r>
     </w:p>
     <w:p>
@@ -1631,7 +1819,21 @@
         <w:rPr>
           <w:lang w:val="en-US"/>
         </w:rPr>
-        <w:t>Incorrect length classes in old sas data</w:t>
+        <w:t xml:space="preserve">Incorrect length classes in old </w:t>
+      </w:r>
+      <w:proofErr w:type="spellStart"/>
+      <w:r>
+        <w:rPr>
+          <w:lang w:val="en-US"/>
+        </w:rPr>
+        <w:t>sas</w:t>
+      </w:r>
+      <w:proofErr w:type="spellEnd"/>
+      <w:r>
+        <w:rPr>
+          <w:lang w:val="en-US"/>
+        </w:rPr>
+        <w:t xml:space="preserve"> data</w:t>
       </w:r>
       <w:r>
         <w:rPr>
@@ -1655,7 +1857,6 @@
           <w:noProof/>
           <w:lang w:val="en-US"/>
         </w:rPr>
-        <w:lastRenderedPageBreak/>
         <w:drawing>
           <wp:inline distT="0" distB="0" distL="0" distR="0" wp14:anchorId="148C2AC6" wp14:editId="7720B385">
             <wp:extent cx="5731510" cy="1900555"/>
@@ -1672,7 +1873,7 @@
                     <pic:cNvPicPr/>
                   </pic:nvPicPr>
                   <pic:blipFill>
-                    <a:blip r:embed="rId12"/>
+                    <a:blip r:embed="rId11"/>
                     <a:stretch>
                       <a:fillRect/>
                     </a:stretch>
@@ -1790,7 +1991,21 @@
         <w:rPr>
           <w:lang w:val="en-US"/>
         </w:rPr>
-        <w:t xml:space="preserve"> Rmd now running</w:t>
+        <w:t xml:space="preserve"> </w:t>
+      </w:r>
+      <w:proofErr w:type="spellStart"/>
+      <w:r>
+        <w:rPr>
+          <w:lang w:val="en-US"/>
+        </w:rPr>
+        <w:t>Rmd</w:t>
+      </w:r>
+      <w:proofErr w:type="spellEnd"/>
+      <w:r>
+        <w:rPr>
+          <w:lang w:val="en-US"/>
+        </w:rPr>
+        <w:t xml:space="preserve"> now running</w:t>
       </w:r>
       <w:r>
         <w:rPr>
@@ -1823,12 +2038,14 @@
         </w:rPr>
         <w:t xml:space="preserve">: </w:t>
       </w:r>
+      <w:proofErr w:type="spellStart"/>
       <w:r>
         <w:rPr>
           <w:lang w:val="en-US"/>
         </w:rPr>
         <w:t>IC_DB.rds</w:t>
       </w:r>
+      <w:proofErr w:type="spellEnd"/>
       <w:r>
         <w:rPr>
           <w:lang w:val="en-US"/>
@@ -1859,11 +2076,19 @@
         </w:rPr>
         <w:t xml:space="preserve">TABLE F: </w:t>
       </w:r>
-      <w:r>
-        <w:rPr>
-          <w:lang w:val="en-US"/>
-        </w:rPr>
-        <w:t>Rmd now running</w:t>
+      <w:proofErr w:type="spellStart"/>
+      <w:r>
+        <w:rPr>
+          <w:lang w:val="en-US"/>
+        </w:rPr>
+        <w:t>Rmd</w:t>
+      </w:r>
+      <w:proofErr w:type="spellEnd"/>
+      <w:r>
+        <w:rPr>
+          <w:lang w:val="en-US"/>
+        </w:rPr>
+        <w:t xml:space="preserve"> now running</w:t>
       </w:r>
       <w:r>
         <w:rPr>
@@ -1919,8 +2144,16 @@
         <w:rPr>
           <w:lang w:val="en-US"/>
         </w:rPr>
-        <w:t xml:space="preserve"> Rmd</w:t>
-      </w:r>
+        <w:t xml:space="preserve"> </w:t>
+      </w:r>
+      <w:proofErr w:type="spellStart"/>
+      <w:r>
+        <w:rPr>
+          <w:lang w:val="en-US"/>
+        </w:rPr>
+        <w:t>Rmd</w:t>
+      </w:r>
+      <w:proofErr w:type="spellEnd"/>
     </w:p>
     <w:p>
       <w:pPr>
@@ -1939,6 +2172,7 @@
           <w:strike/>
           <w:lang w:val="en-US"/>
         </w:rPr>
+        <w:lastRenderedPageBreak/>
         <w:t>Starting to i</w:t>
       </w:r>
       <w:r>
@@ -1960,7 +2194,23 @@
           <w:strike/>
           <w:lang w:val="en-US"/>
         </w:rPr>
-        <w:t>new mongo implementation of Suomu cloud data</w:t>
+        <w:t xml:space="preserve">new mongo implementation of </w:t>
+      </w:r>
+      <w:proofErr w:type="spellStart"/>
+      <w:r>
+        <w:rPr>
+          <w:strike/>
+          <w:lang w:val="en-US"/>
+        </w:rPr>
+        <w:t>Suomu</w:t>
+      </w:r>
+      <w:proofErr w:type="spellEnd"/>
+      <w:r>
+        <w:rPr>
+          <w:strike/>
+          <w:lang w:val="en-US"/>
+        </w:rPr>
+        <w:t xml:space="preserve"> cloud data</w:t>
       </w:r>
     </w:p>
     <w:p>
@@ -1984,7 +2234,21 @@
         <w:rPr>
           <w:lang w:val="en-US"/>
         </w:rPr>
-        <w:t xml:space="preserve"> Rmd prepared and test run</w:t>
+        <w:t xml:space="preserve"> </w:t>
+      </w:r>
+      <w:proofErr w:type="spellStart"/>
+      <w:r>
+        <w:rPr>
+          <w:lang w:val="en-US"/>
+        </w:rPr>
+        <w:t>Rmd</w:t>
+      </w:r>
+      <w:proofErr w:type="spellEnd"/>
+      <w:r>
+        <w:rPr>
+          <w:lang w:val="en-US"/>
+        </w:rPr>
+        <w:t xml:space="preserve"> prepared and test run</w:t>
       </w:r>
       <w:r>
         <w:rPr>
@@ -2051,7 +2315,21 @@
         <w:rPr>
           <w:lang w:val="en-US"/>
         </w:rPr>
-        <w:t xml:space="preserve"> Rmd preparation</w:t>
+        <w:t xml:space="preserve"> </w:t>
+      </w:r>
+      <w:proofErr w:type="spellStart"/>
+      <w:r>
+        <w:rPr>
+          <w:lang w:val="en-US"/>
+        </w:rPr>
+        <w:t>Rmd</w:t>
+      </w:r>
+      <w:proofErr w:type="spellEnd"/>
+      <w:r>
+        <w:rPr>
+          <w:lang w:val="en-US"/>
+        </w:rPr>
+        <w:t xml:space="preserve"> preparation</w:t>
       </w:r>
       <w:r>
         <w:rPr>
@@ -2112,7 +2390,21 @@
         <w:rPr>
           <w:lang w:val="en-US"/>
         </w:rPr>
-        <w:t>Table e Rmd preparation</w:t>
+        <w:t xml:space="preserve">Table e </w:t>
+      </w:r>
+      <w:proofErr w:type="spellStart"/>
+      <w:r>
+        <w:rPr>
+          <w:lang w:val="en-US"/>
+        </w:rPr>
+        <w:t>Rmd</w:t>
+      </w:r>
+      <w:proofErr w:type="spellEnd"/>
+      <w:r>
+        <w:rPr>
+          <w:lang w:val="en-US"/>
+        </w:rPr>
+        <w:t xml:space="preserve"> preparation</w:t>
       </w:r>
     </w:p>
     <w:p>
@@ -2174,7 +2466,23 @@
           <w:strike/>
           <w:lang w:val="en-US"/>
         </w:rPr>
-        <w:t>Needs new Suomu cloud implementation</w:t>
+        <w:t xml:space="preserve">Needs new </w:t>
+      </w:r>
+      <w:proofErr w:type="spellStart"/>
+      <w:r>
+        <w:rPr>
+          <w:strike/>
+          <w:lang w:val="en-US"/>
+        </w:rPr>
+        <w:t>Suomu</w:t>
+      </w:r>
+      <w:proofErr w:type="spellEnd"/>
+      <w:r>
+        <w:rPr>
+          <w:strike/>
+          <w:lang w:val="en-US"/>
+        </w:rPr>
+        <w:t xml:space="preserve"> cloud implementation</w:t>
       </w:r>
     </w:p>
     <w:p>
@@ -2192,7 +2500,29 @@
         <w:rPr>
           <w:lang w:val="en-US"/>
         </w:rPr>
-        <w:t>Table f Rmd preparation</w:t>
+        <w:t xml:space="preserve">Table </w:t>
+      </w:r>
+      <w:proofErr w:type="gramStart"/>
+      <w:r>
+        <w:rPr>
+          <w:lang w:val="en-US"/>
+        </w:rPr>
+        <w:t xml:space="preserve">f </w:t>
+      </w:r>
+      <w:proofErr w:type="spellStart"/>
+      <w:r>
+        <w:rPr>
+          <w:lang w:val="en-US"/>
+        </w:rPr>
+        <w:t>Rmd</w:t>
+      </w:r>
+      <w:proofErr w:type="spellEnd"/>
+      <w:proofErr w:type="gramEnd"/>
+      <w:r>
+        <w:rPr>
+          <w:lang w:val="en-US"/>
+        </w:rPr>
+        <w:t xml:space="preserve"> preparation</w:t>
       </w:r>
     </w:p>
     <w:p>
@@ -2230,7 +2560,23 @@
           <w:strike/>
           <w:lang w:val="en-US"/>
         </w:rPr>
-        <w:t>Needs new Suomu cloud implementation</w:t>
+        <w:t xml:space="preserve">Needs new </w:t>
+      </w:r>
+      <w:proofErr w:type="spellStart"/>
+      <w:r>
+        <w:rPr>
+          <w:strike/>
+          <w:lang w:val="en-US"/>
+        </w:rPr>
+        <w:t>Suomu</w:t>
+      </w:r>
+      <w:proofErr w:type="spellEnd"/>
+      <w:r>
+        <w:rPr>
+          <w:strike/>
+          <w:lang w:val="en-US"/>
+        </w:rPr>
+        <w:t xml:space="preserve"> cloud implementation</w:t>
       </w:r>
     </w:p>
     <w:p>
@@ -2290,14 +2636,27 @@
         <w:rPr>
           <w:lang w:val="en-US"/>
         </w:rPr>
-        <w:lastRenderedPageBreak/>
-        <w:t>Fixing meti</w:t>
-      </w:r>
-      <w:r>
-        <w:rPr>
-          <w:lang w:val="en-US"/>
-        </w:rPr>
-        <w:t>ers in table a-j script</w:t>
+        <w:t xml:space="preserve">Fixing </w:t>
+      </w:r>
+      <w:proofErr w:type="spellStart"/>
+      <w:r>
+        <w:rPr>
+          <w:lang w:val="en-US"/>
+        </w:rPr>
+        <w:t>meti</w:t>
+      </w:r>
+      <w:r>
+        <w:rPr>
+          <w:lang w:val="en-US"/>
+        </w:rPr>
+        <w:t>ers</w:t>
+      </w:r>
+      <w:proofErr w:type="spellEnd"/>
+      <w:r>
+        <w:rPr>
+          <w:lang w:val="en-US"/>
+        </w:rPr>
+        <w:t xml:space="preserve"> in table a-j script</w:t>
       </w:r>
     </w:p>
     <w:p>
@@ -2311,11 +2670,19 @@
           <w:lang w:val="en-US"/>
         </w:rPr>
       </w:pPr>
-      <w:r>
-        <w:rPr>
-          <w:lang w:val="en-US"/>
-        </w:rPr>
-        <w:t>Rmd now running</w:t>
+      <w:proofErr w:type="spellStart"/>
+      <w:r>
+        <w:rPr>
+          <w:lang w:val="en-US"/>
+        </w:rPr>
+        <w:t>Rmd</w:t>
+      </w:r>
+      <w:proofErr w:type="spellEnd"/>
+      <w:r>
+        <w:rPr>
+          <w:lang w:val="en-US"/>
+        </w:rPr>
+        <w:t xml:space="preserve"> now running</w:t>
       </w:r>
     </w:p>
     <w:p>
@@ -2401,17 +2768,39 @@
           <w:lang w:val="en-US"/>
         </w:rPr>
       </w:pPr>
-      <w:r>
-        <w:rPr>
-          <w:lang w:val="en-US"/>
-        </w:rPr>
-        <w:t>LukeTools (testing)</w:t>
-      </w:r>
-      <w:r>
-        <w:rPr>
-          <w:lang w:val="en-US"/>
-        </w:rPr>
-        <w:t xml:space="preserve">  - DONE</w:t>
+      <w:proofErr w:type="spellStart"/>
+      <w:r>
+        <w:rPr>
+          <w:lang w:val="en-US"/>
+        </w:rPr>
+        <w:t>LukeTools</w:t>
+      </w:r>
+      <w:proofErr w:type="spellEnd"/>
+      <w:r>
+        <w:rPr>
+          <w:lang w:val="en-US"/>
+        </w:rPr>
+        <w:t xml:space="preserve"> (</w:t>
+      </w:r>
+      <w:proofErr w:type="gramStart"/>
+      <w:r>
+        <w:rPr>
+          <w:lang w:val="en-US"/>
+        </w:rPr>
+        <w:t>testing)</w:t>
+      </w:r>
+      <w:r>
+        <w:rPr>
+          <w:lang w:val="en-US"/>
+        </w:rPr>
+        <w:t xml:space="preserve">  -</w:t>
+      </w:r>
+      <w:proofErr w:type="gramEnd"/>
+      <w:r>
+        <w:rPr>
+          <w:lang w:val="en-US"/>
+        </w:rPr>
+        <w:t xml:space="preserve"> DONE</w:t>
       </w:r>
     </w:p>
     <w:p>
@@ -2447,7 +2836,21 @@
         <w:rPr>
           <w:lang w:val="en-US"/>
         </w:rPr>
-        <w:t>Replace scripts with Rmd files</w:t>
+        <w:t xml:space="preserve">Replace scripts with </w:t>
+      </w:r>
+      <w:proofErr w:type="spellStart"/>
+      <w:r>
+        <w:rPr>
+          <w:lang w:val="en-US"/>
+        </w:rPr>
+        <w:t>Rmd</w:t>
+      </w:r>
+      <w:proofErr w:type="spellEnd"/>
+      <w:r>
+        <w:rPr>
+          <w:lang w:val="en-US"/>
+        </w:rPr>
+        <w:t xml:space="preserve"> files</w:t>
       </w:r>
     </w:p>
     <w:p>
@@ -2501,8 +2904,30 @@
         <w:rPr>
           <w:lang w:val="en-US"/>
         </w:rPr>
-        <w:t>Change the metier lookup from github</w:t>
-      </w:r>
+        <w:t xml:space="preserve">Change the </w:t>
+      </w:r>
+      <w:proofErr w:type="spellStart"/>
+      <w:r>
+        <w:rPr>
+          <w:lang w:val="en-US"/>
+        </w:rPr>
+        <w:t>metier</w:t>
+      </w:r>
+      <w:proofErr w:type="spellEnd"/>
+      <w:r>
+        <w:rPr>
+          <w:lang w:val="en-US"/>
+        </w:rPr>
+        <w:t xml:space="preserve"> lookup from </w:t>
+      </w:r>
+      <w:proofErr w:type="spellStart"/>
+      <w:r>
+        <w:rPr>
+          <w:lang w:val="en-US"/>
+        </w:rPr>
+        <w:t>github</w:t>
+      </w:r>
+      <w:proofErr w:type="spellEnd"/>
     </w:p>
     <w:p>
       <w:pPr>
@@ -2519,7 +2944,21 @@
         <w:rPr>
           <w:lang w:val="en-US"/>
         </w:rPr>
-        <w:t>Save sas logbook from database and import from database</w:t>
+        <w:t xml:space="preserve">Save </w:t>
+      </w:r>
+      <w:proofErr w:type="spellStart"/>
+      <w:r>
+        <w:rPr>
+          <w:lang w:val="en-US"/>
+        </w:rPr>
+        <w:t>sas</w:t>
+      </w:r>
+      <w:proofErr w:type="spellEnd"/>
+      <w:r>
+        <w:rPr>
+          <w:lang w:val="en-US"/>
+        </w:rPr>
+        <w:t xml:space="preserve"> logbook from database and import from database</w:t>
       </w:r>
     </w:p>
     <w:p>
@@ -2573,7 +3012,21 @@
         <w:rPr>
           <w:lang w:val="en-US"/>
         </w:rPr>
-        <w:t>Create first Rmd version</w:t>
+        <w:t xml:space="preserve">Create first </w:t>
+      </w:r>
+      <w:proofErr w:type="spellStart"/>
+      <w:r>
+        <w:rPr>
+          <w:lang w:val="en-US"/>
+        </w:rPr>
+        <w:t>Rmd</w:t>
+      </w:r>
+      <w:proofErr w:type="spellEnd"/>
+      <w:r>
+        <w:rPr>
+          <w:lang w:val="en-US"/>
+        </w:rPr>
+        <w:t xml:space="preserve"> version</w:t>
       </w:r>
     </w:p>
     <w:p>
@@ -2613,7 +3066,21 @@
         <w:rPr>
           <w:lang w:val="en-US"/>
         </w:rPr>
-        <w:t>A fishing trip is approximated by reported fishing days, aggregated from monthly reports by taking the maximum number of fishing days per vessel–month–metier combination and summing these over time and vessels.</w:t>
+        <w:t>A fishing trip is approximated by reported fishing days, aggregated from monthly reports by taking the maximum number of fishing days per vessel–month–</w:t>
+      </w:r>
+      <w:proofErr w:type="spellStart"/>
+      <w:r>
+        <w:rPr>
+          <w:lang w:val="en-US"/>
+        </w:rPr>
+        <w:t>metier</w:t>
+      </w:r>
+      <w:proofErr w:type="spellEnd"/>
+      <w:r>
+        <w:rPr>
+          <w:lang w:val="en-US"/>
+        </w:rPr>
+        <w:t xml:space="preserve"> combination and summing these over time and vessels.</w:t>
       </w:r>
     </w:p>
     <w:p>
@@ -2653,7 +3120,7 @@
                     </pic:cNvPicPr>
                   </pic:nvPicPr>
                   <pic:blipFill>
-                    <a:blip r:embed="rId13">
+                    <a:blip r:embed="rId12">
                       <a:extLst>
                         <a:ext uri="{28A0092B-C50C-407E-A947-70E740481C1C}">
                           <a14:useLocalDpi xmlns:a14="http://schemas.microsoft.com/office/drawing/2010/main" val="0"/>

</xml_diff>

<commit_message>
some data checks am
</commit_message>
<xml_diff>
--- a/documents/2026/FDI_TO_DO.docx
+++ b/documents/2026/FDI_TO_DO.docx
@@ -59,6 +59,128 @@
           <w:bCs/>
           <w:lang w:val="en-US"/>
         </w:rPr>
+        <w:t>18/04/2026</w:t>
+      </w:r>
+    </w:p>
+    <w:p>
+      <w:pPr>
+        <w:pStyle w:val="ListParagraph"/>
+        <w:numPr>
+          <w:ilvl w:val="0"/>
+          <w:numId w:val="29"/>
+        </w:numPr>
+        <w:rPr>
+          <w:lang w:val="en-US"/>
+        </w:rPr>
+      </w:pPr>
+      <w:r>
+        <w:rPr>
+          <w:lang w:val="en-US"/>
+        </w:rPr>
+        <w:t>What happened to the 2013-2015 VL0008 VESSEL_</w:t>
+      </w:r>
+      <w:proofErr w:type="gramStart"/>
+      <w:r>
+        <w:rPr>
+          <w:lang w:val="en-US"/>
+        </w:rPr>
+        <w:t>LENGTH’s ???</w:t>
+      </w:r>
+      <w:proofErr w:type="gramEnd"/>
+    </w:p>
+    <w:p>
+      <w:pPr>
+        <w:pStyle w:val="ListParagraph"/>
+        <w:numPr>
+          <w:ilvl w:val="0"/>
+          <w:numId w:val="29"/>
+        </w:numPr>
+        <w:rPr>
+          <w:lang w:val="en-US"/>
+        </w:rPr>
+      </w:pPr>
+      <w:r>
+        <w:rPr>
+          <w:lang w:val="en-US"/>
+        </w:rPr>
+        <w:t>They are still there at the beginning of the script after import!</w:t>
+      </w:r>
+    </w:p>
+    <w:p>
+      <w:pPr>
+        <w:rPr>
+          <w:lang w:val="en-US"/>
+        </w:rPr>
+      </w:pPr>
+      <w:r>
+        <w:rPr>
+          <w:lang w:val="en-US"/>
+        </w:rPr>
+        <w:drawing>
+          <wp:inline distT="0" distB="0" distL="0" distR="0" wp14:anchorId="2E6D38C3" wp14:editId="2F276044">
+            <wp:extent cx="4963218" cy="1333686"/>
+            <wp:effectExtent l="0" t="0" r="8890" b="0"/>
+            <wp:docPr id="1546192002" name="Picture 1"/>
+            <wp:cNvGraphicFramePr>
+              <a:graphicFrameLocks xmlns:a="http://schemas.openxmlformats.org/drawingml/2006/main" noChangeAspect="1"/>
+            </wp:cNvGraphicFramePr>
+            <a:graphic xmlns:a="http://schemas.openxmlformats.org/drawingml/2006/main">
+              <a:graphicData uri="http://schemas.openxmlformats.org/drawingml/2006/picture">
+                <pic:pic xmlns:pic="http://schemas.openxmlformats.org/drawingml/2006/picture">
+                  <pic:nvPicPr>
+                    <pic:cNvPr id="1546192002" name=""/>
+                    <pic:cNvPicPr/>
+                  </pic:nvPicPr>
+                  <pic:blipFill>
+                    <a:blip r:embed="rId5"/>
+                    <a:stretch>
+                      <a:fillRect/>
+                    </a:stretch>
+                  </pic:blipFill>
+                  <pic:spPr>
+                    <a:xfrm>
+                      <a:off x="0" y="0"/>
+                      <a:ext cx="4963218" cy="1333686"/>
+                    </a:xfrm>
+                    <a:prstGeom prst="rect">
+                      <a:avLst/>
+                    </a:prstGeom>
+                  </pic:spPr>
+                </pic:pic>
+              </a:graphicData>
+            </a:graphic>
+          </wp:inline>
+        </w:drawing>
+      </w:r>
+    </w:p>
+    <w:p>
+      <w:pPr>
+        <w:rPr>
+          <w:lang w:val="en-US"/>
+        </w:rPr>
+      </w:pPr>
+    </w:p>
+    <w:p>
+      <w:pPr>
+        <w:rPr>
+          <w:lang w:val="en-US"/>
+        </w:rPr>
+      </w:pPr>
+    </w:p>
+    <w:p>
+      <w:pPr>
+        <w:rPr>
+          <w:b/>
+          <w:bCs/>
+          <w:lang w:val="en-US"/>
+        </w:rPr>
+      </w:pPr>
+      <w:r>
+        <w:rPr>
+          <w:b/>
+          <w:bCs/>
+          <w:lang w:val="en-US"/>
+        </w:rPr>
         <w:t>17/06/2026</w:t>
       </w:r>
     </w:p>
@@ -107,19 +229,7 @@
         <w:rPr>
           <w:lang w:val="en-US"/>
         </w:rPr>
-        <w:t xml:space="preserve">If in table A, but not in table </w:t>
-      </w:r>
-      <w:r>
-        <w:rPr>
-          <w:lang w:val="en-US"/>
-        </w:rPr>
-        <w:t>D</w:t>
-      </w:r>
-      <w:r>
-        <w:rPr>
-          <w:lang w:val="en-US"/>
-        </w:rPr>
-        <w:t xml:space="preserve"> </w:t>
+        <w:t xml:space="preserve">If in table A, but not in table D </w:t>
       </w:r>
       <w:r>
         <w:rPr>
@@ -196,15 +306,233 @@
           <w:numId w:val="26"/>
         </w:numPr>
         <w:rPr>
-          <w:lang w:val="en-US"/>
-        </w:rPr>
-      </w:pPr>
-      <w:r>
-        <w:rPr>
-          <w:lang w:val="en-US"/>
-        </w:rPr>
-        <w:t>Check if rows need dropping</w:t>
-      </w:r>
+          <w:lang w:val="fi-FI"/>
+        </w:rPr>
+      </w:pPr>
+      <w:proofErr w:type="spellStart"/>
+      <w:r>
+        <w:rPr>
+          <w:lang w:val="fi-FI"/>
+        </w:rPr>
+        <w:t>Split</w:t>
+      </w:r>
+      <w:proofErr w:type="spellEnd"/>
+      <w:r>
+        <w:rPr>
+          <w:lang w:val="fi-FI"/>
+        </w:rPr>
+        <w:t xml:space="preserve"> file on </w:t>
+      </w:r>
+      <w:r>
+        <w:rPr>
+          <w:lang w:val="fi-FI"/>
+        </w:rPr>
+        <w:t>KKILMOITUS</w:t>
+      </w:r>
+      <w:r>
+        <w:rPr>
+          <w:lang w:val="fi-FI"/>
+        </w:rPr>
+        <w:t xml:space="preserve"> and </w:t>
+      </w:r>
+      <w:proofErr w:type="spellStart"/>
+      <w:r>
+        <w:rPr>
+          <w:lang w:val="fi-FI"/>
+        </w:rPr>
+        <w:t>remove</w:t>
+      </w:r>
+      <w:proofErr w:type="spellEnd"/>
+      <w:r>
+        <w:rPr>
+          <w:lang w:val="fi-FI"/>
+        </w:rPr>
+        <w:t xml:space="preserve"> </w:t>
+      </w:r>
+      <w:r>
+        <w:rPr>
+          <w:lang w:val="fi-FI"/>
+        </w:rPr>
+        <w:t>KALASTUSTAILMANALUSTA</w:t>
+      </w:r>
+    </w:p>
+    <w:p>
+      <w:pPr>
+        <w:pStyle w:val="ListParagraph"/>
+        <w:numPr>
+          <w:ilvl w:val="1"/>
+          <w:numId w:val="26"/>
+        </w:numPr>
+        <w:rPr>
+          <w:lang w:val="en-US"/>
+        </w:rPr>
+      </w:pPr>
+      <w:r>
+        <w:rPr>
+          <w:lang w:val="en-US"/>
+        </w:rPr>
+        <w:t>Only keep highest PYYNTIPV</w:t>
+      </w:r>
+      <w:r>
+        <w:rPr>
+          <w:lang w:val="en-US"/>
+        </w:rPr>
+        <w:t xml:space="preserve"> by YEAR, MONTH, ULKOINENTUNNUS and SUB_REGION</w:t>
+      </w:r>
+    </w:p>
+    <w:p>
+      <w:pPr>
+        <w:rPr>
+          <w:b/>
+          <w:bCs/>
+          <w:lang w:val="en-US"/>
+        </w:rPr>
+      </w:pPr>
+      <w:r>
+        <w:rPr>
+          <w:b/>
+          <w:bCs/>
+          <w:lang w:val="en-US"/>
+        </w:rPr>
+        <w:lastRenderedPageBreak/>
+        <w:drawing>
+          <wp:inline distT="0" distB="0" distL="0" distR="0" wp14:anchorId="77433B9C" wp14:editId="700EC0D1">
+            <wp:extent cx="2760462" cy="4114486"/>
+            <wp:effectExtent l="0" t="0" r="1905" b="635"/>
+            <wp:docPr id="1588501645" name="Picture 1"/>
+            <wp:cNvGraphicFramePr>
+              <a:graphicFrameLocks xmlns:a="http://schemas.openxmlformats.org/drawingml/2006/main" noChangeAspect="1"/>
+            </wp:cNvGraphicFramePr>
+            <a:graphic xmlns:a="http://schemas.openxmlformats.org/drawingml/2006/main">
+              <a:graphicData uri="http://schemas.openxmlformats.org/drawingml/2006/picture">
+                <pic:pic xmlns:pic="http://schemas.openxmlformats.org/drawingml/2006/picture">
+                  <pic:nvPicPr>
+                    <pic:cNvPr id="1588501645" name=""/>
+                    <pic:cNvPicPr/>
+                  </pic:nvPicPr>
+                  <pic:blipFill>
+                    <a:blip r:embed="rId6"/>
+                    <a:stretch>
+                      <a:fillRect/>
+                    </a:stretch>
+                  </pic:blipFill>
+                  <pic:spPr>
+                    <a:xfrm>
+                      <a:off x="0" y="0"/>
+                      <a:ext cx="2772349" cy="4132203"/>
+                    </a:xfrm>
+                    <a:prstGeom prst="rect">
+                      <a:avLst/>
+                    </a:prstGeom>
+                  </pic:spPr>
+                </pic:pic>
+              </a:graphicData>
+            </a:graphic>
+          </wp:inline>
+        </w:drawing>
+      </w:r>
+      <w:r>
+        <w:rPr>
+          <w:b/>
+          <w:bCs/>
+          <w:lang w:val="en-US"/>
+        </w:rPr>
+        <w:drawing>
+          <wp:inline distT="0" distB="0" distL="0" distR="0" wp14:anchorId="15928535" wp14:editId="3E84BEEB">
+            <wp:extent cx="2744967" cy="4049672"/>
+            <wp:effectExtent l="0" t="0" r="0" b="8255"/>
+            <wp:docPr id="1417236696" name="Picture 1"/>
+            <wp:cNvGraphicFramePr>
+              <a:graphicFrameLocks xmlns:a="http://schemas.openxmlformats.org/drawingml/2006/main" noChangeAspect="1"/>
+            </wp:cNvGraphicFramePr>
+            <a:graphic xmlns:a="http://schemas.openxmlformats.org/drawingml/2006/main">
+              <a:graphicData uri="http://schemas.openxmlformats.org/drawingml/2006/picture">
+                <pic:pic xmlns:pic="http://schemas.openxmlformats.org/drawingml/2006/picture">
+                  <pic:nvPicPr>
+                    <pic:cNvPr id="1417236696" name=""/>
+                    <pic:cNvPicPr/>
+                  </pic:nvPicPr>
+                  <pic:blipFill>
+                    <a:blip r:embed="rId7"/>
+                    <a:stretch>
+                      <a:fillRect/>
+                    </a:stretch>
+                  </pic:blipFill>
+                  <pic:spPr>
+                    <a:xfrm>
+                      <a:off x="0" y="0"/>
+                      <a:ext cx="2750539" cy="4057892"/>
+                    </a:xfrm>
+                    <a:prstGeom prst="rect">
+                      <a:avLst/>
+                    </a:prstGeom>
+                  </pic:spPr>
+                </pic:pic>
+              </a:graphicData>
+            </a:graphic>
+          </wp:inline>
+        </w:drawing>
+      </w:r>
+    </w:p>
+    <w:p>
+      <w:pPr>
+        <w:rPr>
+          <w:b/>
+          <w:bCs/>
+          <w:lang w:val="en-US"/>
+        </w:rPr>
+      </w:pPr>
+      <w:r>
+        <w:rPr>
+          <w:b/>
+          <w:bCs/>
+          <w:lang w:val="en-US"/>
+        </w:rPr>
+        <w:drawing>
+          <wp:inline distT="0" distB="0" distL="0" distR="0" wp14:anchorId="5131BA67" wp14:editId="7BC8D243">
+            <wp:extent cx="4677428" cy="4334480"/>
+            <wp:effectExtent l="0" t="0" r="8890" b="9525"/>
+            <wp:docPr id="1125027532" name="Picture 1"/>
+            <wp:cNvGraphicFramePr>
+              <a:graphicFrameLocks xmlns:a="http://schemas.openxmlformats.org/drawingml/2006/main" noChangeAspect="1"/>
+            </wp:cNvGraphicFramePr>
+            <a:graphic xmlns:a="http://schemas.openxmlformats.org/drawingml/2006/main">
+              <a:graphicData uri="http://schemas.openxmlformats.org/drawingml/2006/picture">
+                <pic:pic xmlns:pic="http://schemas.openxmlformats.org/drawingml/2006/picture">
+                  <pic:nvPicPr>
+                    <pic:cNvPr id="1125027532" name=""/>
+                    <pic:cNvPicPr/>
+                  </pic:nvPicPr>
+                  <pic:blipFill>
+                    <a:blip r:embed="rId8"/>
+                    <a:stretch>
+                      <a:fillRect/>
+                    </a:stretch>
+                  </pic:blipFill>
+                  <pic:spPr>
+                    <a:xfrm>
+                      <a:off x="0" y="0"/>
+                      <a:ext cx="4677428" cy="4334480"/>
+                    </a:xfrm>
+                    <a:prstGeom prst="rect">
+                      <a:avLst/>
+                    </a:prstGeom>
+                  </pic:spPr>
+                </pic:pic>
+              </a:graphicData>
+            </a:graphic>
+          </wp:inline>
+        </w:drawing>
+      </w:r>
+    </w:p>
+    <w:p>
+      <w:pPr>
+        <w:rPr>
+          <w:b/>
+          <w:bCs/>
+          <w:lang w:val="en-US"/>
+        </w:rPr>
+      </w:pPr>
     </w:p>
     <w:p>
       <w:pPr>
@@ -457,7 +785,7 @@
                     <pic:cNvPicPr/>
                   </pic:nvPicPr>
                   <pic:blipFill>
-                    <a:blip r:embed="rId5"/>
+                    <a:blip r:embed="rId9"/>
                     <a:stretch>
                       <a:fillRect/>
                     </a:stretch>
@@ -508,7 +836,6 @@
           <w:noProof/>
           <w:lang w:val="en-US"/>
         </w:rPr>
-        <w:lastRenderedPageBreak/>
         <w:drawing>
           <wp:inline distT="0" distB="0" distL="0" distR="0" wp14:anchorId="0C20FD64" wp14:editId="68A59E32">
             <wp:extent cx="2903472" cy="1920406"/>
@@ -525,7 +852,7 @@
                     <pic:cNvPicPr/>
                   </pic:nvPicPr>
                   <pic:blipFill>
-                    <a:blip r:embed="rId6"/>
+                    <a:blip r:embed="rId10"/>
                     <a:stretch>
                       <a:fillRect/>
                     </a:stretch>
@@ -557,6 +884,7 @@
         <w:rPr>
           <w:lang w:val="en-US"/>
         </w:rPr>
+        <w:lastRenderedPageBreak/>
         <w:t xml:space="preserve">Overwrite 33 records where </w:t>
       </w:r>
       <w:r>
@@ -1241,7 +1569,7 @@
                     <pic:cNvPicPr/>
                   </pic:nvPicPr>
                   <pic:blipFill>
-                    <a:blip r:embed="rId7"/>
+                    <a:blip r:embed="rId11"/>
                     <a:stretch>
                       <a:fillRect/>
                     </a:stretch>
@@ -1288,7 +1616,7 @@
                     <pic:cNvPicPr/>
                   </pic:nvPicPr>
                   <pic:blipFill>
-                    <a:blip r:embed="rId8"/>
+                    <a:blip r:embed="rId12"/>
                     <a:stretch>
                       <a:fillRect/>
                     </a:stretch>
@@ -1405,7 +1733,7 @@
                     <pic:cNvPicPr/>
                   </pic:nvPicPr>
                   <pic:blipFill>
-                    <a:blip r:embed="rId9"/>
+                    <a:blip r:embed="rId13"/>
                     <a:stretch>
                       <a:fillRect/>
                     </a:stretch>
@@ -1452,7 +1780,7 @@
                     <pic:cNvPicPr/>
                   </pic:nvPicPr>
                   <pic:blipFill>
-                    <a:blip r:embed="rId10"/>
+                    <a:blip r:embed="rId14"/>
                     <a:stretch>
                       <a:fillRect/>
                     </a:stretch>
@@ -1873,7 +2201,7 @@
                     <pic:cNvPicPr/>
                   </pic:nvPicPr>
                   <pic:blipFill>
-                    <a:blip r:embed="rId11"/>
+                    <a:blip r:embed="rId15"/>
                     <a:stretch>
                       <a:fillRect/>
                     </a:stretch>
@@ -3120,7 +3448,7 @@
                     </pic:cNvPicPr>
                   </pic:nvPicPr>
                   <pic:blipFill>
-                    <a:blip r:embed="rId12">
+                    <a:blip r:embed="rId16">
                       <a:extLst>
                         <a:ext uri="{28A0092B-C50C-407E-A947-70E740481C1C}">
                           <a14:useLocalDpi xmlns:a14="http://schemas.microsoft.com/office/drawing/2010/main" val="0"/>
@@ -4088,6 +4416,119 @@
     </w:lvl>
   </w:abstractNum>
   <w:abstractNum w:abstractNumId="8" w15:restartNumberingAfterBreak="0">
+    <w:nsid w:val="27D9741C"/>
+    <w:multiLevelType w:val="hybridMultilevel"/>
+    <w:tmpl w:val="3918AADE"/>
+    <w:lvl w:ilvl="0" w:tplc="08090001">
+      <w:start w:val="1"/>
+      <w:numFmt w:val="bullet"/>
+      <w:lvlText w:val=""/>
+      <w:lvlJc w:val="left"/>
+      <w:pPr>
+        <w:ind w:left="720" w:hanging="360"/>
+      </w:pPr>
+      <w:rPr>
+        <w:rFonts w:ascii="Symbol" w:hAnsi="Symbol" w:hint="default"/>
+      </w:rPr>
+    </w:lvl>
+    <w:lvl w:ilvl="1" w:tplc="08090003" w:tentative="1">
+      <w:start w:val="1"/>
+      <w:numFmt w:val="bullet"/>
+      <w:lvlText w:val="o"/>
+      <w:lvlJc w:val="left"/>
+      <w:pPr>
+        <w:ind w:left="1440" w:hanging="360"/>
+      </w:pPr>
+      <w:rPr>
+        <w:rFonts w:ascii="Courier New" w:hAnsi="Courier New" w:cs="Courier New" w:hint="default"/>
+      </w:rPr>
+    </w:lvl>
+    <w:lvl w:ilvl="2" w:tplc="08090005" w:tentative="1">
+      <w:start w:val="1"/>
+      <w:numFmt w:val="bullet"/>
+      <w:lvlText w:val=""/>
+      <w:lvlJc w:val="left"/>
+      <w:pPr>
+        <w:ind w:left="2160" w:hanging="360"/>
+      </w:pPr>
+      <w:rPr>
+        <w:rFonts w:ascii="Wingdings" w:hAnsi="Wingdings" w:hint="default"/>
+      </w:rPr>
+    </w:lvl>
+    <w:lvl w:ilvl="3" w:tplc="08090001" w:tentative="1">
+      <w:start w:val="1"/>
+      <w:numFmt w:val="bullet"/>
+      <w:lvlText w:val=""/>
+      <w:lvlJc w:val="left"/>
+      <w:pPr>
+        <w:ind w:left="2880" w:hanging="360"/>
+      </w:pPr>
+      <w:rPr>
+        <w:rFonts w:ascii="Symbol" w:hAnsi="Symbol" w:hint="default"/>
+      </w:rPr>
+    </w:lvl>
+    <w:lvl w:ilvl="4" w:tplc="08090003" w:tentative="1">
+      <w:start w:val="1"/>
+      <w:numFmt w:val="bullet"/>
+      <w:lvlText w:val="o"/>
+      <w:lvlJc w:val="left"/>
+      <w:pPr>
+        <w:ind w:left="3600" w:hanging="360"/>
+      </w:pPr>
+      <w:rPr>
+        <w:rFonts w:ascii="Courier New" w:hAnsi="Courier New" w:cs="Courier New" w:hint="default"/>
+      </w:rPr>
+    </w:lvl>
+    <w:lvl w:ilvl="5" w:tplc="08090005" w:tentative="1">
+      <w:start w:val="1"/>
+      <w:numFmt w:val="bullet"/>
+      <w:lvlText w:val=""/>
+      <w:lvlJc w:val="left"/>
+      <w:pPr>
+        <w:ind w:left="4320" w:hanging="360"/>
+      </w:pPr>
+      <w:rPr>
+        <w:rFonts w:ascii="Wingdings" w:hAnsi="Wingdings" w:hint="default"/>
+      </w:rPr>
+    </w:lvl>
+    <w:lvl w:ilvl="6" w:tplc="08090001" w:tentative="1">
+      <w:start w:val="1"/>
+      <w:numFmt w:val="bullet"/>
+      <w:lvlText w:val=""/>
+      <w:lvlJc w:val="left"/>
+      <w:pPr>
+        <w:ind w:left="5040" w:hanging="360"/>
+      </w:pPr>
+      <w:rPr>
+        <w:rFonts w:ascii="Symbol" w:hAnsi="Symbol" w:hint="default"/>
+      </w:rPr>
+    </w:lvl>
+    <w:lvl w:ilvl="7" w:tplc="08090003" w:tentative="1">
+      <w:start w:val="1"/>
+      <w:numFmt w:val="bullet"/>
+      <w:lvlText w:val="o"/>
+      <w:lvlJc w:val="left"/>
+      <w:pPr>
+        <w:ind w:left="5760" w:hanging="360"/>
+      </w:pPr>
+      <w:rPr>
+        <w:rFonts w:ascii="Courier New" w:hAnsi="Courier New" w:cs="Courier New" w:hint="default"/>
+      </w:rPr>
+    </w:lvl>
+    <w:lvl w:ilvl="8" w:tplc="08090005" w:tentative="1">
+      <w:start w:val="1"/>
+      <w:numFmt w:val="bullet"/>
+      <w:lvlText w:val=""/>
+      <w:lvlJc w:val="left"/>
+      <w:pPr>
+        <w:ind w:left="6480" w:hanging="360"/>
+      </w:pPr>
+      <w:rPr>
+        <w:rFonts w:ascii="Wingdings" w:hAnsi="Wingdings" w:hint="default"/>
+      </w:rPr>
+    </w:lvl>
+  </w:abstractNum>
+  <w:abstractNum w:abstractNumId="9" w15:restartNumberingAfterBreak="0">
     <w:nsid w:val="28575A35"/>
     <w:multiLevelType w:val="hybridMultilevel"/>
     <w:tmpl w:val="599E81EC"/>
@@ -4199,7 +4640,7 @@
       </w:rPr>
     </w:lvl>
   </w:abstractNum>
-  <w:abstractNum w:abstractNumId="9" w15:restartNumberingAfterBreak="0">
+  <w:abstractNum w:abstractNumId="10" w15:restartNumberingAfterBreak="0">
     <w:nsid w:val="2A623D97"/>
     <w:multiLevelType w:val="hybridMultilevel"/>
     <w:tmpl w:val="236C2F34"/>
@@ -4311,7 +4752,7 @@
       </w:rPr>
     </w:lvl>
   </w:abstractNum>
-  <w:abstractNum w:abstractNumId="10" w15:restartNumberingAfterBreak="0">
+  <w:abstractNum w:abstractNumId="11" w15:restartNumberingAfterBreak="0">
     <w:nsid w:val="2EAF3385"/>
     <w:multiLevelType w:val="hybridMultilevel"/>
     <w:tmpl w:val="FDEA9C72"/>
@@ -4423,7 +4864,7 @@
       </w:rPr>
     </w:lvl>
   </w:abstractNum>
-  <w:abstractNum w:abstractNumId="11" w15:restartNumberingAfterBreak="0">
+  <w:abstractNum w:abstractNumId="12" w15:restartNumberingAfterBreak="0">
     <w:nsid w:val="308237DE"/>
     <w:multiLevelType w:val="hybridMultilevel"/>
     <w:tmpl w:val="E0942DCE"/>
@@ -4536,7 +4977,7 @@
       </w:rPr>
     </w:lvl>
   </w:abstractNum>
-  <w:abstractNum w:abstractNumId="12" w15:restartNumberingAfterBreak="0">
+  <w:abstractNum w:abstractNumId="13" w15:restartNumberingAfterBreak="0">
     <w:nsid w:val="324547E5"/>
     <w:multiLevelType w:val="hybridMultilevel"/>
     <w:tmpl w:val="D7488678"/>
@@ -4649,7 +5090,7 @@
       </w:rPr>
     </w:lvl>
   </w:abstractNum>
-  <w:abstractNum w:abstractNumId="13" w15:restartNumberingAfterBreak="0">
+  <w:abstractNum w:abstractNumId="14" w15:restartNumberingAfterBreak="0">
     <w:nsid w:val="3B13134C"/>
     <w:multiLevelType w:val="hybridMultilevel"/>
     <w:tmpl w:val="041AC950"/>
@@ -4761,7 +5202,7 @@
       </w:rPr>
     </w:lvl>
   </w:abstractNum>
-  <w:abstractNum w:abstractNumId="14" w15:restartNumberingAfterBreak="0">
+  <w:abstractNum w:abstractNumId="15" w15:restartNumberingAfterBreak="0">
     <w:nsid w:val="3B3F2A02"/>
     <w:multiLevelType w:val="hybridMultilevel"/>
     <w:tmpl w:val="9BB62138"/>
@@ -4874,7 +5315,7 @@
       </w:rPr>
     </w:lvl>
   </w:abstractNum>
-  <w:abstractNum w:abstractNumId="15" w15:restartNumberingAfterBreak="0">
+  <w:abstractNum w:abstractNumId="16" w15:restartNumberingAfterBreak="0">
     <w:nsid w:val="3BA86148"/>
     <w:multiLevelType w:val="hybridMultilevel"/>
     <w:tmpl w:val="8CA86A1E"/>
@@ -4987,7 +5428,7 @@
       </w:rPr>
     </w:lvl>
   </w:abstractNum>
-  <w:abstractNum w:abstractNumId="16" w15:restartNumberingAfterBreak="0">
+  <w:abstractNum w:abstractNumId="17" w15:restartNumberingAfterBreak="0">
     <w:nsid w:val="3C5B376A"/>
     <w:multiLevelType w:val="hybridMultilevel"/>
     <w:tmpl w:val="318AF922"/>
@@ -5099,7 +5540,7 @@
       </w:rPr>
     </w:lvl>
   </w:abstractNum>
-  <w:abstractNum w:abstractNumId="17" w15:restartNumberingAfterBreak="0">
+  <w:abstractNum w:abstractNumId="18" w15:restartNumberingAfterBreak="0">
     <w:nsid w:val="47F96F2F"/>
     <w:multiLevelType w:val="hybridMultilevel"/>
     <w:tmpl w:val="7256ACFE"/>
@@ -5211,7 +5652,7 @@
       </w:rPr>
     </w:lvl>
   </w:abstractNum>
-  <w:abstractNum w:abstractNumId="18" w15:restartNumberingAfterBreak="0">
+  <w:abstractNum w:abstractNumId="19" w15:restartNumberingAfterBreak="0">
     <w:nsid w:val="483435CC"/>
     <w:multiLevelType w:val="hybridMultilevel"/>
     <w:tmpl w:val="787CC9BA"/>
@@ -5323,7 +5764,7 @@
       </w:rPr>
     </w:lvl>
   </w:abstractNum>
-  <w:abstractNum w:abstractNumId="19" w15:restartNumberingAfterBreak="0">
+  <w:abstractNum w:abstractNumId="20" w15:restartNumberingAfterBreak="0">
     <w:nsid w:val="49A87142"/>
     <w:multiLevelType w:val="hybridMultilevel"/>
     <w:tmpl w:val="0C047B9C"/>
@@ -5435,7 +5876,7 @@
       </w:rPr>
     </w:lvl>
   </w:abstractNum>
-  <w:abstractNum w:abstractNumId="20" w15:restartNumberingAfterBreak="0">
+  <w:abstractNum w:abstractNumId="21" w15:restartNumberingAfterBreak="0">
     <w:nsid w:val="4C2329FC"/>
     <w:multiLevelType w:val="hybridMultilevel"/>
     <w:tmpl w:val="DE9ED958"/>
@@ -5548,7 +5989,7 @@
       </w:rPr>
     </w:lvl>
   </w:abstractNum>
-  <w:abstractNum w:abstractNumId="21" w15:restartNumberingAfterBreak="0">
+  <w:abstractNum w:abstractNumId="22" w15:restartNumberingAfterBreak="0">
     <w:nsid w:val="4C62209E"/>
     <w:multiLevelType w:val="hybridMultilevel"/>
     <w:tmpl w:val="07F6CAEE"/>
@@ -5661,7 +6102,7 @@
       </w:rPr>
     </w:lvl>
   </w:abstractNum>
-  <w:abstractNum w:abstractNumId="22" w15:restartNumberingAfterBreak="0">
+  <w:abstractNum w:abstractNumId="23" w15:restartNumberingAfterBreak="0">
     <w:nsid w:val="5A9430D7"/>
     <w:multiLevelType w:val="hybridMultilevel"/>
     <w:tmpl w:val="BB3A180A"/>
@@ -5774,7 +6215,7 @@
       </w:rPr>
     </w:lvl>
   </w:abstractNum>
-  <w:abstractNum w:abstractNumId="23" w15:restartNumberingAfterBreak="0">
+  <w:abstractNum w:abstractNumId="24" w15:restartNumberingAfterBreak="0">
     <w:nsid w:val="5FC00F8A"/>
     <w:multiLevelType w:val="hybridMultilevel"/>
     <w:tmpl w:val="9D96EDD4"/>
@@ -5887,7 +6328,7 @@
       </w:rPr>
     </w:lvl>
   </w:abstractNum>
-  <w:abstractNum w:abstractNumId="24" w15:restartNumberingAfterBreak="0">
+  <w:abstractNum w:abstractNumId="25" w15:restartNumberingAfterBreak="0">
     <w:nsid w:val="65070E8D"/>
     <w:multiLevelType w:val="hybridMultilevel"/>
     <w:tmpl w:val="BDB6982A"/>
@@ -6000,7 +6441,7 @@
       </w:rPr>
     </w:lvl>
   </w:abstractNum>
-  <w:abstractNum w:abstractNumId="25" w15:restartNumberingAfterBreak="0">
+  <w:abstractNum w:abstractNumId="26" w15:restartNumberingAfterBreak="0">
     <w:nsid w:val="695A7833"/>
     <w:multiLevelType w:val="hybridMultilevel"/>
     <w:tmpl w:val="E564D540"/>
@@ -6112,7 +6553,7 @@
       </w:rPr>
     </w:lvl>
   </w:abstractNum>
-  <w:abstractNum w:abstractNumId="26" w15:restartNumberingAfterBreak="0">
+  <w:abstractNum w:abstractNumId="27" w15:restartNumberingAfterBreak="0">
     <w:nsid w:val="6E5176C4"/>
     <w:multiLevelType w:val="hybridMultilevel"/>
     <w:tmpl w:val="51C0ACA8"/>
@@ -6224,7 +6665,7 @@
       </w:rPr>
     </w:lvl>
   </w:abstractNum>
-  <w:abstractNum w:abstractNumId="27" w15:restartNumberingAfterBreak="0">
+  <w:abstractNum w:abstractNumId="28" w15:restartNumberingAfterBreak="0">
     <w:nsid w:val="73B949D2"/>
     <w:multiLevelType w:val="hybridMultilevel"/>
     <w:tmpl w:val="28606D2A"/>
@@ -6343,7 +6784,7 @@
     <w:abstractNumId w:val="2"/>
   </w:num>
   <w:num w:numId="3" w16cid:durableId="1364742651">
-    <w:abstractNumId w:val="23"/>
+    <w:abstractNumId w:val="24"/>
   </w:num>
   <w:num w:numId="4" w16cid:durableId="302855184">
     <w:abstractNumId w:val="7"/>
@@ -6352,61 +6793,61 @@
     <w:abstractNumId w:val="6"/>
   </w:num>
   <w:num w:numId="6" w16cid:durableId="1637492389">
-    <w:abstractNumId w:val="8"/>
+    <w:abstractNumId w:val="9"/>
   </w:num>
   <w:num w:numId="7" w16cid:durableId="276644472">
-    <w:abstractNumId w:val="11"/>
+    <w:abstractNumId w:val="12"/>
   </w:num>
   <w:num w:numId="8" w16cid:durableId="836699043">
-    <w:abstractNumId w:val="14"/>
+    <w:abstractNumId w:val="15"/>
   </w:num>
   <w:num w:numId="9" w16cid:durableId="536427938">
     <w:abstractNumId w:val="4"/>
   </w:num>
   <w:num w:numId="10" w16cid:durableId="1761370988">
-    <w:abstractNumId w:val="24"/>
+    <w:abstractNumId w:val="25"/>
   </w:num>
   <w:num w:numId="11" w16cid:durableId="1499495752">
-    <w:abstractNumId w:val="17"/>
+    <w:abstractNumId w:val="18"/>
   </w:num>
   <w:num w:numId="12" w16cid:durableId="1412316134">
-    <w:abstractNumId w:val="27"/>
+    <w:abstractNumId w:val="28"/>
   </w:num>
   <w:num w:numId="13" w16cid:durableId="1350258004">
-    <w:abstractNumId w:val="9"/>
+    <w:abstractNumId w:val="10"/>
   </w:num>
   <w:num w:numId="14" w16cid:durableId="1673683661">
+    <w:abstractNumId w:val="20"/>
+  </w:num>
+  <w:num w:numId="15" w16cid:durableId="867064272">
+    <w:abstractNumId w:val="26"/>
+  </w:num>
+  <w:num w:numId="16" w16cid:durableId="7604246">
     <w:abstractNumId w:val="19"/>
   </w:num>
-  <w:num w:numId="15" w16cid:durableId="867064272">
-    <w:abstractNumId w:val="25"/>
-  </w:num>
-  <w:num w:numId="16" w16cid:durableId="7604246">
-    <w:abstractNumId w:val="18"/>
-  </w:num>
   <w:num w:numId="17" w16cid:durableId="2089039549">
-    <w:abstractNumId w:val="10"/>
+    <w:abstractNumId w:val="11"/>
   </w:num>
   <w:num w:numId="18" w16cid:durableId="595285920">
-    <w:abstractNumId w:val="21"/>
+    <w:abstractNumId w:val="22"/>
   </w:num>
   <w:num w:numId="19" w16cid:durableId="2136634086">
-    <w:abstractNumId w:val="12"/>
+    <w:abstractNumId w:val="13"/>
   </w:num>
   <w:num w:numId="20" w16cid:durableId="411004895">
     <w:abstractNumId w:val="0"/>
   </w:num>
   <w:num w:numId="21" w16cid:durableId="1646935873">
-    <w:abstractNumId w:val="22"/>
+    <w:abstractNumId w:val="23"/>
   </w:num>
   <w:num w:numId="22" w16cid:durableId="18512531">
-    <w:abstractNumId w:val="15"/>
+    <w:abstractNumId w:val="16"/>
   </w:num>
   <w:num w:numId="23" w16cid:durableId="926422375">
-    <w:abstractNumId w:val="20"/>
+    <w:abstractNumId w:val="21"/>
   </w:num>
   <w:num w:numId="24" w16cid:durableId="1654137957">
-    <w:abstractNumId w:val="13"/>
+    <w:abstractNumId w:val="14"/>
   </w:num>
   <w:num w:numId="25" w16cid:durableId="412093067">
     <w:abstractNumId w:val="3"/>
@@ -6415,10 +6856,13 @@
     <w:abstractNumId w:val="5"/>
   </w:num>
   <w:num w:numId="27" w16cid:durableId="1512182773">
-    <w:abstractNumId w:val="16"/>
+    <w:abstractNumId w:val="17"/>
   </w:num>
   <w:num w:numId="28" w16cid:durableId="1900287879">
-    <w:abstractNumId w:val="26"/>
+    <w:abstractNumId w:val="27"/>
+  </w:num>
+  <w:num w:numId="29" w16cid:durableId="112094442">
+    <w:abstractNumId w:val="8"/>
   </w:num>
 </w:numbering>
 </file>

</xml_diff>

<commit_message>
meeting logs for today
</commit_message>
<xml_diff>
--- a/documents/2026/FDI_TO_DO.docx
+++ b/documents/2026/FDI_TO_DO.docx
@@ -59,6 +59,50 @@
           <w:bCs/>
           <w:lang w:val="en-US"/>
         </w:rPr>
+        <w:t>22/06/2026</w:t>
+      </w:r>
+    </w:p>
+    <w:p>
+      <w:pPr>
+        <w:pStyle w:val="ListParagraph"/>
+        <w:numPr>
+          <w:ilvl w:val="0"/>
+          <w:numId w:val="31"/>
+        </w:numPr>
+        <w:rPr>
+          <w:lang w:val="en-US"/>
+        </w:rPr>
+      </w:pPr>
+      <w:r>
+        <w:rPr>
+          <w:lang w:val="en-US"/>
+        </w:rPr>
+        <w:t>Finishing table J</w:t>
+      </w:r>
+    </w:p>
+    <w:p>
+      <w:pPr>
+        <w:rPr>
+          <w:b/>
+          <w:bCs/>
+          <w:lang w:val="en-US"/>
+        </w:rPr>
+      </w:pPr>
+    </w:p>
+    <w:p>
+      <w:pPr>
+        <w:rPr>
+          <w:b/>
+          <w:bCs/>
+          <w:lang w:val="en-US"/>
+        </w:rPr>
+      </w:pPr>
+      <w:r>
+        <w:rPr>
+          <w:b/>
+          <w:bCs/>
+          <w:lang w:val="en-US"/>
+        </w:rPr>
         <w:t>18/04/2026</w:t>
       </w:r>
     </w:p>
@@ -77,16 +121,8 @@
         <w:rPr>
           <w:lang w:val="en-US"/>
         </w:rPr>
-        <w:t>What happened to the 2013-2015 VL0008 VESSEL_</w:t>
-      </w:r>
-      <w:proofErr w:type="gramStart"/>
-      <w:r>
-        <w:rPr>
-          <w:lang w:val="en-US"/>
-        </w:rPr>
-        <w:t>LENGTH’s ???</w:t>
-      </w:r>
-      <w:proofErr w:type="gramEnd"/>
+        <w:t>What happened to the 2013-2015 VL0008 VESSEL_LENGTH’s ???</w:t>
+      </w:r>
     </w:p>
     <w:p>
       <w:pPr>
@@ -189,6 +225,12 @@
         </w:rPr>
         <w:t xml:space="preserve"> </w:t>
       </w:r>
+      <w:r>
+        <w:rPr>
+          <w:lang w:val="en-US"/>
+        </w:rPr>
+        <w:t>!</w:t>
+      </w:r>
     </w:p>
     <w:p>
       <w:pPr>
@@ -346,39 +388,17 @@
           <w:lang w:val="fi-FI"/>
         </w:rPr>
       </w:pPr>
-      <w:proofErr w:type="spellStart"/>
       <w:r>
         <w:rPr>
           <w:lang w:val="fi-FI"/>
         </w:rPr>
-        <w:t>Split</w:t>
-      </w:r>
-      <w:proofErr w:type="spellEnd"/>
+        <w:t xml:space="preserve">Split file on </w:t>
+      </w:r>
       <w:r>
         <w:rPr>
           <w:lang w:val="fi-FI"/>
         </w:rPr>
-        <w:t xml:space="preserve"> file on </w:t>
-      </w:r>
-      <w:r>
-        <w:rPr>
-          <w:lang w:val="fi-FI"/>
-        </w:rPr>
-        <w:t xml:space="preserve">KKILMOITUS and </w:t>
-      </w:r>
-      <w:proofErr w:type="spellStart"/>
-      <w:r>
-        <w:rPr>
-          <w:lang w:val="fi-FI"/>
-        </w:rPr>
-        <w:t>remove</w:t>
-      </w:r>
-      <w:proofErr w:type="spellEnd"/>
-      <w:r>
-        <w:rPr>
-          <w:lang w:val="fi-FI"/>
-        </w:rPr>
-        <w:t xml:space="preserve"> KALASTUSTAILMANALUSTA</w:t>
+        <w:t>KKILMOITUS and remove KALASTUSTAILMANALUSTA</w:t>
       </w:r>
     </w:p>
     <w:p>
@@ -762,21 +782,7 @@
         <w:rPr>
           <w:lang w:val="en-US"/>
         </w:rPr>
-        <w:t xml:space="preserve">Replace </w:t>
-      </w:r>
-      <w:proofErr w:type="spellStart"/>
-      <w:r>
-        <w:rPr>
-          <w:lang w:val="en-US"/>
-        </w:rPr>
-        <w:t>shorelog</w:t>
-      </w:r>
-      <w:proofErr w:type="spellEnd"/>
-      <w:r>
-        <w:rPr>
-          <w:lang w:val="en-US"/>
-        </w:rPr>
-        <w:t xml:space="preserve"> vessel length VL0010 with VL0812 </w:t>
+        <w:t xml:space="preserve">Replace shorelog vessel length VL0010 with VL0812 </w:t>
       </w:r>
       <w:r>
         <w:rPr>
@@ -937,21 +943,7 @@
         <w:rPr>
           <w:lang w:val="en-US"/>
         </w:rPr>
-        <w:t>Save clean data back to DCRPOD (</w:t>
-      </w:r>
-      <w:proofErr w:type="spellStart"/>
-      <w:r>
-        <w:rPr>
-          <w:lang w:val="en-US"/>
-        </w:rPr>
-        <w:t>Pertuu</w:t>
-      </w:r>
-      <w:proofErr w:type="spellEnd"/>
-      <w:r>
-        <w:rPr>
-          <w:lang w:val="en-US"/>
-        </w:rPr>
-        <w:t>??? I don’t have permissions</w:t>
+        <w:t>Save clean data back to DCRPOD (Pertuu??? I don’t have permissions</w:t>
       </w:r>
       <w:r>
         <w:rPr>
@@ -975,21 +967,7 @@
         <w:rPr>
           <w:lang w:val="en-US"/>
         </w:rPr>
-        <w:t xml:space="preserve">Chunk 23: </w:t>
-      </w:r>
-      <w:proofErr w:type="spellStart"/>
-      <w:r>
-        <w:rPr>
-          <w:lang w:val="en-US"/>
-        </w:rPr>
-        <w:t>fecR</w:t>
-      </w:r>
-      <w:proofErr w:type="spellEnd"/>
-      <w:r>
-        <w:rPr>
-          <w:lang w:val="en-US"/>
-        </w:rPr>
-        <w:t>-logbooks</w:t>
+        <w:t>Chunk 23: fecR-logbooks</w:t>
       </w:r>
       <w:r>
         <w:rPr>
@@ -1031,27 +1009,13 @@
         <w:rPr>
           <w:lang w:val="en-US"/>
         </w:rPr>
-        <w:t xml:space="preserve">Chunk </w:t>
-      </w:r>
-      <w:proofErr w:type="gramStart"/>
-      <w:r>
-        <w:rPr>
-          <w:lang w:val="en-US"/>
-        </w:rPr>
-        <w:t>24:</w:t>
-      </w:r>
-      <w:r>
-        <w:rPr>
-          <w:lang w:val="en-US"/>
-        </w:rPr>
-        <w:t>shore</w:t>
-      </w:r>
-      <w:proofErr w:type="gramEnd"/>
-      <w:r>
-        <w:rPr>
-          <w:lang w:val="en-US"/>
-        </w:rPr>
-        <w:t>-effort</w:t>
+        <w:t>Chunk 24:</w:t>
+      </w:r>
+      <w:r>
+        <w:rPr>
+          <w:lang w:val="en-US"/>
+        </w:rPr>
+        <w:t>shore-effort</w:t>
       </w:r>
       <w:r>
         <w:rPr>
@@ -1219,41 +1183,13 @@
         <w:rPr>
           <w:lang w:val="en-US"/>
         </w:rPr>
-        <w:t xml:space="preserve"> cleaned </w:t>
-      </w:r>
-      <w:proofErr w:type="spellStart"/>
-      <w:r>
-        <w:rPr>
-          <w:lang w:val="en-US"/>
-        </w:rPr>
-        <w:t>sas</w:t>
-      </w:r>
-      <w:proofErr w:type="spellEnd"/>
-      <w:r>
-        <w:rPr>
-          <w:lang w:val="en-US"/>
-        </w:rPr>
-        <w:t xml:space="preserve"> data in </w:t>
-      </w:r>
-      <w:r>
-        <w:rPr>
-          <w:lang w:val="en-US"/>
-        </w:rPr>
-        <w:t>Tables a-g-h-</w:t>
-      </w:r>
-      <w:proofErr w:type="spellStart"/>
-      <w:r>
-        <w:rPr>
-          <w:lang w:val="en-US"/>
-        </w:rPr>
-        <w:t>i</w:t>
-      </w:r>
-      <w:proofErr w:type="spellEnd"/>
-      <w:r>
-        <w:rPr>
-          <w:lang w:val="en-US"/>
-        </w:rPr>
-        <w:t>-j</w:t>
+        <w:t xml:space="preserve"> cleaned sas data in </w:t>
+      </w:r>
+      <w:r>
+        <w:rPr>
+          <w:lang w:val="en-US"/>
+        </w:rPr>
+        <w:t>Tables a-g-h-i-j</w:t>
       </w:r>
       <w:r>
         <w:rPr>
@@ -1279,19 +1215,11 @@
         </w:rPr>
         <w:t xml:space="preserve">TODO: add </w:t>
       </w:r>
-      <w:proofErr w:type="spellStart"/>
-      <w:r>
-        <w:rPr>
-          <w:lang w:val="en-US"/>
-        </w:rPr>
-        <w:t>sql</w:t>
-      </w:r>
-      <w:proofErr w:type="spellEnd"/>
-      <w:r>
-        <w:rPr>
-          <w:lang w:val="en-US"/>
-        </w:rPr>
-        <w:t xml:space="preserve"> permissions to script (Petri)</w:t>
+      <w:r>
+        <w:rPr>
+          <w:lang w:val="en-US"/>
+        </w:rPr>
+        <w:t>sql permissions to script (Petri)</w:t>
       </w:r>
     </w:p>
     <w:p>
@@ -1309,35 +1237,7 @@
         <w:rPr>
           <w:lang w:val="en-US"/>
         </w:rPr>
-        <w:t xml:space="preserve">TODO: find minimal needed columns and join </w:t>
-      </w:r>
-      <w:proofErr w:type="spellStart"/>
-      <w:r>
-        <w:rPr>
-          <w:lang w:val="en-US"/>
-        </w:rPr>
-        <w:t>sas</w:t>
-      </w:r>
-      <w:proofErr w:type="spellEnd"/>
-      <w:r>
-        <w:rPr>
-          <w:lang w:val="en-US"/>
-        </w:rPr>
-        <w:t xml:space="preserve"> and </w:t>
-      </w:r>
-      <w:proofErr w:type="spellStart"/>
-      <w:r>
-        <w:rPr>
-          <w:lang w:val="en-US"/>
-        </w:rPr>
-        <w:t>aktiviteeti</w:t>
-      </w:r>
-      <w:proofErr w:type="spellEnd"/>
-      <w:r>
-        <w:rPr>
-          <w:lang w:val="en-US"/>
-        </w:rPr>
-        <w:t xml:space="preserve"> tables</w:t>
+        <w:t>TODO: find minimal needed columns and join sas and aktiviteeti tables</w:t>
       </w:r>
       <w:r>
         <w:rPr>
@@ -1385,35 +1285,7 @@
         <w:rPr>
           <w:lang w:val="en-US"/>
         </w:rPr>
-        <w:t xml:space="preserve">Go through last </w:t>
-      </w:r>
-      <w:proofErr w:type="gramStart"/>
-      <w:r>
-        <w:rPr>
-          <w:lang w:val="en-US"/>
-        </w:rPr>
-        <w:t>years’</w:t>
-      </w:r>
-      <w:proofErr w:type="gramEnd"/>
-      <w:r>
-        <w:rPr>
-          <w:lang w:val="en-US"/>
-        </w:rPr>
-        <w:t xml:space="preserve"> </w:t>
-      </w:r>
-      <w:proofErr w:type="spellStart"/>
-      <w:r>
-        <w:rPr>
-          <w:lang w:val="en-US"/>
-        </w:rPr>
-        <w:t>sas</w:t>
-      </w:r>
-      <w:proofErr w:type="spellEnd"/>
-      <w:r>
-        <w:rPr>
-          <w:lang w:val="en-US"/>
-        </w:rPr>
-        <w:t xml:space="preserve"> integration logic</w:t>
+        <w:t>Go through last years’ sas integration logic</w:t>
       </w:r>
     </w:p>
     <w:p>
@@ -1512,7 +1384,6 @@
         </w:rPr>
         <w:t xml:space="preserve">see chunk </w:t>
       </w:r>
-      <w:proofErr w:type="gramStart"/>
       <w:r>
         <w:rPr>
           <w:rFonts w:ascii="Miriam Fixed" w:hAnsi="Miriam Fixed" w:cs="Miriam Fixed" w:hint="cs"/>
@@ -1529,7 +1400,6 @@
         </w:rPr>
         <w:t>k</w:t>
       </w:r>
-      <w:proofErr w:type="gramEnd"/>
       <w:r>
         <w:rPr>
           <w:rFonts w:ascii="Miriam Fixed" w:hAnsi="Miriam Fixed" w:cs="Miriam Fixed"/>
@@ -1677,19 +1547,11 @@
           <w:u w:val="single"/>
         </w:rPr>
       </w:pPr>
-      <w:proofErr w:type="spellStart"/>
-      <w:r>
-        <w:rPr>
-          <w:lang w:val="en-US"/>
-        </w:rPr>
-        <w:t>Shorelogs</w:t>
-      </w:r>
-      <w:proofErr w:type="spellEnd"/>
-      <w:r>
-        <w:rPr>
-          <w:lang w:val="en-US"/>
-        </w:rPr>
-        <w:t xml:space="preserve">: see chunk </w:t>
+      <w:r>
+        <w:rPr>
+          <w:lang w:val="en-US"/>
+        </w:rPr>
+        <w:t xml:space="preserve">Shorelogs: see chunk </w:t>
       </w:r>
       <w:r>
         <w:rPr>
@@ -1697,18 +1559,8 @@
           <w:u w:val="single"/>
           <w:lang w:val="en-US"/>
         </w:rPr>
-        <w:t>clean-</w:t>
-      </w:r>
-      <w:proofErr w:type="spellStart"/>
-      <w:r>
-        <w:rPr>
-          <w:rFonts w:ascii="Miriam Fixed" w:hAnsi="Miriam Fixed" w:cs="Miriam Fixed" w:hint="cs"/>
-          <w:u w:val="single"/>
-          <w:lang w:val="en-US"/>
-        </w:rPr>
-        <w:t>shorelogs</w:t>
-      </w:r>
-      <w:proofErr w:type="spellEnd"/>
+        <w:t>clean-shorelogs</w:t>
+      </w:r>
       <w:r>
         <w:rPr>
           <w:rFonts w:ascii="Miriam Fixed" w:hAnsi="Miriam Fixed" w:cs="Miriam Fixed"/>
@@ -1875,14 +1727,7 @@
         <w:rPr>
           <w:lang w:val="en-US"/>
         </w:rPr>
-        <w:t xml:space="preserve">Go through last </w:t>
-      </w:r>
-      <w:proofErr w:type="gramStart"/>
-      <w:r>
-        <w:rPr>
-          <w:lang w:val="en-US"/>
-        </w:rPr>
-        <w:t>years</w:t>
+        <w:t>Go through last years</w:t>
       </w:r>
       <w:r>
         <w:rPr>
@@ -1890,26 +1735,11 @@
         </w:rPr>
         <w:t>’</w:t>
       </w:r>
-      <w:proofErr w:type="gramEnd"/>
-      <w:r>
-        <w:rPr>
-          <w:lang w:val="en-US"/>
-        </w:rPr>
-        <w:t xml:space="preserve"> </w:t>
-      </w:r>
-      <w:proofErr w:type="spellStart"/>
-      <w:r>
-        <w:rPr>
-          <w:lang w:val="en-US"/>
-        </w:rPr>
-        <w:t>sas</w:t>
-      </w:r>
-      <w:proofErr w:type="spellEnd"/>
-      <w:r>
-        <w:rPr>
-          <w:lang w:val="en-US"/>
-        </w:rPr>
-        <w:t xml:space="preserve"> integration logic</w:t>
+      <w:r>
+        <w:rPr>
+          <w:lang w:val="en-US"/>
+        </w:rPr>
+        <w:t xml:space="preserve"> sas integration logic</w:t>
       </w:r>
     </w:p>
     <w:p>
@@ -1944,35 +1774,7 @@
         <w:rPr>
           <w:lang w:val="en-US"/>
         </w:rPr>
-        <w:t xml:space="preserve">Create </w:t>
-      </w:r>
-      <w:proofErr w:type="spellStart"/>
-      <w:r>
-        <w:rPr>
-          <w:lang w:val="en-US"/>
-        </w:rPr>
-        <w:t>Rmd</w:t>
-      </w:r>
-      <w:proofErr w:type="spellEnd"/>
-      <w:r>
-        <w:rPr>
-          <w:lang w:val="en-US"/>
-        </w:rPr>
-        <w:t xml:space="preserve"> version of </w:t>
-      </w:r>
-      <w:proofErr w:type="spellStart"/>
-      <w:r>
-        <w:rPr>
-          <w:lang w:val="en-US"/>
-        </w:rPr>
-        <w:t>sas</w:t>
-      </w:r>
-      <w:proofErr w:type="spellEnd"/>
-      <w:r>
-        <w:rPr>
-          <w:lang w:val="en-US"/>
-        </w:rPr>
-        <w:t xml:space="preserve"> integration script from 2025</w:t>
+        <w:t>Create Rmd version of sas integration script from 2025</w:t>
       </w:r>
     </w:p>
     <w:p>
@@ -2175,21 +1977,7 @@
         <w:rPr>
           <w:lang w:val="en-US"/>
         </w:rPr>
-        <w:t xml:space="preserve">Incorrect length classes in old </w:t>
-      </w:r>
-      <w:proofErr w:type="spellStart"/>
-      <w:r>
-        <w:rPr>
-          <w:lang w:val="en-US"/>
-        </w:rPr>
-        <w:t>sas</w:t>
-      </w:r>
-      <w:proofErr w:type="spellEnd"/>
-      <w:r>
-        <w:rPr>
-          <w:lang w:val="en-US"/>
-        </w:rPr>
-        <w:t xml:space="preserve"> data</w:t>
+        <w:t>Incorrect length classes in old sas data</w:t>
       </w:r>
       <w:r>
         <w:rPr>
@@ -2347,21 +2135,7 @@
         <w:rPr>
           <w:lang w:val="en-US"/>
         </w:rPr>
-        <w:t xml:space="preserve"> </w:t>
-      </w:r>
-      <w:proofErr w:type="spellStart"/>
-      <w:r>
-        <w:rPr>
-          <w:lang w:val="en-US"/>
-        </w:rPr>
-        <w:t>Rmd</w:t>
-      </w:r>
-      <w:proofErr w:type="spellEnd"/>
-      <w:r>
-        <w:rPr>
-          <w:lang w:val="en-US"/>
-        </w:rPr>
-        <w:t xml:space="preserve"> now running</w:t>
+        <w:t xml:space="preserve"> Rmd now running</w:t>
       </w:r>
       <w:r>
         <w:rPr>
@@ -2394,14 +2168,12 @@
         </w:rPr>
         <w:t xml:space="preserve">: </w:t>
       </w:r>
-      <w:proofErr w:type="spellStart"/>
       <w:r>
         <w:rPr>
           <w:lang w:val="en-US"/>
         </w:rPr>
         <w:t>IC_DB.rds</w:t>
       </w:r>
-      <w:proofErr w:type="spellEnd"/>
       <w:r>
         <w:rPr>
           <w:lang w:val="en-US"/>
@@ -2432,19 +2204,11 @@
         </w:rPr>
         <w:t xml:space="preserve">TABLE F: </w:t>
       </w:r>
-      <w:proofErr w:type="spellStart"/>
-      <w:r>
-        <w:rPr>
-          <w:lang w:val="en-US"/>
-        </w:rPr>
-        <w:t>Rmd</w:t>
-      </w:r>
-      <w:proofErr w:type="spellEnd"/>
-      <w:r>
-        <w:rPr>
-          <w:lang w:val="en-US"/>
-        </w:rPr>
-        <w:t xml:space="preserve"> now running</w:t>
+      <w:r>
+        <w:rPr>
+          <w:lang w:val="en-US"/>
+        </w:rPr>
+        <w:t>Rmd now running</w:t>
       </w:r>
       <w:r>
         <w:rPr>
@@ -2500,16 +2264,8 @@
         <w:rPr>
           <w:lang w:val="en-US"/>
         </w:rPr>
-        <w:t xml:space="preserve"> </w:t>
-      </w:r>
-      <w:proofErr w:type="spellStart"/>
-      <w:r>
-        <w:rPr>
-          <w:lang w:val="en-US"/>
-        </w:rPr>
-        <w:t>Rmd</w:t>
-      </w:r>
-      <w:proofErr w:type="spellEnd"/>
+        <w:t xml:space="preserve"> Rmd</w:t>
+      </w:r>
     </w:p>
     <w:p>
       <w:pPr>
@@ -2550,23 +2306,7 @@
           <w:strike/>
           <w:lang w:val="en-US"/>
         </w:rPr>
-        <w:t xml:space="preserve">new mongo implementation of </w:t>
-      </w:r>
-      <w:proofErr w:type="spellStart"/>
-      <w:r>
-        <w:rPr>
-          <w:strike/>
-          <w:lang w:val="en-US"/>
-        </w:rPr>
-        <w:t>Suomu</w:t>
-      </w:r>
-      <w:proofErr w:type="spellEnd"/>
-      <w:r>
-        <w:rPr>
-          <w:strike/>
-          <w:lang w:val="en-US"/>
-        </w:rPr>
-        <w:t xml:space="preserve"> cloud data</w:t>
+        <w:t>new mongo implementation of Suomu cloud data</w:t>
       </w:r>
     </w:p>
     <w:p>
@@ -2590,21 +2330,7 @@
         <w:rPr>
           <w:lang w:val="en-US"/>
         </w:rPr>
-        <w:t xml:space="preserve"> </w:t>
-      </w:r>
-      <w:proofErr w:type="spellStart"/>
-      <w:r>
-        <w:rPr>
-          <w:lang w:val="en-US"/>
-        </w:rPr>
-        <w:t>Rmd</w:t>
-      </w:r>
-      <w:proofErr w:type="spellEnd"/>
-      <w:r>
-        <w:rPr>
-          <w:lang w:val="en-US"/>
-        </w:rPr>
-        <w:t xml:space="preserve"> prepared and test run</w:t>
+        <w:t xml:space="preserve"> Rmd prepared and test run</w:t>
       </w:r>
       <w:r>
         <w:rPr>
@@ -2671,21 +2397,7 @@
         <w:rPr>
           <w:lang w:val="en-US"/>
         </w:rPr>
-        <w:t xml:space="preserve"> </w:t>
-      </w:r>
-      <w:proofErr w:type="spellStart"/>
-      <w:r>
-        <w:rPr>
-          <w:lang w:val="en-US"/>
-        </w:rPr>
-        <w:t>Rmd</w:t>
-      </w:r>
-      <w:proofErr w:type="spellEnd"/>
-      <w:r>
-        <w:rPr>
-          <w:lang w:val="en-US"/>
-        </w:rPr>
-        <w:t xml:space="preserve"> preparation</w:t>
+        <w:t xml:space="preserve"> Rmd preparation</w:t>
       </w:r>
       <w:r>
         <w:rPr>
@@ -2746,21 +2458,7 @@
         <w:rPr>
           <w:lang w:val="en-US"/>
         </w:rPr>
-        <w:t xml:space="preserve">Table e </w:t>
-      </w:r>
-      <w:proofErr w:type="spellStart"/>
-      <w:r>
-        <w:rPr>
-          <w:lang w:val="en-US"/>
-        </w:rPr>
-        <w:t>Rmd</w:t>
-      </w:r>
-      <w:proofErr w:type="spellEnd"/>
-      <w:r>
-        <w:rPr>
-          <w:lang w:val="en-US"/>
-        </w:rPr>
-        <w:t xml:space="preserve"> preparation</w:t>
+        <w:t>Table e Rmd preparation</w:t>
       </w:r>
     </w:p>
     <w:p>
@@ -2822,23 +2520,7 @@
           <w:strike/>
           <w:lang w:val="en-US"/>
         </w:rPr>
-        <w:t xml:space="preserve">Needs new </w:t>
-      </w:r>
-      <w:proofErr w:type="spellStart"/>
-      <w:r>
-        <w:rPr>
-          <w:strike/>
-          <w:lang w:val="en-US"/>
-        </w:rPr>
-        <w:t>Suomu</w:t>
-      </w:r>
-      <w:proofErr w:type="spellEnd"/>
-      <w:r>
-        <w:rPr>
-          <w:strike/>
-          <w:lang w:val="en-US"/>
-        </w:rPr>
-        <w:t xml:space="preserve"> cloud implementation</w:t>
+        <w:t>Needs new Suomu cloud implementation</w:t>
       </w:r>
     </w:p>
     <w:p>
@@ -2856,29 +2538,7 @@
         <w:rPr>
           <w:lang w:val="en-US"/>
         </w:rPr>
-        <w:t xml:space="preserve">Table </w:t>
-      </w:r>
-      <w:proofErr w:type="gramStart"/>
-      <w:r>
-        <w:rPr>
-          <w:lang w:val="en-US"/>
-        </w:rPr>
-        <w:t xml:space="preserve">f </w:t>
-      </w:r>
-      <w:proofErr w:type="spellStart"/>
-      <w:r>
-        <w:rPr>
-          <w:lang w:val="en-US"/>
-        </w:rPr>
-        <w:t>Rmd</w:t>
-      </w:r>
-      <w:proofErr w:type="spellEnd"/>
-      <w:proofErr w:type="gramEnd"/>
-      <w:r>
-        <w:rPr>
-          <w:lang w:val="en-US"/>
-        </w:rPr>
-        <w:t xml:space="preserve"> preparation</w:t>
+        <w:t>Table f Rmd preparation</w:t>
       </w:r>
     </w:p>
     <w:p>
@@ -2916,23 +2576,7 @@
           <w:strike/>
           <w:lang w:val="en-US"/>
         </w:rPr>
-        <w:t xml:space="preserve">Needs new </w:t>
-      </w:r>
-      <w:proofErr w:type="spellStart"/>
-      <w:r>
-        <w:rPr>
-          <w:strike/>
-          <w:lang w:val="en-US"/>
-        </w:rPr>
-        <w:t>Suomu</w:t>
-      </w:r>
-      <w:proofErr w:type="spellEnd"/>
-      <w:r>
-        <w:rPr>
-          <w:strike/>
-          <w:lang w:val="en-US"/>
-        </w:rPr>
-        <w:t xml:space="preserve"> cloud implementation</w:t>
+        <w:t>Needs new Suomu cloud implementation</w:t>
       </w:r>
     </w:p>
     <w:p>
@@ -2992,27 +2636,13 @@
         <w:rPr>
           <w:lang w:val="en-US"/>
         </w:rPr>
-        <w:t xml:space="preserve">Fixing </w:t>
-      </w:r>
-      <w:proofErr w:type="spellStart"/>
-      <w:r>
-        <w:rPr>
-          <w:lang w:val="en-US"/>
-        </w:rPr>
-        <w:t>meti</w:t>
-      </w:r>
-      <w:r>
-        <w:rPr>
-          <w:lang w:val="en-US"/>
-        </w:rPr>
-        <w:t>ers</w:t>
-      </w:r>
-      <w:proofErr w:type="spellEnd"/>
-      <w:r>
-        <w:rPr>
-          <w:lang w:val="en-US"/>
-        </w:rPr>
-        <w:t xml:space="preserve"> in table a-j script</w:t>
+        <w:t>Fixing meti</w:t>
+      </w:r>
+      <w:r>
+        <w:rPr>
+          <w:lang w:val="en-US"/>
+        </w:rPr>
+        <w:t>ers in table a-j script</w:t>
       </w:r>
     </w:p>
     <w:p>
@@ -3026,19 +2656,11 @@
           <w:lang w:val="en-US"/>
         </w:rPr>
       </w:pPr>
-      <w:proofErr w:type="spellStart"/>
-      <w:r>
-        <w:rPr>
-          <w:lang w:val="en-US"/>
-        </w:rPr>
-        <w:t>Rmd</w:t>
-      </w:r>
-      <w:proofErr w:type="spellEnd"/>
-      <w:r>
-        <w:rPr>
-          <w:lang w:val="en-US"/>
-        </w:rPr>
-        <w:t xml:space="preserve"> now running</w:t>
+      <w:r>
+        <w:rPr>
+          <w:lang w:val="en-US"/>
+        </w:rPr>
+        <w:t>Rmd now running</w:t>
       </w:r>
     </w:p>
     <w:p>
@@ -3124,39 +2746,17 @@
           <w:lang w:val="en-US"/>
         </w:rPr>
       </w:pPr>
-      <w:proofErr w:type="spellStart"/>
-      <w:r>
-        <w:rPr>
-          <w:lang w:val="en-US"/>
-        </w:rPr>
-        <w:t>LukeTools</w:t>
-      </w:r>
-      <w:proofErr w:type="spellEnd"/>
-      <w:r>
-        <w:rPr>
-          <w:lang w:val="en-US"/>
-        </w:rPr>
-        <w:t xml:space="preserve"> (</w:t>
-      </w:r>
-      <w:proofErr w:type="gramStart"/>
-      <w:r>
-        <w:rPr>
-          <w:lang w:val="en-US"/>
-        </w:rPr>
-        <w:t>testing)</w:t>
-      </w:r>
-      <w:r>
-        <w:rPr>
-          <w:lang w:val="en-US"/>
-        </w:rPr>
-        <w:t xml:space="preserve">  -</w:t>
-      </w:r>
-      <w:proofErr w:type="gramEnd"/>
-      <w:r>
-        <w:rPr>
-          <w:lang w:val="en-US"/>
-        </w:rPr>
-        <w:t xml:space="preserve"> DONE</w:t>
+      <w:r>
+        <w:rPr>
+          <w:lang w:val="en-US"/>
+        </w:rPr>
+        <w:t>LukeTools (testing)</w:t>
+      </w:r>
+      <w:r>
+        <w:rPr>
+          <w:lang w:val="en-US"/>
+        </w:rPr>
+        <w:t xml:space="preserve">  - DONE</w:t>
       </w:r>
     </w:p>
     <w:p>
@@ -3192,21 +2792,7 @@
         <w:rPr>
           <w:lang w:val="en-US"/>
         </w:rPr>
-        <w:t xml:space="preserve">Replace scripts with </w:t>
-      </w:r>
-      <w:proofErr w:type="spellStart"/>
-      <w:r>
-        <w:rPr>
-          <w:lang w:val="en-US"/>
-        </w:rPr>
-        <w:t>Rmd</w:t>
-      </w:r>
-      <w:proofErr w:type="spellEnd"/>
-      <w:r>
-        <w:rPr>
-          <w:lang w:val="en-US"/>
-        </w:rPr>
-        <w:t xml:space="preserve"> files</w:t>
+        <w:t>Replace scripts with Rmd files</w:t>
       </w:r>
     </w:p>
     <w:p>
@@ -3260,30 +2846,8 @@
         <w:rPr>
           <w:lang w:val="en-US"/>
         </w:rPr>
-        <w:t xml:space="preserve">Change the </w:t>
-      </w:r>
-      <w:proofErr w:type="spellStart"/>
-      <w:r>
-        <w:rPr>
-          <w:lang w:val="en-US"/>
-        </w:rPr>
-        <w:t>metier</w:t>
-      </w:r>
-      <w:proofErr w:type="spellEnd"/>
-      <w:r>
-        <w:rPr>
-          <w:lang w:val="en-US"/>
-        </w:rPr>
-        <w:t xml:space="preserve"> lookup from </w:t>
-      </w:r>
-      <w:proofErr w:type="spellStart"/>
-      <w:r>
-        <w:rPr>
-          <w:lang w:val="en-US"/>
-        </w:rPr>
-        <w:t>github</w:t>
-      </w:r>
-      <w:proofErr w:type="spellEnd"/>
+        <w:t>Change the metier lookup from github</w:t>
+      </w:r>
     </w:p>
     <w:p>
       <w:pPr>
@@ -3300,21 +2864,7 @@
         <w:rPr>
           <w:lang w:val="en-US"/>
         </w:rPr>
-        <w:t xml:space="preserve">Save </w:t>
-      </w:r>
-      <w:proofErr w:type="spellStart"/>
-      <w:r>
-        <w:rPr>
-          <w:lang w:val="en-US"/>
-        </w:rPr>
-        <w:t>sas</w:t>
-      </w:r>
-      <w:proofErr w:type="spellEnd"/>
-      <w:r>
-        <w:rPr>
-          <w:lang w:val="en-US"/>
-        </w:rPr>
-        <w:t xml:space="preserve"> logbook from database and import from database</w:t>
+        <w:t>Save sas logbook from database and import from database</w:t>
       </w:r>
     </w:p>
     <w:p>
@@ -3368,21 +2918,7 @@
         <w:rPr>
           <w:lang w:val="en-US"/>
         </w:rPr>
-        <w:t xml:space="preserve">Create first </w:t>
-      </w:r>
-      <w:proofErr w:type="spellStart"/>
-      <w:r>
-        <w:rPr>
-          <w:lang w:val="en-US"/>
-        </w:rPr>
-        <w:t>Rmd</w:t>
-      </w:r>
-      <w:proofErr w:type="spellEnd"/>
-      <w:r>
-        <w:rPr>
-          <w:lang w:val="en-US"/>
-        </w:rPr>
-        <w:t xml:space="preserve"> version</w:t>
+        <w:t>Create first Rmd version</w:t>
       </w:r>
     </w:p>
     <w:p>
@@ -3422,21 +2958,7 @@
         <w:rPr>
           <w:lang w:val="en-US"/>
         </w:rPr>
-        <w:t>A fishing trip is approximated by reported fishing days, aggregated from monthly reports by taking the maximum number of fishing days per vessel–month–</w:t>
-      </w:r>
-      <w:proofErr w:type="spellStart"/>
-      <w:r>
-        <w:rPr>
-          <w:lang w:val="en-US"/>
-        </w:rPr>
-        <w:t>metier</w:t>
-      </w:r>
-      <w:proofErr w:type="spellEnd"/>
-      <w:r>
-        <w:rPr>
-          <w:lang w:val="en-US"/>
-        </w:rPr>
-        <w:t xml:space="preserve"> combination and summing these over time and vessels.</w:t>
+        <w:t>A fishing trip is approximated by reported fishing days, aggregated from monthly reports by taking the maximum number of fishing days per vessel–month–metier combination and summing these over time and vessels.</w:t>
       </w:r>
     </w:p>
     <w:p>
@@ -3771,6 +3293,119 @@
     </w:lvl>
   </w:abstractNum>
   <w:abstractNum w:abstractNumId="2" w15:restartNumberingAfterBreak="0">
+    <w:nsid w:val="05692AA5"/>
+    <w:multiLevelType w:val="hybridMultilevel"/>
+    <w:tmpl w:val="6180DB82"/>
+    <w:lvl w:ilvl="0" w:tplc="08090001">
+      <w:start w:val="1"/>
+      <w:numFmt w:val="bullet"/>
+      <w:lvlText w:val=""/>
+      <w:lvlJc w:val="left"/>
+      <w:pPr>
+        <w:ind w:left="720" w:hanging="360"/>
+      </w:pPr>
+      <w:rPr>
+        <w:rFonts w:ascii="Symbol" w:hAnsi="Symbol" w:hint="default"/>
+      </w:rPr>
+    </w:lvl>
+    <w:lvl w:ilvl="1" w:tplc="08090003" w:tentative="1">
+      <w:start w:val="1"/>
+      <w:numFmt w:val="bullet"/>
+      <w:lvlText w:val="o"/>
+      <w:lvlJc w:val="left"/>
+      <w:pPr>
+        <w:ind w:left="1440" w:hanging="360"/>
+      </w:pPr>
+      <w:rPr>
+        <w:rFonts w:ascii="Courier New" w:hAnsi="Courier New" w:cs="Courier New" w:hint="default"/>
+      </w:rPr>
+    </w:lvl>
+    <w:lvl w:ilvl="2" w:tplc="08090005" w:tentative="1">
+      <w:start w:val="1"/>
+      <w:numFmt w:val="bullet"/>
+      <w:lvlText w:val=""/>
+      <w:lvlJc w:val="left"/>
+      <w:pPr>
+        <w:ind w:left="2160" w:hanging="360"/>
+      </w:pPr>
+      <w:rPr>
+        <w:rFonts w:ascii="Wingdings" w:hAnsi="Wingdings" w:hint="default"/>
+      </w:rPr>
+    </w:lvl>
+    <w:lvl w:ilvl="3" w:tplc="08090001" w:tentative="1">
+      <w:start w:val="1"/>
+      <w:numFmt w:val="bullet"/>
+      <w:lvlText w:val=""/>
+      <w:lvlJc w:val="left"/>
+      <w:pPr>
+        <w:ind w:left="2880" w:hanging="360"/>
+      </w:pPr>
+      <w:rPr>
+        <w:rFonts w:ascii="Symbol" w:hAnsi="Symbol" w:hint="default"/>
+      </w:rPr>
+    </w:lvl>
+    <w:lvl w:ilvl="4" w:tplc="08090003" w:tentative="1">
+      <w:start w:val="1"/>
+      <w:numFmt w:val="bullet"/>
+      <w:lvlText w:val="o"/>
+      <w:lvlJc w:val="left"/>
+      <w:pPr>
+        <w:ind w:left="3600" w:hanging="360"/>
+      </w:pPr>
+      <w:rPr>
+        <w:rFonts w:ascii="Courier New" w:hAnsi="Courier New" w:cs="Courier New" w:hint="default"/>
+      </w:rPr>
+    </w:lvl>
+    <w:lvl w:ilvl="5" w:tplc="08090005" w:tentative="1">
+      <w:start w:val="1"/>
+      <w:numFmt w:val="bullet"/>
+      <w:lvlText w:val=""/>
+      <w:lvlJc w:val="left"/>
+      <w:pPr>
+        <w:ind w:left="4320" w:hanging="360"/>
+      </w:pPr>
+      <w:rPr>
+        <w:rFonts w:ascii="Wingdings" w:hAnsi="Wingdings" w:hint="default"/>
+      </w:rPr>
+    </w:lvl>
+    <w:lvl w:ilvl="6" w:tplc="08090001" w:tentative="1">
+      <w:start w:val="1"/>
+      <w:numFmt w:val="bullet"/>
+      <w:lvlText w:val=""/>
+      <w:lvlJc w:val="left"/>
+      <w:pPr>
+        <w:ind w:left="5040" w:hanging="360"/>
+      </w:pPr>
+      <w:rPr>
+        <w:rFonts w:ascii="Symbol" w:hAnsi="Symbol" w:hint="default"/>
+      </w:rPr>
+    </w:lvl>
+    <w:lvl w:ilvl="7" w:tplc="08090003" w:tentative="1">
+      <w:start w:val="1"/>
+      <w:numFmt w:val="bullet"/>
+      <w:lvlText w:val="o"/>
+      <w:lvlJc w:val="left"/>
+      <w:pPr>
+        <w:ind w:left="5760" w:hanging="360"/>
+      </w:pPr>
+      <w:rPr>
+        <w:rFonts w:ascii="Courier New" w:hAnsi="Courier New" w:cs="Courier New" w:hint="default"/>
+      </w:rPr>
+    </w:lvl>
+    <w:lvl w:ilvl="8" w:tplc="08090005" w:tentative="1">
+      <w:start w:val="1"/>
+      <w:numFmt w:val="bullet"/>
+      <w:lvlText w:val=""/>
+      <w:lvlJc w:val="left"/>
+      <w:pPr>
+        <w:ind w:left="6480" w:hanging="360"/>
+      </w:pPr>
+      <w:rPr>
+        <w:rFonts w:ascii="Wingdings" w:hAnsi="Wingdings" w:hint="default"/>
+      </w:rPr>
+    </w:lvl>
+  </w:abstractNum>
+  <w:abstractNum w:abstractNumId="3" w15:restartNumberingAfterBreak="0">
     <w:nsid w:val="10DA3FA4"/>
     <w:multiLevelType w:val="hybridMultilevel"/>
     <w:tmpl w:val="45F06DE6"/>
@@ -3882,7 +3517,7 @@
       </w:rPr>
     </w:lvl>
   </w:abstractNum>
-  <w:abstractNum w:abstractNumId="3" w15:restartNumberingAfterBreak="0">
+  <w:abstractNum w:abstractNumId="4" w15:restartNumberingAfterBreak="0">
     <w:nsid w:val="12FA2BA1"/>
     <w:multiLevelType w:val="hybridMultilevel"/>
     <w:tmpl w:val="F59ADA98"/>
@@ -3995,7 +3630,7 @@
       </w:rPr>
     </w:lvl>
   </w:abstractNum>
-  <w:abstractNum w:abstractNumId="4" w15:restartNumberingAfterBreak="0">
+  <w:abstractNum w:abstractNumId="5" w15:restartNumberingAfterBreak="0">
     <w:nsid w:val="15761132"/>
     <w:multiLevelType w:val="hybridMultilevel"/>
     <w:tmpl w:val="AE70A39C"/>
@@ -4107,7 +3742,7 @@
       </w:rPr>
     </w:lvl>
   </w:abstractNum>
-  <w:abstractNum w:abstractNumId="5" w15:restartNumberingAfterBreak="0">
+  <w:abstractNum w:abstractNumId="6" w15:restartNumberingAfterBreak="0">
     <w:nsid w:val="1864755F"/>
     <w:multiLevelType w:val="hybridMultilevel"/>
     <w:tmpl w:val="42D41E72"/>
@@ -4219,7 +3854,7 @@
       </w:rPr>
     </w:lvl>
   </w:abstractNum>
-  <w:abstractNum w:abstractNumId="6" w15:restartNumberingAfterBreak="0">
+  <w:abstractNum w:abstractNumId="7" w15:restartNumberingAfterBreak="0">
     <w:nsid w:val="1C8F4780"/>
     <w:multiLevelType w:val="hybridMultilevel"/>
     <w:tmpl w:val="5FD6290A"/>
@@ -4331,7 +3966,7 @@
       </w:rPr>
     </w:lvl>
   </w:abstractNum>
-  <w:abstractNum w:abstractNumId="7" w15:restartNumberingAfterBreak="0">
+  <w:abstractNum w:abstractNumId="8" w15:restartNumberingAfterBreak="0">
     <w:nsid w:val="23120FA5"/>
     <w:multiLevelType w:val="hybridMultilevel"/>
     <w:tmpl w:val="4AE806A8"/>
@@ -4443,7 +4078,7 @@
       </w:rPr>
     </w:lvl>
   </w:abstractNum>
-  <w:abstractNum w:abstractNumId="8" w15:restartNumberingAfterBreak="0">
+  <w:abstractNum w:abstractNumId="9" w15:restartNumberingAfterBreak="0">
     <w:nsid w:val="260F3E04"/>
     <w:multiLevelType w:val="hybridMultilevel"/>
     <w:tmpl w:val="4FE43C20"/>
@@ -4555,7 +4190,7 @@
       </w:rPr>
     </w:lvl>
   </w:abstractNum>
-  <w:abstractNum w:abstractNumId="9" w15:restartNumberingAfterBreak="0">
+  <w:abstractNum w:abstractNumId="10" w15:restartNumberingAfterBreak="0">
     <w:nsid w:val="27D9741C"/>
     <w:multiLevelType w:val="hybridMultilevel"/>
     <w:tmpl w:val="3918AADE"/>
@@ -4668,7 +4303,7 @@
       </w:rPr>
     </w:lvl>
   </w:abstractNum>
-  <w:abstractNum w:abstractNumId="10" w15:restartNumberingAfterBreak="0">
+  <w:abstractNum w:abstractNumId="11" w15:restartNumberingAfterBreak="0">
     <w:nsid w:val="28575A35"/>
     <w:multiLevelType w:val="hybridMultilevel"/>
     <w:tmpl w:val="599E81EC"/>
@@ -4780,7 +4415,7 @@
       </w:rPr>
     </w:lvl>
   </w:abstractNum>
-  <w:abstractNum w:abstractNumId="11" w15:restartNumberingAfterBreak="0">
+  <w:abstractNum w:abstractNumId="12" w15:restartNumberingAfterBreak="0">
     <w:nsid w:val="2A623D97"/>
     <w:multiLevelType w:val="hybridMultilevel"/>
     <w:tmpl w:val="236C2F34"/>
@@ -4892,7 +4527,7 @@
       </w:rPr>
     </w:lvl>
   </w:abstractNum>
-  <w:abstractNum w:abstractNumId="12" w15:restartNumberingAfterBreak="0">
+  <w:abstractNum w:abstractNumId="13" w15:restartNumberingAfterBreak="0">
     <w:nsid w:val="2EAF3385"/>
     <w:multiLevelType w:val="hybridMultilevel"/>
     <w:tmpl w:val="FDEA9C72"/>
@@ -5004,7 +4639,7 @@
       </w:rPr>
     </w:lvl>
   </w:abstractNum>
-  <w:abstractNum w:abstractNumId="13" w15:restartNumberingAfterBreak="0">
+  <w:abstractNum w:abstractNumId="14" w15:restartNumberingAfterBreak="0">
     <w:nsid w:val="308237DE"/>
     <w:multiLevelType w:val="hybridMultilevel"/>
     <w:tmpl w:val="E0942DCE"/>
@@ -5117,7 +4752,7 @@
       </w:rPr>
     </w:lvl>
   </w:abstractNum>
-  <w:abstractNum w:abstractNumId="14" w15:restartNumberingAfterBreak="0">
+  <w:abstractNum w:abstractNumId="15" w15:restartNumberingAfterBreak="0">
     <w:nsid w:val="324547E5"/>
     <w:multiLevelType w:val="hybridMultilevel"/>
     <w:tmpl w:val="D7488678"/>
@@ -5230,7 +4865,7 @@
       </w:rPr>
     </w:lvl>
   </w:abstractNum>
-  <w:abstractNum w:abstractNumId="15" w15:restartNumberingAfterBreak="0">
+  <w:abstractNum w:abstractNumId="16" w15:restartNumberingAfterBreak="0">
     <w:nsid w:val="3B13134C"/>
     <w:multiLevelType w:val="hybridMultilevel"/>
     <w:tmpl w:val="041AC950"/>
@@ -5342,7 +4977,7 @@
       </w:rPr>
     </w:lvl>
   </w:abstractNum>
-  <w:abstractNum w:abstractNumId="16" w15:restartNumberingAfterBreak="0">
+  <w:abstractNum w:abstractNumId="17" w15:restartNumberingAfterBreak="0">
     <w:nsid w:val="3B3F2A02"/>
     <w:multiLevelType w:val="hybridMultilevel"/>
     <w:tmpl w:val="9BB62138"/>
@@ -5455,7 +5090,7 @@
       </w:rPr>
     </w:lvl>
   </w:abstractNum>
-  <w:abstractNum w:abstractNumId="17" w15:restartNumberingAfterBreak="0">
+  <w:abstractNum w:abstractNumId="18" w15:restartNumberingAfterBreak="0">
     <w:nsid w:val="3BA86148"/>
     <w:multiLevelType w:val="hybridMultilevel"/>
     <w:tmpl w:val="8CA86A1E"/>
@@ -5568,7 +5203,7 @@
       </w:rPr>
     </w:lvl>
   </w:abstractNum>
-  <w:abstractNum w:abstractNumId="18" w15:restartNumberingAfterBreak="0">
+  <w:abstractNum w:abstractNumId="19" w15:restartNumberingAfterBreak="0">
     <w:nsid w:val="3C5B376A"/>
     <w:multiLevelType w:val="hybridMultilevel"/>
     <w:tmpl w:val="318AF922"/>
@@ -5680,7 +5315,7 @@
       </w:rPr>
     </w:lvl>
   </w:abstractNum>
-  <w:abstractNum w:abstractNumId="19" w15:restartNumberingAfterBreak="0">
+  <w:abstractNum w:abstractNumId="20" w15:restartNumberingAfterBreak="0">
     <w:nsid w:val="47F96F2F"/>
     <w:multiLevelType w:val="hybridMultilevel"/>
     <w:tmpl w:val="7256ACFE"/>
@@ -5792,7 +5427,7 @@
       </w:rPr>
     </w:lvl>
   </w:abstractNum>
-  <w:abstractNum w:abstractNumId="20" w15:restartNumberingAfterBreak="0">
+  <w:abstractNum w:abstractNumId="21" w15:restartNumberingAfterBreak="0">
     <w:nsid w:val="483435CC"/>
     <w:multiLevelType w:val="hybridMultilevel"/>
     <w:tmpl w:val="787CC9BA"/>
@@ -5904,7 +5539,7 @@
       </w:rPr>
     </w:lvl>
   </w:abstractNum>
-  <w:abstractNum w:abstractNumId="21" w15:restartNumberingAfterBreak="0">
+  <w:abstractNum w:abstractNumId="22" w15:restartNumberingAfterBreak="0">
     <w:nsid w:val="49A87142"/>
     <w:multiLevelType w:val="hybridMultilevel"/>
     <w:tmpl w:val="0C047B9C"/>
@@ -6016,7 +5651,7 @@
       </w:rPr>
     </w:lvl>
   </w:abstractNum>
-  <w:abstractNum w:abstractNumId="22" w15:restartNumberingAfterBreak="0">
+  <w:abstractNum w:abstractNumId="23" w15:restartNumberingAfterBreak="0">
     <w:nsid w:val="4C2329FC"/>
     <w:multiLevelType w:val="hybridMultilevel"/>
     <w:tmpl w:val="DE9ED958"/>
@@ -6129,7 +5764,7 @@
       </w:rPr>
     </w:lvl>
   </w:abstractNum>
-  <w:abstractNum w:abstractNumId="23" w15:restartNumberingAfterBreak="0">
+  <w:abstractNum w:abstractNumId="24" w15:restartNumberingAfterBreak="0">
     <w:nsid w:val="4C62209E"/>
     <w:multiLevelType w:val="hybridMultilevel"/>
     <w:tmpl w:val="07F6CAEE"/>
@@ -6242,7 +5877,7 @@
       </w:rPr>
     </w:lvl>
   </w:abstractNum>
-  <w:abstractNum w:abstractNumId="24" w15:restartNumberingAfterBreak="0">
+  <w:abstractNum w:abstractNumId="25" w15:restartNumberingAfterBreak="0">
     <w:nsid w:val="5A9430D7"/>
     <w:multiLevelType w:val="hybridMultilevel"/>
     <w:tmpl w:val="BB3A180A"/>
@@ -6355,7 +5990,7 @@
       </w:rPr>
     </w:lvl>
   </w:abstractNum>
-  <w:abstractNum w:abstractNumId="25" w15:restartNumberingAfterBreak="0">
+  <w:abstractNum w:abstractNumId="26" w15:restartNumberingAfterBreak="0">
     <w:nsid w:val="5FC00F8A"/>
     <w:multiLevelType w:val="hybridMultilevel"/>
     <w:tmpl w:val="9D96EDD4"/>
@@ -6468,7 +6103,7 @@
       </w:rPr>
     </w:lvl>
   </w:abstractNum>
-  <w:abstractNum w:abstractNumId="26" w15:restartNumberingAfterBreak="0">
+  <w:abstractNum w:abstractNumId="27" w15:restartNumberingAfterBreak="0">
     <w:nsid w:val="65070E8D"/>
     <w:multiLevelType w:val="hybridMultilevel"/>
     <w:tmpl w:val="BDB6982A"/>
@@ -6581,7 +6216,7 @@
       </w:rPr>
     </w:lvl>
   </w:abstractNum>
-  <w:abstractNum w:abstractNumId="27" w15:restartNumberingAfterBreak="0">
+  <w:abstractNum w:abstractNumId="28" w15:restartNumberingAfterBreak="0">
     <w:nsid w:val="695A7833"/>
     <w:multiLevelType w:val="hybridMultilevel"/>
     <w:tmpl w:val="E564D540"/>
@@ -6693,7 +6328,7 @@
       </w:rPr>
     </w:lvl>
   </w:abstractNum>
-  <w:abstractNum w:abstractNumId="28" w15:restartNumberingAfterBreak="0">
+  <w:abstractNum w:abstractNumId="29" w15:restartNumberingAfterBreak="0">
     <w:nsid w:val="6E5176C4"/>
     <w:multiLevelType w:val="hybridMultilevel"/>
     <w:tmpl w:val="51C0ACA8"/>
@@ -6805,7 +6440,7 @@
       </w:rPr>
     </w:lvl>
   </w:abstractNum>
-  <w:abstractNum w:abstractNumId="29" w15:restartNumberingAfterBreak="0">
+  <w:abstractNum w:abstractNumId="30" w15:restartNumberingAfterBreak="0">
     <w:nsid w:val="73B949D2"/>
     <w:multiLevelType w:val="hybridMultilevel"/>
     <w:tmpl w:val="28606D2A"/>
@@ -6921,90 +6556,93 @@
     <w:abstractNumId w:val="1"/>
   </w:num>
   <w:num w:numId="2" w16cid:durableId="214704310">
-    <w:abstractNumId w:val="3"/>
+    <w:abstractNumId w:val="4"/>
   </w:num>
   <w:num w:numId="3" w16cid:durableId="1364742651">
-    <w:abstractNumId w:val="25"/>
+    <w:abstractNumId w:val="26"/>
   </w:num>
   <w:num w:numId="4" w16cid:durableId="302855184">
+    <w:abstractNumId w:val="9"/>
+  </w:num>
+  <w:num w:numId="5" w16cid:durableId="913128674">
     <w:abstractNumId w:val="8"/>
   </w:num>
-  <w:num w:numId="5" w16cid:durableId="913128674">
-    <w:abstractNumId w:val="7"/>
-  </w:num>
   <w:num w:numId="6" w16cid:durableId="1637492389">
-    <w:abstractNumId w:val="10"/>
+    <w:abstractNumId w:val="11"/>
   </w:num>
   <w:num w:numId="7" w16cid:durableId="276644472">
+    <w:abstractNumId w:val="14"/>
+  </w:num>
+  <w:num w:numId="8" w16cid:durableId="836699043">
+    <w:abstractNumId w:val="17"/>
+  </w:num>
+  <w:num w:numId="9" w16cid:durableId="536427938">
+    <w:abstractNumId w:val="6"/>
+  </w:num>
+  <w:num w:numId="10" w16cid:durableId="1761370988">
+    <w:abstractNumId w:val="27"/>
+  </w:num>
+  <w:num w:numId="11" w16cid:durableId="1499495752">
+    <w:abstractNumId w:val="20"/>
+  </w:num>
+  <w:num w:numId="12" w16cid:durableId="1412316134">
+    <w:abstractNumId w:val="30"/>
+  </w:num>
+  <w:num w:numId="13" w16cid:durableId="1350258004">
+    <w:abstractNumId w:val="12"/>
+  </w:num>
+  <w:num w:numId="14" w16cid:durableId="1673683661">
+    <w:abstractNumId w:val="22"/>
+  </w:num>
+  <w:num w:numId="15" w16cid:durableId="867064272">
+    <w:abstractNumId w:val="28"/>
+  </w:num>
+  <w:num w:numId="16" w16cid:durableId="7604246">
+    <w:abstractNumId w:val="21"/>
+  </w:num>
+  <w:num w:numId="17" w16cid:durableId="2089039549">
     <w:abstractNumId w:val="13"/>
   </w:num>
-  <w:num w:numId="8" w16cid:durableId="836699043">
-    <w:abstractNumId w:val="16"/>
-  </w:num>
-  <w:num w:numId="9" w16cid:durableId="536427938">
-    <w:abstractNumId w:val="5"/>
-  </w:num>
-  <w:num w:numId="10" w16cid:durableId="1761370988">
-    <w:abstractNumId w:val="26"/>
-  </w:num>
-  <w:num w:numId="11" w16cid:durableId="1499495752">
-    <w:abstractNumId w:val="19"/>
-  </w:num>
-  <w:num w:numId="12" w16cid:durableId="1412316134">
-    <w:abstractNumId w:val="29"/>
-  </w:num>
-  <w:num w:numId="13" w16cid:durableId="1350258004">
-    <w:abstractNumId w:val="11"/>
-  </w:num>
-  <w:num w:numId="14" w16cid:durableId="1673683661">
-    <w:abstractNumId w:val="21"/>
-  </w:num>
-  <w:num w:numId="15" w16cid:durableId="867064272">
-    <w:abstractNumId w:val="27"/>
-  </w:num>
-  <w:num w:numId="16" w16cid:durableId="7604246">
-    <w:abstractNumId w:val="20"/>
-  </w:num>
-  <w:num w:numId="17" w16cid:durableId="2089039549">
-    <w:abstractNumId w:val="12"/>
-  </w:num>
   <w:num w:numId="18" w16cid:durableId="595285920">
-    <w:abstractNumId w:val="23"/>
+    <w:abstractNumId w:val="24"/>
   </w:num>
   <w:num w:numId="19" w16cid:durableId="2136634086">
-    <w:abstractNumId w:val="14"/>
+    <w:abstractNumId w:val="15"/>
   </w:num>
   <w:num w:numId="20" w16cid:durableId="411004895">
     <w:abstractNumId w:val="0"/>
   </w:num>
   <w:num w:numId="21" w16cid:durableId="1646935873">
-    <w:abstractNumId w:val="24"/>
+    <w:abstractNumId w:val="25"/>
   </w:num>
   <w:num w:numId="22" w16cid:durableId="18512531">
-    <w:abstractNumId w:val="17"/>
+    <w:abstractNumId w:val="18"/>
   </w:num>
   <w:num w:numId="23" w16cid:durableId="926422375">
-    <w:abstractNumId w:val="22"/>
+    <w:abstractNumId w:val="23"/>
   </w:num>
   <w:num w:numId="24" w16cid:durableId="1654137957">
-    <w:abstractNumId w:val="15"/>
+    <w:abstractNumId w:val="16"/>
   </w:num>
   <w:num w:numId="25" w16cid:durableId="412093067">
-    <w:abstractNumId w:val="4"/>
+    <w:abstractNumId w:val="5"/>
   </w:num>
   <w:num w:numId="26" w16cid:durableId="1880586110">
-    <w:abstractNumId w:val="6"/>
+    <w:abstractNumId w:val="7"/>
   </w:num>
   <w:num w:numId="27" w16cid:durableId="1512182773">
-    <w:abstractNumId w:val="18"/>
+    <w:abstractNumId w:val="19"/>
   </w:num>
   <w:num w:numId="28" w16cid:durableId="1900287879">
-    <w:abstractNumId w:val="28"/>
+    <w:abstractNumId w:val="29"/>
   </w:num>
   <w:num w:numId="29" w16cid:durableId="112094442">
-    <w:abstractNumId w:val="9"/>
+    <w:abstractNumId w:val="10"/>
   </w:num>
   <w:num w:numId="30" w16cid:durableId="568854349">
+    <w:abstractNumId w:val="3"/>
+  </w:num>
+  <w:num w:numId="31" w16cid:durableId="322009496">
     <w:abstractNumId w:val="2"/>
   </w:num>
 </w:numbering>

</xml_diff>

<commit_message>
to do's for today
</commit_message>
<xml_diff>
--- a/documents/2026/FDI_TO_DO.docx
+++ b/documents/2026/FDI_TO_DO.docx
@@ -59,6 +59,127 @@
           <w:bCs/>
           <w:lang w:val="en-US"/>
         </w:rPr>
+        <w:t>23/</w:t>
+      </w:r>
+      <w:r>
+        <w:rPr>
+          <w:b/>
+          <w:bCs/>
+          <w:lang w:val="en-US"/>
+        </w:rPr>
+        <w:t>06/2026</w:t>
+      </w:r>
+    </w:p>
+    <w:p>
+      <w:pPr>
+        <w:pStyle w:val="ListParagraph"/>
+        <w:numPr>
+          <w:ilvl w:val="0"/>
+          <w:numId w:val="32"/>
+        </w:numPr>
+        <w:rPr>
+          <w:lang w:val="en-US"/>
+        </w:rPr>
+      </w:pPr>
+      <w:r>
+        <w:rPr>
+          <w:lang w:val="en-US"/>
+        </w:rPr>
+        <w:t>Check fecR logic in import_sas_metier_2013-15.Rmd</w:t>
+      </w:r>
+    </w:p>
+    <w:p>
+      <w:pPr>
+        <w:pStyle w:val="ListParagraph"/>
+        <w:numPr>
+          <w:ilvl w:val="1"/>
+          <w:numId w:val="32"/>
+        </w:numPr>
+        <w:rPr>
+          <w:lang w:val="en-US"/>
+        </w:rPr>
+      </w:pPr>
+      <w:r>
+        <w:rPr>
+          <w:lang w:val="en-US"/>
+        </w:rPr>
+        <w:t>NA's in KALASTUSPAIVAT/MERIPAIVAT</w:t>
+      </w:r>
+      <w:r>
+        <w:rPr>
+          <w:lang w:val="en-US"/>
+        </w:rPr>
+        <w:t>!!!</w:t>
+      </w:r>
+    </w:p>
+    <w:p>
+      <w:pPr>
+        <w:pStyle w:val="ListParagraph"/>
+        <w:numPr>
+          <w:ilvl w:val="0"/>
+          <w:numId w:val="32"/>
+        </w:numPr>
+        <w:rPr>
+          <w:lang w:val="en-US"/>
+        </w:rPr>
+      </w:pPr>
+      <w:r>
+        <w:rPr>
+          <w:lang w:val="en-US"/>
+        </w:rPr>
+        <w:t>maxseadays_2</w:t>
+      </w:r>
+      <w:r>
+        <w:rPr>
+          <w:lang w:val="en-US"/>
+        </w:rPr>
+        <w:t xml:space="preserve"> logic in table_a-J.Rmd</w:t>
+      </w:r>
+    </w:p>
+    <w:p>
+      <w:pPr>
+        <w:pStyle w:val="ListParagraph"/>
+        <w:numPr>
+          <w:ilvl w:val="1"/>
+          <w:numId w:val="32"/>
+        </w:numPr>
+        <w:rPr>
+          <w:lang w:val="en-US"/>
+        </w:rPr>
+      </w:pPr>
+      <w:r>
+        <w:rPr>
+          <w:lang w:val="en-US"/>
+        </w:rPr>
+        <w:t xml:space="preserve">should have the same aggregation as </w:t>
+      </w:r>
+      <w:r>
+        <w:rPr>
+          <w:lang w:val="en-US"/>
+        </w:rPr>
+        <w:t>totkw_totgt</w:t>
+      </w:r>
+      <w:r>
+        <w:rPr>
+          <w:lang w:val="en-US"/>
+        </w:rPr>
+        <w:t xml:space="preserve"> – so needs a fix</w:t>
+      </w:r>
+    </w:p>
+    <w:p>
+      <w:pPr>
+        <w:rPr>
+          <w:b/>
+          <w:bCs/>
+          <w:lang w:val="en-US"/>
+        </w:rPr>
+      </w:pPr>
+      <w:r>
+        <w:rPr>
+          <w:b/>
+          <w:bCs/>
+          <w:lang w:val="en-US"/>
+        </w:rPr>
         <w:t>22/06/2026</w:t>
       </w:r>
     </w:p>
@@ -78,6 +199,12 @@
           <w:lang w:val="en-US"/>
         </w:rPr>
         <w:t>Finishing table J</w:t>
+      </w:r>
+      <w:r>
+        <w:rPr>
+          <w:lang w:val="en-US"/>
+        </w:rPr>
+        <w:t xml:space="preserve"> - error</w:t>
       </w:r>
     </w:p>
     <w:p>
@@ -6441,6 +6568,119 @@
     </w:lvl>
   </w:abstractNum>
   <w:abstractNum w:abstractNumId="30" w15:restartNumberingAfterBreak="0">
+    <w:nsid w:val="6FE3157E"/>
+    <w:multiLevelType w:val="hybridMultilevel"/>
+    <w:tmpl w:val="6B0E535E"/>
+    <w:lvl w:ilvl="0" w:tplc="08090001">
+      <w:start w:val="1"/>
+      <w:numFmt w:val="bullet"/>
+      <w:lvlText w:val=""/>
+      <w:lvlJc w:val="left"/>
+      <w:pPr>
+        <w:ind w:left="720" w:hanging="360"/>
+      </w:pPr>
+      <w:rPr>
+        <w:rFonts w:ascii="Symbol" w:hAnsi="Symbol" w:hint="default"/>
+      </w:rPr>
+    </w:lvl>
+    <w:lvl w:ilvl="1" w:tplc="08090003">
+      <w:start w:val="1"/>
+      <w:numFmt w:val="bullet"/>
+      <w:lvlText w:val="o"/>
+      <w:lvlJc w:val="left"/>
+      <w:pPr>
+        <w:ind w:left="1440" w:hanging="360"/>
+      </w:pPr>
+      <w:rPr>
+        <w:rFonts w:ascii="Courier New" w:hAnsi="Courier New" w:cs="Courier New" w:hint="default"/>
+      </w:rPr>
+    </w:lvl>
+    <w:lvl w:ilvl="2" w:tplc="08090005" w:tentative="1">
+      <w:start w:val="1"/>
+      <w:numFmt w:val="bullet"/>
+      <w:lvlText w:val=""/>
+      <w:lvlJc w:val="left"/>
+      <w:pPr>
+        <w:ind w:left="2160" w:hanging="360"/>
+      </w:pPr>
+      <w:rPr>
+        <w:rFonts w:ascii="Wingdings" w:hAnsi="Wingdings" w:hint="default"/>
+      </w:rPr>
+    </w:lvl>
+    <w:lvl w:ilvl="3" w:tplc="08090001" w:tentative="1">
+      <w:start w:val="1"/>
+      <w:numFmt w:val="bullet"/>
+      <w:lvlText w:val=""/>
+      <w:lvlJc w:val="left"/>
+      <w:pPr>
+        <w:ind w:left="2880" w:hanging="360"/>
+      </w:pPr>
+      <w:rPr>
+        <w:rFonts w:ascii="Symbol" w:hAnsi="Symbol" w:hint="default"/>
+      </w:rPr>
+    </w:lvl>
+    <w:lvl w:ilvl="4" w:tplc="08090003" w:tentative="1">
+      <w:start w:val="1"/>
+      <w:numFmt w:val="bullet"/>
+      <w:lvlText w:val="o"/>
+      <w:lvlJc w:val="left"/>
+      <w:pPr>
+        <w:ind w:left="3600" w:hanging="360"/>
+      </w:pPr>
+      <w:rPr>
+        <w:rFonts w:ascii="Courier New" w:hAnsi="Courier New" w:cs="Courier New" w:hint="default"/>
+      </w:rPr>
+    </w:lvl>
+    <w:lvl w:ilvl="5" w:tplc="08090005" w:tentative="1">
+      <w:start w:val="1"/>
+      <w:numFmt w:val="bullet"/>
+      <w:lvlText w:val=""/>
+      <w:lvlJc w:val="left"/>
+      <w:pPr>
+        <w:ind w:left="4320" w:hanging="360"/>
+      </w:pPr>
+      <w:rPr>
+        <w:rFonts w:ascii="Wingdings" w:hAnsi="Wingdings" w:hint="default"/>
+      </w:rPr>
+    </w:lvl>
+    <w:lvl w:ilvl="6" w:tplc="08090001" w:tentative="1">
+      <w:start w:val="1"/>
+      <w:numFmt w:val="bullet"/>
+      <w:lvlText w:val=""/>
+      <w:lvlJc w:val="left"/>
+      <w:pPr>
+        <w:ind w:left="5040" w:hanging="360"/>
+      </w:pPr>
+      <w:rPr>
+        <w:rFonts w:ascii="Symbol" w:hAnsi="Symbol" w:hint="default"/>
+      </w:rPr>
+    </w:lvl>
+    <w:lvl w:ilvl="7" w:tplc="08090003" w:tentative="1">
+      <w:start w:val="1"/>
+      <w:numFmt w:val="bullet"/>
+      <w:lvlText w:val="o"/>
+      <w:lvlJc w:val="left"/>
+      <w:pPr>
+        <w:ind w:left="5760" w:hanging="360"/>
+      </w:pPr>
+      <w:rPr>
+        <w:rFonts w:ascii="Courier New" w:hAnsi="Courier New" w:cs="Courier New" w:hint="default"/>
+      </w:rPr>
+    </w:lvl>
+    <w:lvl w:ilvl="8" w:tplc="08090005" w:tentative="1">
+      <w:start w:val="1"/>
+      <w:numFmt w:val="bullet"/>
+      <w:lvlText w:val=""/>
+      <w:lvlJc w:val="left"/>
+      <w:pPr>
+        <w:ind w:left="6480" w:hanging="360"/>
+      </w:pPr>
+      <w:rPr>
+        <w:rFonts w:ascii="Wingdings" w:hAnsi="Wingdings" w:hint="default"/>
+      </w:rPr>
+    </w:lvl>
+  </w:abstractNum>
+  <w:abstractNum w:abstractNumId="31" w15:restartNumberingAfterBreak="0">
     <w:nsid w:val="73B949D2"/>
     <w:multiLevelType w:val="hybridMultilevel"/>
     <w:tmpl w:val="28606D2A"/>
@@ -6586,7 +6826,7 @@
     <w:abstractNumId w:val="20"/>
   </w:num>
   <w:num w:numId="12" w16cid:durableId="1412316134">
-    <w:abstractNumId w:val="30"/>
+    <w:abstractNumId w:val="31"/>
   </w:num>
   <w:num w:numId="13" w16cid:durableId="1350258004">
     <w:abstractNumId w:val="12"/>
@@ -6644,6 +6884,9 @@
   </w:num>
   <w:num w:numId="31" w16cid:durableId="322009496">
     <w:abstractNumId w:val="2"/>
+  </w:num>
+  <w:num w:numId="32" w16cid:durableId="366636805">
+    <w:abstractNumId w:val="30"/>
   </w:num>
 </w:numbering>
 </file>

</xml_diff>

<commit_message>
comments for last coupld of days of work
</commit_message>
<xml_diff>
--- a/documents/2026/FDI_TO_DO.docx
+++ b/documents/2026/FDI_TO_DO.docx
@@ -59,6 +59,146 @@
           <w:bCs/>
           <w:lang w:val="en-US"/>
         </w:rPr>
+        <w:t>29/06/2026</w:t>
+      </w:r>
+    </w:p>
+    <w:p>
+      <w:pPr>
+        <w:pStyle w:val="ListParagraph"/>
+        <w:numPr>
+          <w:ilvl w:val="0"/>
+          <w:numId w:val="33"/>
+        </w:numPr>
+        <w:rPr>
+          <w:lang w:val="en-US"/>
+        </w:rPr>
+      </w:pPr>
+      <w:r>
+        <w:rPr>
+          <w:lang w:val="en-US"/>
+        </w:rPr>
+        <w:t>Running and comparing new IC data</w:t>
+      </w:r>
+    </w:p>
+    <w:p>
+      <w:pPr>
+        <w:pStyle w:val="ListParagraph"/>
+        <w:numPr>
+          <w:ilvl w:val="0"/>
+          <w:numId w:val="33"/>
+        </w:numPr>
+        <w:rPr>
+          <w:lang w:val="en-US"/>
+        </w:rPr>
+      </w:pPr>
+      <w:r>
+        <w:rPr>
+          <w:lang w:val="en-US"/>
+        </w:rPr>
+        <w:t>Fixing hard-coded year remnants!</w:t>
+      </w:r>
+    </w:p>
+    <w:p>
+      <w:pPr>
+        <w:pStyle w:val="ListParagraph"/>
+        <w:numPr>
+          <w:ilvl w:val="0"/>
+          <w:numId w:val="33"/>
+        </w:numPr>
+        <w:rPr>
+          <w:lang w:val="en-US"/>
+        </w:rPr>
+      </w:pPr>
+      <w:r>
+        <w:rPr>
+          <w:lang w:val="en-US"/>
+        </w:rPr>
+        <w:t xml:space="preserve">Fixing ugly </w:t>
+      </w:r>
+      <w:proofErr w:type="spellStart"/>
+      <w:r>
+        <w:rPr>
+          <w:lang w:val="en-US"/>
+        </w:rPr>
+        <w:t>fl</w:t>
+      </w:r>
+      <w:r>
+        <w:rPr>
+          <w:lang w:val="en-US"/>
+        </w:rPr>
+        <w:t>e</w:t>
+      </w:r>
+      <w:r>
+        <w:rPr>
+          <w:lang w:val="en-US"/>
+        </w:rPr>
+        <w:t>xtables</w:t>
+      </w:r>
+      <w:proofErr w:type="spellEnd"/>
+    </w:p>
+    <w:p>
+      <w:pPr>
+        <w:rPr>
+          <w:lang w:val="en-US"/>
+        </w:rPr>
+      </w:pPr>
+    </w:p>
+    <w:p>
+      <w:pPr>
+        <w:rPr>
+          <w:b/>
+          <w:bCs/>
+          <w:lang w:val="en-US"/>
+        </w:rPr>
+      </w:pPr>
+      <w:r>
+        <w:rPr>
+          <w:b/>
+          <w:bCs/>
+          <w:lang w:val="en-US"/>
+        </w:rPr>
+        <w:t>24+25/07/2026</w:t>
+      </w:r>
+    </w:p>
+    <w:p>
+      <w:pPr>
+        <w:pStyle w:val="ListParagraph"/>
+        <w:numPr>
+          <w:ilvl w:val="0"/>
+          <w:numId w:val="34"/>
+        </w:numPr>
+        <w:rPr>
+          <w:lang w:val="en-US"/>
+        </w:rPr>
+      </w:pPr>
+      <w:r>
+        <w:rPr>
+          <w:lang w:val="en-US"/>
+        </w:rPr>
+        <w:t>Fixing table J</w:t>
+      </w:r>
+    </w:p>
+    <w:p>
+      <w:pPr>
+        <w:rPr>
+          <w:lang w:val="en-US"/>
+        </w:rPr>
+      </w:pPr>
+    </w:p>
+    <w:p>
+      <w:pPr>
+        <w:rPr>
+          <w:b/>
+          <w:bCs/>
+          <w:lang w:val="en-US"/>
+        </w:rPr>
+      </w:pPr>
+      <w:r>
+        <w:rPr>
+          <w:b/>
+          <w:bCs/>
+          <w:lang w:val="en-US"/>
+        </w:rPr>
         <w:t>23/</w:t>
       </w:r>
       <w:r>
@@ -85,8 +225,30 @@
         <w:rPr>
           <w:lang w:val="en-US"/>
         </w:rPr>
-        <w:t>Check fecR logic in import_sas_metier_2013-15.Rmd</w:t>
-      </w:r>
+        <w:t xml:space="preserve">Check </w:t>
+      </w:r>
+      <w:proofErr w:type="spellStart"/>
+      <w:r>
+        <w:rPr>
+          <w:lang w:val="en-US"/>
+        </w:rPr>
+        <w:t>fecR</w:t>
+      </w:r>
+      <w:proofErr w:type="spellEnd"/>
+      <w:r>
+        <w:rPr>
+          <w:lang w:val="en-US"/>
+        </w:rPr>
+        <w:t xml:space="preserve"> logic in import_sas_metier_2013-</w:t>
+      </w:r>
+      <w:proofErr w:type="gramStart"/>
+      <w:r>
+        <w:rPr>
+          <w:lang w:val="en-US"/>
+        </w:rPr>
+        <w:t>15.Rmd</w:t>
+      </w:r>
+      <w:proofErr w:type="gramEnd"/>
     </w:p>
     <w:p>
       <w:pPr>
@@ -133,8 +295,24 @@
         <w:rPr>
           <w:lang w:val="en-US"/>
         </w:rPr>
-        <w:t xml:space="preserve"> logic in table_a-J.Rmd</w:t>
-      </w:r>
+        <w:t xml:space="preserve"> logic in </w:t>
+      </w:r>
+      <w:proofErr w:type="spellStart"/>
+      <w:r>
+        <w:rPr>
+          <w:lang w:val="en-US"/>
+        </w:rPr>
+        <w:t>table_a-</w:t>
+      </w:r>
+      <w:proofErr w:type="gramStart"/>
+      <w:r>
+        <w:rPr>
+          <w:lang w:val="en-US"/>
+        </w:rPr>
+        <w:t>J.Rmd</w:t>
+      </w:r>
+      <w:proofErr w:type="spellEnd"/>
+      <w:proofErr w:type="gramEnd"/>
     </w:p>
     <w:p>
       <w:pPr>
@@ -153,12 +331,14 @@
         </w:rPr>
         <w:t xml:space="preserve">should have the same aggregation as </w:t>
       </w:r>
+      <w:proofErr w:type="spellStart"/>
       <w:r>
         <w:rPr>
           <w:lang w:val="en-US"/>
         </w:rPr>
         <w:t>totkw_totgt</w:t>
       </w:r>
+      <w:proofErr w:type="spellEnd"/>
       <w:r>
         <w:rPr>
           <w:lang w:val="en-US"/>
@@ -248,8 +428,16 @@
         <w:rPr>
           <w:lang w:val="en-US"/>
         </w:rPr>
-        <w:t>What happened to the 2013-2015 VL0008 VESSEL_LENGTH’s ???</w:t>
-      </w:r>
+        <w:t>What happened to the 2013-2015 VL0008 VESSEL_</w:t>
+      </w:r>
+      <w:proofErr w:type="gramStart"/>
+      <w:r>
+        <w:rPr>
+          <w:lang w:val="en-US"/>
+        </w:rPr>
+        <w:t>LENGTH’s ???</w:t>
+      </w:r>
+      <w:proofErr w:type="gramEnd"/>
     </w:p>
     <w:p>
       <w:pPr>
@@ -344,7 +532,14 @@
         <w:rPr>
           <w:lang w:val="en-US"/>
         </w:rPr>
-        <w:t>under KKILMOITUS</w:t>
+        <w:t xml:space="preserve">under </w:t>
+      </w:r>
+      <w:proofErr w:type="gramStart"/>
+      <w:r>
+        <w:rPr>
+          <w:lang w:val="en-US"/>
+        </w:rPr>
+        <w:t>KKILMOITUS</w:t>
       </w:r>
       <w:r>
         <w:rPr>
@@ -358,6 +553,7 @@
         </w:rPr>
         <w:t>!</w:t>
       </w:r>
+      <w:proofErr w:type="gramEnd"/>
     </w:p>
     <w:p>
       <w:pPr>
@@ -405,6 +601,7 @@
         <w:rPr>
           <w:lang w:val="en-US"/>
         </w:rPr>
+        <w:lastRenderedPageBreak/>
         <w:t xml:space="preserve">if in table A, but not in table C </w:t>
       </w:r>
       <w:r>
@@ -515,17 +712,39 @@
           <w:lang w:val="fi-FI"/>
         </w:rPr>
       </w:pPr>
+      <w:proofErr w:type="spellStart"/>
       <w:r>
         <w:rPr>
           <w:lang w:val="fi-FI"/>
         </w:rPr>
-        <w:t xml:space="preserve">Split file on </w:t>
-      </w:r>
+        <w:t>Split</w:t>
+      </w:r>
+      <w:proofErr w:type="spellEnd"/>
       <w:r>
         <w:rPr>
           <w:lang w:val="fi-FI"/>
         </w:rPr>
-        <w:t>KKILMOITUS and remove KALASTUSTAILMANALUSTA</w:t>
+        <w:t xml:space="preserve"> file on </w:t>
+      </w:r>
+      <w:r>
+        <w:rPr>
+          <w:lang w:val="fi-FI"/>
+        </w:rPr>
+        <w:t xml:space="preserve">KKILMOITUS and </w:t>
+      </w:r>
+      <w:proofErr w:type="spellStart"/>
+      <w:r>
+        <w:rPr>
+          <w:lang w:val="fi-FI"/>
+        </w:rPr>
+        <w:t>remove</w:t>
+      </w:r>
+      <w:proofErr w:type="spellEnd"/>
+      <w:r>
+        <w:rPr>
+          <w:lang w:val="fi-FI"/>
+        </w:rPr>
+        <w:t xml:space="preserve"> KALASTUSTAILMANALUSTA</w:t>
       </w:r>
     </w:p>
     <w:p>
@@ -567,7 +786,6 @@
           <w:noProof/>
           <w:lang w:val="en-US"/>
         </w:rPr>
-        <w:lastRenderedPageBreak/>
         <w:drawing>
           <wp:inline distT="0" distB="0" distL="0" distR="0" wp14:anchorId="77433B9C" wp14:editId="700EC0D1">
             <wp:extent cx="2760462" cy="4114486"/>
@@ -663,6 +881,7 @@
           <w:noProof/>
           <w:lang w:val="en-US"/>
         </w:rPr>
+        <w:lastRenderedPageBreak/>
         <w:drawing>
           <wp:inline distT="0" distB="0" distL="0" distR="0" wp14:anchorId="5131BA67" wp14:editId="7BC8D243">
             <wp:extent cx="4677428" cy="4334480"/>
@@ -909,7 +1128,21 @@
         <w:rPr>
           <w:lang w:val="en-US"/>
         </w:rPr>
-        <w:t xml:space="preserve">Replace shorelog vessel length VL0010 with VL0812 </w:t>
+        <w:t xml:space="preserve">Replace </w:t>
+      </w:r>
+      <w:proofErr w:type="spellStart"/>
+      <w:r>
+        <w:rPr>
+          <w:lang w:val="en-US"/>
+        </w:rPr>
+        <w:t>shorelog</w:t>
+      </w:r>
+      <w:proofErr w:type="spellEnd"/>
+      <w:r>
+        <w:rPr>
+          <w:lang w:val="en-US"/>
+        </w:rPr>
+        <w:t xml:space="preserve"> vessel length VL0010 with VL0812 </w:t>
       </w:r>
       <w:r>
         <w:rPr>
@@ -930,6 +1163,7 @@
           <w:noProof/>
           <w:lang w:val="en-US"/>
         </w:rPr>
+        <w:lastRenderedPageBreak/>
         <w:drawing>
           <wp:inline distT="0" distB="0" distL="0" distR="0" wp14:anchorId="246A9859" wp14:editId="28635C7C">
             <wp:extent cx="3505504" cy="3086367"/>
@@ -1045,7 +1279,6 @@
         <w:rPr>
           <w:lang w:val="en-US"/>
         </w:rPr>
-        <w:lastRenderedPageBreak/>
         <w:t xml:space="preserve">Overwrite 33 records where </w:t>
       </w:r>
       <w:r>
@@ -1070,7 +1303,21 @@
         <w:rPr>
           <w:lang w:val="en-US"/>
         </w:rPr>
-        <w:t>Save clean data back to DCRPOD (Pertuu??? I don’t have permissions</w:t>
+        <w:t>Save clean data back to DCRPOD (</w:t>
+      </w:r>
+      <w:proofErr w:type="spellStart"/>
+      <w:r>
+        <w:rPr>
+          <w:lang w:val="en-US"/>
+        </w:rPr>
+        <w:t>Pertuu</w:t>
+      </w:r>
+      <w:proofErr w:type="spellEnd"/>
+      <w:r>
+        <w:rPr>
+          <w:lang w:val="en-US"/>
+        </w:rPr>
+        <w:t>??? I don’t have permissions</w:t>
       </w:r>
       <w:r>
         <w:rPr>
@@ -1094,7 +1341,21 @@
         <w:rPr>
           <w:lang w:val="en-US"/>
         </w:rPr>
-        <w:t>Chunk 23: fecR-logbooks</w:t>
+        <w:t xml:space="preserve">Chunk 23: </w:t>
+      </w:r>
+      <w:proofErr w:type="spellStart"/>
+      <w:r>
+        <w:rPr>
+          <w:lang w:val="en-US"/>
+        </w:rPr>
+        <w:t>fecR</w:t>
+      </w:r>
+      <w:proofErr w:type="spellEnd"/>
+      <w:r>
+        <w:rPr>
+          <w:lang w:val="en-US"/>
+        </w:rPr>
+        <w:t>-logbooks</w:t>
       </w:r>
       <w:r>
         <w:rPr>
@@ -1136,13 +1397,27 @@
         <w:rPr>
           <w:lang w:val="en-US"/>
         </w:rPr>
-        <w:t>Chunk 24:</w:t>
-      </w:r>
-      <w:r>
-        <w:rPr>
-          <w:lang w:val="en-US"/>
-        </w:rPr>
-        <w:t>shore-effort</w:t>
+        <w:t xml:space="preserve">Chunk </w:t>
+      </w:r>
+      <w:proofErr w:type="gramStart"/>
+      <w:r>
+        <w:rPr>
+          <w:lang w:val="en-US"/>
+        </w:rPr>
+        <w:t>24:</w:t>
+      </w:r>
+      <w:r>
+        <w:rPr>
+          <w:lang w:val="en-US"/>
+        </w:rPr>
+        <w:t>shore</w:t>
+      </w:r>
+      <w:proofErr w:type="gramEnd"/>
+      <w:r>
+        <w:rPr>
+          <w:lang w:val="en-US"/>
+        </w:rPr>
+        <w:t>-effort</w:t>
       </w:r>
       <w:r>
         <w:rPr>
@@ -1310,13 +1585,41 @@
         <w:rPr>
           <w:lang w:val="en-US"/>
         </w:rPr>
-        <w:t xml:space="preserve"> cleaned sas data in </w:t>
-      </w:r>
-      <w:r>
-        <w:rPr>
-          <w:lang w:val="en-US"/>
-        </w:rPr>
-        <w:t>Tables a-g-h-i-j</w:t>
+        <w:t xml:space="preserve"> cleaned </w:t>
+      </w:r>
+      <w:proofErr w:type="spellStart"/>
+      <w:r>
+        <w:rPr>
+          <w:lang w:val="en-US"/>
+        </w:rPr>
+        <w:t>sas</w:t>
+      </w:r>
+      <w:proofErr w:type="spellEnd"/>
+      <w:r>
+        <w:rPr>
+          <w:lang w:val="en-US"/>
+        </w:rPr>
+        <w:t xml:space="preserve"> data in </w:t>
+      </w:r>
+      <w:r>
+        <w:rPr>
+          <w:lang w:val="en-US"/>
+        </w:rPr>
+        <w:t>Tables a-g-h-</w:t>
+      </w:r>
+      <w:proofErr w:type="spellStart"/>
+      <w:r>
+        <w:rPr>
+          <w:lang w:val="en-US"/>
+        </w:rPr>
+        <w:t>i</w:t>
+      </w:r>
+      <w:proofErr w:type="spellEnd"/>
+      <w:r>
+        <w:rPr>
+          <w:lang w:val="en-US"/>
+        </w:rPr>
+        <w:t>-j</w:t>
       </w:r>
       <w:r>
         <w:rPr>
@@ -1342,11 +1645,19 @@
         </w:rPr>
         <w:t xml:space="preserve">TODO: add </w:t>
       </w:r>
-      <w:r>
-        <w:rPr>
-          <w:lang w:val="en-US"/>
-        </w:rPr>
-        <w:t>sql permissions to script (Petri)</w:t>
+      <w:proofErr w:type="spellStart"/>
+      <w:r>
+        <w:rPr>
+          <w:lang w:val="en-US"/>
+        </w:rPr>
+        <w:t>sql</w:t>
+      </w:r>
+      <w:proofErr w:type="spellEnd"/>
+      <w:r>
+        <w:rPr>
+          <w:lang w:val="en-US"/>
+        </w:rPr>
+        <w:t xml:space="preserve"> permissions to script (Petri)</w:t>
       </w:r>
     </w:p>
     <w:p>
@@ -1364,7 +1675,35 @@
         <w:rPr>
           <w:lang w:val="en-US"/>
         </w:rPr>
-        <w:t>TODO: find minimal needed columns and join sas and aktiviteeti tables</w:t>
+        <w:t xml:space="preserve">TODO: find minimal needed columns and join </w:t>
+      </w:r>
+      <w:proofErr w:type="spellStart"/>
+      <w:r>
+        <w:rPr>
+          <w:lang w:val="en-US"/>
+        </w:rPr>
+        <w:t>sas</w:t>
+      </w:r>
+      <w:proofErr w:type="spellEnd"/>
+      <w:r>
+        <w:rPr>
+          <w:lang w:val="en-US"/>
+        </w:rPr>
+        <w:t xml:space="preserve"> and </w:t>
+      </w:r>
+      <w:proofErr w:type="spellStart"/>
+      <w:r>
+        <w:rPr>
+          <w:lang w:val="en-US"/>
+        </w:rPr>
+        <w:t>aktiviteeti</w:t>
+      </w:r>
+      <w:proofErr w:type="spellEnd"/>
+      <w:r>
+        <w:rPr>
+          <w:lang w:val="en-US"/>
+        </w:rPr>
+        <w:t xml:space="preserve"> tables</w:t>
       </w:r>
       <w:r>
         <w:rPr>
@@ -1394,6 +1733,7 @@
           <w:bCs/>
           <w:lang w:val="en-US"/>
         </w:rPr>
+        <w:lastRenderedPageBreak/>
         <w:t>12/06/2026</w:t>
       </w:r>
     </w:p>
@@ -1412,7 +1752,35 @@
         <w:rPr>
           <w:lang w:val="en-US"/>
         </w:rPr>
-        <w:t>Go through last years’ sas integration logic</w:t>
+        <w:t xml:space="preserve">Go through last </w:t>
+      </w:r>
+      <w:proofErr w:type="gramStart"/>
+      <w:r>
+        <w:rPr>
+          <w:lang w:val="en-US"/>
+        </w:rPr>
+        <w:t>years’</w:t>
+      </w:r>
+      <w:proofErr w:type="gramEnd"/>
+      <w:r>
+        <w:rPr>
+          <w:lang w:val="en-US"/>
+        </w:rPr>
+        <w:t xml:space="preserve"> </w:t>
+      </w:r>
+      <w:proofErr w:type="spellStart"/>
+      <w:r>
+        <w:rPr>
+          <w:lang w:val="en-US"/>
+        </w:rPr>
+        <w:t>sas</w:t>
+      </w:r>
+      <w:proofErr w:type="spellEnd"/>
+      <w:r>
+        <w:rPr>
+          <w:lang w:val="en-US"/>
+        </w:rPr>
+        <w:t xml:space="preserve"> integration logic</w:t>
       </w:r>
     </w:p>
     <w:p>
@@ -1511,6 +1879,7 @@
         </w:rPr>
         <w:t xml:space="preserve">see chunk </w:t>
       </w:r>
+      <w:proofErr w:type="gramStart"/>
       <w:r>
         <w:rPr>
           <w:rFonts w:ascii="Miriam Fixed" w:hAnsi="Miriam Fixed" w:cs="Miriam Fixed" w:hint="cs"/>
@@ -1527,6 +1896,7 @@
         </w:rPr>
         <w:t>k</w:t>
       </w:r>
+      <w:proofErr w:type="gramEnd"/>
       <w:r>
         <w:rPr>
           <w:rFonts w:ascii="Miriam Fixed" w:hAnsi="Miriam Fixed" w:cs="Miriam Fixed"/>
@@ -1577,7 +1947,6 @@
           <w:noProof/>
           <w:lang w:val="en-US"/>
         </w:rPr>
-        <w:lastRenderedPageBreak/>
         <w:drawing>
           <wp:inline distT="0" distB="0" distL="0" distR="0" wp14:anchorId="531A49BB" wp14:editId="3B74A859">
             <wp:extent cx="2570780" cy="3753852"/>
@@ -1674,11 +2043,19 @@
           <w:u w:val="single"/>
         </w:rPr>
       </w:pPr>
-      <w:r>
-        <w:rPr>
-          <w:lang w:val="en-US"/>
-        </w:rPr>
-        <w:t xml:space="preserve">Shorelogs: see chunk </w:t>
+      <w:proofErr w:type="spellStart"/>
+      <w:r>
+        <w:rPr>
+          <w:lang w:val="en-US"/>
+        </w:rPr>
+        <w:t>Shorelogs</w:t>
+      </w:r>
+      <w:proofErr w:type="spellEnd"/>
+      <w:r>
+        <w:rPr>
+          <w:lang w:val="en-US"/>
+        </w:rPr>
+        <w:t xml:space="preserve">: see chunk </w:t>
       </w:r>
       <w:r>
         <w:rPr>
@@ -1686,8 +2063,18 @@
           <w:u w:val="single"/>
           <w:lang w:val="en-US"/>
         </w:rPr>
-        <w:t>clean-shorelogs</w:t>
-      </w:r>
+        <w:t>clean-</w:t>
+      </w:r>
+      <w:proofErr w:type="spellStart"/>
+      <w:r>
+        <w:rPr>
+          <w:rFonts w:ascii="Miriam Fixed" w:hAnsi="Miriam Fixed" w:cs="Miriam Fixed" w:hint="cs"/>
+          <w:u w:val="single"/>
+          <w:lang w:val="en-US"/>
+        </w:rPr>
+        <w:t>shorelogs</w:t>
+      </w:r>
+      <w:proofErr w:type="spellEnd"/>
       <w:r>
         <w:rPr>
           <w:rFonts w:ascii="Miriam Fixed" w:hAnsi="Miriam Fixed" w:cs="Miriam Fixed"/>
@@ -1724,6 +2111,7 @@
           <w:noProof/>
           <w:lang w:val="en-US"/>
         </w:rPr>
+        <w:lastRenderedPageBreak/>
         <w:drawing>
           <wp:inline distT="0" distB="0" distL="0" distR="0" wp14:anchorId="6CD656A8" wp14:editId="0A804541">
             <wp:extent cx="2422358" cy="1376051"/>
@@ -1854,7 +2242,14 @@
         <w:rPr>
           <w:lang w:val="en-US"/>
         </w:rPr>
-        <w:t>Go through last years</w:t>
+        <w:t xml:space="preserve">Go through last </w:t>
+      </w:r>
+      <w:proofErr w:type="gramStart"/>
+      <w:r>
+        <w:rPr>
+          <w:lang w:val="en-US"/>
+        </w:rPr>
+        <w:t>years</w:t>
       </w:r>
       <w:r>
         <w:rPr>
@@ -1862,11 +2257,26 @@
         </w:rPr>
         <w:t>’</w:t>
       </w:r>
-      <w:r>
-        <w:rPr>
-          <w:lang w:val="en-US"/>
-        </w:rPr>
-        <w:t xml:space="preserve"> sas integration logic</w:t>
+      <w:proofErr w:type="gramEnd"/>
+      <w:r>
+        <w:rPr>
+          <w:lang w:val="en-US"/>
+        </w:rPr>
+        <w:t xml:space="preserve"> </w:t>
+      </w:r>
+      <w:proofErr w:type="spellStart"/>
+      <w:r>
+        <w:rPr>
+          <w:lang w:val="en-US"/>
+        </w:rPr>
+        <w:t>sas</w:t>
+      </w:r>
+      <w:proofErr w:type="spellEnd"/>
+      <w:r>
+        <w:rPr>
+          <w:lang w:val="en-US"/>
+        </w:rPr>
+        <w:t xml:space="preserve"> integration logic</w:t>
       </w:r>
     </w:p>
     <w:p>
@@ -1901,7 +2311,35 @@
         <w:rPr>
           <w:lang w:val="en-US"/>
         </w:rPr>
-        <w:t>Create Rmd version of sas integration script from 2025</w:t>
+        <w:t xml:space="preserve">Create </w:t>
+      </w:r>
+      <w:proofErr w:type="spellStart"/>
+      <w:r>
+        <w:rPr>
+          <w:lang w:val="en-US"/>
+        </w:rPr>
+        <w:t>Rmd</w:t>
+      </w:r>
+      <w:proofErr w:type="spellEnd"/>
+      <w:r>
+        <w:rPr>
+          <w:lang w:val="en-US"/>
+        </w:rPr>
+        <w:t xml:space="preserve"> version of </w:t>
+      </w:r>
+      <w:proofErr w:type="spellStart"/>
+      <w:r>
+        <w:rPr>
+          <w:lang w:val="en-US"/>
+        </w:rPr>
+        <w:t>sas</w:t>
+      </w:r>
+      <w:proofErr w:type="spellEnd"/>
+      <w:r>
+        <w:rPr>
+          <w:lang w:val="en-US"/>
+        </w:rPr>
+        <w:t xml:space="preserve"> integration script from 2025</w:t>
       </w:r>
     </w:p>
     <w:p>
@@ -2104,7 +2542,21 @@
         <w:rPr>
           <w:lang w:val="en-US"/>
         </w:rPr>
-        <w:t>Incorrect length classes in old sas data</w:t>
+        <w:t xml:space="preserve">Incorrect length classes in old </w:t>
+      </w:r>
+      <w:proofErr w:type="spellStart"/>
+      <w:r>
+        <w:rPr>
+          <w:lang w:val="en-US"/>
+        </w:rPr>
+        <w:t>sas</w:t>
+      </w:r>
+      <w:proofErr w:type="spellEnd"/>
+      <w:r>
+        <w:rPr>
+          <w:lang w:val="en-US"/>
+        </w:rPr>
+        <w:t xml:space="preserve"> data</w:t>
       </w:r>
       <w:r>
         <w:rPr>
@@ -2128,6 +2580,7 @@
           <w:noProof/>
           <w:lang w:val="en-US"/>
         </w:rPr>
+        <w:lastRenderedPageBreak/>
         <w:drawing>
           <wp:inline distT="0" distB="0" distL="0" distR="0" wp14:anchorId="148C2AC6" wp14:editId="7720B385">
             <wp:extent cx="5731510" cy="1900555"/>
@@ -2262,7 +2715,21 @@
         <w:rPr>
           <w:lang w:val="en-US"/>
         </w:rPr>
-        <w:t xml:space="preserve"> Rmd now running</w:t>
+        <w:t xml:space="preserve"> </w:t>
+      </w:r>
+      <w:proofErr w:type="spellStart"/>
+      <w:r>
+        <w:rPr>
+          <w:lang w:val="en-US"/>
+        </w:rPr>
+        <w:t>Rmd</w:t>
+      </w:r>
+      <w:proofErr w:type="spellEnd"/>
+      <w:r>
+        <w:rPr>
+          <w:lang w:val="en-US"/>
+        </w:rPr>
+        <w:t xml:space="preserve"> now running</w:t>
       </w:r>
       <w:r>
         <w:rPr>
@@ -2295,12 +2762,14 @@
         </w:rPr>
         <w:t xml:space="preserve">: </w:t>
       </w:r>
+      <w:proofErr w:type="spellStart"/>
       <w:r>
         <w:rPr>
           <w:lang w:val="en-US"/>
         </w:rPr>
         <w:t>IC_DB.rds</w:t>
       </w:r>
+      <w:proofErr w:type="spellEnd"/>
       <w:r>
         <w:rPr>
           <w:lang w:val="en-US"/>
@@ -2331,11 +2800,19 @@
         </w:rPr>
         <w:t xml:space="preserve">TABLE F: </w:t>
       </w:r>
-      <w:r>
-        <w:rPr>
-          <w:lang w:val="en-US"/>
-        </w:rPr>
-        <w:t>Rmd now running</w:t>
+      <w:proofErr w:type="spellStart"/>
+      <w:r>
+        <w:rPr>
+          <w:lang w:val="en-US"/>
+        </w:rPr>
+        <w:t>Rmd</w:t>
+      </w:r>
+      <w:proofErr w:type="spellEnd"/>
+      <w:r>
+        <w:rPr>
+          <w:lang w:val="en-US"/>
+        </w:rPr>
+        <w:t xml:space="preserve"> now running</w:t>
       </w:r>
       <w:r>
         <w:rPr>
@@ -2391,8 +2868,16 @@
         <w:rPr>
           <w:lang w:val="en-US"/>
         </w:rPr>
-        <w:t xml:space="preserve"> Rmd</w:t>
-      </w:r>
+        <w:t xml:space="preserve"> </w:t>
+      </w:r>
+      <w:proofErr w:type="spellStart"/>
+      <w:r>
+        <w:rPr>
+          <w:lang w:val="en-US"/>
+        </w:rPr>
+        <w:t>Rmd</w:t>
+      </w:r>
+      <w:proofErr w:type="spellEnd"/>
     </w:p>
     <w:p>
       <w:pPr>
@@ -2411,7 +2896,6 @@
           <w:strike/>
           <w:lang w:val="en-US"/>
         </w:rPr>
-        <w:lastRenderedPageBreak/>
         <w:t>Starting to i</w:t>
       </w:r>
       <w:r>
@@ -2433,7 +2917,23 @@
           <w:strike/>
           <w:lang w:val="en-US"/>
         </w:rPr>
-        <w:t>new mongo implementation of Suomu cloud data</w:t>
+        <w:t xml:space="preserve">new mongo implementation of </w:t>
+      </w:r>
+      <w:proofErr w:type="spellStart"/>
+      <w:r>
+        <w:rPr>
+          <w:strike/>
+          <w:lang w:val="en-US"/>
+        </w:rPr>
+        <w:t>Suomu</w:t>
+      </w:r>
+      <w:proofErr w:type="spellEnd"/>
+      <w:r>
+        <w:rPr>
+          <w:strike/>
+          <w:lang w:val="en-US"/>
+        </w:rPr>
+        <w:t xml:space="preserve"> cloud data</w:t>
       </w:r>
     </w:p>
     <w:p>
@@ -2457,7 +2957,21 @@
         <w:rPr>
           <w:lang w:val="en-US"/>
         </w:rPr>
-        <w:t xml:space="preserve"> Rmd prepared and test run</w:t>
+        <w:t xml:space="preserve"> </w:t>
+      </w:r>
+      <w:proofErr w:type="spellStart"/>
+      <w:r>
+        <w:rPr>
+          <w:lang w:val="en-US"/>
+        </w:rPr>
+        <w:t>Rmd</w:t>
+      </w:r>
+      <w:proofErr w:type="spellEnd"/>
+      <w:r>
+        <w:rPr>
+          <w:lang w:val="en-US"/>
+        </w:rPr>
+        <w:t xml:space="preserve"> prepared and test run</w:t>
       </w:r>
       <w:r>
         <w:rPr>
@@ -2524,7 +3038,21 @@
         <w:rPr>
           <w:lang w:val="en-US"/>
         </w:rPr>
-        <w:t xml:space="preserve"> Rmd preparation</w:t>
+        <w:t xml:space="preserve"> </w:t>
+      </w:r>
+      <w:proofErr w:type="spellStart"/>
+      <w:r>
+        <w:rPr>
+          <w:lang w:val="en-US"/>
+        </w:rPr>
+        <w:t>Rmd</w:t>
+      </w:r>
+      <w:proofErr w:type="spellEnd"/>
+      <w:r>
+        <w:rPr>
+          <w:lang w:val="en-US"/>
+        </w:rPr>
+        <w:t xml:space="preserve"> preparation</w:t>
       </w:r>
       <w:r>
         <w:rPr>
@@ -2585,7 +3113,21 @@
         <w:rPr>
           <w:lang w:val="en-US"/>
         </w:rPr>
-        <w:t>Table e Rmd preparation</w:t>
+        <w:t xml:space="preserve">Table e </w:t>
+      </w:r>
+      <w:proofErr w:type="spellStart"/>
+      <w:r>
+        <w:rPr>
+          <w:lang w:val="en-US"/>
+        </w:rPr>
+        <w:t>Rmd</w:t>
+      </w:r>
+      <w:proofErr w:type="spellEnd"/>
+      <w:r>
+        <w:rPr>
+          <w:lang w:val="en-US"/>
+        </w:rPr>
+        <w:t xml:space="preserve"> preparation</w:t>
       </w:r>
     </w:p>
     <w:p>
@@ -2647,7 +3189,23 @@
           <w:strike/>
           <w:lang w:val="en-US"/>
         </w:rPr>
-        <w:t>Needs new Suomu cloud implementation</w:t>
+        <w:t xml:space="preserve">Needs new </w:t>
+      </w:r>
+      <w:proofErr w:type="spellStart"/>
+      <w:r>
+        <w:rPr>
+          <w:strike/>
+          <w:lang w:val="en-US"/>
+        </w:rPr>
+        <w:t>Suomu</w:t>
+      </w:r>
+      <w:proofErr w:type="spellEnd"/>
+      <w:r>
+        <w:rPr>
+          <w:strike/>
+          <w:lang w:val="en-US"/>
+        </w:rPr>
+        <w:t xml:space="preserve"> cloud implementation</w:t>
       </w:r>
     </w:p>
     <w:p>
@@ -2665,7 +3223,29 @@
         <w:rPr>
           <w:lang w:val="en-US"/>
         </w:rPr>
-        <w:t>Table f Rmd preparation</w:t>
+        <w:t xml:space="preserve">Table </w:t>
+      </w:r>
+      <w:proofErr w:type="gramStart"/>
+      <w:r>
+        <w:rPr>
+          <w:lang w:val="en-US"/>
+        </w:rPr>
+        <w:t xml:space="preserve">f </w:t>
+      </w:r>
+      <w:proofErr w:type="spellStart"/>
+      <w:r>
+        <w:rPr>
+          <w:lang w:val="en-US"/>
+        </w:rPr>
+        <w:t>Rmd</w:t>
+      </w:r>
+      <w:proofErr w:type="spellEnd"/>
+      <w:proofErr w:type="gramEnd"/>
+      <w:r>
+        <w:rPr>
+          <w:lang w:val="en-US"/>
+        </w:rPr>
+        <w:t xml:space="preserve"> preparation</w:t>
       </w:r>
     </w:p>
     <w:p>
@@ -2703,7 +3283,23 @@
           <w:strike/>
           <w:lang w:val="en-US"/>
         </w:rPr>
-        <w:t>Needs new Suomu cloud implementation</w:t>
+        <w:t xml:space="preserve">Needs new </w:t>
+      </w:r>
+      <w:proofErr w:type="spellStart"/>
+      <w:r>
+        <w:rPr>
+          <w:strike/>
+          <w:lang w:val="en-US"/>
+        </w:rPr>
+        <w:t>Suomu</w:t>
+      </w:r>
+      <w:proofErr w:type="spellEnd"/>
+      <w:r>
+        <w:rPr>
+          <w:strike/>
+          <w:lang w:val="en-US"/>
+        </w:rPr>
+        <w:t xml:space="preserve"> cloud implementation</w:t>
       </w:r>
     </w:p>
     <w:p>
@@ -2763,13 +3359,28 @@
         <w:rPr>
           <w:lang w:val="en-US"/>
         </w:rPr>
-        <w:t>Fixing meti</w:t>
-      </w:r>
-      <w:r>
-        <w:rPr>
-          <w:lang w:val="en-US"/>
-        </w:rPr>
-        <w:t>ers in table a-j script</w:t>
+        <w:lastRenderedPageBreak/>
+        <w:t xml:space="preserve">Fixing </w:t>
+      </w:r>
+      <w:proofErr w:type="spellStart"/>
+      <w:r>
+        <w:rPr>
+          <w:lang w:val="en-US"/>
+        </w:rPr>
+        <w:t>meti</w:t>
+      </w:r>
+      <w:r>
+        <w:rPr>
+          <w:lang w:val="en-US"/>
+        </w:rPr>
+        <w:t>ers</w:t>
+      </w:r>
+      <w:proofErr w:type="spellEnd"/>
+      <w:r>
+        <w:rPr>
+          <w:lang w:val="en-US"/>
+        </w:rPr>
+        <w:t xml:space="preserve"> in table a-j script</w:t>
       </w:r>
     </w:p>
     <w:p>
@@ -2783,11 +3394,19 @@
           <w:lang w:val="en-US"/>
         </w:rPr>
       </w:pPr>
-      <w:r>
-        <w:rPr>
-          <w:lang w:val="en-US"/>
-        </w:rPr>
-        <w:t>Rmd now running</w:t>
+      <w:proofErr w:type="spellStart"/>
+      <w:r>
+        <w:rPr>
+          <w:lang w:val="en-US"/>
+        </w:rPr>
+        <w:t>Rmd</w:t>
+      </w:r>
+      <w:proofErr w:type="spellEnd"/>
+      <w:r>
+        <w:rPr>
+          <w:lang w:val="en-US"/>
+        </w:rPr>
+        <w:t xml:space="preserve"> now running</w:t>
       </w:r>
     </w:p>
     <w:p>
@@ -2873,17 +3492,39 @@
           <w:lang w:val="en-US"/>
         </w:rPr>
       </w:pPr>
-      <w:r>
-        <w:rPr>
-          <w:lang w:val="en-US"/>
-        </w:rPr>
-        <w:t>LukeTools (testing)</w:t>
-      </w:r>
-      <w:r>
-        <w:rPr>
-          <w:lang w:val="en-US"/>
-        </w:rPr>
-        <w:t xml:space="preserve">  - DONE</w:t>
+      <w:proofErr w:type="spellStart"/>
+      <w:r>
+        <w:rPr>
+          <w:lang w:val="en-US"/>
+        </w:rPr>
+        <w:t>LukeTools</w:t>
+      </w:r>
+      <w:proofErr w:type="spellEnd"/>
+      <w:r>
+        <w:rPr>
+          <w:lang w:val="en-US"/>
+        </w:rPr>
+        <w:t xml:space="preserve"> (</w:t>
+      </w:r>
+      <w:proofErr w:type="gramStart"/>
+      <w:r>
+        <w:rPr>
+          <w:lang w:val="en-US"/>
+        </w:rPr>
+        <w:t>testing)</w:t>
+      </w:r>
+      <w:r>
+        <w:rPr>
+          <w:lang w:val="en-US"/>
+        </w:rPr>
+        <w:t xml:space="preserve">  -</w:t>
+      </w:r>
+      <w:proofErr w:type="gramEnd"/>
+      <w:r>
+        <w:rPr>
+          <w:lang w:val="en-US"/>
+        </w:rPr>
+        <w:t xml:space="preserve"> DONE</w:t>
       </w:r>
     </w:p>
     <w:p>
@@ -2919,7 +3560,21 @@
         <w:rPr>
           <w:lang w:val="en-US"/>
         </w:rPr>
-        <w:t>Replace scripts with Rmd files</w:t>
+        <w:t xml:space="preserve">Replace scripts with </w:t>
+      </w:r>
+      <w:proofErr w:type="spellStart"/>
+      <w:r>
+        <w:rPr>
+          <w:lang w:val="en-US"/>
+        </w:rPr>
+        <w:t>Rmd</w:t>
+      </w:r>
+      <w:proofErr w:type="spellEnd"/>
+      <w:r>
+        <w:rPr>
+          <w:lang w:val="en-US"/>
+        </w:rPr>
+        <w:t xml:space="preserve"> files</w:t>
       </w:r>
     </w:p>
     <w:p>
@@ -2973,8 +3628,30 @@
         <w:rPr>
           <w:lang w:val="en-US"/>
         </w:rPr>
-        <w:t>Change the metier lookup from github</w:t>
-      </w:r>
+        <w:t xml:space="preserve">Change the </w:t>
+      </w:r>
+      <w:proofErr w:type="spellStart"/>
+      <w:r>
+        <w:rPr>
+          <w:lang w:val="en-US"/>
+        </w:rPr>
+        <w:t>metier</w:t>
+      </w:r>
+      <w:proofErr w:type="spellEnd"/>
+      <w:r>
+        <w:rPr>
+          <w:lang w:val="en-US"/>
+        </w:rPr>
+        <w:t xml:space="preserve"> lookup from </w:t>
+      </w:r>
+      <w:proofErr w:type="spellStart"/>
+      <w:r>
+        <w:rPr>
+          <w:lang w:val="en-US"/>
+        </w:rPr>
+        <w:t>github</w:t>
+      </w:r>
+      <w:proofErr w:type="spellEnd"/>
     </w:p>
     <w:p>
       <w:pPr>
@@ -2991,7 +3668,21 @@
         <w:rPr>
           <w:lang w:val="en-US"/>
         </w:rPr>
-        <w:t>Save sas logbook from database and import from database</w:t>
+        <w:t xml:space="preserve">Save </w:t>
+      </w:r>
+      <w:proofErr w:type="spellStart"/>
+      <w:r>
+        <w:rPr>
+          <w:lang w:val="en-US"/>
+        </w:rPr>
+        <w:t>sas</w:t>
+      </w:r>
+      <w:proofErr w:type="spellEnd"/>
+      <w:r>
+        <w:rPr>
+          <w:lang w:val="en-US"/>
+        </w:rPr>
+        <w:t xml:space="preserve"> logbook from database and import from database</w:t>
       </w:r>
     </w:p>
     <w:p>
@@ -3045,7 +3736,21 @@
         <w:rPr>
           <w:lang w:val="en-US"/>
         </w:rPr>
-        <w:t>Create first Rmd version</w:t>
+        <w:t xml:space="preserve">Create first </w:t>
+      </w:r>
+      <w:proofErr w:type="spellStart"/>
+      <w:r>
+        <w:rPr>
+          <w:lang w:val="en-US"/>
+        </w:rPr>
+        <w:t>Rmd</w:t>
+      </w:r>
+      <w:proofErr w:type="spellEnd"/>
+      <w:r>
+        <w:rPr>
+          <w:lang w:val="en-US"/>
+        </w:rPr>
+        <w:t xml:space="preserve"> version</w:t>
       </w:r>
     </w:p>
     <w:p>
@@ -3085,7 +3790,21 @@
         <w:rPr>
           <w:lang w:val="en-US"/>
         </w:rPr>
-        <w:t>A fishing trip is approximated by reported fishing days, aggregated from monthly reports by taking the maximum number of fishing days per vessel–month–metier combination and summing these over time and vessels.</w:t>
+        <w:t>A fishing trip is approximated by reported fishing days, aggregated from monthly reports by taking the maximum number of fishing days per vessel–month–</w:t>
+      </w:r>
+      <w:proofErr w:type="spellStart"/>
+      <w:r>
+        <w:rPr>
+          <w:lang w:val="en-US"/>
+        </w:rPr>
+        <w:t>metier</w:t>
+      </w:r>
+      <w:proofErr w:type="spellEnd"/>
+      <w:r>
+        <w:rPr>
+          <w:lang w:val="en-US"/>
+        </w:rPr>
+        <w:t xml:space="preserve"> combination and summing these over time and vessels.</w:t>
       </w:r>
     </w:p>
     <w:p>
@@ -4993,6 +5712,118 @@
     </w:lvl>
   </w:abstractNum>
   <w:abstractNum w:abstractNumId="16" w15:restartNumberingAfterBreak="0">
+    <w:nsid w:val="3AEE0163"/>
+    <w:multiLevelType w:val="hybridMultilevel"/>
+    <w:tmpl w:val="99805352"/>
+    <w:lvl w:ilvl="0" w:tplc="E660ADC2">
+      <w:numFmt w:val="bullet"/>
+      <w:lvlText w:val="-"/>
+      <w:lvlJc w:val="left"/>
+      <w:pPr>
+        <w:ind w:left="720" w:hanging="360"/>
+      </w:pPr>
+      <w:rPr>
+        <w:rFonts w:ascii="Aptos" w:eastAsiaTheme="minorHAnsi" w:hAnsi="Aptos" w:cstheme="minorBidi" w:hint="default"/>
+      </w:rPr>
+    </w:lvl>
+    <w:lvl w:ilvl="1" w:tplc="08090003" w:tentative="1">
+      <w:start w:val="1"/>
+      <w:numFmt w:val="bullet"/>
+      <w:lvlText w:val="o"/>
+      <w:lvlJc w:val="left"/>
+      <w:pPr>
+        <w:ind w:left="1440" w:hanging="360"/>
+      </w:pPr>
+      <w:rPr>
+        <w:rFonts w:ascii="Courier New" w:hAnsi="Courier New" w:cs="Courier New" w:hint="default"/>
+      </w:rPr>
+    </w:lvl>
+    <w:lvl w:ilvl="2" w:tplc="08090005" w:tentative="1">
+      <w:start w:val="1"/>
+      <w:numFmt w:val="bullet"/>
+      <w:lvlText w:val=""/>
+      <w:lvlJc w:val="left"/>
+      <w:pPr>
+        <w:ind w:left="2160" w:hanging="360"/>
+      </w:pPr>
+      <w:rPr>
+        <w:rFonts w:ascii="Wingdings" w:hAnsi="Wingdings" w:hint="default"/>
+      </w:rPr>
+    </w:lvl>
+    <w:lvl w:ilvl="3" w:tplc="08090001" w:tentative="1">
+      <w:start w:val="1"/>
+      <w:numFmt w:val="bullet"/>
+      <w:lvlText w:val=""/>
+      <w:lvlJc w:val="left"/>
+      <w:pPr>
+        <w:ind w:left="2880" w:hanging="360"/>
+      </w:pPr>
+      <w:rPr>
+        <w:rFonts w:ascii="Symbol" w:hAnsi="Symbol" w:hint="default"/>
+      </w:rPr>
+    </w:lvl>
+    <w:lvl w:ilvl="4" w:tplc="08090003" w:tentative="1">
+      <w:start w:val="1"/>
+      <w:numFmt w:val="bullet"/>
+      <w:lvlText w:val="o"/>
+      <w:lvlJc w:val="left"/>
+      <w:pPr>
+        <w:ind w:left="3600" w:hanging="360"/>
+      </w:pPr>
+      <w:rPr>
+        <w:rFonts w:ascii="Courier New" w:hAnsi="Courier New" w:cs="Courier New" w:hint="default"/>
+      </w:rPr>
+    </w:lvl>
+    <w:lvl w:ilvl="5" w:tplc="08090005" w:tentative="1">
+      <w:start w:val="1"/>
+      <w:numFmt w:val="bullet"/>
+      <w:lvlText w:val=""/>
+      <w:lvlJc w:val="left"/>
+      <w:pPr>
+        <w:ind w:left="4320" w:hanging="360"/>
+      </w:pPr>
+      <w:rPr>
+        <w:rFonts w:ascii="Wingdings" w:hAnsi="Wingdings" w:hint="default"/>
+      </w:rPr>
+    </w:lvl>
+    <w:lvl w:ilvl="6" w:tplc="08090001" w:tentative="1">
+      <w:start w:val="1"/>
+      <w:numFmt w:val="bullet"/>
+      <w:lvlText w:val=""/>
+      <w:lvlJc w:val="left"/>
+      <w:pPr>
+        <w:ind w:left="5040" w:hanging="360"/>
+      </w:pPr>
+      <w:rPr>
+        <w:rFonts w:ascii="Symbol" w:hAnsi="Symbol" w:hint="default"/>
+      </w:rPr>
+    </w:lvl>
+    <w:lvl w:ilvl="7" w:tplc="08090003" w:tentative="1">
+      <w:start w:val="1"/>
+      <w:numFmt w:val="bullet"/>
+      <w:lvlText w:val="o"/>
+      <w:lvlJc w:val="left"/>
+      <w:pPr>
+        <w:ind w:left="5760" w:hanging="360"/>
+      </w:pPr>
+      <w:rPr>
+        <w:rFonts w:ascii="Courier New" w:hAnsi="Courier New" w:cs="Courier New" w:hint="default"/>
+      </w:rPr>
+    </w:lvl>
+    <w:lvl w:ilvl="8" w:tplc="08090005" w:tentative="1">
+      <w:start w:val="1"/>
+      <w:numFmt w:val="bullet"/>
+      <w:lvlText w:val=""/>
+      <w:lvlJc w:val="left"/>
+      <w:pPr>
+        <w:ind w:left="6480" w:hanging="360"/>
+      </w:pPr>
+      <w:rPr>
+        <w:rFonts w:ascii="Wingdings" w:hAnsi="Wingdings" w:hint="default"/>
+      </w:rPr>
+    </w:lvl>
+  </w:abstractNum>
+  <w:abstractNum w:abstractNumId="17" w15:restartNumberingAfterBreak="0">
     <w:nsid w:val="3B13134C"/>
     <w:multiLevelType w:val="hybridMultilevel"/>
     <w:tmpl w:val="041AC950"/>
@@ -5104,7 +5935,7 @@
       </w:rPr>
     </w:lvl>
   </w:abstractNum>
-  <w:abstractNum w:abstractNumId="17" w15:restartNumberingAfterBreak="0">
+  <w:abstractNum w:abstractNumId="18" w15:restartNumberingAfterBreak="0">
     <w:nsid w:val="3B3F2A02"/>
     <w:multiLevelType w:val="hybridMultilevel"/>
     <w:tmpl w:val="9BB62138"/>
@@ -5217,7 +6048,7 @@
       </w:rPr>
     </w:lvl>
   </w:abstractNum>
-  <w:abstractNum w:abstractNumId="18" w15:restartNumberingAfterBreak="0">
+  <w:abstractNum w:abstractNumId="19" w15:restartNumberingAfterBreak="0">
     <w:nsid w:val="3BA86148"/>
     <w:multiLevelType w:val="hybridMultilevel"/>
     <w:tmpl w:val="8CA86A1E"/>
@@ -5330,7 +6161,7 @@
       </w:rPr>
     </w:lvl>
   </w:abstractNum>
-  <w:abstractNum w:abstractNumId="19" w15:restartNumberingAfterBreak="0">
+  <w:abstractNum w:abstractNumId="20" w15:restartNumberingAfterBreak="0">
     <w:nsid w:val="3C5B376A"/>
     <w:multiLevelType w:val="hybridMultilevel"/>
     <w:tmpl w:val="318AF922"/>
@@ -5442,7 +6273,7 @@
       </w:rPr>
     </w:lvl>
   </w:abstractNum>
-  <w:abstractNum w:abstractNumId="20" w15:restartNumberingAfterBreak="0">
+  <w:abstractNum w:abstractNumId="21" w15:restartNumberingAfterBreak="0">
     <w:nsid w:val="47F96F2F"/>
     <w:multiLevelType w:val="hybridMultilevel"/>
     <w:tmpl w:val="7256ACFE"/>
@@ -5554,7 +6385,7 @@
       </w:rPr>
     </w:lvl>
   </w:abstractNum>
-  <w:abstractNum w:abstractNumId="21" w15:restartNumberingAfterBreak="0">
+  <w:abstractNum w:abstractNumId="22" w15:restartNumberingAfterBreak="0">
     <w:nsid w:val="483435CC"/>
     <w:multiLevelType w:val="hybridMultilevel"/>
     <w:tmpl w:val="787CC9BA"/>
@@ -5666,7 +6497,7 @@
       </w:rPr>
     </w:lvl>
   </w:abstractNum>
-  <w:abstractNum w:abstractNumId="22" w15:restartNumberingAfterBreak="0">
+  <w:abstractNum w:abstractNumId="23" w15:restartNumberingAfterBreak="0">
     <w:nsid w:val="49A87142"/>
     <w:multiLevelType w:val="hybridMultilevel"/>
     <w:tmpl w:val="0C047B9C"/>
@@ -5778,7 +6609,7 @@
       </w:rPr>
     </w:lvl>
   </w:abstractNum>
-  <w:abstractNum w:abstractNumId="23" w15:restartNumberingAfterBreak="0">
+  <w:abstractNum w:abstractNumId="24" w15:restartNumberingAfterBreak="0">
     <w:nsid w:val="4C2329FC"/>
     <w:multiLevelType w:val="hybridMultilevel"/>
     <w:tmpl w:val="DE9ED958"/>
@@ -5891,7 +6722,7 @@
       </w:rPr>
     </w:lvl>
   </w:abstractNum>
-  <w:abstractNum w:abstractNumId="24" w15:restartNumberingAfterBreak="0">
+  <w:abstractNum w:abstractNumId="25" w15:restartNumberingAfterBreak="0">
     <w:nsid w:val="4C62209E"/>
     <w:multiLevelType w:val="hybridMultilevel"/>
     <w:tmpl w:val="07F6CAEE"/>
@@ -6004,7 +6835,7 @@
       </w:rPr>
     </w:lvl>
   </w:abstractNum>
-  <w:abstractNum w:abstractNumId="25" w15:restartNumberingAfterBreak="0">
+  <w:abstractNum w:abstractNumId="26" w15:restartNumberingAfterBreak="0">
     <w:nsid w:val="5A9430D7"/>
     <w:multiLevelType w:val="hybridMultilevel"/>
     <w:tmpl w:val="BB3A180A"/>
@@ -6117,7 +6948,7 @@
       </w:rPr>
     </w:lvl>
   </w:abstractNum>
-  <w:abstractNum w:abstractNumId="26" w15:restartNumberingAfterBreak="0">
+  <w:abstractNum w:abstractNumId="27" w15:restartNumberingAfterBreak="0">
     <w:nsid w:val="5FC00F8A"/>
     <w:multiLevelType w:val="hybridMultilevel"/>
     <w:tmpl w:val="9D96EDD4"/>
@@ -6230,7 +7061,119 @@
       </w:rPr>
     </w:lvl>
   </w:abstractNum>
-  <w:abstractNum w:abstractNumId="27" w15:restartNumberingAfterBreak="0">
+  <w:abstractNum w:abstractNumId="28" w15:restartNumberingAfterBreak="0">
+    <w:nsid w:val="625F2396"/>
+    <w:multiLevelType w:val="hybridMultilevel"/>
+    <w:tmpl w:val="CC6833A0"/>
+    <w:lvl w:ilvl="0" w:tplc="E660ADC2">
+      <w:numFmt w:val="bullet"/>
+      <w:lvlText w:val="-"/>
+      <w:lvlJc w:val="left"/>
+      <w:pPr>
+        <w:ind w:left="720" w:hanging="360"/>
+      </w:pPr>
+      <w:rPr>
+        <w:rFonts w:ascii="Aptos" w:eastAsiaTheme="minorHAnsi" w:hAnsi="Aptos" w:cstheme="minorBidi" w:hint="default"/>
+      </w:rPr>
+    </w:lvl>
+    <w:lvl w:ilvl="1" w:tplc="08090003" w:tentative="1">
+      <w:start w:val="1"/>
+      <w:numFmt w:val="bullet"/>
+      <w:lvlText w:val="o"/>
+      <w:lvlJc w:val="left"/>
+      <w:pPr>
+        <w:ind w:left="1440" w:hanging="360"/>
+      </w:pPr>
+      <w:rPr>
+        <w:rFonts w:ascii="Courier New" w:hAnsi="Courier New" w:cs="Courier New" w:hint="default"/>
+      </w:rPr>
+    </w:lvl>
+    <w:lvl w:ilvl="2" w:tplc="08090005" w:tentative="1">
+      <w:start w:val="1"/>
+      <w:numFmt w:val="bullet"/>
+      <w:lvlText w:val=""/>
+      <w:lvlJc w:val="left"/>
+      <w:pPr>
+        <w:ind w:left="2160" w:hanging="360"/>
+      </w:pPr>
+      <w:rPr>
+        <w:rFonts w:ascii="Wingdings" w:hAnsi="Wingdings" w:hint="default"/>
+      </w:rPr>
+    </w:lvl>
+    <w:lvl w:ilvl="3" w:tplc="08090001" w:tentative="1">
+      <w:start w:val="1"/>
+      <w:numFmt w:val="bullet"/>
+      <w:lvlText w:val=""/>
+      <w:lvlJc w:val="left"/>
+      <w:pPr>
+        <w:ind w:left="2880" w:hanging="360"/>
+      </w:pPr>
+      <w:rPr>
+        <w:rFonts w:ascii="Symbol" w:hAnsi="Symbol" w:hint="default"/>
+      </w:rPr>
+    </w:lvl>
+    <w:lvl w:ilvl="4" w:tplc="08090003" w:tentative="1">
+      <w:start w:val="1"/>
+      <w:numFmt w:val="bullet"/>
+      <w:lvlText w:val="o"/>
+      <w:lvlJc w:val="left"/>
+      <w:pPr>
+        <w:ind w:left="3600" w:hanging="360"/>
+      </w:pPr>
+      <w:rPr>
+        <w:rFonts w:ascii="Courier New" w:hAnsi="Courier New" w:cs="Courier New" w:hint="default"/>
+      </w:rPr>
+    </w:lvl>
+    <w:lvl w:ilvl="5" w:tplc="08090005" w:tentative="1">
+      <w:start w:val="1"/>
+      <w:numFmt w:val="bullet"/>
+      <w:lvlText w:val=""/>
+      <w:lvlJc w:val="left"/>
+      <w:pPr>
+        <w:ind w:left="4320" w:hanging="360"/>
+      </w:pPr>
+      <w:rPr>
+        <w:rFonts w:ascii="Wingdings" w:hAnsi="Wingdings" w:hint="default"/>
+      </w:rPr>
+    </w:lvl>
+    <w:lvl w:ilvl="6" w:tplc="08090001" w:tentative="1">
+      <w:start w:val="1"/>
+      <w:numFmt w:val="bullet"/>
+      <w:lvlText w:val=""/>
+      <w:lvlJc w:val="left"/>
+      <w:pPr>
+        <w:ind w:left="5040" w:hanging="360"/>
+      </w:pPr>
+      <w:rPr>
+        <w:rFonts w:ascii="Symbol" w:hAnsi="Symbol" w:hint="default"/>
+      </w:rPr>
+    </w:lvl>
+    <w:lvl w:ilvl="7" w:tplc="08090003" w:tentative="1">
+      <w:start w:val="1"/>
+      <w:numFmt w:val="bullet"/>
+      <w:lvlText w:val="o"/>
+      <w:lvlJc w:val="left"/>
+      <w:pPr>
+        <w:ind w:left="5760" w:hanging="360"/>
+      </w:pPr>
+      <w:rPr>
+        <w:rFonts w:ascii="Courier New" w:hAnsi="Courier New" w:cs="Courier New" w:hint="default"/>
+      </w:rPr>
+    </w:lvl>
+    <w:lvl w:ilvl="8" w:tplc="08090005" w:tentative="1">
+      <w:start w:val="1"/>
+      <w:numFmt w:val="bullet"/>
+      <w:lvlText w:val=""/>
+      <w:lvlJc w:val="left"/>
+      <w:pPr>
+        <w:ind w:left="6480" w:hanging="360"/>
+      </w:pPr>
+      <w:rPr>
+        <w:rFonts w:ascii="Wingdings" w:hAnsi="Wingdings" w:hint="default"/>
+      </w:rPr>
+    </w:lvl>
+  </w:abstractNum>
+  <w:abstractNum w:abstractNumId="29" w15:restartNumberingAfterBreak="0">
     <w:nsid w:val="65070E8D"/>
     <w:multiLevelType w:val="hybridMultilevel"/>
     <w:tmpl w:val="BDB6982A"/>
@@ -6343,7 +7286,7 @@
       </w:rPr>
     </w:lvl>
   </w:abstractNum>
-  <w:abstractNum w:abstractNumId="28" w15:restartNumberingAfterBreak="0">
+  <w:abstractNum w:abstractNumId="30" w15:restartNumberingAfterBreak="0">
     <w:nsid w:val="695A7833"/>
     <w:multiLevelType w:val="hybridMultilevel"/>
     <w:tmpl w:val="E564D540"/>
@@ -6455,7 +7398,7 @@
       </w:rPr>
     </w:lvl>
   </w:abstractNum>
-  <w:abstractNum w:abstractNumId="29" w15:restartNumberingAfterBreak="0">
+  <w:abstractNum w:abstractNumId="31" w15:restartNumberingAfterBreak="0">
     <w:nsid w:val="6E5176C4"/>
     <w:multiLevelType w:val="hybridMultilevel"/>
     <w:tmpl w:val="51C0ACA8"/>
@@ -6567,7 +7510,7 @@
       </w:rPr>
     </w:lvl>
   </w:abstractNum>
-  <w:abstractNum w:abstractNumId="30" w15:restartNumberingAfterBreak="0">
+  <w:abstractNum w:abstractNumId="32" w15:restartNumberingAfterBreak="0">
     <w:nsid w:val="6FE3157E"/>
     <w:multiLevelType w:val="hybridMultilevel"/>
     <w:tmpl w:val="6B0E535E"/>
@@ -6680,7 +7623,7 @@
       </w:rPr>
     </w:lvl>
   </w:abstractNum>
-  <w:abstractNum w:abstractNumId="31" w15:restartNumberingAfterBreak="0">
+  <w:abstractNum w:abstractNumId="33" w15:restartNumberingAfterBreak="0">
     <w:nsid w:val="73B949D2"/>
     <w:multiLevelType w:val="hybridMultilevel"/>
     <w:tmpl w:val="28606D2A"/>
@@ -6799,7 +7742,7 @@
     <w:abstractNumId w:val="4"/>
   </w:num>
   <w:num w:numId="3" w16cid:durableId="1364742651">
-    <w:abstractNumId w:val="26"/>
+    <w:abstractNumId w:val="27"/>
   </w:num>
   <w:num w:numId="4" w16cid:durableId="302855184">
     <w:abstractNumId w:val="9"/>
@@ -6814,37 +7757,37 @@
     <w:abstractNumId w:val="14"/>
   </w:num>
   <w:num w:numId="8" w16cid:durableId="836699043">
-    <w:abstractNumId w:val="17"/>
+    <w:abstractNumId w:val="18"/>
   </w:num>
   <w:num w:numId="9" w16cid:durableId="536427938">
     <w:abstractNumId w:val="6"/>
   </w:num>
   <w:num w:numId="10" w16cid:durableId="1761370988">
-    <w:abstractNumId w:val="27"/>
+    <w:abstractNumId w:val="29"/>
   </w:num>
   <w:num w:numId="11" w16cid:durableId="1499495752">
-    <w:abstractNumId w:val="20"/>
+    <w:abstractNumId w:val="21"/>
   </w:num>
   <w:num w:numId="12" w16cid:durableId="1412316134">
-    <w:abstractNumId w:val="31"/>
+    <w:abstractNumId w:val="33"/>
   </w:num>
   <w:num w:numId="13" w16cid:durableId="1350258004">
     <w:abstractNumId w:val="12"/>
   </w:num>
   <w:num w:numId="14" w16cid:durableId="1673683661">
-    <w:abstractNumId w:val="22"/>
+    <w:abstractNumId w:val="23"/>
   </w:num>
   <w:num w:numId="15" w16cid:durableId="867064272">
-    <w:abstractNumId w:val="28"/>
+    <w:abstractNumId w:val="30"/>
   </w:num>
   <w:num w:numId="16" w16cid:durableId="7604246">
-    <w:abstractNumId w:val="21"/>
+    <w:abstractNumId w:val="22"/>
   </w:num>
   <w:num w:numId="17" w16cid:durableId="2089039549">
     <w:abstractNumId w:val="13"/>
   </w:num>
   <w:num w:numId="18" w16cid:durableId="595285920">
-    <w:abstractNumId w:val="24"/>
+    <w:abstractNumId w:val="25"/>
   </w:num>
   <w:num w:numId="19" w16cid:durableId="2136634086">
     <w:abstractNumId w:val="15"/>
@@ -6853,16 +7796,16 @@
     <w:abstractNumId w:val="0"/>
   </w:num>
   <w:num w:numId="21" w16cid:durableId="1646935873">
-    <w:abstractNumId w:val="25"/>
+    <w:abstractNumId w:val="26"/>
   </w:num>
   <w:num w:numId="22" w16cid:durableId="18512531">
-    <w:abstractNumId w:val="18"/>
+    <w:abstractNumId w:val="19"/>
   </w:num>
   <w:num w:numId="23" w16cid:durableId="926422375">
-    <w:abstractNumId w:val="23"/>
+    <w:abstractNumId w:val="24"/>
   </w:num>
   <w:num w:numId="24" w16cid:durableId="1654137957">
-    <w:abstractNumId w:val="16"/>
+    <w:abstractNumId w:val="17"/>
   </w:num>
   <w:num w:numId="25" w16cid:durableId="412093067">
     <w:abstractNumId w:val="5"/>
@@ -6871,10 +7814,10 @@
     <w:abstractNumId w:val="7"/>
   </w:num>
   <w:num w:numId="27" w16cid:durableId="1512182773">
-    <w:abstractNumId w:val="19"/>
+    <w:abstractNumId w:val="20"/>
   </w:num>
   <w:num w:numId="28" w16cid:durableId="1900287879">
-    <w:abstractNumId w:val="29"/>
+    <w:abstractNumId w:val="31"/>
   </w:num>
   <w:num w:numId="29" w16cid:durableId="112094442">
     <w:abstractNumId w:val="10"/>
@@ -6886,7 +7829,13 @@
     <w:abstractNumId w:val="2"/>
   </w:num>
   <w:num w:numId="32" w16cid:durableId="366636805">
-    <w:abstractNumId w:val="30"/>
+    <w:abstractNumId w:val="32"/>
+  </w:num>
+  <w:num w:numId="33" w16cid:durableId="305666819">
+    <w:abstractNumId w:val="16"/>
+  </w:num>
+  <w:num w:numId="34" w16cid:durableId="2041860774">
+    <w:abstractNumId w:val="28"/>
   </w:num>
 </w:numbering>
 </file>

</xml_diff>

<commit_message>
today's updates and whishlist for next year
</commit_message>
<xml_diff>
--- a/documents/2026/FDI_TO_DO.docx
+++ b/documents/2026/FDI_TO_DO.docx
@@ -59,6 +59,279 @@
           <w:bCs/>
           <w:lang w:val="en-US"/>
         </w:rPr>
+        <w:t>TO DO</w:t>
+      </w:r>
+    </w:p>
+    <w:p>
+      <w:pPr>
+        <w:pStyle w:val="ListParagraph"/>
+        <w:numPr>
+          <w:ilvl w:val="0"/>
+          <w:numId w:val="36"/>
+        </w:numPr>
+        <w:rPr>
+          <w:lang w:val="en-US"/>
+        </w:rPr>
+      </w:pPr>
+      <w:r>
+        <w:rPr>
+          <w:lang w:val="en-US"/>
+        </w:rPr>
+        <w:t>VMS output in 2 tables (</w:t>
+      </w:r>
+      <w:r>
+        <w:rPr>
+          <w:lang w:val="en-US"/>
+        </w:rPr>
+        <w:t>ices, csq)</w:t>
+      </w:r>
+    </w:p>
+    <w:p>
+      <w:pPr>
+        <w:pStyle w:val="ListParagraph"/>
+        <w:numPr>
+          <w:ilvl w:val="0"/>
+          <w:numId w:val="36"/>
+        </w:numPr>
+        <w:rPr>
+          <w:lang w:val="en-US"/>
+        </w:rPr>
+      </w:pPr>
+      <w:r>
+        <w:rPr>
+          <w:lang w:val="en-US"/>
+        </w:rPr>
+        <w:t xml:space="preserve">FDI </w:t>
+      </w:r>
+    </w:p>
+    <w:p>
+      <w:pPr>
+        <w:pStyle w:val="ListParagraph"/>
+        <w:numPr>
+          <w:ilvl w:val="0"/>
+          <w:numId w:val="36"/>
+        </w:numPr>
+        <w:rPr>
+          <w:lang w:val="en-US"/>
+        </w:rPr>
+      </w:pPr>
+      <w:r>
+        <w:rPr>
+          <w:lang w:val="en-US"/>
+        </w:rPr>
+        <w:t>How to get the data to both data calls</w:t>
+      </w:r>
+      <w:r>
+        <w:rPr>
+          <w:lang w:val="en-US"/>
+        </w:rPr>
+        <w:t>?</w:t>
+      </w:r>
+    </w:p>
+    <w:p>
+      <w:pPr>
+        <w:pStyle w:val="ListParagraph"/>
+        <w:numPr>
+          <w:ilvl w:val="1"/>
+          <w:numId w:val="36"/>
+        </w:numPr>
+        <w:rPr>
+          <w:lang w:val="en-US"/>
+        </w:rPr>
+      </w:pPr>
+      <w:r>
+        <w:rPr>
+          <w:lang w:val="en-US"/>
+        </w:rPr>
+        <w:t>VMS and FDI don’t align</w:t>
+      </w:r>
+    </w:p>
+    <w:p>
+      <w:pPr>
+        <w:pStyle w:val="ListParagraph"/>
+        <w:numPr>
+          <w:ilvl w:val="1"/>
+          <w:numId w:val="36"/>
+        </w:numPr>
+        <w:rPr>
+          <w:lang w:val="en-US"/>
+        </w:rPr>
+      </w:pPr>
+      <w:r>
+        <w:rPr>
+          <w:lang w:val="en-US"/>
+        </w:rPr>
+        <w:t>Tables H and I</w:t>
+      </w:r>
+    </w:p>
+    <w:p>
+      <w:pPr>
+        <w:rPr>
+          <w:b/>
+          <w:bCs/>
+          <w:lang w:val="en-US"/>
+        </w:rPr>
+      </w:pPr>
+    </w:p>
+    <w:p>
+      <w:pPr>
+        <w:rPr>
+          <w:b/>
+          <w:bCs/>
+          <w:lang w:val="en-US"/>
+        </w:rPr>
+      </w:pPr>
+      <w:r>
+        <w:rPr>
+          <w:b/>
+          <w:bCs/>
+          <w:lang w:val="en-US"/>
+        </w:rPr>
+        <w:t>30/06/2026</w:t>
+      </w:r>
+    </w:p>
+    <w:p>
+      <w:pPr>
+        <w:pStyle w:val="ListParagraph"/>
+        <w:numPr>
+          <w:ilvl w:val="0"/>
+          <w:numId w:val="35"/>
+        </w:numPr>
+        <w:rPr>
+          <w:b/>
+          <w:bCs/>
+          <w:lang w:val="en-US"/>
+        </w:rPr>
+      </w:pPr>
+      <w:r>
+        <w:rPr>
+          <w:lang w:val="en-US"/>
+        </w:rPr>
+        <w:t xml:space="preserve">Clean </w:t>
+      </w:r>
+      <w:r>
+        <w:rPr>
+          <w:lang w:val="en-US"/>
+        </w:rPr>
+        <w:t>out</w:t>
+      </w:r>
+      <w:r>
+        <w:rPr>
+          <w:lang w:val="en-US"/>
+        </w:rPr>
+        <w:t xml:space="preserve"> flextable codes from output document</w:t>
+      </w:r>
+    </w:p>
+    <w:p>
+      <w:pPr>
+        <w:pStyle w:val="ListParagraph"/>
+        <w:numPr>
+          <w:ilvl w:val="0"/>
+          <w:numId w:val="35"/>
+        </w:numPr>
+        <w:rPr>
+          <w:b/>
+          <w:bCs/>
+          <w:lang w:val="en-US"/>
+        </w:rPr>
+      </w:pPr>
+      <w:r>
+        <w:rPr>
+          <w:lang w:val="en-US"/>
+        </w:rPr>
+        <w:t>Clean up some comments</w:t>
+      </w:r>
+    </w:p>
+    <w:p>
+      <w:pPr>
+        <w:pStyle w:val="ListParagraph"/>
+        <w:numPr>
+          <w:ilvl w:val="0"/>
+          <w:numId w:val="35"/>
+        </w:numPr>
+        <w:rPr>
+          <w:b/>
+          <w:bCs/>
+          <w:lang w:val="en-US"/>
+        </w:rPr>
+      </w:pPr>
+      <w:r>
+        <w:rPr>
+          <w:lang w:val="en-US"/>
+        </w:rPr>
+        <w:t>Move rotate images to path_out</w:t>
+      </w:r>
+    </w:p>
+    <w:p>
+      <w:pPr>
+        <w:pStyle w:val="ListParagraph"/>
+        <w:numPr>
+          <w:ilvl w:val="0"/>
+          <w:numId w:val="35"/>
+        </w:numPr>
+        <w:rPr>
+          <w:b/>
+          <w:bCs/>
+          <w:lang w:val="en-US"/>
+        </w:rPr>
+      </w:pPr>
+      <w:r>
+        <w:rPr>
+          <w:lang w:val="en-US"/>
+        </w:rPr>
+        <w:t xml:space="preserve">Adding appendix description </w:t>
+      </w:r>
+      <w:r>
+        <w:rPr>
+          <w:lang w:val="en-US"/>
+        </w:rPr>
+        <w:t>as markdown tables</w:t>
+      </w:r>
+    </w:p>
+    <w:p>
+      <w:pPr>
+        <w:pStyle w:val="ListParagraph"/>
+        <w:numPr>
+          <w:ilvl w:val="0"/>
+          <w:numId w:val="35"/>
+        </w:numPr>
+        <w:rPr>
+          <w:b/>
+          <w:bCs/>
+          <w:lang w:val="en-US"/>
+        </w:rPr>
+      </w:pPr>
+      <w:r>
+        <w:rPr>
+          <w:lang w:val="en-US"/>
+        </w:rPr>
+        <w:t>Adding footnotes for appendix tables</w:t>
+      </w:r>
+    </w:p>
+    <w:p>
+      <w:pPr>
+        <w:ind w:left="360"/>
+        <w:rPr>
+          <w:b/>
+          <w:bCs/>
+          <w:lang w:val="en-US"/>
+        </w:rPr>
+      </w:pPr>
+    </w:p>
+    <w:p>
+      <w:pPr>
+        <w:rPr>
+          <w:b/>
+          <w:bCs/>
+          <w:lang w:val="en-US"/>
+        </w:rPr>
+      </w:pPr>
+      <w:r>
+        <w:rPr>
+          <w:b/>
+          <w:bCs/>
+          <w:lang w:val="en-US"/>
+        </w:rPr>
         <w:t>29/06/2026</w:t>
       </w:r>
     </w:p>
@@ -113,14 +386,7 @@
         <w:rPr>
           <w:lang w:val="en-US"/>
         </w:rPr>
-        <w:t xml:space="preserve">Fixing ugly </w:t>
-      </w:r>
-      <w:proofErr w:type="spellStart"/>
-      <w:r>
-        <w:rPr>
-          <w:lang w:val="en-US"/>
-        </w:rPr>
-        <w:t>fl</w:t>
+        <w:t>Fixing ugly fl</w:t>
       </w:r>
       <w:r>
         <w:rPr>
@@ -134,7 +400,6 @@
         </w:rPr>
         <w:t>xtables</w:t>
       </w:r>
-      <w:proofErr w:type="spellEnd"/>
     </w:p>
     <w:p>
       <w:pPr>
@@ -225,30 +490,8 @@
         <w:rPr>
           <w:lang w:val="en-US"/>
         </w:rPr>
-        <w:t xml:space="preserve">Check </w:t>
-      </w:r>
-      <w:proofErr w:type="spellStart"/>
-      <w:r>
-        <w:rPr>
-          <w:lang w:val="en-US"/>
-        </w:rPr>
-        <w:t>fecR</w:t>
-      </w:r>
-      <w:proofErr w:type="spellEnd"/>
-      <w:r>
-        <w:rPr>
-          <w:lang w:val="en-US"/>
-        </w:rPr>
-        <w:t xml:space="preserve"> logic in import_sas_metier_2013-</w:t>
-      </w:r>
-      <w:proofErr w:type="gramStart"/>
-      <w:r>
-        <w:rPr>
-          <w:lang w:val="en-US"/>
-        </w:rPr>
-        <w:t>15.Rmd</w:t>
-      </w:r>
-      <w:proofErr w:type="gramEnd"/>
+        <w:t>Check fecR logic in import_sas_metier_2013-15.Rmd</w:t>
+      </w:r>
     </w:p>
     <w:p>
       <w:pPr>
@@ -295,24 +538,8 @@
         <w:rPr>
           <w:lang w:val="en-US"/>
         </w:rPr>
-        <w:t xml:space="preserve"> logic in </w:t>
-      </w:r>
-      <w:proofErr w:type="spellStart"/>
-      <w:r>
-        <w:rPr>
-          <w:lang w:val="en-US"/>
-        </w:rPr>
-        <w:t>table_a-</w:t>
-      </w:r>
-      <w:proofErr w:type="gramStart"/>
-      <w:r>
-        <w:rPr>
-          <w:lang w:val="en-US"/>
-        </w:rPr>
-        <w:t>J.Rmd</w:t>
-      </w:r>
-      <w:proofErr w:type="spellEnd"/>
-      <w:proofErr w:type="gramEnd"/>
+        <w:t xml:space="preserve"> logic in table_a-J.Rmd</w:t>
+      </w:r>
     </w:p>
     <w:p>
       <w:pPr>
@@ -331,14 +558,12 @@
         </w:rPr>
         <w:t xml:space="preserve">should have the same aggregation as </w:t>
       </w:r>
-      <w:proofErr w:type="spellStart"/>
       <w:r>
         <w:rPr>
           <w:lang w:val="en-US"/>
         </w:rPr>
         <w:t>totkw_totgt</w:t>
       </w:r>
-      <w:proofErr w:type="spellEnd"/>
       <w:r>
         <w:rPr>
           <w:lang w:val="en-US"/>
@@ -410,6 +635,7 @@
           <w:bCs/>
           <w:lang w:val="en-US"/>
         </w:rPr>
+        <w:lastRenderedPageBreak/>
         <w:t>18/04/2026</w:t>
       </w:r>
     </w:p>
@@ -428,16 +654,8 @@
         <w:rPr>
           <w:lang w:val="en-US"/>
         </w:rPr>
-        <w:t>What happened to the 2013-2015 VL0008 VESSEL_</w:t>
-      </w:r>
-      <w:proofErr w:type="gramStart"/>
-      <w:r>
-        <w:rPr>
-          <w:lang w:val="en-US"/>
-        </w:rPr>
-        <w:t>LENGTH’s ???</w:t>
-      </w:r>
-      <w:proofErr w:type="gramEnd"/>
+        <w:t>What happened to the 2013-2015 VL0008 VESSEL_LENGTH’s ???</w:t>
+      </w:r>
     </w:p>
     <w:p>
       <w:pPr>
@@ -532,14 +750,7 @@
         <w:rPr>
           <w:lang w:val="en-US"/>
         </w:rPr>
-        <w:t xml:space="preserve">under </w:t>
-      </w:r>
-      <w:proofErr w:type="gramStart"/>
-      <w:r>
-        <w:rPr>
-          <w:lang w:val="en-US"/>
-        </w:rPr>
-        <w:t>KKILMOITUS</w:t>
+        <w:t>under KKILMOITUS</w:t>
       </w:r>
       <w:r>
         <w:rPr>
@@ -553,7 +764,6 @@
         </w:rPr>
         <w:t>!</w:t>
       </w:r>
-      <w:proofErr w:type="gramEnd"/>
     </w:p>
     <w:p>
       <w:pPr>
@@ -601,7 +811,6 @@
         <w:rPr>
           <w:lang w:val="en-US"/>
         </w:rPr>
-        <w:lastRenderedPageBreak/>
         <w:t xml:space="preserve">if in table A, but not in table C </w:t>
       </w:r>
       <w:r>
@@ -712,39 +921,17 @@
           <w:lang w:val="fi-FI"/>
         </w:rPr>
       </w:pPr>
-      <w:proofErr w:type="spellStart"/>
       <w:r>
         <w:rPr>
           <w:lang w:val="fi-FI"/>
         </w:rPr>
-        <w:t>Split</w:t>
-      </w:r>
-      <w:proofErr w:type="spellEnd"/>
+        <w:t xml:space="preserve">Split file on </w:t>
+      </w:r>
       <w:r>
         <w:rPr>
           <w:lang w:val="fi-FI"/>
         </w:rPr>
-        <w:t xml:space="preserve"> file on </w:t>
-      </w:r>
-      <w:r>
-        <w:rPr>
-          <w:lang w:val="fi-FI"/>
-        </w:rPr>
-        <w:t xml:space="preserve">KKILMOITUS and </w:t>
-      </w:r>
-      <w:proofErr w:type="spellStart"/>
-      <w:r>
-        <w:rPr>
-          <w:lang w:val="fi-FI"/>
-        </w:rPr>
-        <w:t>remove</w:t>
-      </w:r>
-      <w:proofErr w:type="spellEnd"/>
-      <w:r>
-        <w:rPr>
-          <w:lang w:val="fi-FI"/>
-        </w:rPr>
-        <w:t xml:space="preserve"> KALASTUSTAILMANALUSTA</w:t>
+        <w:t>KKILMOITUS and remove KALASTUSTAILMANALUSTA</w:t>
       </w:r>
     </w:p>
     <w:p>
@@ -786,6 +973,7 @@
           <w:noProof/>
           <w:lang w:val="en-US"/>
         </w:rPr>
+        <w:lastRenderedPageBreak/>
         <w:drawing>
           <wp:inline distT="0" distB="0" distL="0" distR="0" wp14:anchorId="77433B9C" wp14:editId="700EC0D1">
             <wp:extent cx="2760462" cy="4114486"/>
@@ -881,7 +1069,6 @@
           <w:noProof/>
           <w:lang w:val="en-US"/>
         </w:rPr>
-        <w:lastRenderedPageBreak/>
         <w:drawing>
           <wp:inline distT="0" distB="0" distL="0" distR="0" wp14:anchorId="5131BA67" wp14:editId="7BC8D243">
             <wp:extent cx="4677428" cy="4334480"/>
@@ -1128,21 +1315,7 @@
         <w:rPr>
           <w:lang w:val="en-US"/>
         </w:rPr>
-        <w:t xml:space="preserve">Replace </w:t>
-      </w:r>
-      <w:proofErr w:type="spellStart"/>
-      <w:r>
-        <w:rPr>
-          <w:lang w:val="en-US"/>
-        </w:rPr>
-        <w:t>shorelog</w:t>
-      </w:r>
-      <w:proofErr w:type="spellEnd"/>
-      <w:r>
-        <w:rPr>
-          <w:lang w:val="en-US"/>
-        </w:rPr>
-        <w:t xml:space="preserve"> vessel length VL0010 with VL0812 </w:t>
+        <w:t xml:space="preserve">Replace shorelog vessel length VL0010 with VL0812 </w:t>
       </w:r>
       <w:r>
         <w:rPr>
@@ -1163,7 +1336,6 @@
           <w:noProof/>
           <w:lang w:val="en-US"/>
         </w:rPr>
-        <w:lastRenderedPageBreak/>
         <w:drawing>
           <wp:inline distT="0" distB="0" distL="0" distR="0" wp14:anchorId="246A9859" wp14:editId="28635C7C">
             <wp:extent cx="3505504" cy="3086367"/>
@@ -1279,6 +1451,7 @@
         <w:rPr>
           <w:lang w:val="en-US"/>
         </w:rPr>
+        <w:lastRenderedPageBreak/>
         <w:t xml:space="preserve">Overwrite 33 records where </w:t>
       </w:r>
       <w:r>
@@ -1303,21 +1476,7 @@
         <w:rPr>
           <w:lang w:val="en-US"/>
         </w:rPr>
-        <w:t>Save clean data back to DCRPOD (</w:t>
-      </w:r>
-      <w:proofErr w:type="spellStart"/>
-      <w:r>
-        <w:rPr>
-          <w:lang w:val="en-US"/>
-        </w:rPr>
-        <w:t>Pertuu</w:t>
-      </w:r>
-      <w:proofErr w:type="spellEnd"/>
-      <w:r>
-        <w:rPr>
-          <w:lang w:val="en-US"/>
-        </w:rPr>
-        <w:t>??? I don’t have permissions</w:t>
+        <w:t>Save clean data back to DCRPOD (Pertuu??? I don’t have permissions</w:t>
       </w:r>
       <w:r>
         <w:rPr>
@@ -1341,21 +1500,7 @@
         <w:rPr>
           <w:lang w:val="en-US"/>
         </w:rPr>
-        <w:t xml:space="preserve">Chunk 23: </w:t>
-      </w:r>
-      <w:proofErr w:type="spellStart"/>
-      <w:r>
-        <w:rPr>
-          <w:lang w:val="en-US"/>
-        </w:rPr>
-        <w:t>fecR</w:t>
-      </w:r>
-      <w:proofErr w:type="spellEnd"/>
-      <w:r>
-        <w:rPr>
-          <w:lang w:val="en-US"/>
-        </w:rPr>
-        <w:t>-logbooks</w:t>
+        <w:t>Chunk 23: fecR-logbooks</w:t>
       </w:r>
       <w:r>
         <w:rPr>
@@ -1397,27 +1542,13 @@
         <w:rPr>
           <w:lang w:val="en-US"/>
         </w:rPr>
-        <w:t xml:space="preserve">Chunk </w:t>
-      </w:r>
-      <w:proofErr w:type="gramStart"/>
-      <w:r>
-        <w:rPr>
-          <w:lang w:val="en-US"/>
-        </w:rPr>
-        <w:t>24:</w:t>
-      </w:r>
-      <w:r>
-        <w:rPr>
-          <w:lang w:val="en-US"/>
-        </w:rPr>
-        <w:t>shore</w:t>
-      </w:r>
-      <w:proofErr w:type="gramEnd"/>
-      <w:r>
-        <w:rPr>
-          <w:lang w:val="en-US"/>
-        </w:rPr>
-        <w:t>-effort</w:t>
+        <w:t>Chunk 24:</w:t>
+      </w:r>
+      <w:r>
+        <w:rPr>
+          <w:lang w:val="en-US"/>
+        </w:rPr>
+        <w:t>shore-effort</w:t>
       </w:r>
       <w:r>
         <w:rPr>
@@ -1585,41 +1716,13 @@
         <w:rPr>
           <w:lang w:val="en-US"/>
         </w:rPr>
-        <w:t xml:space="preserve"> cleaned </w:t>
-      </w:r>
-      <w:proofErr w:type="spellStart"/>
-      <w:r>
-        <w:rPr>
-          <w:lang w:val="en-US"/>
-        </w:rPr>
-        <w:t>sas</w:t>
-      </w:r>
-      <w:proofErr w:type="spellEnd"/>
-      <w:r>
-        <w:rPr>
-          <w:lang w:val="en-US"/>
-        </w:rPr>
-        <w:t xml:space="preserve"> data in </w:t>
-      </w:r>
-      <w:r>
-        <w:rPr>
-          <w:lang w:val="en-US"/>
-        </w:rPr>
-        <w:t>Tables a-g-h-</w:t>
-      </w:r>
-      <w:proofErr w:type="spellStart"/>
-      <w:r>
-        <w:rPr>
-          <w:lang w:val="en-US"/>
-        </w:rPr>
-        <w:t>i</w:t>
-      </w:r>
-      <w:proofErr w:type="spellEnd"/>
-      <w:r>
-        <w:rPr>
-          <w:lang w:val="en-US"/>
-        </w:rPr>
-        <w:t>-j</w:t>
+        <w:t xml:space="preserve"> cleaned sas data in </w:t>
+      </w:r>
+      <w:r>
+        <w:rPr>
+          <w:lang w:val="en-US"/>
+        </w:rPr>
+        <w:t>Tables a-g-h-i-j</w:t>
       </w:r>
       <w:r>
         <w:rPr>
@@ -1645,19 +1748,11 @@
         </w:rPr>
         <w:t xml:space="preserve">TODO: add </w:t>
       </w:r>
-      <w:proofErr w:type="spellStart"/>
-      <w:r>
-        <w:rPr>
-          <w:lang w:val="en-US"/>
-        </w:rPr>
-        <w:t>sql</w:t>
-      </w:r>
-      <w:proofErr w:type="spellEnd"/>
-      <w:r>
-        <w:rPr>
-          <w:lang w:val="en-US"/>
-        </w:rPr>
-        <w:t xml:space="preserve"> permissions to script (Petri)</w:t>
+      <w:r>
+        <w:rPr>
+          <w:lang w:val="en-US"/>
+        </w:rPr>
+        <w:t>sql permissions to script (Petri)</w:t>
       </w:r>
     </w:p>
     <w:p>
@@ -1675,35 +1770,7 @@
         <w:rPr>
           <w:lang w:val="en-US"/>
         </w:rPr>
-        <w:t xml:space="preserve">TODO: find minimal needed columns and join </w:t>
-      </w:r>
-      <w:proofErr w:type="spellStart"/>
-      <w:r>
-        <w:rPr>
-          <w:lang w:val="en-US"/>
-        </w:rPr>
-        <w:t>sas</w:t>
-      </w:r>
-      <w:proofErr w:type="spellEnd"/>
-      <w:r>
-        <w:rPr>
-          <w:lang w:val="en-US"/>
-        </w:rPr>
-        <w:t xml:space="preserve"> and </w:t>
-      </w:r>
-      <w:proofErr w:type="spellStart"/>
-      <w:r>
-        <w:rPr>
-          <w:lang w:val="en-US"/>
-        </w:rPr>
-        <w:t>aktiviteeti</w:t>
-      </w:r>
-      <w:proofErr w:type="spellEnd"/>
-      <w:r>
-        <w:rPr>
-          <w:lang w:val="en-US"/>
-        </w:rPr>
-        <w:t xml:space="preserve"> tables</w:t>
+        <w:t>TODO: find minimal needed columns and join sas and aktiviteeti tables</w:t>
       </w:r>
       <w:r>
         <w:rPr>
@@ -1733,7 +1800,6 @@
           <w:bCs/>
           <w:lang w:val="en-US"/>
         </w:rPr>
-        <w:lastRenderedPageBreak/>
         <w:t>12/06/2026</w:t>
       </w:r>
     </w:p>
@@ -1752,35 +1818,7 @@
         <w:rPr>
           <w:lang w:val="en-US"/>
         </w:rPr>
-        <w:t xml:space="preserve">Go through last </w:t>
-      </w:r>
-      <w:proofErr w:type="gramStart"/>
-      <w:r>
-        <w:rPr>
-          <w:lang w:val="en-US"/>
-        </w:rPr>
-        <w:t>years’</w:t>
-      </w:r>
-      <w:proofErr w:type="gramEnd"/>
-      <w:r>
-        <w:rPr>
-          <w:lang w:val="en-US"/>
-        </w:rPr>
-        <w:t xml:space="preserve"> </w:t>
-      </w:r>
-      <w:proofErr w:type="spellStart"/>
-      <w:r>
-        <w:rPr>
-          <w:lang w:val="en-US"/>
-        </w:rPr>
-        <w:t>sas</w:t>
-      </w:r>
-      <w:proofErr w:type="spellEnd"/>
-      <w:r>
-        <w:rPr>
-          <w:lang w:val="en-US"/>
-        </w:rPr>
-        <w:t xml:space="preserve"> integration logic</w:t>
+        <w:t>Go through last years’ sas integration logic</w:t>
       </w:r>
     </w:p>
     <w:p>
@@ -1879,7 +1917,6 @@
         </w:rPr>
         <w:t xml:space="preserve">see chunk </w:t>
       </w:r>
-      <w:proofErr w:type="gramStart"/>
       <w:r>
         <w:rPr>
           <w:rFonts w:ascii="Miriam Fixed" w:hAnsi="Miriam Fixed" w:cs="Miriam Fixed" w:hint="cs"/>
@@ -1896,7 +1933,6 @@
         </w:rPr>
         <w:t>k</w:t>
       </w:r>
-      <w:proofErr w:type="gramEnd"/>
       <w:r>
         <w:rPr>
           <w:rFonts w:ascii="Miriam Fixed" w:hAnsi="Miriam Fixed" w:cs="Miriam Fixed"/>
@@ -1947,6 +1983,7 @@
           <w:noProof/>
           <w:lang w:val="en-US"/>
         </w:rPr>
+        <w:lastRenderedPageBreak/>
         <w:drawing>
           <wp:inline distT="0" distB="0" distL="0" distR="0" wp14:anchorId="531A49BB" wp14:editId="3B74A859">
             <wp:extent cx="2570780" cy="3753852"/>
@@ -2043,19 +2080,11 @@
           <w:u w:val="single"/>
         </w:rPr>
       </w:pPr>
-      <w:proofErr w:type="spellStart"/>
-      <w:r>
-        <w:rPr>
-          <w:lang w:val="en-US"/>
-        </w:rPr>
-        <w:t>Shorelogs</w:t>
-      </w:r>
-      <w:proofErr w:type="spellEnd"/>
-      <w:r>
-        <w:rPr>
-          <w:lang w:val="en-US"/>
-        </w:rPr>
-        <w:t xml:space="preserve">: see chunk </w:t>
+      <w:r>
+        <w:rPr>
+          <w:lang w:val="en-US"/>
+        </w:rPr>
+        <w:t xml:space="preserve">Shorelogs: see chunk </w:t>
       </w:r>
       <w:r>
         <w:rPr>
@@ -2063,18 +2092,8 @@
           <w:u w:val="single"/>
           <w:lang w:val="en-US"/>
         </w:rPr>
-        <w:t>clean-</w:t>
-      </w:r>
-      <w:proofErr w:type="spellStart"/>
-      <w:r>
-        <w:rPr>
-          <w:rFonts w:ascii="Miriam Fixed" w:hAnsi="Miriam Fixed" w:cs="Miriam Fixed" w:hint="cs"/>
-          <w:u w:val="single"/>
-          <w:lang w:val="en-US"/>
-        </w:rPr>
-        <w:t>shorelogs</w:t>
-      </w:r>
-      <w:proofErr w:type="spellEnd"/>
+        <w:t>clean-shorelogs</w:t>
+      </w:r>
       <w:r>
         <w:rPr>
           <w:rFonts w:ascii="Miriam Fixed" w:hAnsi="Miriam Fixed" w:cs="Miriam Fixed"/>
@@ -2111,7 +2130,6 @@
           <w:noProof/>
           <w:lang w:val="en-US"/>
         </w:rPr>
-        <w:lastRenderedPageBreak/>
         <w:drawing>
           <wp:inline distT="0" distB="0" distL="0" distR="0" wp14:anchorId="6CD656A8" wp14:editId="0A804541">
             <wp:extent cx="2422358" cy="1376051"/>
@@ -2242,14 +2260,7 @@
         <w:rPr>
           <w:lang w:val="en-US"/>
         </w:rPr>
-        <w:t xml:space="preserve">Go through last </w:t>
-      </w:r>
-      <w:proofErr w:type="gramStart"/>
-      <w:r>
-        <w:rPr>
-          <w:lang w:val="en-US"/>
-        </w:rPr>
-        <w:t>years</w:t>
+        <w:t>Go through last years</w:t>
       </w:r>
       <w:r>
         <w:rPr>
@@ -2257,26 +2268,11 @@
         </w:rPr>
         <w:t>’</w:t>
       </w:r>
-      <w:proofErr w:type="gramEnd"/>
-      <w:r>
-        <w:rPr>
-          <w:lang w:val="en-US"/>
-        </w:rPr>
-        <w:t xml:space="preserve"> </w:t>
-      </w:r>
-      <w:proofErr w:type="spellStart"/>
-      <w:r>
-        <w:rPr>
-          <w:lang w:val="en-US"/>
-        </w:rPr>
-        <w:t>sas</w:t>
-      </w:r>
-      <w:proofErr w:type="spellEnd"/>
-      <w:r>
-        <w:rPr>
-          <w:lang w:val="en-US"/>
-        </w:rPr>
-        <w:t xml:space="preserve"> integration logic</w:t>
+      <w:r>
+        <w:rPr>
+          <w:lang w:val="en-US"/>
+        </w:rPr>
+        <w:t xml:space="preserve"> sas integration logic</w:t>
       </w:r>
     </w:p>
     <w:p>
@@ -2311,35 +2307,7 @@
         <w:rPr>
           <w:lang w:val="en-US"/>
         </w:rPr>
-        <w:t xml:space="preserve">Create </w:t>
-      </w:r>
-      <w:proofErr w:type="spellStart"/>
-      <w:r>
-        <w:rPr>
-          <w:lang w:val="en-US"/>
-        </w:rPr>
-        <w:t>Rmd</w:t>
-      </w:r>
-      <w:proofErr w:type="spellEnd"/>
-      <w:r>
-        <w:rPr>
-          <w:lang w:val="en-US"/>
-        </w:rPr>
-        <w:t xml:space="preserve"> version of </w:t>
-      </w:r>
-      <w:proofErr w:type="spellStart"/>
-      <w:r>
-        <w:rPr>
-          <w:lang w:val="en-US"/>
-        </w:rPr>
-        <w:t>sas</w:t>
-      </w:r>
-      <w:proofErr w:type="spellEnd"/>
-      <w:r>
-        <w:rPr>
-          <w:lang w:val="en-US"/>
-        </w:rPr>
-        <w:t xml:space="preserve"> integration script from 2025</w:t>
+        <w:t>Create Rmd version of sas integration script from 2025</w:t>
       </w:r>
     </w:p>
     <w:p>
@@ -2542,21 +2510,7 @@
         <w:rPr>
           <w:lang w:val="en-US"/>
         </w:rPr>
-        <w:t xml:space="preserve">Incorrect length classes in old </w:t>
-      </w:r>
-      <w:proofErr w:type="spellStart"/>
-      <w:r>
-        <w:rPr>
-          <w:lang w:val="en-US"/>
-        </w:rPr>
-        <w:t>sas</w:t>
-      </w:r>
-      <w:proofErr w:type="spellEnd"/>
-      <w:r>
-        <w:rPr>
-          <w:lang w:val="en-US"/>
-        </w:rPr>
-        <w:t xml:space="preserve"> data</w:t>
+        <w:t>Incorrect length classes in old sas data</w:t>
       </w:r>
       <w:r>
         <w:rPr>
@@ -2580,7 +2534,6 @@
           <w:noProof/>
           <w:lang w:val="en-US"/>
         </w:rPr>
-        <w:lastRenderedPageBreak/>
         <w:drawing>
           <wp:inline distT="0" distB="0" distL="0" distR="0" wp14:anchorId="148C2AC6" wp14:editId="7720B385">
             <wp:extent cx="5731510" cy="1900555"/>
@@ -2715,21 +2668,7 @@
         <w:rPr>
           <w:lang w:val="en-US"/>
         </w:rPr>
-        <w:t xml:space="preserve"> </w:t>
-      </w:r>
-      <w:proofErr w:type="spellStart"/>
-      <w:r>
-        <w:rPr>
-          <w:lang w:val="en-US"/>
-        </w:rPr>
-        <w:t>Rmd</w:t>
-      </w:r>
-      <w:proofErr w:type="spellEnd"/>
-      <w:r>
-        <w:rPr>
-          <w:lang w:val="en-US"/>
-        </w:rPr>
-        <w:t xml:space="preserve"> now running</w:t>
+        <w:t xml:space="preserve"> Rmd now running</w:t>
       </w:r>
       <w:r>
         <w:rPr>
@@ -2762,14 +2701,12 @@
         </w:rPr>
         <w:t xml:space="preserve">: </w:t>
       </w:r>
-      <w:proofErr w:type="spellStart"/>
       <w:r>
         <w:rPr>
           <w:lang w:val="en-US"/>
         </w:rPr>
         <w:t>IC_DB.rds</w:t>
       </w:r>
-      <w:proofErr w:type="spellEnd"/>
       <w:r>
         <w:rPr>
           <w:lang w:val="en-US"/>
@@ -2800,19 +2737,11 @@
         </w:rPr>
         <w:t xml:space="preserve">TABLE F: </w:t>
       </w:r>
-      <w:proofErr w:type="spellStart"/>
-      <w:r>
-        <w:rPr>
-          <w:lang w:val="en-US"/>
-        </w:rPr>
-        <w:t>Rmd</w:t>
-      </w:r>
-      <w:proofErr w:type="spellEnd"/>
-      <w:r>
-        <w:rPr>
-          <w:lang w:val="en-US"/>
-        </w:rPr>
-        <w:t xml:space="preserve"> now running</w:t>
+      <w:r>
+        <w:rPr>
+          <w:lang w:val="en-US"/>
+        </w:rPr>
+        <w:t>Rmd now running</w:t>
       </w:r>
       <w:r>
         <w:rPr>
@@ -2868,16 +2797,8 @@
         <w:rPr>
           <w:lang w:val="en-US"/>
         </w:rPr>
-        <w:t xml:space="preserve"> </w:t>
-      </w:r>
-      <w:proofErr w:type="spellStart"/>
-      <w:r>
-        <w:rPr>
-          <w:lang w:val="en-US"/>
-        </w:rPr>
-        <w:t>Rmd</w:t>
-      </w:r>
-      <w:proofErr w:type="spellEnd"/>
+        <w:t xml:space="preserve"> Rmd</w:t>
+      </w:r>
     </w:p>
     <w:p>
       <w:pPr>
@@ -2896,6 +2817,7 @@
           <w:strike/>
           <w:lang w:val="en-US"/>
         </w:rPr>
+        <w:lastRenderedPageBreak/>
         <w:t>Starting to i</w:t>
       </w:r>
       <w:r>
@@ -2917,23 +2839,7 @@
           <w:strike/>
           <w:lang w:val="en-US"/>
         </w:rPr>
-        <w:t xml:space="preserve">new mongo implementation of </w:t>
-      </w:r>
-      <w:proofErr w:type="spellStart"/>
-      <w:r>
-        <w:rPr>
-          <w:strike/>
-          <w:lang w:val="en-US"/>
-        </w:rPr>
-        <w:t>Suomu</w:t>
-      </w:r>
-      <w:proofErr w:type="spellEnd"/>
-      <w:r>
-        <w:rPr>
-          <w:strike/>
-          <w:lang w:val="en-US"/>
-        </w:rPr>
-        <w:t xml:space="preserve"> cloud data</w:t>
+        <w:t>new mongo implementation of Suomu cloud data</w:t>
       </w:r>
     </w:p>
     <w:p>
@@ -2957,21 +2863,7 @@
         <w:rPr>
           <w:lang w:val="en-US"/>
         </w:rPr>
-        <w:t xml:space="preserve"> </w:t>
-      </w:r>
-      <w:proofErr w:type="spellStart"/>
-      <w:r>
-        <w:rPr>
-          <w:lang w:val="en-US"/>
-        </w:rPr>
-        <w:t>Rmd</w:t>
-      </w:r>
-      <w:proofErr w:type="spellEnd"/>
-      <w:r>
-        <w:rPr>
-          <w:lang w:val="en-US"/>
-        </w:rPr>
-        <w:t xml:space="preserve"> prepared and test run</w:t>
+        <w:t xml:space="preserve"> Rmd prepared and test run</w:t>
       </w:r>
       <w:r>
         <w:rPr>
@@ -3038,21 +2930,7 @@
         <w:rPr>
           <w:lang w:val="en-US"/>
         </w:rPr>
-        <w:t xml:space="preserve"> </w:t>
-      </w:r>
-      <w:proofErr w:type="spellStart"/>
-      <w:r>
-        <w:rPr>
-          <w:lang w:val="en-US"/>
-        </w:rPr>
-        <w:t>Rmd</w:t>
-      </w:r>
-      <w:proofErr w:type="spellEnd"/>
-      <w:r>
-        <w:rPr>
-          <w:lang w:val="en-US"/>
-        </w:rPr>
-        <w:t xml:space="preserve"> preparation</w:t>
+        <w:t xml:space="preserve"> Rmd preparation</w:t>
       </w:r>
       <w:r>
         <w:rPr>
@@ -3113,21 +2991,7 @@
         <w:rPr>
           <w:lang w:val="en-US"/>
         </w:rPr>
-        <w:t xml:space="preserve">Table e </w:t>
-      </w:r>
-      <w:proofErr w:type="spellStart"/>
-      <w:r>
-        <w:rPr>
-          <w:lang w:val="en-US"/>
-        </w:rPr>
-        <w:t>Rmd</w:t>
-      </w:r>
-      <w:proofErr w:type="spellEnd"/>
-      <w:r>
-        <w:rPr>
-          <w:lang w:val="en-US"/>
-        </w:rPr>
-        <w:t xml:space="preserve"> preparation</w:t>
+        <w:t>Table e Rmd preparation</w:t>
       </w:r>
     </w:p>
     <w:p>
@@ -3189,23 +3053,7 @@
           <w:strike/>
           <w:lang w:val="en-US"/>
         </w:rPr>
-        <w:t xml:space="preserve">Needs new </w:t>
-      </w:r>
-      <w:proofErr w:type="spellStart"/>
-      <w:r>
-        <w:rPr>
-          <w:strike/>
-          <w:lang w:val="en-US"/>
-        </w:rPr>
-        <w:t>Suomu</w:t>
-      </w:r>
-      <w:proofErr w:type="spellEnd"/>
-      <w:r>
-        <w:rPr>
-          <w:strike/>
-          <w:lang w:val="en-US"/>
-        </w:rPr>
-        <w:t xml:space="preserve"> cloud implementation</w:t>
+        <w:t>Needs new Suomu cloud implementation</w:t>
       </w:r>
     </w:p>
     <w:p>
@@ -3223,29 +3071,7 @@
         <w:rPr>
           <w:lang w:val="en-US"/>
         </w:rPr>
-        <w:t xml:space="preserve">Table </w:t>
-      </w:r>
-      <w:proofErr w:type="gramStart"/>
-      <w:r>
-        <w:rPr>
-          <w:lang w:val="en-US"/>
-        </w:rPr>
-        <w:t xml:space="preserve">f </w:t>
-      </w:r>
-      <w:proofErr w:type="spellStart"/>
-      <w:r>
-        <w:rPr>
-          <w:lang w:val="en-US"/>
-        </w:rPr>
-        <w:t>Rmd</w:t>
-      </w:r>
-      <w:proofErr w:type="spellEnd"/>
-      <w:proofErr w:type="gramEnd"/>
-      <w:r>
-        <w:rPr>
-          <w:lang w:val="en-US"/>
-        </w:rPr>
-        <w:t xml:space="preserve"> preparation</w:t>
+        <w:t>Table f Rmd preparation</w:t>
       </w:r>
     </w:p>
     <w:p>
@@ -3283,23 +3109,7 @@
           <w:strike/>
           <w:lang w:val="en-US"/>
         </w:rPr>
-        <w:t xml:space="preserve">Needs new </w:t>
-      </w:r>
-      <w:proofErr w:type="spellStart"/>
-      <w:r>
-        <w:rPr>
-          <w:strike/>
-          <w:lang w:val="en-US"/>
-        </w:rPr>
-        <w:t>Suomu</w:t>
-      </w:r>
-      <w:proofErr w:type="spellEnd"/>
-      <w:r>
-        <w:rPr>
-          <w:strike/>
-          <w:lang w:val="en-US"/>
-        </w:rPr>
-        <w:t xml:space="preserve"> cloud implementation</w:t>
+        <w:t>Needs new Suomu cloud implementation</w:t>
       </w:r>
     </w:p>
     <w:p>
@@ -3359,28 +3169,13 @@
         <w:rPr>
           <w:lang w:val="en-US"/>
         </w:rPr>
-        <w:lastRenderedPageBreak/>
-        <w:t xml:space="preserve">Fixing </w:t>
-      </w:r>
-      <w:proofErr w:type="spellStart"/>
-      <w:r>
-        <w:rPr>
-          <w:lang w:val="en-US"/>
-        </w:rPr>
-        <w:t>meti</w:t>
-      </w:r>
-      <w:r>
-        <w:rPr>
-          <w:lang w:val="en-US"/>
-        </w:rPr>
-        <w:t>ers</w:t>
-      </w:r>
-      <w:proofErr w:type="spellEnd"/>
-      <w:r>
-        <w:rPr>
-          <w:lang w:val="en-US"/>
-        </w:rPr>
-        <w:t xml:space="preserve"> in table a-j script</w:t>
+        <w:t>Fixing meti</w:t>
+      </w:r>
+      <w:r>
+        <w:rPr>
+          <w:lang w:val="en-US"/>
+        </w:rPr>
+        <w:t>ers in table a-j script</w:t>
       </w:r>
     </w:p>
     <w:p>
@@ -3394,19 +3189,11 @@
           <w:lang w:val="en-US"/>
         </w:rPr>
       </w:pPr>
-      <w:proofErr w:type="spellStart"/>
-      <w:r>
-        <w:rPr>
-          <w:lang w:val="en-US"/>
-        </w:rPr>
-        <w:t>Rmd</w:t>
-      </w:r>
-      <w:proofErr w:type="spellEnd"/>
-      <w:r>
-        <w:rPr>
-          <w:lang w:val="en-US"/>
-        </w:rPr>
-        <w:t xml:space="preserve"> now running</w:t>
+      <w:r>
+        <w:rPr>
+          <w:lang w:val="en-US"/>
+        </w:rPr>
+        <w:t>Rmd now running</w:t>
       </w:r>
     </w:p>
     <w:p>
@@ -3492,39 +3279,17 @@
           <w:lang w:val="en-US"/>
         </w:rPr>
       </w:pPr>
-      <w:proofErr w:type="spellStart"/>
-      <w:r>
-        <w:rPr>
-          <w:lang w:val="en-US"/>
-        </w:rPr>
-        <w:t>LukeTools</w:t>
-      </w:r>
-      <w:proofErr w:type="spellEnd"/>
-      <w:r>
-        <w:rPr>
-          <w:lang w:val="en-US"/>
-        </w:rPr>
-        <w:t xml:space="preserve"> (</w:t>
-      </w:r>
-      <w:proofErr w:type="gramStart"/>
-      <w:r>
-        <w:rPr>
-          <w:lang w:val="en-US"/>
-        </w:rPr>
-        <w:t>testing)</w:t>
-      </w:r>
-      <w:r>
-        <w:rPr>
-          <w:lang w:val="en-US"/>
-        </w:rPr>
-        <w:t xml:space="preserve">  -</w:t>
-      </w:r>
-      <w:proofErr w:type="gramEnd"/>
-      <w:r>
-        <w:rPr>
-          <w:lang w:val="en-US"/>
-        </w:rPr>
-        <w:t xml:space="preserve"> DONE</w:t>
+      <w:r>
+        <w:rPr>
+          <w:lang w:val="en-US"/>
+        </w:rPr>
+        <w:t>LukeTools (testing)</w:t>
+      </w:r>
+      <w:r>
+        <w:rPr>
+          <w:lang w:val="en-US"/>
+        </w:rPr>
+        <w:t xml:space="preserve">  - DONE</w:t>
       </w:r>
     </w:p>
     <w:p>
@@ -3560,21 +3325,7 @@
         <w:rPr>
           <w:lang w:val="en-US"/>
         </w:rPr>
-        <w:t xml:space="preserve">Replace scripts with </w:t>
-      </w:r>
-      <w:proofErr w:type="spellStart"/>
-      <w:r>
-        <w:rPr>
-          <w:lang w:val="en-US"/>
-        </w:rPr>
-        <w:t>Rmd</w:t>
-      </w:r>
-      <w:proofErr w:type="spellEnd"/>
-      <w:r>
-        <w:rPr>
-          <w:lang w:val="en-US"/>
-        </w:rPr>
-        <w:t xml:space="preserve"> files</w:t>
+        <w:t>Replace scripts with Rmd files</w:t>
       </w:r>
     </w:p>
     <w:p>
@@ -3628,30 +3379,8 @@
         <w:rPr>
           <w:lang w:val="en-US"/>
         </w:rPr>
-        <w:t xml:space="preserve">Change the </w:t>
-      </w:r>
-      <w:proofErr w:type="spellStart"/>
-      <w:r>
-        <w:rPr>
-          <w:lang w:val="en-US"/>
-        </w:rPr>
-        <w:t>metier</w:t>
-      </w:r>
-      <w:proofErr w:type="spellEnd"/>
-      <w:r>
-        <w:rPr>
-          <w:lang w:val="en-US"/>
-        </w:rPr>
-        <w:t xml:space="preserve"> lookup from </w:t>
-      </w:r>
-      <w:proofErr w:type="spellStart"/>
-      <w:r>
-        <w:rPr>
-          <w:lang w:val="en-US"/>
-        </w:rPr>
-        <w:t>github</w:t>
-      </w:r>
-      <w:proofErr w:type="spellEnd"/>
+        <w:t>Change the metier lookup from github</w:t>
+      </w:r>
     </w:p>
     <w:p>
       <w:pPr>
@@ -3668,21 +3397,7 @@
         <w:rPr>
           <w:lang w:val="en-US"/>
         </w:rPr>
-        <w:t xml:space="preserve">Save </w:t>
-      </w:r>
-      <w:proofErr w:type="spellStart"/>
-      <w:r>
-        <w:rPr>
-          <w:lang w:val="en-US"/>
-        </w:rPr>
-        <w:t>sas</w:t>
-      </w:r>
-      <w:proofErr w:type="spellEnd"/>
-      <w:r>
-        <w:rPr>
-          <w:lang w:val="en-US"/>
-        </w:rPr>
-        <w:t xml:space="preserve"> logbook from database and import from database</w:t>
+        <w:t>Save sas logbook from database and import from database</w:t>
       </w:r>
     </w:p>
     <w:p>
@@ -3736,21 +3451,7 @@
         <w:rPr>
           <w:lang w:val="en-US"/>
         </w:rPr>
-        <w:t xml:space="preserve">Create first </w:t>
-      </w:r>
-      <w:proofErr w:type="spellStart"/>
-      <w:r>
-        <w:rPr>
-          <w:lang w:val="en-US"/>
-        </w:rPr>
-        <w:t>Rmd</w:t>
-      </w:r>
-      <w:proofErr w:type="spellEnd"/>
-      <w:r>
-        <w:rPr>
-          <w:lang w:val="en-US"/>
-        </w:rPr>
-        <w:t xml:space="preserve"> version</w:t>
+        <w:t>Create first Rmd version</w:t>
       </w:r>
     </w:p>
     <w:p>
@@ -3790,21 +3491,7 @@
         <w:rPr>
           <w:lang w:val="en-US"/>
         </w:rPr>
-        <w:t>A fishing trip is approximated by reported fishing days, aggregated from monthly reports by taking the maximum number of fishing days per vessel–month–</w:t>
-      </w:r>
-      <w:proofErr w:type="spellStart"/>
-      <w:r>
-        <w:rPr>
-          <w:lang w:val="en-US"/>
-        </w:rPr>
-        <w:t>metier</w:t>
-      </w:r>
-      <w:proofErr w:type="spellEnd"/>
-      <w:r>
-        <w:rPr>
-          <w:lang w:val="en-US"/>
-        </w:rPr>
-        <w:t xml:space="preserve"> combination and summing these over time and vessels.</w:t>
+        <w:t>A fishing trip is approximated by reported fishing days, aggregated from monthly reports by taking the maximum number of fishing days per vessel–month–metier combination and summing these over time and vessels.</w:t>
       </w:r>
     </w:p>
     <w:p>
@@ -6274,6 +5961,118 @@
     </w:lvl>
   </w:abstractNum>
   <w:abstractNum w:abstractNumId="21" w15:restartNumberingAfterBreak="0">
+    <w:nsid w:val="46031837"/>
+    <w:multiLevelType w:val="hybridMultilevel"/>
+    <w:tmpl w:val="562095E2"/>
+    <w:lvl w:ilvl="0" w:tplc="91A877DA">
+      <w:numFmt w:val="bullet"/>
+      <w:lvlText w:val="-"/>
+      <w:lvlJc w:val="left"/>
+      <w:pPr>
+        <w:ind w:left="720" w:hanging="360"/>
+      </w:pPr>
+      <w:rPr>
+        <w:rFonts w:ascii="Aptos" w:eastAsiaTheme="minorHAnsi" w:hAnsi="Aptos" w:cstheme="minorBidi" w:hint="default"/>
+      </w:rPr>
+    </w:lvl>
+    <w:lvl w:ilvl="1" w:tplc="08090003" w:tentative="1">
+      <w:start w:val="1"/>
+      <w:numFmt w:val="bullet"/>
+      <w:lvlText w:val="o"/>
+      <w:lvlJc w:val="left"/>
+      <w:pPr>
+        <w:ind w:left="1440" w:hanging="360"/>
+      </w:pPr>
+      <w:rPr>
+        <w:rFonts w:ascii="Courier New" w:hAnsi="Courier New" w:cs="Courier New" w:hint="default"/>
+      </w:rPr>
+    </w:lvl>
+    <w:lvl w:ilvl="2" w:tplc="08090005" w:tentative="1">
+      <w:start w:val="1"/>
+      <w:numFmt w:val="bullet"/>
+      <w:lvlText w:val=""/>
+      <w:lvlJc w:val="left"/>
+      <w:pPr>
+        <w:ind w:left="2160" w:hanging="360"/>
+      </w:pPr>
+      <w:rPr>
+        <w:rFonts w:ascii="Wingdings" w:hAnsi="Wingdings" w:hint="default"/>
+      </w:rPr>
+    </w:lvl>
+    <w:lvl w:ilvl="3" w:tplc="08090001" w:tentative="1">
+      <w:start w:val="1"/>
+      <w:numFmt w:val="bullet"/>
+      <w:lvlText w:val=""/>
+      <w:lvlJc w:val="left"/>
+      <w:pPr>
+        <w:ind w:left="2880" w:hanging="360"/>
+      </w:pPr>
+      <w:rPr>
+        <w:rFonts w:ascii="Symbol" w:hAnsi="Symbol" w:hint="default"/>
+      </w:rPr>
+    </w:lvl>
+    <w:lvl w:ilvl="4" w:tplc="08090003" w:tentative="1">
+      <w:start w:val="1"/>
+      <w:numFmt w:val="bullet"/>
+      <w:lvlText w:val="o"/>
+      <w:lvlJc w:val="left"/>
+      <w:pPr>
+        <w:ind w:left="3600" w:hanging="360"/>
+      </w:pPr>
+      <w:rPr>
+        <w:rFonts w:ascii="Courier New" w:hAnsi="Courier New" w:cs="Courier New" w:hint="default"/>
+      </w:rPr>
+    </w:lvl>
+    <w:lvl w:ilvl="5" w:tplc="08090005" w:tentative="1">
+      <w:start w:val="1"/>
+      <w:numFmt w:val="bullet"/>
+      <w:lvlText w:val=""/>
+      <w:lvlJc w:val="left"/>
+      <w:pPr>
+        <w:ind w:left="4320" w:hanging="360"/>
+      </w:pPr>
+      <w:rPr>
+        <w:rFonts w:ascii="Wingdings" w:hAnsi="Wingdings" w:hint="default"/>
+      </w:rPr>
+    </w:lvl>
+    <w:lvl w:ilvl="6" w:tplc="08090001" w:tentative="1">
+      <w:start w:val="1"/>
+      <w:numFmt w:val="bullet"/>
+      <w:lvlText w:val=""/>
+      <w:lvlJc w:val="left"/>
+      <w:pPr>
+        <w:ind w:left="5040" w:hanging="360"/>
+      </w:pPr>
+      <w:rPr>
+        <w:rFonts w:ascii="Symbol" w:hAnsi="Symbol" w:hint="default"/>
+      </w:rPr>
+    </w:lvl>
+    <w:lvl w:ilvl="7" w:tplc="08090003" w:tentative="1">
+      <w:start w:val="1"/>
+      <w:numFmt w:val="bullet"/>
+      <w:lvlText w:val="o"/>
+      <w:lvlJc w:val="left"/>
+      <w:pPr>
+        <w:ind w:left="5760" w:hanging="360"/>
+      </w:pPr>
+      <w:rPr>
+        <w:rFonts w:ascii="Courier New" w:hAnsi="Courier New" w:cs="Courier New" w:hint="default"/>
+      </w:rPr>
+    </w:lvl>
+    <w:lvl w:ilvl="8" w:tplc="08090005" w:tentative="1">
+      <w:start w:val="1"/>
+      <w:numFmt w:val="bullet"/>
+      <w:lvlText w:val=""/>
+      <w:lvlJc w:val="left"/>
+      <w:pPr>
+        <w:ind w:left="6480" w:hanging="360"/>
+      </w:pPr>
+      <w:rPr>
+        <w:rFonts w:ascii="Wingdings" w:hAnsi="Wingdings" w:hint="default"/>
+      </w:rPr>
+    </w:lvl>
+  </w:abstractNum>
+  <w:abstractNum w:abstractNumId="22" w15:restartNumberingAfterBreak="0">
     <w:nsid w:val="47F96F2F"/>
     <w:multiLevelType w:val="hybridMultilevel"/>
     <w:tmpl w:val="7256ACFE"/>
@@ -6385,7 +6184,7 @@
       </w:rPr>
     </w:lvl>
   </w:abstractNum>
-  <w:abstractNum w:abstractNumId="22" w15:restartNumberingAfterBreak="0">
+  <w:abstractNum w:abstractNumId="23" w15:restartNumberingAfterBreak="0">
     <w:nsid w:val="483435CC"/>
     <w:multiLevelType w:val="hybridMultilevel"/>
     <w:tmpl w:val="787CC9BA"/>
@@ -6497,7 +6296,7 @@
       </w:rPr>
     </w:lvl>
   </w:abstractNum>
-  <w:abstractNum w:abstractNumId="23" w15:restartNumberingAfterBreak="0">
+  <w:abstractNum w:abstractNumId="24" w15:restartNumberingAfterBreak="0">
     <w:nsid w:val="49A87142"/>
     <w:multiLevelType w:val="hybridMultilevel"/>
     <w:tmpl w:val="0C047B9C"/>
@@ -6609,7 +6408,7 @@
       </w:rPr>
     </w:lvl>
   </w:abstractNum>
-  <w:abstractNum w:abstractNumId="24" w15:restartNumberingAfterBreak="0">
+  <w:abstractNum w:abstractNumId="25" w15:restartNumberingAfterBreak="0">
     <w:nsid w:val="4C2329FC"/>
     <w:multiLevelType w:val="hybridMultilevel"/>
     <w:tmpl w:val="DE9ED958"/>
@@ -6722,7 +6521,7 @@
       </w:rPr>
     </w:lvl>
   </w:abstractNum>
-  <w:abstractNum w:abstractNumId="25" w15:restartNumberingAfterBreak="0">
+  <w:abstractNum w:abstractNumId="26" w15:restartNumberingAfterBreak="0">
     <w:nsid w:val="4C62209E"/>
     <w:multiLevelType w:val="hybridMultilevel"/>
     <w:tmpl w:val="07F6CAEE"/>
@@ -6835,7 +6634,7 @@
       </w:rPr>
     </w:lvl>
   </w:abstractNum>
-  <w:abstractNum w:abstractNumId="26" w15:restartNumberingAfterBreak="0">
+  <w:abstractNum w:abstractNumId="27" w15:restartNumberingAfterBreak="0">
     <w:nsid w:val="5A9430D7"/>
     <w:multiLevelType w:val="hybridMultilevel"/>
     <w:tmpl w:val="BB3A180A"/>
@@ -6948,7 +6747,7 @@
       </w:rPr>
     </w:lvl>
   </w:abstractNum>
-  <w:abstractNum w:abstractNumId="27" w15:restartNumberingAfterBreak="0">
+  <w:abstractNum w:abstractNumId="28" w15:restartNumberingAfterBreak="0">
     <w:nsid w:val="5FC00F8A"/>
     <w:multiLevelType w:val="hybridMultilevel"/>
     <w:tmpl w:val="9D96EDD4"/>
@@ -7061,7 +6860,119 @@
       </w:rPr>
     </w:lvl>
   </w:abstractNum>
-  <w:abstractNum w:abstractNumId="28" w15:restartNumberingAfterBreak="0">
+  <w:abstractNum w:abstractNumId="29" w15:restartNumberingAfterBreak="0">
+    <w:nsid w:val="61B82196"/>
+    <w:multiLevelType w:val="hybridMultilevel"/>
+    <w:tmpl w:val="F9281AA4"/>
+    <w:lvl w:ilvl="0" w:tplc="084C944E">
+      <w:numFmt w:val="bullet"/>
+      <w:lvlText w:val="-"/>
+      <w:lvlJc w:val="left"/>
+      <w:pPr>
+        <w:ind w:left="720" w:hanging="360"/>
+      </w:pPr>
+      <w:rPr>
+        <w:rFonts w:ascii="Aptos" w:eastAsiaTheme="minorHAnsi" w:hAnsi="Aptos" w:cstheme="minorBidi" w:hint="default"/>
+      </w:rPr>
+    </w:lvl>
+    <w:lvl w:ilvl="1" w:tplc="08090003">
+      <w:start w:val="1"/>
+      <w:numFmt w:val="bullet"/>
+      <w:lvlText w:val="o"/>
+      <w:lvlJc w:val="left"/>
+      <w:pPr>
+        <w:ind w:left="1440" w:hanging="360"/>
+      </w:pPr>
+      <w:rPr>
+        <w:rFonts w:ascii="Courier New" w:hAnsi="Courier New" w:cs="Courier New" w:hint="default"/>
+      </w:rPr>
+    </w:lvl>
+    <w:lvl w:ilvl="2" w:tplc="08090005" w:tentative="1">
+      <w:start w:val="1"/>
+      <w:numFmt w:val="bullet"/>
+      <w:lvlText w:val=""/>
+      <w:lvlJc w:val="left"/>
+      <w:pPr>
+        <w:ind w:left="2160" w:hanging="360"/>
+      </w:pPr>
+      <w:rPr>
+        <w:rFonts w:ascii="Wingdings" w:hAnsi="Wingdings" w:hint="default"/>
+      </w:rPr>
+    </w:lvl>
+    <w:lvl w:ilvl="3" w:tplc="08090001" w:tentative="1">
+      <w:start w:val="1"/>
+      <w:numFmt w:val="bullet"/>
+      <w:lvlText w:val=""/>
+      <w:lvlJc w:val="left"/>
+      <w:pPr>
+        <w:ind w:left="2880" w:hanging="360"/>
+      </w:pPr>
+      <w:rPr>
+        <w:rFonts w:ascii="Symbol" w:hAnsi="Symbol" w:hint="default"/>
+      </w:rPr>
+    </w:lvl>
+    <w:lvl w:ilvl="4" w:tplc="08090003" w:tentative="1">
+      <w:start w:val="1"/>
+      <w:numFmt w:val="bullet"/>
+      <w:lvlText w:val="o"/>
+      <w:lvlJc w:val="left"/>
+      <w:pPr>
+        <w:ind w:left="3600" w:hanging="360"/>
+      </w:pPr>
+      <w:rPr>
+        <w:rFonts w:ascii="Courier New" w:hAnsi="Courier New" w:cs="Courier New" w:hint="default"/>
+      </w:rPr>
+    </w:lvl>
+    <w:lvl w:ilvl="5" w:tplc="08090005" w:tentative="1">
+      <w:start w:val="1"/>
+      <w:numFmt w:val="bullet"/>
+      <w:lvlText w:val=""/>
+      <w:lvlJc w:val="left"/>
+      <w:pPr>
+        <w:ind w:left="4320" w:hanging="360"/>
+      </w:pPr>
+      <w:rPr>
+        <w:rFonts w:ascii="Wingdings" w:hAnsi="Wingdings" w:hint="default"/>
+      </w:rPr>
+    </w:lvl>
+    <w:lvl w:ilvl="6" w:tplc="08090001" w:tentative="1">
+      <w:start w:val="1"/>
+      <w:numFmt w:val="bullet"/>
+      <w:lvlText w:val=""/>
+      <w:lvlJc w:val="left"/>
+      <w:pPr>
+        <w:ind w:left="5040" w:hanging="360"/>
+      </w:pPr>
+      <w:rPr>
+        <w:rFonts w:ascii="Symbol" w:hAnsi="Symbol" w:hint="default"/>
+      </w:rPr>
+    </w:lvl>
+    <w:lvl w:ilvl="7" w:tplc="08090003" w:tentative="1">
+      <w:start w:val="1"/>
+      <w:numFmt w:val="bullet"/>
+      <w:lvlText w:val="o"/>
+      <w:lvlJc w:val="left"/>
+      <w:pPr>
+        <w:ind w:left="5760" w:hanging="360"/>
+      </w:pPr>
+      <w:rPr>
+        <w:rFonts w:ascii="Courier New" w:hAnsi="Courier New" w:cs="Courier New" w:hint="default"/>
+      </w:rPr>
+    </w:lvl>
+    <w:lvl w:ilvl="8" w:tplc="08090005" w:tentative="1">
+      <w:start w:val="1"/>
+      <w:numFmt w:val="bullet"/>
+      <w:lvlText w:val=""/>
+      <w:lvlJc w:val="left"/>
+      <w:pPr>
+        <w:ind w:left="6480" w:hanging="360"/>
+      </w:pPr>
+      <w:rPr>
+        <w:rFonts w:ascii="Wingdings" w:hAnsi="Wingdings" w:hint="default"/>
+      </w:rPr>
+    </w:lvl>
+  </w:abstractNum>
+  <w:abstractNum w:abstractNumId="30" w15:restartNumberingAfterBreak="0">
     <w:nsid w:val="625F2396"/>
     <w:multiLevelType w:val="hybridMultilevel"/>
     <w:tmpl w:val="CC6833A0"/>
@@ -7173,7 +7084,7 @@
       </w:rPr>
     </w:lvl>
   </w:abstractNum>
-  <w:abstractNum w:abstractNumId="29" w15:restartNumberingAfterBreak="0">
+  <w:abstractNum w:abstractNumId="31" w15:restartNumberingAfterBreak="0">
     <w:nsid w:val="65070E8D"/>
     <w:multiLevelType w:val="hybridMultilevel"/>
     <w:tmpl w:val="BDB6982A"/>
@@ -7286,7 +7197,7 @@
       </w:rPr>
     </w:lvl>
   </w:abstractNum>
-  <w:abstractNum w:abstractNumId="30" w15:restartNumberingAfterBreak="0">
+  <w:abstractNum w:abstractNumId="32" w15:restartNumberingAfterBreak="0">
     <w:nsid w:val="695A7833"/>
     <w:multiLevelType w:val="hybridMultilevel"/>
     <w:tmpl w:val="E564D540"/>
@@ -7398,7 +7309,7 @@
       </w:rPr>
     </w:lvl>
   </w:abstractNum>
-  <w:abstractNum w:abstractNumId="31" w15:restartNumberingAfterBreak="0">
+  <w:abstractNum w:abstractNumId="33" w15:restartNumberingAfterBreak="0">
     <w:nsid w:val="6E5176C4"/>
     <w:multiLevelType w:val="hybridMultilevel"/>
     <w:tmpl w:val="51C0ACA8"/>
@@ -7510,7 +7421,7 @@
       </w:rPr>
     </w:lvl>
   </w:abstractNum>
-  <w:abstractNum w:abstractNumId="32" w15:restartNumberingAfterBreak="0">
+  <w:abstractNum w:abstractNumId="34" w15:restartNumberingAfterBreak="0">
     <w:nsid w:val="6FE3157E"/>
     <w:multiLevelType w:val="hybridMultilevel"/>
     <w:tmpl w:val="6B0E535E"/>
@@ -7623,7 +7534,7 @@
       </w:rPr>
     </w:lvl>
   </w:abstractNum>
-  <w:abstractNum w:abstractNumId="33" w15:restartNumberingAfterBreak="0">
+  <w:abstractNum w:abstractNumId="35" w15:restartNumberingAfterBreak="0">
     <w:nsid w:val="73B949D2"/>
     <w:multiLevelType w:val="hybridMultilevel"/>
     <w:tmpl w:val="28606D2A"/>
@@ -7742,7 +7653,7 @@
     <w:abstractNumId w:val="4"/>
   </w:num>
   <w:num w:numId="3" w16cid:durableId="1364742651">
-    <w:abstractNumId w:val="27"/>
+    <w:abstractNumId w:val="28"/>
   </w:num>
   <w:num w:numId="4" w16cid:durableId="302855184">
     <w:abstractNumId w:val="9"/>
@@ -7763,31 +7674,31 @@
     <w:abstractNumId w:val="6"/>
   </w:num>
   <w:num w:numId="10" w16cid:durableId="1761370988">
-    <w:abstractNumId w:val="29"/>
+    <w:abstractNumId w:val="31"/>
   </w:num>
   <w:num w:numId="11" w16cid:durableId="1499495752">
-    <w:abstractNumId w:val="21"/>
+    <w:abstractNumId w:val="22"/>
   </w:num>
   <w:num w:numId="12" w16cid:durableId="1412316134">
-    <w:abstractNumId w:val="33"/>
+    <w:abstractNumId w:val="35"/>
   </w:num>
   <w:num w:numId="13" w16cid:durableId="1350258004">
     <w:abstractNumId w:val="12"/>
   </w:num>
   <w:num w:numId="14" w16cid:durableId="1673683661">
-    <w:abstractNumId w:val="23"/>
+    <w:abstractNumId w:val="24"/>
   </w:num>
   <w:num w:numId="15" w16cid:durableId="867064272">
-    <w:abstractNumId w:val="30"/>
+    <w:abstractNumId w:val="32"/>
   </w:num>
   <w:num w:numId="16" w16cid:durableId="7604246">
-    <w:abstractNumId w:val="22"/>
+    <w:abstractNumId w:val="23"/>
   </w:num>
   <w:num w:numId="17" w16cid:durableId="2089039549">
     <w:abstractNumId w:val="13"/>
   </w:num>
   <w:num w:numId="18" w16cid:durableId="595285920">
-    <w:abstractNumId w:val="25"/>
+    <w:abstractNumId w:val="26"/>
   </w:num>
   <w:num w:numId="19" w16cid:durableId="2136634086">
     <w:abstractNumId w:val="15"/>
@@ -7796,13 +7707,13 @@
     <w:abstractNumId w:val="0"/>
   </w:num>
   <w:num w:numId="21" w16cid:durableId="1646935873">
-    <w:abstractNumId w:val="26"/>
+    <w:abstractNumId w:val="27"/>
   </w:num>
   <w:num w:numId="22" w16cid:durableId="18512531">
     <w:abstractNumId w:val="19"/>
   </w:num>
   <w:num w:numId="23" w16cid:durableId="926422375">
-    <w:abstractNumId w:val="24"/>
+    <w:abstractNumId w:val="25"/>
   </w:num>
   <w:num w:numId="24" w16cid:durableId="1654137957">
     <w:abstractNumId w:val="17"/>
@@ -7817,7 +7728,7 @@
     <w:abstractNumId w:val="20"/>
   </w:num>
   <w:num w:numId="28" w16cid:durableId="1900287879">
-    <w:abstractNumId w:val="31"/>
+    <w:abstractNumId w:val="33"/>
   </w:num>
   <w:num w:numId="29" w16cid:durableId="112094442">
     <w:abstractNumId w:val="10"/>
@@ -7829,13 +7740,19 @@
     <w:abstractNumId w:val="2"/>
   </w:num>
   <w:num w:numId="32" w16cid:durableId="366636805">
-    <w:abstractNumId w:val="32"/>
+    <w:abstractNumId w:val="34"/>
   </w:num>
   <w:num w:numId="33" w16cid:durableId="305666819">
     <w:abstractNumId w:val="16"/>
   </w:num>
   <w:num w:numId="34" w16cid:durableId="2041860774">
-    <w:abstractNumId w:val="28"/>
+    <w:abstractNumId w:val="30"/>
+  </w:num>
+  <w:num w:numId="35" w16cid:durableId="531963867">
+    <w:abstractNumId w:val="21"/>
+  </w:num>
+  <w:num w:numId="36" w16cid:durableId="1205829286">
+    <w:abstractNumId w:val="29"/>
   </w:num>
 </w:numbering>
 </file>

</xml_diff>